<commit_message>
merged edits from AF
</commit_message>
<xml_diff>
--- a/Products/oreo-taxonomy.docx
+++ b/Products/oreo-taxonomy.docx
@@ -55,7 +55,7 @@
         <w:pStyle w:val="Date"/>
       </w:pPr>
       <w:r>
-        <w:t xml:space="preserve">2025-04-12</w:t>
+        <w:t xml:space="preserve">2025-04-16</w:t>
       </w:r>
     </w:p>
     <w:p>
@@ -5159,7 +5159,7 @@
       <w:r>
         <w:t xml:space="preserve"> </w:t>
       </w:r>
-      <w:hyperlink w:anchor="fig-fullphylogeny-support">
+      <w:hyperlink w:anchor="fig-phylo">
         <w:r>
           <w:rPr>
             <w:rStyle w:val="Hyperlink"/>
@@ -5233,7 +5233,7 @@
       <w:r>
         <w:t xml:space="preserve">with high support (</w:t>
       </w:r>
-      <w:hyperlink w:anchor="fig-fullphylogeny-support">
+      <w:hyperlink w:anchor="fig-phylo">
         <w:r>
           <w:rPr>
             <w:rStyle w:val="Hyperlink"/>
@@ -5340,7 +5340,7 @@
       <w:tr>
         <w:tc>
           <w:tcPr/>
-          <w:bookmarkStart w:id="44" w:name="fig-fullphylogeny-support"/>
+          <w:bookmarkStart w:id="44" w:name="fig-phylo"/>
           <w:p>
             <w:pPr>
               <w:pStyle w:val="Compact"/>
@@ -5774,7 +5774,7 @@
         <w:t xml:space="preserve"> </w:t>
       </w:r>
       <w:r>
-        <w:t xml:space="preserve">is an arboreal clade with expanded digital dics of roughly equal width between the fingers and toes, whereas</w:t>
+        <w:t xml:space="preserve">is an arboreal clade with expanded digital pads of roughly equal width between the fingers and toes, whereas</w:t>
       </w:r>
       <w:r>
         <w:t xml:space="preserve"> </w:t>
@@ -26932,7 +26932,7 @@
             <w:r>
               <w:drawing>
                 <wp:inline>
-                  <wp:extent cx="5334000" cy="3429000"/>
+                  <wp:extent cx="5334000" cy="3556000"/>
                   <wp:effectExtent b="0" l="0" r="0" t="0"/>
                   <wp:docPr descr="" title="" id="49" name="Picture"/>
                   <a:graphic>
@@ -26953,7 +26953,7 @@
                         <pic:spPr bwMode="auto">
                           <a:xfrm>
                             <a:off x="0" y="0"/>
-                            <a:ext cx="5334000" cy="3429000"/>
+                            <a:ext cx="5334000" cy="3556000"/>
                           </a:xfrm>
                           <a:prstGeom prst="rect">
                             <a:avLst/>
@@ -27036,7 +27036,39 @@
         <w:pStyle w:val="FirstParagraph"/>
       </w:pPr>
       <w:r>
-        <w:t xml:space="preserve">We use a maximum crown-clade definition for designating Oreophryne and Auparoparo because the monophyly of these taxa are strongly supported, and the relationships of these taxa to each other and to sister genera of Asterophryinae are well-supported</w:t>
+        <w:t xml:space="preserve">We use a maximum crown-clade definition for designating</w:t>
+      </w:r>
+      <w:r>
+        <w:t xml:space="preserve"> </w:t>
+      </w:r>
+      <w:r>
+        <w:rPr>
+          <w:i/>
+          <w:iCs/>
+        </w:rPr>
+        <w:t xml:space="preserve">Oreophryne</w:t>
+      </w:r>
+      <w:r>
+        <w:t xml:space="preserve"> </w:t>
+      </w:r>
+      <w:r>
+        <w:t xml:space="preserve">and</w:t>
+      </w:r>
+      <w:r>
+        <w:t xml:space="preserve"> </w:t>
+      </w:r>
+      <w:r>
+        <w:rPr>
+          <w:i/>
+          <w:iCs/>
+        </w:rPr>
+        <w:t xml:space="preserve">Auparoparo</w:t>
+      </w:r>
+      <w:r>
+        <w:t xml:space="preserve"> </w:t>
+      </w:r>
+      <w:r>
+        <w:t xml:space="preserve">because the monophyly of these taxa are strongly supported, and the relationships of these taxa to each other and to sister genera of Asterophryinae are well-supported</w:t>
       </w:r>
       <w:r>
         <w:t xml:space="preserve"> </w:t>
@@ -27078,7 +27110,33 @@
         <w:t xml:space="preserve"> </w:t>
       </w:r>
       <w:r>
-        <w:t xml:space="preserve">in using the terms converted clade name (CCN) to indicate the phylogenetic redefinition of Oreophryne, and new clade name (NCN) for newly designated names (Auparoparo), whereas the previously defined polyphyletic Oreophryne is indicated by</w:t>
+        <w:t xml:space="preserve">in using the terms converted clade name (CCN) to indicate the phylogenetic redefinition of Oreophryne, and new clade name (NCN) for newly designated names (</w:t>
+      </w:r>
+      <w:r>
+        <w:rPr>
+          <w:i/>
+          <w:iCs/>
+        </w:rPr>
+        <w:t xml:space="preserve">Auparoparo</w:t>
+      </w:r>
+      <w:r>
+        <w:t xml:space="preserve">), whereas the previously defined polyphyletic</w:t>
+      </w:r>
+      <w:r>
+        <w:t xml:space="preserve"> </w:t>
+      </w:r>
+      <w:r>
+        <w:rPr>
+          <w:i/>
+          <w:iCs/>
+        </w:rPr>
+        <w:t xml:space="preserve">Oreophryne</w:t>
+      </w:r>
+      <w:r>
+        <w:t xml:space="preserve"> </w:t>
+      </w:r>
+      <w:r>
+        <w:t xml:space="preserve">is indicated by</w:t>
       </w:r>
       <w:r>
         <w:t xml:space="preserve"> </w:t>
@@ -27102,11 +27160,7 @@
         <w:t xml:space="preserve">Family Microhylidae Günther, 1858 (1843)</w:t>
       </w:r>
       <w:r>
-        <w:rPr>
-          <w:b/>
-          <w:bCs/>
-        </w:rPr>
-        <w:t xml:space="preserve"> </w:t>
+        <w:br/>
       </w:r>
       <w:r>
         <w:rPr>
@@ -27116,11 +27170,7 @@
         <w:t xml:space="preserve">Subfamily Asterophryinae Günther, 1858</w:t>
       </w:r>
       <w:r>
-        <w:rPr>
-          <w:b/>
-          <w:bCs/>
-        </w:rPr>
-        <w:t xml:space="preserve"> </w:t>
+        <w:br/>
       </w:r>
       <w:r>
         <w:rPr>
@@ -27318,7 +27368,23 @@
         <w:t xml:space="preserve"> </w:t>
       </w:r>
       <w:r>
-        <w:t xml:space="preserve">We note that these morphological features for Oreophryne are shared with</w:t>
+        <w:t xml:space="preserve">We note that there are no synapomorphies in adult</w:t>
+      </w:r>
+      <w:r>
+        <w:t xml:space="preserve"> </w:t>
+      </w:r>
+      <w:r>
+        <w:rPr>
+          <w:i/>
+          <w:iCs/>
+        </w:rPr>
+        <w:t xml:space="preserve">Oreophryne</w:t>
+      </w:r>
+      <w:r>
+        <w:t xml:space="preserve"> </w:t>
+      </w:r>
+      <w:r>
+        <w:t xml:space="preserve">that differ from the morphologically similar genus</w:t>
       </w:r>
       <w:r>
         <w:t xml:space="preserve"> </w:t>
@@ -27331,7 +27397,7 @@
         <w:t xml:space="preserve">Auparoparo</w:t>
       </w:r>
       <w:r>
-        <w:t xml:space="preserve">.</w:t>
+        <w:t xml:space="preserve">. Diagnoses should be made by molecular phylogenetic analysis, including at least representatives of</w:t>
       </w:r>
       <w:r>
         <w:t xml:space="preserve"> </w:t>
@@ -27344,10 +27410,7 @@
         <w:t xml:space="preserve">Oreophryne</w:t>
       </w:r>
       <w:r>
-        <w:t xml:space="preserve"> </w:t>
-      </w:r>
-      <w:r>
-        <w:t xml:space="preserve">and</w:t>
+        <w:t xml:space="preserve">,</w:t>
       </w:r>
       <w:r>
         <w:t xml:space="preserve"> </w:t>
@@ -27360,10 +27423,80 @@
         <w:t xml:space="preserve">Auparoparo</w:t>
       </w:r>
       <w:r>
-        <w:t xml:space="preserve"> </w:t>
-      </w:r>
-      <w:r>
-        <w:t xml:space="preserve">may be distinguished from other genera in subfamily Asterophryinae primarily by the combination of (1) presence of highly reduced clavicles (vs absence or elongate) which have a distinctly curved shape (</w:t>
+        <w:t xml:space="preserve">,</w:t>
+      </w:r>
+      <w:r>
+        <w:t xml:space="preserve"> </w:t>
+      </w:r>
+      <w:r>
+        <w:rPr>
+          <w:i/>
+          <w:iCs/>
+        </w:rPr>
+        <w:t xml:space="preserve">Cophixalus</w:t>
+      </w:r>
+      <w:r>
+        <w:t xml:space="preserve"> </w:t>
+      </w:r>
+      <w:r>
+        <w:t xml:space="preserve">and</w:t>
+      </w:r>
+      <w:r>
+        <w:t xml:space="preserve"> </w:t>
+      </w:r>
+      <w:r>
+        <w:rPr>
+          <w:i/>
+          <w:iCs/>
+        </w:rPr>
+        <w:t xml:space="preserve">Paedophryne</w:t>
+      </w:r>
+      <w:r>
+        <w:t xml:space="preserve"> </w:t>
+      </w:r>
+      <w:r>
+        <w:t xml:space="preserve">or other closest sister genera as outgroups.</w:t>
+      </w:r>
+    </w:p>
+    <w:p>
+      <w:pPr>
+        <w:pStyle w:val="BodyText"/>
+      </w:pPr>
+      <w:r>
+        <w:rPr>
+          <w:b/>
+          <w:bCs/>
+        </w:rPr>
+        <w:t xml:space="preserve">Description:</w:t>
+      </w:r>
+      <w:r>
+        <w:t xml:space="preserve"> </w:t>
+      </w:r>
+      <w:r>
+        <w:rPr>
+          <w:i/>
+          <w:iCs/>
+        </w:rPr>
+        <w:t xml:space="preserve">Oreophryne</w:t>
+      </w:r>
+      <w:r>
+        <w:t xml:space="preserve"> </w:t>
+      </w:r>
+      <w:r>
+        <w:t xml:space="preserve">differs from most other genera in subfamily Asterophryinae, but not from</w:t>
+      </w:r>
+      <w:r>
+        <w:t xml:space="preserve"> </w:t>
+      </w:r>
+      <w:r>
+        <w:rPr>
+          <w:i/>
+          <w:iCs/>
+        </w:rPr>
+        <w:t xml:space="preserve">Auparoparo</w:t>
+      </w:r>
+      <w:r>
+        <w:t xml:space="preserve">, by the combination of (1) presence of highly reduced clavicles (vs absence or elongate) which have a distinctly curved shape (</w:t>
       </w:r>
       <w:hyperlink w:anchor="fig-morph">
         <w:r>
@@ -27374,7 +27507,13 @@
         </w:r>
       </w:hyperlink>
       <w:r>
-        <w:t xml:space="preserve">); (2) presence of well developed digital pads, often with finger and toe pads of similar size; (3) arboreal lifestyle (perch height &gt;2m above ground); (4) most species range in body size from 16mm (</w:t>
+        <w:t xml:space="preserve">); (2) presence of well developed digital pads, often with finger and toe pads of similar size; (3) arboreal lifestyle (perch height &gt;2m above ground); (4) most species range in body size from 16mm</w:t>
+      </w:r>
+      <w:r>
+        <w:t xml:space="preserve"> </w:t>
+      </w:r>
+      <w:r>
+        <w:t xml:space="preserve">(</w:t>
       </w:r>
       <w:r>
         <w:rPr>
@@ -27384,7 +27523,13 @@
         <w:t xml:space="preserve">O. graminis</w:t>
       </w:r>
       <w:r>
-        <w:t xml:space="preserve">, Gunther &amp; Richards 2011) to 30mm, with a few larger species ~40mm (</w:t>
+        <w:t xml:space="preserve">, Günther and Richards 2011)</w:t>
+      </w:r>
+      <w:r>
+        <w:t xml:space="preserve"> </w:t>
+      </w:r>
+      <w:r>
+        <w:t xml:space="preserve">to 30mm, with a few larger species ~40mm (</w:t>
       </w:r>
       <w:r>
         <w:rPr>
@@ -27430,7 +27575,39 @@
         <w:t xml:space="preserve"> </w:t>
       </w:r>
       <w:r>
-        <w:t xml:space="preserve">type. Oreophryne may be preliminarily distinguished from Auparoparo by roughly equal finger to toe pad ratio, and males calling with</w:t>
+        <w:t xml:space="preserve">type. Some species of</w:t>
+      </w:r>
+      <w:r>
+        <w:t xml:space="preserve"> </w:t>
+      </w:r>
+      <w:r>
+        <w:rPr>
+          <w:i/>
+          <w:iCs/>
+        </w:rPr>
+        <w:t xml:space="preserve">Oreophryne</w:t>
+      </w:r>
+      <w:r>
+        <w:t xml:space="preserve"> </w:t>
+      </w:r>
+      <w:r>
+        <w:t xml:space="preserve">may be distinguished from</w:t>
+      </w:r>
+      <w:r>
+        <w:t xml:space="preserve"> </w:t>
+      </w:r>
+      <w:r>
+        <w:rPr>
+          <w:i/>
+          <w:iCs/>
+        </w:rPr>
+        <w:t xml:space="preserve">Auparoparo</w:t>
+      </w:r>
+      <w:r>
+        <w:t xml:space="preserve"> </w:t>
+      </w:r>
+      <w:r>
+        <w:t xml:space="preserve">by roughly equal finger to toe pad ratio and males calling with</w:t>
       </w:r>
       <w:r>
         <w:t xml:space="preserve"> </w:t>
@@ -27454,7 +27631,19 @@
         <w:t xml:space="preserve"> </w:t>
       </w:r>
       <w:r>
-        <w:t xml:space="preserve">call types, and geographic range, but confirmation should be made by molecular phylogenetics. We are not aware of any morphological synapomorphies for Oreophryne.</w:t>
+        <w:t xml:space="preserve">but not</w:t>
+      </w:r>
+      <w:r>
+        <w:t xml:space="preserve"> </w:t>
+      </w:r>
+      <w:r>
+        <w:t xml:space="preserve">“whinny”</w:t>
+      </w:r>
+      <w:r>
+        <w:t xml:space="preserve"> </w:t>
+      </w:r>
+      <w:r>
+        <w:t xml:space="preserve">call types.</w:t>
       </w:r>
     </w:p>
     <w:p>
@@ -27482,7 +27671,21 @@
         <w:t xml:space="preserve"> </w:t>
       </w:r>
       <w:r>
-        <w:t xml:space="preserve">(CCN) is defined as the maximum crown-clade (A, Figure 1) originating with the most recent common ancestor of</w:t>
+        <w:t xml:space="preserve">(CCN) is defined as the maximum crown-clade (the monophyletic clade descending from node A,</w:t>
+      </w:r>
+      <w:r>
+        <w:t xml:space="preserve"> </w:t>
+      </w:r>
+      <w:hyperlink w:anchor="fig-phylo">
+        <w:r>
+          <w:rPr>
+            <w:rStyle w:val="Hyperlink"/>
+          </w:rPr>
+          <w:t xml:space="preserve">Figure 2</w:t>
+        </w:r>
+      </w:hyperlink>
+      <w:r>
+        <w:t xml:space="preserve">) originating with the most recent common ancestor of</w:t>
       </w:r>
       <w:r>
         <w:t xml:space="preserve"> </w:t>
@@ -30231,7 +30434,7 @@
         <w:t xml:space="preserve"> </w:t>
       </w:r>
       <w:r>
-        <w:t xml:space="preserve">(Peters &amp; Doria, 1878). Forty-six species were not available for our study but should molecular evidence demonstrate their relationship within Oreophryne, those species should also retain their generic identity.</w:t>
+        <w:t xml:space="preserve">(Peters &amp; Doria, 1878). A number of species were not available for our study but should molecular evidence demonstrate their relationship within Oreophryne, those species should also retain their generic identity.</w:t>
       </w:r>
     </w:p>
     <w:p>
@@ -30249,7 +30452,18 @@
         <w:t xml:space="preserve"> </w:t>
       </w:r>
       <w:r>
-        <w:t xml:space="preserve">The range of confirmed species in this dataset remains nearly as broad as previously defined, from the Philippines and Indonesia to the southeastern most tip of mainland New Guinea and several near-shore islands (Fergusson, and Normanby Is.) and the distant Rossel Island of the Louisiade Archipelago. However, the transfer of species which occupy Woodlark Islands and Misima and Sudest Islands of the Louisaide Archipelago reduces the known range of Oreophryne. Woodlark Island is inhabited by</w:t>
+        <w:t xml:space="preserve">The range of confirmed species in this dataset remains nearly as broad as previously defined (</w:t>
+      </w:r>
+      <w:hyperlink w:anchor="fig-map">
+        <w:r>
+          <w:rPr>
+            <w:rStyle w:val="Hyperlink"/>
+          </w:rPr>
+          <w:t xml:space="preserve">Figure 3</w:t>
+        </w:r>
+      </w:hyperlink>
+      <w:r>
+        <w:t xml:space="preserve">), from the Philippines and Indonesia to the southeastern most tip of mainland New Guinea and several near-shore islands (Fergusson, and Normanby Is.) and the distant Rossel Island of the Louisiade Archipelago. However, the transfer of species which occupy Woodlark Islands and Misima and Sudest Islands of the Louisaide Archipelago reduces the known range of Oreophryne. Woodlark Island is inhabited by</w:t>
       </w:r>
       <w:r>
         <w:t xml:space="preserve"> </w:t>
@@ -30377,7 +30591,11 @@
         <w:t xml:space="preserve">Family Microhylidae Günther, 1858.</w:t>
       </w:r>
       <w:r>
-        <w:br/>
+        <w:rPr>
+          <w:b/>
+          <w:bCs/>
+        </w:rPr>
+        <w:t xml:space="preserve"> </w:t>
       </w:r>
       <w:r>
         <w:rPr>
@@ -30387,7 +30605,11 @@
         <w:t xml:space="preserve">Subfamily Asterophryinae Günther, 1858.</w:t>
       </w:r>
       <w:r>
-        <w:br/>
+        <w:rPr>
+          <w:b/>
+          <w:bCs/>
+        </w:rPr>
+        <w:t xml:space="preserve"> </w:t>
       </w:r>
       <w:r>
         <w:rPr>
@@ -30397,7 +30619,7 @@
         <w:t xml:space="preserve">Genus Auparoparo gen. Nov.</w:t>
       </w:r>
       <w:r>
-        <w:br/>
+        <w:t xml:space="preserve"> </w:t>
       </w:r>
       <w:r>
         <w:rPr>
@@ -30413,7 +30635,7 @@
         <w:t xml:space="preserve">Boettger, 1895</w:t>
       </w:r>
       <w:r>
-        <w:br/>
+        <w:t xml:space="preserve"> </w:t>
       </w:r>
       <w:r>
         <w:rPr>
@@ -30429,7 +30651,7 @@
         <w:t xml:space="preserve">Fry, 1917</w:t>
       </w:r>
       <w:r>
-        <w:br/>
+        <w:t xml:space="preserve"> </w:t>
       </w:r>
       <w:r>
         <w:rPr>
@@ -30442,20 +30664,10 @@
         <w:t xml:space="preserve"> </w:t>
       </w:r>
       <w:r>
-        <w:t xml:space="preserve">(</w:t>
-      </w:r>
-      <w:r>
-        <w:rPr>
-          <w:i/>
-          <w:iCs/>
-        </w:rPr>
-        <w:t xml:space="preserve">anthonyi</w:t>
-      </w:r>
-      <w:r>
-        <w:t xml:space="preserve">) Boulenger, 1897</w:t>
-      </w:r>
-      <w:r>
-        <w:br/>
+        <w:t xml:space="preserve">(anthonyi) Boulenger, 1897</w:t>
+      </w:r>
+      <w:r>
+        <w:t xml:space="preserve"> </w:t>
       </w:r>
       <w:r>
         <w:t xml:space="preserve">Type species</w:t>
@@ -30502,7 +30714,7 @@
         <w:t xml:space="preserve"> </w:t>
       </w:r>
       <w:r>
-        <w:t xml:space="preserve">We note that these diagnostic morphological features for arboreal species of</w:t>
+        <w:t xml:space="preserve">We note that there are no synapomorphies in adult</w:t>
       </w:r>
       <w:r>
         <w:t xml:space="preserve"> </w:t>
@@ -30518,7 +30730,7 @@
         <w:t xml:space="preserve"> </w:t>
       </w:r>
       <w:r>
-        <w:t xml:space="preserve">are all shared with</w:t>
+        <w:t xml:space="preserve">that differ from the morphologically similar genus</w:t>
       </w:r>
       <w:r>
         <w:t xml:space="preserve"> </w:t>
@@ -30531,7 +30743,7 @@
         <w:t xml:space="preserve">Oreophryne</w:t>
       </w:r>
       <w:r>
-        <w:t xml:space="preserve">. Most species of</w:t>
+        <w:t xml:space="preserve">. Diagnoses should be made by molecular phylogenetic analysis, including at least representatives of</w:t>
       </w:r>
       <w:r>
         <w:t xml:space="preserve"> </w:t>
@@ -30544,10 +30756,93 @@
         <w:t xml:space="preserve">Auparoparo</w:t>
       </w:r>
       <w:r>
-        <w:t xml:space="preserve"> </w:t>
-      </w:r>
-      <w:r>
-        <w:t xml:space="preserve">may be distinguished from other genera in subfamily Asterophryinae primarily by the combination of (1) presence of highly reduced clavicles (vs absence or elongate) which have a distinctly curved shape; (2) presence of well developed digital pads, with finger pads notably wider than toe pads (typically 20% or more); (3) arboreal lifestyle (perch height &gt;2m above ground); (4) small to moderately large body size in known species, from 16mm (</w:t>
+        <w:t xml:space="preserve">,</w:t>
+      </w:r>
+      <w:r>
+        <w:t xml:space="preserve"> </w:t>
+      </w:r>
+      <w:r>
+        <w:rPr>
+          <w:i/>
+          <w:iCs/>
+        </w:rPr>
+        <w:t xml:space="preserve">Oreophryne</w:t>
+      </w:r>
+      <w:r>
+        <w:t xml:space="preserve">,</w:t>
+      </w:r>
+      <w:r>
+        <w:t xml:space="preserve"> </w:t>
+      </w:r>
+      <w:r>
+        <w:rPr>
+          <w:i/>
+          <w:iCs/>
+        </w:rPr>
+        <w:t xml:space="preserve">Cophixalus</w:t>
+      </w:r>
+      <w:r>
+        <w:t xml:space="preserve"> </w:t>
+      </w:r>
+      <w:r>
+        <w:t xml:space="preserve">and</w:t>
+      </w:r>
+      <w:r>
+        <w:t xml:space="preserve"> </w:t>
+      </w:r>
+      <w:r>
+        <w:rPr>
+          <w:i/>
+          <w:iCs/>
+        </w:rPr>
+        <w:t xml:space="preserve">Paedophryne</w:t>
+      </w:r>
+      <w:r>
+        <w:t xml:space="preserve"> </w:t>
+      </w:r>
+      <w:r>
+        <w:t xml:space="preserve">or other closest sister genera as outgroups.</w:t>
+      </w:r>
+    </w:p>
+    <w:p>
+      <w:pPr>
+        <w:pStyle w:val="BodyText"/>
+      </w:pPr>
+      <w:r>
+        <w:rPr>
+          <w:b/>
+          <w:bCs/>
+        </w:rPr>
+        <w:t xml:space="preserve">Description:</w:t>
+      </w:r>
+      <w:r>
+        <w:t xml:space="preserve"> </w:t>
+      </w:r>
+      <w:r>
+        <w:rPr>
+          <w:i/>
+          <w:iCs/>
+        </w:rPr>
+        <w:t xml:space="preserve">Auparoparo</w:t>
+      </w:r>
+      <w:r>
+        <w:t xml:space="preserve"> </w:t>
+      </w:r>
+      <w:r>
+        <w:t xml:space="preserve">differs from most other genera in subfamily Asterophryinae, but not from</w:t>
+      </w:r>
+      <w:r>
+        <w:t xml:space="preserve"> </w:t>
+      </w:r>
+      <w:r>
+        <w:rPr>
+          <w:i/>
+          <w:iCs/>
+        </w:rPr>
+        <w:t xml:space="preserve">Oreophryne</w:t>
+      </w:r>
+      <w:r>
+        <w:t xml:space="preserve">, by the combination of (1) presence of highly reduced clavicles (vs absence or elongate) which have a distinctly curved shape; (2) presence of well developed digital discs, with finger discs notably wider than toe discs (typically 20% or more); (3) arboreal lifestyle (perch height &gt;2m above ground); (4) small to moderately large body size in known species, from 16mm (</w:t>
       </w:r>
       <w:r>
         <w:rPr>
@@ -30557,17 +30852,7 @@
         <w:t xml:space="preserve">A. brunnea</w:t>
       </w:r>
       <w:r>
-        <w:t xml:space="preserve">, Kraus 2017) to 25 mm (</w:t>
-      </w:r>
-      <w:r>
-        <w:rPr>
-          <w:i/>
-          <w:iCs/>
-        </w:rPr>
-        <w:t xml:space="preserve">A. picticrus</w:t>
-      </w:r>
-      <w:r>
-        <w:t xml:space="preserve">, Kraus 2016); (5) small to invisible tympanum; (6) large eyes with pupil horizontal; (7) occasional presence of toe webbing; (8) and thin, elongated limbs; and (9) and in many species males that call with a</w:t>
+        <w:t xml:space="preserve">, Kraus 2017) to 25 mm (A. picticrus, Kraus 2016); (5) small to invisible tympanum; (6) large eyes with pupil horizontal; (7) occasional presence of toe webbing; (8) and thin, elongated limbs; and (9) and in many species males that call with a</w:t>
       </w:r>
       <w:r>
         <w:t xml:space="preserve"> </w:t>
@@ -30591,33 +30876,7 @@
         <w:t xml:space="preserve"> </w:t>
       </w:r>
       <w:r>
-        <w:t xml:space="preserve">type. Researchers should be aware of a high-elevation morphotype exception that are terrestrial or fossorial species, included in subgenus nov.</w:t>
-      </w:r>
-      <w:r>
-        <w:t xml:space="preserve"> </w:t>
-      </w:r>
-      <w:r>
-        <w:rPr>
-          <w:i/>
-          <w:iCs/>
-        </w:rPr>
-        <w:t xml:space="preserve">Aphantophryne</w:t>
-      </w:r>
-      <w:r>
-        <w:t xml:space="preserve">, previously genus</w:t>
-      </w:r>
-      <w:r>
-        <w:t xml:space="preserve"> </w:t>
-      </w:r>
-      <w:r>
-        <w:rPr>
-          <w:i/>
-          <w:iCs/>
-        </w:rPr>
-        <w:t xml:space="preserve">Aphantophryne</w:t>
-      </w:r>
-      <w:r>
-        <w:t xml:space="preserve">. We suspect that there are other members in the genus that have not yet been sequenced which may exhibit specialized features that vary from those described, including smaller body size and less digital pad expansion. We are not aware of any morphological synapomorphies for</w:t>
+        <w:t xml:space="preserve">type. Some species of</w:t>
       </w:r>
       <w:r>
         <w:t xml:space="preserve"> </w:t>
@@ -30630,7 +30889,62 @@
         <w:t xml:space="preserve">Auparoparo</w:t>
       </w:r>
       <w:r>
-        <w:t xml:space="preserve">.</w:t>
+        <w:t xml:space="preserve"> </w:t>
+      </w:r>
+      <w:r>
+        <w:t xml:space="preserve">may be distinguished from</w:t>
+      </w:r>
+      <w:r>
+        <w:t xml:space="preserve"> </w:t>
+      </w:r>
+      <w:r>
+        <w:rPr>
+          <w:i/>
+          <w:iCs/>
+        </w:rPr>
+        <w:t xml:space="preserve">Oreophryne</w:t>
+      </w:r>
+      <w:r>
+        <w:t xml:space="preserve"> </w:t>
+      </w:r>
+      <w:r>
+        <w:t xml:space="preserve">by larger finger pads than toe pads and males calling with</w:t>
+      </w:r>
+      <w:r>
+        <w:t xml:space="preserve"> </w:t>
+      </w:r>
+      <w:r>
+        <w:t xml:space="preserve">“whinny”</w:t>
+      </w:r>
+      <w:r>
+        <w:t xml:space="preserve"> </w:t>
+      </w:r>
+      <w:r>
+        <w:t xml:space="preserve">but not</w:t>
+      </w:r>
+      <w:r>
+        <w:t xml:space="preserve"> </w:t>
+      </w:r>
+      <w:r>
+        <w:t xml:space="preserve">“honk”</w:t>
+      </w:r>
+      <w:r>
+        <w:t xml:space="preserve"> </w:t>
+      </w:r>
+      <w:r>
+        <w:t xml:space="preserve">or</w:t>
+      </w:r>
+      <w:r>
+        <w:t xml:space="preserve"> </w:t>
+      </w:r>
+      <w:r>
+        <w:t xml:space="preserve">“peep”</w:t>
+      </w:r>
+      <w:r>
+        <w:t xml:space="preserve"> </w:t>
+      </w:r>
+      <w:r>
+        <w:t xml:space="preserve">call types.</w:t>
       </w:r>
     </w:p>
     <w:p>
@@ -30658,36 +30972,7 @@
         <w:t xml:space="preserve"> </w:t>
       </w:r>
       <w:r>
-        <w:t xml:space="preserve">(NCN) applies to the maximum crown-clade originating with the most recent common ancestor of</w:t>
-      </w:r>
-      <w:r>
-        <w:t xml:space="preserve"> </w:t>
-      </w:r>
-      <w:r>
-        <w:rPr>
-          <w:i/>
-          <w:iCs/>
-        </w:rPr>
-        <w:t xml:space="preserve">Auparoparo penelopeia</w:t>
-      </w:r>
-      <w:r>
-        <w:t xml:space="preserve"> </w:t>
-      </w:r>
-      <w:r>
-        <w:t xml:space="preserve">Kraus 2016, the type species of</w:t>
-      </w:r>
-      <w:r>
-        <w:t xml:space="preserve"> </w:t>
-      </w:r>
-      <w:r>
-        <w:rPr>
-          <w:i/>
-          <w:iCs/>
-        </w:rPr>
-        <w:t xml:space="preserve">Auparoparo</w:t>
-      </w:r>
-      <w:r>
-        <w:t xml:space="preserve">, and all extant species that share a common ancestor with</w:t>
+        <w:t xml:space="preserve">(NCN) applies to the largest crown clade originating in (CCN) is defined as the maximum crown-clade originating with the most recent common ancestor of Auparoparo penelopeia Kraus 2016, the type species of Auparoparo, and all extant species that share a common ancestor with</w:t>
       </w:r>
       <w:r>
         <w:t xml:space="preserve"> </w:t>
@@ -30797,7 +31082,445 @@
         <w:t xml:space="preserve"> </w:t>
       </w:r>
       <w:r>
-        <w:t xml:space="preserve">We transfer eleven named species from</w:t>
+        <w:t xml:space="preserve">We transfer eleven named species from Oreophryne into</w:t>
+      </w:r>
+      <w:r>
+        <w:t xml:space="preserve"> </w:t>
+      </w:r>
+      <w:r>
+        <w:rPr>
+          <w:i/>
+          <w:iCs/>
+        </w:rPr>
+        <w:t xml:space="preserve">Auparoparo</w:t>
+      </w:r>
+      <w:r>
+        <w:t xml:space="preserve"> </w:t>
+      </w:r>
+      <w:r>
+        <w:t xml:space="preserve">gen. Nov.:</w:t>
+      </w:r>
+      <w:r>
+        <w:t xml:space="preserve"> </w:t>
+      </w:r>
+      <w:r>
+        <w:rPr>
+          <w:i/>
+          <w:iCs/>
+        </w:rPr>
+        <w:t xml:space="preserve">Auparoparo brunnea</w:t>
+      </w:r>
+      <w:r>
+        <w:t xml:space="preserve"> </w:t>
+      </w:r>
+      <w:r>
+        <w:t xml:space="preserve">(Kraus, 2017),</w:t>
+      </w:r>
+      <w:r>
+        <w:t xml:space="preserve"> </w:t>
+      </w:r>
+      <w:r>
+        <w:rPr>
+          <w:i/>
+          <w:iCs/>
+        </w:rPr>
+        <w:t xml:space="preserve">Auparoparo equus</w:t>
+      </w:r>
+      <w:r>
+        <w:t xml:space="preserve"> </w:t>
+      </w:r>
+      <w:r>
+        <w:t xml:space="preserve">(Kraus, 2016),</w:t>
+      </w:r>
+      <w:r>
+        <w:t xml:space="preserve"> </w:t>
+      </w:r>
+      <w:r>
+        <w:rPr>
+          <w:i/>
+          <w:iCs/>
+        </w:rPr>
+        <w:t xml:space="preserve">Auparoparo ezra</w:t>
+      </w:r>
+      <w:r>
+        <w:t xml:space="preserve"> </w:t>
+      </w:r>
+      <w:r>
+        <w:t xml:space="preserve">Kraus and Allison, 2009,</w:t>
+      </w:r>
+      <w:r>
+        <w:t xml:space="preserve"> </w:t>
+      </w:r>
+      <w:r>
+        <w:rPr>
+          <w:i/>
+          <w:iCs/>
+        </w:rPr>
+        <w:t xml:space="preserve">Auparoparo insulana</w:t>
+      </w:r>
+      <w:r>
+        <w:t xml:space="preserve"> </w:t>
+      </w:r>
+      <w:r>
+        <w:t xml:space="preserve">Zweifel, 1956,</w:t>
+      </w:r>
+      <w:r>
+        <w:t xml:space="preserve"> </w:t>
+      </w:r>
+      <w:r>
+        <w:rPr>
+          <w:i/>
+          <w:iCs/>
+        </w:rPr>
+        <w:t xml:space="preserve">Auparoparo matawan</w:t>
+      </w:r>
+      <w:r>
+        <w:t xml:space="preserve"> </w:t>
+      </w:r>
+      <w:r>
+        <w:t xml:space="preserve">Kraus, 2016,</w:t>
+      </w:r>
+      <w:r>
+        <w:t xml:space="preserve"> </w:t>
+      </w:r>
+      <w:r>
+        <w:rPr>
+          <w:i/>
+          <w:iCs/>
+        </w:rPr>
+        <w:t xml:space="preserve">Auparoparo meliades</w:t>
+      </w:r>
+      <w:r>
+        <w:t xml:space="preserve"> </w:t>
+      </w:r>
+      <w:r>
+        <w:t xml:space="preserve">Kraus, 2016,</w:t>
+      </w:r>
+      <w:r>
+        <w:t xml:space="preserve"> </w:t>
+      </w:r>
+      <w:r>
+        <w:rPr>
+          <w:i/>
+          <w:iCs/>
+        </w:rPr>
+        <w:t xml:space="preserve">Auparoparo penelopeia</w:t>
+      </w:r>
+      <w:r>
+        <w:t xml:space="preserve"> </w:t>
+      </w:r>
+      <w:r>
+        <w:t xml:space="preserve">Kraus, 2016,</w:t>
+      </w:r>
+      <w:r>
+        <w:t xml:space="preserve"> </w:t>
+      </w:r>
+      <w:r>
+        <w:rPr>
+          <w:i/>
+          <w:iCs/>
+        </w:rPr>
+        <w:t xml:space="preserve">Auparoparo phoebe</w:t>
+      </w:r>
+      <w:r>
+        <w:t xml:space="preserve"> </w:t>
+      </w:r>
+      <w:r>
+        <w:t xml:space="preserve">Kraus, 2017,</w:t>
+      </w:r>
+      <w:r>
+        <w:t xml:space="preserve"> </w:t>
+      </w:r>
+      <w:r>
+        <w:rPr>
+          <w:i/>
+          <w:iCs/>
+        </w:rPr>
+        <w:t xml:space="preserve">Auparoparo picticrus</w:t>
+      </w:r>
+      <w:r>
+        <w:t xml:space="preserve"> </w:t>
+      </w:r>
+      <w:r>
+        <w:t xml:space="preserve">Kraus, 2016,</w:t>
+      </w:r>
+      <w:r>
+        <w:t xml:space="preserve"> </w:t>
+      </w:r>
+      <w:r>
+        <w:rPr>
+          <w:i/>
+          <w:iCs/>
+        </w:rPr>
+        <w:t xml:space="preserve">Auparoparo nana</w:t>
+      </w:r>
+      <w:r>
+        <w:t xml:space="preserve">,</w:t>
+      </w:r>
+      <w:r>
+        <w:t xml:space="preserve"> </w:t>
+      </w:r>
+      <w:r>
+        <w:rPr>
+          <w:i/>
+          <w:iCs/>
+        </w:rPr>
+        <w:t xml:space="preserve">Auparoparo penelopia</w:t>
+      </w:r>
+      <w:r>
+        <w:t xml:space="preserve"> </w:t>
+      </w:r>
+      <w:r>
+        <w:t xml:space="preserve">(Kraus 2016),</w:t>
+      </w:r>
+      <w:r>
+        <w:t xml:space="preserve"> </w:t>
+      </w:r>
+      <w:r>
+        <w:rPr>
+          <w:i/>
+          <w:iCs/>
+        </w:rPr>
+        <w:t xml:space="preserve">Auparoparo variabilis</w:t>
+      </w:r>
+      <w:r>
+        <w:t xml:space="preserve"> </w:t>
+      </w:r>
+      <w:r>
+        <w:t xml:space="preserve">(Boulenger, 1896).</w:t>
+      </w:r>
+    </w:p>
+    <w:p>
+      <w:pPr>
+        <w:pStyle w:val="BodyText"/>
+      </w:pPr>
+      <w:r>
+        <w:rPr>
+          <w:b/>
+          <w:bCs/>
+        </w:rPr>
+        <w:t xml:space="preserve">Distribution:</w:t>
+      </w:r>
+      <w:r>
+        <w:t xml:space="preserve"> </w:t>
+      </w:r>
+      <w:r>
+        <w:t xml:space="preserve">Southeastern tip of mainland Papua New Guinea and satellite islands (Fergusson, Misima, Normanby, Rossel, Sudest, Woodlark Is.), Sulawesi.</w:t>
+      </w:r>
+    </w:p>
+    <w:p>
+      <w:pPr>
+        <w:pStyle w:val="BodyText"/>
+      </w:pPr>
+      <w:r>
+        <w:rPr>
+          <w:b/>
+          <w:bCs/>
+        </w:rPr>
+        <w:t xml:space="preserve">Etymology:</w:t>
+      </w:r>
+      <w:r>
+        <w:t xml:space="preserve"> </w:t>
+      </w:r>
+      <w:r>
+        <w:t xml:space="preserve">The generic name</w:t>
+      </w:r>
+      <w:r>
+        <w:t xml:space="preserve"> </w:t>
+      </w:r>
+      <w:r>
+        <w:rPr>
+          <w:i/>
+          <w:iCs/>
+        </w:rPr>
+        <w:t xml:space="preserve">Auparoparo</w:t>
+      </w:r>
+      <w:r>
+        <w:t xml:space="preserve"> </w:t>
+      </w:r>
+      <w:r>
+        <w:t xml:space="preserve">comes from the indigenous language, Motu, which is widely spoken in the region of Papua New Guinea in which this genus is found. It is a combination of the words</w:t>
+      </w:r>
+      <w:r>
+        <w:t xml:space="preserve"> </w:t>
+      </w:r>
+      <w:r>
+        <w:t xml:space="preserve">“au”</w:t>
+      </w:r>
+      <w:r>
+        <w:t xml:space="preserve"> </w:t>
+      </w:r>
+      <w:r>
+        <w:t xml:space="preserve">(tree) and</w:t>
+      </w:r>
+      <w:r>
+        <w:t xml:space="preserve"> </w:t>
+      </w:r>
+      <w:r>
+        <w:t xml:space="preserve">“paro paro”</w:t>
+      </w:r>
+      <w:r>
+        <w:t xml:space="preserve"> </w:t>
+      </w:r>
+      <w:r>
+        <w:t xml:space="preserve">(frog).</w:t>
+      </w:r>
+    </w:p>
+    <w:p>
+      <w:pPr>
+        <w:pStyle w:val="BodyText"/>
+      </w:pPr>
+      <w:r>
+        <w:rPr>
+          <w:b/>
+          <w:bCs/>
+        </w:rPr>
+        <w:t xml:space="preserve">Comment:</w:t>
+      </w:r>
+      <w:r>
+        <w:t xml:space="preserve"> </w:t>
+      </w:r>
+      <w:r>
+        <w:t xml:space="preserve">According to ICZN convention for nomenclature assignment, the presence of one</w:t>
+      </w:r>
+      <w:r>
+        <w:t xml:space="preserve"> </w:t>
+      </w:r>
+      <w:r>
+        <w:rPr>
+          <w:i/>
+          <w:iCs/>
+        </w:rPr>
+        <w:t xml:space="preserve">Aphantophryne pansa</w:t>
+      </w:r>
+      <w:r>
+        <w:t xml:space="preserve"> </w:t>
+      </w:r>
+      <w:r>
+        <w:t xml:space="preserve">sequence grouped within</w:t>
+      </w:r>
+      <w:r>
+        <w:t xml:space="preserve"> </w:t>
+      </w:r>
+      <w:r>
+        <w:rPr>
+          <w:i/>
+          <w:iCs/>
+        </w:rPr>
+        <w:t xml:space="preserve">Auparoparo</w:t>
+      </w:r>
+      <w:r>
+        <w:t xml:space="preserve"> </w:t>
+      </w:r>
+      <w:r>
+        <w:t xml:space="preserve">could be considered a name of priority</w:t>
+      </w:r>
+      <w:r>
+        <w:t xml:space="preserve"> </w:t>
+      </w:r>
+      <w:r>
+        <w:t xml:space="preserve">(Zoological Nomenclature et al. 1999)</w:t>
+      </w:r>
+      <w:r>
+        <w:t xml:space="preserve">. However, we suspect that</w:t>
+      </w:r>
+      <w:r>
+        <w:t xml:space="preserve"> </w:t>
+      </w:r>
+      <w:r>
+        <w:rPr>
+          <w:i/>
+          <w:iCs/>
+        </w:rPr>
+        <w:t xml:space="preserve">Aphantophryne</w:t>
+      </w:r>
+      <w:r>
+        <w:t xml:space="preserve"> </w:t>
+      </w:r>
+      <w:r>
+        <w:t xml:space="preserve">may actually represent a highly specialized morphotypic group with members belonging to other clades, which would invalidate its generic status. Future research is needed to clarify the placement and integrity of</w:t>
+      </w:r>
+      <w:r>
+        <w:t xml:space="preserve"> </w:t>
+      </w:r>
+      <w:r>
+        <w:rPr>
+          <w:i/>
+          <w:iCs/>
+        </w:rPr>
+        <w:t xml:space="preserve">Aphantophryne</w:t>
+      </w:r>
+      <w:r>
+        <w:t xml:space="preserve">. Furthermore, based on the tremendous morphological and lifestyle differences between</w:t>
+      </w:r>
+      <w:r>
+        <w:t xml:space="preserve"> </w:t>
+      </w:r>
+      <w:r>
+        <w:rPr>
+          <w:i/>
+          <w:iCs/>
+        </w:rPr>
+        <w:t xml:space="preserve">Aphantophryne pansa</w:t>
+      </w:r>
+      <w:r>
+        <w:t xml:space="preserve"> </w:t>
+      </w:r>
+      <w:r>
+        <w:t xml:space="preserve">and other species of</w:t>
+      </w:r>
+      <w:r>
+        <w:t xml:space="preserve"> </w:t>
+      </w:r>
+      <w:r>
+        <w:rPr>
+          <w:i/>
+          <w:iCs/>
+        </w:rPr>
+        <w:t xml:space="preserve">Auparoparo</w:t>
+      </w:r>
+      <w:r>
+        <w:t xml:space="preserve">, we do not consider this name to be representative of the entire clade.</w:t>
+      </w:r>
+    </w:p>
+    <w:bookmarkEnd w:id="54"/>
+    <w:bookmarkEnd w:id="55"/>
+    <w:bookmarkStart w:id="60" w:name="discussion"/>
+    <w:p>
+      <w:pPr>
+        <w:pStyle w:val="Heading1"/>
+      </w:pPr>
+      <w:r>
+        <w:t xml:space="preserve">Discussion</w:t>
+      </w:r>
+    </w:p>
+    <w:bookmarkStart w:id="56" w:name="phenotypic-characters-and-diagnoses"/>
+    <w:p>
+      <w:pPr>
+        <w:pStyle w:val="Heading2"/>
+      </w:pPr>
+      <w:r>
+        <w:t xml:space="preserve">Phenotypic Characters and Diagnoses</w:t>
+      </w:r>
+    </w:p>
+    <w:p>
+      <w:pPr>
+        <w:pStyle w:val="FirstParagraph"/>
+      </w:pPr>
+      <w:r>
+        <w:t xml:space="preserve">Our phylogenetic results</w:t>
+      </w:r>
+      <w:r>
+        <w:t xml:space="preserve"> </w:t>
+      </w:r>
+      <w:r>
+        <w:t xml:space="preserve">(Hill et al. 2022; 2023b, this study)</w:t>
+      </w:r>
+      <w:r>
+        <w:t xml:space="preserve"> </w:t>
+      </w:r>
+      <w:r>
+        <w:t xml:space="preserve">provide clarity on the classification of the problematic genus</w:t>
       </w:r>
       <w:r>
         <w:t xml:space="preserve"> </w:t>
@@ -30813,7 +31536,125 @@
         <w:t xml:space="preserve"> </w:t>
       </w:r>
       <w:r>
-        <w:t xml:space="preserve">sensu lato into</w:t>
+        <w:t xml:space="preserve">sensu lato. We confirm that</w:t>
+      </w:r>
+      <w:r>
+        <w:t xml:space="preserve"> </w:t>
+      </w:r>
+      <w:r>
+        <w:rPr>
+          <w:i/>
+          <w:iCs/>
+        </w:rPr>
+        <w:t xml:space="preserve">Oreophryne</w:t>
+      </w:r>
+      <w:r>
+        <w:t xml:space="preserve"> </w:t>
+      </w:r>
+      <w:r>
+        <w:t xml:space="preserve">sensu lato is polyphyletic and consists of two reciprocally monophyletic clades,</w:t>
+      </w:r>
+      <w:r>
+        <w:t xml:space="preserve"> </w:t>
+      </w:r>
+      <w:r>
+        <w:t xml:space="preserve">“Oreophryne A”</w:t>
+      </w:r>
+      <w:r>
+        <w:t xml:space="preserve"> </w:t>
+      </w:r>
+      <w:r>
+        <w:t xml:space="preserve">and</w:t>
+      </w:r>
+      <w:r>
+        <w:t xml:space="preserve"> </w:t>
+      </w:r>
+      <w:r>
+        <w:t xml:space="preserve">“B”</w:t>
+      </w:r>
+      <w:r>
+        <w:t xml:space="preserve"> </w:t>
+      </w:r>
+      <w:r>
+        <w:t xml:space="preserve">(of Hill et al. 2022)</w:t>
+      </w:r>
+      <w:r>
+        <w:t xml:space="preserve">, originating 18 and 16 MYA, respectively (Figure 1). Here we designate</w:t>
+      </w:r>
+      <w:r>
+        <w:t xml:space="preserve"> </w:t>
+      </w:r>
+      <w:r>
+        <w:t xml:space="preserve">“Oreophryne A”</w:t>
+      </w:r>
+      <w:r>
+        <w:t xml:space="preserve"> </w:t>
+      </w:r>
+      <w:r>
+        <w:t xml:space="preserve">as retaining the name</w:t>
+      </w:r>
+      <w:r>
+        <w:t xml:space="preserve"> </w:t>
+      </w:r>
+      <w:r>
+        <w:rPr>
+          <w:i/>
+          <w:iCs/>
+        </w:rPr>
+        <w:t xml:space="preserve">Oreophryne</w:t>
+      </w:r>
+      <w:r>
+        <w:t xml:space="preserve"> </w:t>
+      </w:r>
+      <w:r>
+        <w:t xml:space="preserve">based on its containing the type species</w:t>
+      </w:r>
+      <w:r>
+        <w:t xml:space="preserve"> </w:t>
+      </w:r>
+      <w:r>
+        <w:rPr>
+          <w:i/>
+          <w:iCs/>
+        </w:rPr>
+        <w:t xml:space="preserve">Oreophryne senckenbergiana</w:t>
+      </w:r>
+      <w:r>
+        <w:t xml:space="preserve"> </w:t>
+      </w:r>
+      <w:r>
+        <w:t xml:space="preserve">(Peters and Doria 1878)</w:t>
+      </w:r>
+      <w:r>
+        <w:t xml:space="preserve"> </w:t>
+      </w:r>
+      <w:r>
+        <w:t xml:space="preserve">with high support.</w:t>
+      </w:r>
+      <w:r>
+        <w:t xml:space="preserve"> </w:t>
+      </w:r>
+      <w:r>
+        <w:rPr>
+          <w:i/>
+          <w:iCs/>
+        </w:rPr>
+        <w:t xml:space="preserve">Oreophryne</w:t>
+      </w:r>
+      <w:r>
+        <w:t xml:space="preserve"> </w:t>
+      </w:r>
+      <w:r>
+        <w:t xml:space="preserve">is the earliest diverged genus in subfamily Asterophryinae, sister to all the other genera. The second clade,</w:t>
+      </w:r>
+      <w:r>
+        <w:t xml:space="preserve"> </w:t>
+      </w:r>
+      <w:r>
+        <w:t xml:space="preserve">“Oreophryne B”</w:t>
+      </w:r>
+      <w:r>
+        <w:t xml:space="preserve">, is highly supported as a separate, unrelated genus, which contains no known species with historical generic priority. Thus, we designate this genus as</w:t>
       </w:r>
       <w:r>
         <w:t xml:space="preserve"> </w:t>
@@ -30826,10 +31667,25 @@
         <w:t xml:space="preserve">Auparoparo</w:t>
       </w:r>
       <w:r>
-        <w:t xml:space="preserve"> </w:t>
-      </w:r>
-      <w:r>
-        <w:t xml:space="preserve">gen. Nov.:</w:t>
+        <w:t xml:space="preserve">, a nominal tribute to the Motu language of the indigenous peoples of the region.</w:t>
+      </w:r>
+    </w:p>
+    <w:bookmarkEnd w:id="56"/>
+    <w:bookmarkStart w:id="57" w:name="the-difficulty-with-cryptic-genera"/>
+    <w:p>
+      <w:pPr>
+        <w:pStyle w:val="Heading2"/>
+      </w:pPr>
+      <w:r>
+        <w:t xml:space="preserve">The Difficulty with Cryptic Genera</w:t>
+      </w:r>
+    </w:p>
+    <w:p>
+      <w:pPr>
+        <w:pStyle w:val="FirstParagraph"/>
+      </w:pPr>
+      <w:r>
+        <w:t xml:space="preserve">Perhaps the greatest testament to the crypticism of</w:t>
       </w:r>
       <w:r>
         <w:t xml:space="preserve"> </w:t>
@@ -30839,205 +31695,13 @@
           <w:i/>
           <w:iCs/>
         </w:rPr>
-        <w:t xml:space="preserve">Auparoparo brunnea</w:t>
-      </w:r>
-      <w:r>
-        <w:t xml:space="preserve"> </w:t>
-      </w:r>
-      <w:r>
-        <w:t xml:space="preserve">(Kraus, 2017),</w:t>
-      </w:r>
-      <w:r>
-        <w:t xml:space="preserve"> </w:t>
-      </w:r>
-      <w:r>
-        <w:rPr>
-          <w:i/>
-          <w:iCs/>
-        </w:rPr>
-        <w:t xml:space="preserve">Auparoparo equus</w:t>
-      </w:r>
-      <w:r>
-        <w:t xml:space="preserve"> </w:t>
-      </w:r>
-      <w:r>
-        <w:t xml:space="preserve">(Kraus, 2016),</w:t>
-      </w:r>
-      <w:r>
-        <w:t xml:space="preserve"> </w:t>
-      </w:r>
-      <w:r>
-        <w:rPr>
-          <w:i/>
-          <w:iCs/>
-        </w:rPr>
-        <w:t xml:space="preserve">Auparoparo ezra</w:t>
-      </w:r>
-      <w:r>
-        <w:t xml:space="preserve"> </w:t>
-      </w:r>
-      <w:r>
-        <w:t xml:space="preserve">Kraus and Allison, 2009,</w:t>
-      </w:r>
-      <w:r>
-        <w:t xml:space="preserve"> </w:t>
-      </w:r>
-      <w:r>
-        <w:rPr>
-          <w:i/>
-          <w:iCs/>
-        </w:rPr>
-        <w:t xml:space="preserve">Auparoparo insulana</w:t>
-      </w:r>
-      <w:r>
-        <w:t xml:space="preserve"> </w:t>
-      </w:r>
-      <w:r>
-        <w:t xml:space="preserve">Zweifel, 1956,</w:t>
-      </w:r>
-      <w:r>
-        <w:t xml:space="preserve"> </w:t>
-      </w:r>
-      <w:r>
-        <w:rPr>
-          <w:i/>
-          <w:iCs/>
-        </w:rPr>
-        <w:t xml:space="preserve">Auparoparo matawan</w:t>
-      </w:r>
-      <w:r>
-        <w:t xml:space="preserve"> </w:t>
-      </w:r>
-      <w:r>
-        <w:t xml:space="preserve">Kraus, 2016,</w:t>
-      </w:r>
-      <w:r>
-        <w:t xml:space="preserve"> </w:t>
-      </w:r>
-      <w:r>
-        <w:rPr>
-          <w:i/>
-          <w:iCs/>
-        </w:rPr>
-        <w:t xml:space="preserve">Auparoparo meliades</w:t>
-      </w:r>
-      <w:r>
-        <w:t xml:space="preserve"> </w:t>
-      </w:r>
-      <w:r>
-        <w:t xml:space="preserve">Kraus, 2016,</w:t>
-      </w:r>
-      <w:r>
-        <w:t xml:space="preserve"> </w:t>
-      </w:r>
-      <w:r>
-        <w:rPr>
-          <w:i/>
-          <w:iCs/>
-        </w:rPr>
-        <w:t xml:space="preserve">Auparoparo penelopeia</w:t>
-      </w:r>
-      <w:r>
-        <w:t xml:space="preserve"> </w:t>
-      </w:r>
-      <w:r>
-        <w:t xml:space="preserve">Kraus, 2016,</w:t>
-      </w:r>
-      <w:r>
-        <w:t xml:space="preserve"> </w:t>
-      </w:r>
-      <w:r>
-        <w:rPr>
-          <w:i/>
-          <w:iCs/>
-        </w:rPr>
-        <w:t xml:space="preserve">Auparoparo phoebe</w:t>
-      </w:r>
-      <w:r>
-        <w:t xml:space="preserve"> </w:t>
-      </w:r>
-      <w:r>
-        <w:t xml:space="preserve">Kraus, 2017,</w:t>
-      </w:r>
-      <w:r>
-        <w:t xml:space="preserve"> </w:t>
-      </w:r>
-      <w:r>
-        <w:rPr>
-          <w:i/>
-          <w:iCs/>
-        </w:rPr>
-        <w:t xml:space="preserve">Auparoparo picticrus</w:t>
-      </w:r>
-      <w:r>
-        <w:t xml:space="preserve"> </w:t>
-      </w:r>
-      <w:r>
-        <w:t xml:space="preserve">Kraus, 2016,</w:t>
-      </w:r>
-      <w:r>
-        <w:t xml:space="preserve"> </w:t>
-      </w:r>
-      <w:r>
-        <w:rPr>
-          <w:i/>
-          <w:iCs/>
-        </w:rPr>
-        <w:t xml:space="preserve">Auparoparo nana</w:t>
-      </w:r>
-      <w:r>
-        <w:t xml:space="preserve">,</w:t>
-      </w:r>
-      <w:r>
-        <w:t xml:space="preserve"> </w:t>
-      </w:r>
-      <w:r>
-        <w:rPr>
-          <w:i/>
-          <w:iCs/>
-        </w:rPr>
-        <w:t xml:space="preserve">Auparoparo penelopia</w:t>
-      </w:r>
-      <w:r>
-        <w:t xml:space="preserve"> </w:t>
-      </w:r>
-      <w:r>
-        <w:t xml:space="preserve">(Kraus 2016),</w:t>
-      </w:r>
-      <w:r>
-        <w:t xml:space="preserve"> </w:t>
-      </w:r>
-      <w:r>
-        <w:rPr>
-          <w:i/>
-          <w:iCs/>
-        </w:rPr>
-        <w:t xml:space="preserve">Auparoparo variabilis</w:t>
-      </w:r>
-      <w:r>
-        <w:t xml:space="preserve"> </w:t>
-      </w:r>
-      <w:r>
-        <w:t xml:space="preserve">(Boulenger, 1896). We also deprecate the genus</w:t>
-      </w:r>
-      <w:r>
-        <w:t xml:space="preserve"> </w:t>
-      </w:r>
-      <w:r>
-        <w:rPr>
-          <w:i/>
-          <w:iCs/>
-        </w:rPr>
-        <w:t xml:space="preserve">Aphantophryne</w:t>
-      </w:r>
-      <w:r>
-        <w:t xml:space="preserve"> </w:t>
-      </w:r>
-      <w:r>
-        <w:t xml:space="preserve">to a subgenus within</w:t>
-      </w:r>
-      <w:r>
-        <w:t xml:space="preserve"> </w:t>
+        <w:t xml:space="preserve">Oreophryne</w:t>
+      </w:r>
+      <w:r>
+        <w:t xml:space="preserve"> </w:t>
+      </w:r>
+      <w:r>
+        <w:t xml:space="preserve">(CCN) vs. </w:t>
       </w:r>
       <w:r>
         <w:rPr>
@@ -31047,7 +31711,19 @@
         <w:t xml:space="preserve">Auparoparo</w:t>
       </w:r>
       <w:r>
-        <w:t xml:space="preserve">, transferring species:</w:t>
+        <w:t xml:space="preserve"> </w:t>
+      </w:r>
+      <w:r>
+        <w:t xml:space="preserve">(NCN) is that no taxonomist was able to distinguish that they are separate clades, independently evolved, in the 130 years between their discovery and molecular sequencing</w:t>
+      </w:r>
+      <w:r>
+        <w:t xml:space="preserve"> </w:t>
+      </w:r>
+      <w:r>
+        <w:t xml:space="preserve">(Boettger 1895; Rivera et al. 2017)</w:t>
+      </w:r>
+      <w:r>
+        <w:t xml:space="preserve">. These species are indeed morphologically very similar and our results provide some clues as to why</w:t>
       </w:r>
       <w:r>
         <w:t xml:space="preserve"> </w:t>
@@ -31057,13 +31733,19 @@
           <w:i/>
           <w:iCs/>
         </w:rPr>
-        <w:t xml:space="preserve">Auparoparo Aphantophryne pansa</w:t>
-      </w:r>
-      <w:r>
-        <w:t xml:space="preserve"> </w:t>
-      </w:r>
-      <w:r>
-        <w:t xml:space="preserve">(Fry, 1917),</w:t>
+        <w:t xml:space="preserve">Oreophryne</w:t>
+      </w:r>
+      <w:r>
+        <w:t xml:space="preserve"> </w:t>
+      </w:r>
+      <w:r>
+        <w:t xml:space="preserve">taxonomy has been so difficult.</w:t>
+      </w:r>
+      <w:r>
+        <w:t xml:space="preserve"> </w:t>
+      </w:r>
+      <w:r>
+        <w:t xml:space="preserve">We found no morphological synapomorphy for neither</w:t>
       </w:r>
       <w:r>
         <w:t xml:space="preserve"> </w:t>
@@ -31073,13 +31755,26 @@
           <w:i/>
           <w:iCs/>
         </w:rPr>
-        <w:t xml:space="preserve">Auparoparo Aphantophryne sabini</w:t>
-      </w:r>
-      <w:r>
-        <w:t xml:space="preserve"> </w:t>
-      </w:r>
-      <w:r>
-        <w:t xml:space="preserve">(Zweifel and Parker, 1989).</w:t>
+        <w:t xml:space="preserve">Auparoparo</w:t>
+      </w:r>
+      <w:r>
+        <w:t xml:space="preserve"> </w:t>
+      </w:r>
+      <w:r>
+        <w:t xml:space="preserve">nor</w:t>
+      </w:r>
+      <w:r>
+        <w:t xml:space="preserve"> </w:t>
+      </w:r>
+      <w:r>
+        <w:rPr>
+          <w:i/>
+          <w:iCs/>
+        </w:rPr>
+        <w:t xml:space="preserve">Oreophryne</w:t>
+      </w:r>
+      <w:r>
+        <w:t xml:space="preserve">, and moreover, no morphological feature that can diagnose either clade or both in combination.</w:t>
       </w:r>
     </w:p>
     <w:p>
@@ -31087,17 +31782,624 @@
         <w:pStyle w:val="BodyText"/>
       </w:pPr>
       <w:r>
+        <w:t xml:space="preserve">The traditional basis for generic designation of species to</w:t>
+      </w:r>
+      <w:r>
+        <w:t xml:space="preserve"> </w:t>
+      </w:r>
+      <w:r>
         <w:rPr>
-          <w:b/>
-          <w:bCs/>
+          <w:i/>
+          <w:iCs/>
         </w:rPr>
-        <w:t xml:space="preserve">Distribution:</w:t>
-      </w:r>
-      <w:r>
-        <w:t xml:space="preserve"> </w:t>
-      </w:r>
-      <w:r>
-        <w:t xml:space="preserve">Southeastern tip of mainland Papua New Guinea and satellite islands (Fergusson, Misima, Normanby, Rossel, Sudest, Woodlark Is.), Sulawesi (</w:t>
+        <w:t xml:space="preserve">Oreophryne</w:t>
+      </w:r>
+      <w:r>
+        <w:t xml:space="preserve"> </w:t>
+      </w:r>
+      <w:r>
+        <w:t xml:space="preserve">has primarily relied on a signature pectoral anatomy</w:t>
+      </w:r>
+      <w:r>
+        <w:t xml:space="preserve"> </w:t>
+      </w:r>
+      <w:r>
+        <w:t xml:space="preserve">(whether original or revised diagnosis, Parker 1934; Zweifel 2003)</w:t>
+      </w:r>
+      <w:r>
+        <w:t xml:space="preserve">. Our phylogenetic results clearly show that this trait appears more than once, in both</w:t>
+      </w:r>
+      <w:r>
+        <w:t xml:space="preserve"> </w:t>
+      </w:r>
+      <w:r>
+        <w:rPr>
+          <w:i/>
+          <w:iCs/>
+        </w:rPr>
+        <w:t xml:space="preserve">Oreophryne</w:t>
+      </w:r>
+      <w:r>
+        <w:t xml:space="preserve"> </w:t>
+      </w:r>
+      <w:r>
+        <w:t xml:space="preserve">and</w:t>
+      </w:r>
+      <w:r>
+        <w:t xml:space="preserve"> </w:t>
+      </w:r>
+      <w:r>
+        <w:rPr>
+          <w:i/>
+          <w:iCs/>
+        </w:rPr>
+        <w:t xml:space="preserve">Auparaparo</w:t>
+      </w:r>
+      <w:r>
+        <w:t xml:space="preserve">, and rather than being a highly conserved trait, it is either a symplesiomorphy (shared ancestral character) or a result of convergent or parallel evolution, and perhaps adaptive for arboreality. Thus, the pectoral anatomy is not a reliable diagnostic character in differentiating between</w:t>
+      </w:r>
+      <w:r>
+        <w:t xml:space="preserve"> </w:t>
+      </w:r>
+      <w:r>
+        <w:rPr>
+          <w:i/>
+          <w:iCs/>
+        </w:rPr>
+        <w:t xml:space="preserve">Oreophryne</w:t>
+      </w:r>
+      <w:r>
+        <w:t xml:space="preserve"> </w:t>
+      </w:r>
+      <w:r>
+        <w:t xml:space="preserve">and</w:t>
+      </w:r>
+      <w:r>
+        <w:t xml:space="preserve"> </w:t>
+      </w:r>
+      <w:r>
+        <w:rPr>
+          <w:i/>
+          <w:iCs/>
+        </w:rPr>
+        <w:t xml:space="preserve">Auparoparo</w:t>
+      </w:r>
+      <w:r>
+        <w:t xml:space="preserve">. In studies across a wide diversity of anurans,</w:t>
+      </w:r>
+      <w:r>
+        <w:t xml:space="preserve"> </w:t>
+      </w:r>
+      <w:r>
+        <w:t xml:space="preserve">Soliz et al. (2025)</w:t>
+      </w:r>
+      <w:r>
+        <w:t xml:space="preserve"> </w:t>
+      </w:r>
+      <w:r>
+        <w:t xml:space="preserve">found that anatomical variation of the pectoral girdle corresponds with functional and ecological lifestyle demands, whereas</w:t>
+      </w:r>
+      <w:r>
+        <w:t xml:space="preserve"> </w:t>
+      </w:r>
+      <w:r>
+        <w:t xml:space="preserve">Engelkes et al. (2020)</w:t>
+      </w:r>
+      <w:r>
+        <w:t xml:space="preserve"> </w:t>
+      </w:r>
+      <w:r>
+        <w:t xml:space="preserve">found strong phylogenetic influence in the shape of the pectoral girdle. This point would be excellent for further study within Asterophryinae, as there are high elevation terrestrial species of</w:t>
+      </w:r>
+      <w:r>
+        <w:t xml:space="preserve"> </w:t>
+      </w:r>
+      <w:r>
+        <w:rPr>
+          <w:i/>
+          <w:iCs/>
+        </w:rPr>
+        <w:t xml:space="preserve">Oreophryne</w:t>
+      </w:r>
+      <w:r>
+        <w:t xml:space="preserve"> </w:t>
+      </w:r>
+      <w:r>
+        <w:t xml:space="preserve">sensu lato that possess the same pectoral trait</w:t>
+      </w:r>
+      <w:r>
+        <w:t xml:space="preserve"> </w:t>
+      </w:r>
+      <w:r>
+        <w:t xml:space="preserve">(Zweifel et al. 2009)</w:t>
+      </w:r>
+      <w:r>
+        <w:t xml:space="preserve">,as well as a few arboreal species within other genera (</w:t>
+      </w:r>
+      <w:r>
+        <w:rPr>
+          <w:i/>
+          <w:iCs/>
+        </w:rPr>
+        <w:t xml:space="preserve">Cophixalus</w:t>
+      </w:r>
+      <w:r>
+        <w:t xml:space="preserve">,</w:t>
+      </w:r>
+      <w:r>
+        <w:t xml:space="preserve"> </w:t>
+      </w:r>
+      <w:r>
+        <w:rPr>
+          <w:i/>
+          <w:iCs/>
+        </w:rPr>
+        <w:t xml:space="preserve">Asterophrys</w:t>
+      </w:r>
+      <w:r>
+        <w:t xml:space="preserve">,</w:t>
+      </w:r>
+      <w:r>
+        <w:t xml:space="preserve"> </w:t>
+      </w:r>
+      <w:r>
+        <w:rPr>
+          <w:i/>
+          <w:iCs/>
+        </w:rPr>
+        <w:t xml:space="preserve">Xenorhina</w:t>
+      </w:r>
+      <w:r>
+        <w:t xml:space="preserve">) with unknown pectoral morphology.</w:t>
+      </w:r>
+    </w:p>
+    <w:p>
+      <w:pPr>
+        <w:pStyle w:val="BodyText"/>
+      </w:pPr>
+      <w:r>
+        <w:t xml:space="preserve">We further rexamined additional characters previously used to diangnose</w:t>
+      </w:r>
+      <w:r>
+        <w:t xml:space="preserve"> </w:t>
+      </w:r>
+      <w:r>
+        <w:rPr>
+          <w:i/>
+          <w:iCs/>
+        </w:rPr>
+        <w:t xml:space="preserve">Oreophryne</w:t>
+      </w:r>
+      <w:r>
+        <w:t xml:space="preserve"> </w:t>
+      </w:r>
+      <w:r>
+        <w:t xml:space="preserve">as well as characters conventionally used to diagnose species of frogs. We conclude that pectoral girdle connector type</w:t>
+      </w:r>
+      <w:r>
+        <w:t xml:space="preserve"> </w:t>
+      </w:r>
+      <w:r>
+        <w:t xml:space="preserve">(Parker 1934)</w:t>
+      </w:r>
+      <w:r>
+        <w:t xml:space="preserve"> </w:t>
+      </w:r>
+      <w:r>
+        <w:t xml:space="preserve">and relative lengths of the 3rd and 5th toe are uninformative and the degree of toe webbing is subjective. It was previously suggested that species in</w:t>
+      </w:r>
+      <w:r>
+        <w:t xml:space="preserve"> </w:t>
+      </w:r>
+      <w:r>
+        <w:rPr>
+          <w:i/>
+          <w:iCs/>
+        </w:rPr>
+        <w:t xml:space="preserve">Oreophryne</w:t>
+      </w:r>
+      <w:r>
+        <w:t xml:space="preserve"> </w:t>
+      </w:r>
+      <w:r>
+        <w:t xml:space="preserve">sensu lato could be divided into two groups based on the type of connection between the procoracoid cartilages and the scapula</w:t>
+      </w:r>
+      <w:r>
+        <w:t xml:space="preserve"> </w:t>
+      </w:r>
+      <w:r>
+        <w:t xml:space="preserve">(Kraus 2013)</w:t>
+      </w:r>
+      <w:r>
+        <w:t xml:space="preserve">, with roughly half possessing a cartilaginous rod extending to the scapula and others a ligamentous connection</w:t>
+      </w:r>
+      <w:r>
+        <w:t xml:space="preserve"> </w:t>
+      </w:r>
+      <w:r>
+        <w:t xml:space="preserve">(Parker 1934)</w:t>
+      </w:r>
+      <w:r>
+        <w:t xml:space="preserve">. However, our phylogenetic evidence shows that these traits readily evolve and are not synapmorphies and therefore not reliable indicators of monophyletic groups. Ligamentous connectors are most common across both genera (Table 4). Of species with toe webbing,</w:t>
+      </w:r>
+      <w:r>
+        <w:t xml:space="preserve"> </w:t>
+      </w:r>
+      <w:r>
+        <w:rPr>
+          <w:i/>
+          <w:iCs/>
+        </w:rPr>
+        <w:t xml:space="preserve">Oreophryne</w:t>
+      </w:r>
+      <w:r>
+        <w:t xml:space="preserve"> </w:t>
+      </w:r>
+      <w:r>
+        <w:t xml:space="preserve">tends to be described as having</w:t>
+      </w:r>
+      <w:r>
+        <w:t xml:space="preserve"> </w:t>
+      </w:r>
+      <w:r>
+        <w:t xml:space="preserve">“well webbed”</w:t>
+      </w:r>
+      <w:r>
+        <w:t xml:space="preserve"> </w:t>
+      </w:r>
+      <w:r>
+        <w:t xml:space="preserve">toes compared to</w:t>
+      </w:r>
+      <w:r>
+        <w:t xml:space="preserve"> </w:t>
+      </w:r>
+      <w:r>
+        <w:rPr>
+          <w:i/>
+          <w:iCs/>
+        </w:rPr>
+        <w:t xml:space="preserve">Auparoparo</w:t>
+      </w:r>
+      <w:r>
+        <w:t xml:space="preserve">’s</w:t>
+      </w:r>
+      <w:r>
+        <w:t xml:space="preserve"> </w:t>
+      </w:r>
+      <w:r>
+        <w:t xml:space="preserve">“basal”</w:t>
+      </w:r>
+      <w:r>
+        <w:t xml:space="preserve"> </w:t>
+      </w:r>
+      <w:r>
+        <w:t xml:space="preserve">webbing (Table 4). However, intra-specific variability combined with the subjective nature of these descriptions and inconsistency between specific markers when used (</w:t>
+      </w:r>
+      <w:r>
+        <w:t xml:space="preserve">“reaching the penultimate tubercle”</w:t>
+      </w:r>
+      <w:r>
+        <w:t xml:space="preserve">,</w:t>
+      </w:r>
+      <w:r>
+        <w:t xml:space="preserve"> </w:t>
+      </w:r>
+      <w:r>
+        <w:t xml:space="preserve">“webbed 1/3 length of 5th toe”</w:t>
+      </w:r>
+      <w:r>
+        <w:t xml:space="preserve">, etc.), makes this feature difficult to standardize for generic diagnostic use. Many of the morphological traits proposed by</w:t>
+      </w:r>
+      <w:r>
+        <w:t xml:space="preserve"> </w:t>
+      </w:r>
+      <w:r>
+        <w:t xml:space="preserve">Parker (1934)</w:t>
+      </w:r>
+      <w:r>
+        <w:t xml:space="preserve"> </w:t>
+      </w:r>
+      <w:r>
+        <w:t xml:space="preserve">and</w:t>
+      </w:r>
+      <w:r>
+        <w:t xml:space="preserve"> </w:t>
+      </w:r>
+      <w:r>
+        <w:t xml:space="preserve">Zweifel (2003)</w:t>
+      </w:r>
+      <w:r>
+        <w:t xml:space="preserve"> </w:t>
+      </w:r>
+      <w:r>
+        <w:t xml:space="preserve">may in fact be a result of homoplasy to evolutionary pressures imposed by lifestyle or parallel evolution, and while they may prove useful for ecomorphological identification or species diagnoses in combination with other traits, are not informative for generic diagnosis.</w:t>
+      </w:r>
+    </w:p>
+    <w:p>
+      <w:pPr>
+        <w:pStyle w:val="BodyText"/>
+      </w:pPr>
+      <w:r>
+        <w:t xml:space="preserve">We found only two characters with potential for imperfectly identifying genera: relative digital pad size</w:t>
+      </w:r>
+      <w:r>
+        <w:t xml:space="preserve"> </w:t>
+      </w:r>
+      <w:r>
+        <w:t xml:space="preserve">(Parker 1934; Zweifel 1956)</w:t>
+      </w:r>
+      <w:r>
+        <w:t xml:space="preserve">, and call type</w:t>
+      </w:r>
+      <w:r>
+        <w:t xml:space="preserve"> </w:t>
+      </w:r>
+      <w:r>
+        <w:t xml:space="preserve">(e.g., Kraus 2016)</w:t>
+      </w:r>
+      <w:r>
+        <w:t xml:space="preserve">. We found that the relative widths of the digit pads differs between genera:</w:t>
+      </w:r>
+      <w:r>
+        <w:t xml:space="preserve"> </w:t>
+      </w:r>
+      <w:r>
+        <w:rPr>
+          <w:i/>
+          <w:iCs/>
+        </w:rPr>
+        <w:t xml:space="preserve">Auparoparo</w:t>
+      </w:r>
+      <w:r>
+        <w:t xml:space="preserve"> </w:t>
+      </w:r>
+      <w:r>
+        <w:t xml:space="preserve">tends to have visibly larger finger pads in comparison to toe pads, whereas in</w:t>
+      </w:r>
+      <w:r>
+        <w:t xml:space="preserve"> </w:t>
+      </w:r>
+      <w:r>
+        <w:rPr>
+          <w:i/>
+          <w:iCs/>
+        </w:rPr>
+        <w:t xml:space="preserve">Oreophryne</w:t>
+      </w:r>
+      <w:r>
+        <w:t xml:space="preserve"> </w:t>
+      </w:r>
+      <w:r>
+        <w:t xml:space="preserve">the finger and toe pads are roughly equal in size, although there is some overlap in finger to toe pad ratio (</w:t>
+      </w:r>
+      <w:hyperlink w:anchor="tbl-morph">
+        <w:r>
+          <w:rPr>
+            <w:rStyle w:val="Hyperlink"/>
+          </w:rPr>
+          <w:t xml:space="preserve">Table 3</w:t>
+        </w:r>
+      </w:hyperlink>
+      <w:r>
+        <w:t xml:space="preserve">). In some cases,</w:t>
+      </w:r>
+      <w:r>
+        <w:t xml:space="preserve"> </w:t>
+      </w:r>
+      <w:r>
+        <w:rPr>
+          <w:i/>
+          <w:iCs/>
+        </w:rPr>
+        <w:t xml:space="preserve">Auparoparo</w:t>
+      </w:r>
+      <w:r>
+        <w:t xml:space="preserve">’s finger pads display T-shapes while the toes are often rounder and narrower. Whether there is any performance advantage in larger finger pads compared to toes is unknown. Furthermore, a handful of high-elevation species not included in our phylogeny have evolved terrestrial or fossorial habits and possess smaller digital pads compared to their presumed arboreal relatives</w:t>
+      </w:r>
+      <w:r>
+        <w:t xml:space="preserve"> </w:t>
+      </w:r>
+      <w:r>
+        <w:t xml:space="preserve">(Zweifel et al. 2009)</w:t>
+      </w:r>
+      <w:r>
+        <w:t xml:space="preserve">.</w:t>
+      </w:r>
+    </w:p>
+    <w:p>
+      <w:pPr>
+        <w:pStyle w:val="BodyText"/>
+      </w:pPr>
+      <w:r>
+        <w:t xml:space="preserve">Call features are increasingly used for diagnosing species of</w:t>
+      </w:r>
+      <w:r>
+        <w:t xml:space="preserve"> </w:t>
+      </w:r>
+      <w:r>
+        <w:rPr>
+          <w:i/>
+          <w:iCs/>
+        </w:rPr>
+        <w:t xml:space="preserve">Oreophryne</w:t>
+      </w:r>
+      <w:r>
+        <w:t xml:space="preserve">, with advertisement call types commonly categorized as rattle, honk, whinny, peeping, or clicking</w:t>
+      </w:r>
+      <w:r>
+        <w:t xml:space="preserve"> </w:t>
+      </w:r>
+      <w:r>
+        <w:t xml:space="preserve">(Kraus 2016)</w:t>
+      </w:r>
+      <w:r>
+        <w:t xml:space="preserve">. We found honk or peep call types are only found in</w:t>
+      </w:r>
+      <w:r>
+        <w:t xml:space="preserve"> </w:t>
+      </w:r>
+      <w:r>
+        <w:rPr>
+          <w:i/>
+          <w:iCs/>
+        </w:rPr>
+        <w:t xml:space="preserve">Oroephryne</w:t>
+      </w:r>
+      <w:r>
+        <w:t xml:space="preserve"> </w:t>
+      </w:r>
+      <w:r>
+        <w:t xml:space="preserve">species in our sample, while whinny calls are only found in</w:t>
+      </w:r>
+      <w:r>
+        <w:t xml:space="preserve"> </w:t>
+      </w:r>
+      <w:r>
+        <w:rPr>
+          <w:i/>
+          <w:iCs/>
+        </w:rPr>
+        <w:t xml:space="preserve">Auparoparo</w:t>
+      </w:r>
+      <w:r>
+        <w:t xml:space="preserve"> </w:t>
+      </w:r>
+      <w:r>
+        <w:t xml:space="preserve">species, and rattle calls are found in both genera (</w:t>
+      </w:r>
+      <w:hyperlink w:anchor="tbl-morph">
+        <w:r>
+          <w:rPr>
+            <w:rStyle w:val="Hyperlink"/>
+          </w:rPr>
+          <w:t xml:space="preserve">Table 3</w:t>
+        </w:r>
+      </w:hyperlink>
+      <w:r>
+        <w:t xml:space="preserve">). We note that several authors described species of each genus, thus the difference between genera cannot be attributed to the investigator. However, more complete sampling may add further complexity. As far as we are aware there has been no comprehensive acoustic analysis across</w:t>
+      </w:r>
+      <w:r>
+        <w:t xml:space="preserve"> </w:t>
+      </w:r>
+      <w:r>
+        <w:rPr>
+          <w:i/>
+          <w:iCs/>
+        </w:rPr>
+        <w:t xml:space="preserve">Oreophryne</w:t>
+      </w:r>
+      <w:r>
+        <w:t xml:space="preserve"> </w:t>
+      </w:r>
+      <w:r>
+        <w:t xml:space="preserve">sensu lato. More research is needed to explore call diversity both between species and across genera to undertand call evolution and whether there any features that are distinctive of genera.</w:t>
+      </w:r>
+    </w:p>
+    <w:bookmarkEnd w:id="57"/>
+    <w:bookmarkStart w:id="58" w:name="geographic-distribution-1"/>
+    <w:p>
+      <w:pPr>
+        <w:pStyle w:val="Heading2"/>
+      </w:pPr>
+      <w:r>
+        <w:t xml:space="preserve">Geographic Distribution</w:t>
+      </w:r>
+    </w:p>
+    <w:p>
+      <w:pPr>
+        <w:pStyle w:val="FirstParagraph"/>
+      </w:pPr>
+      <w:r>
+        <w:t xml:space="preserve">Both</w:t>
+      </w:r>
+      <w:r>
+        <w:t xml:space="preserve"> </w:t>
+      </w:r>
+      <w:r>
+        <w:rPr>
+          <w:i/>
+          <w:iCs/>
+        </w:rPr>
+        <w:t xml:space="preserve">Oreophryne</w:t>
+      </w:r>
+      <w:r>
+        <w:t xml:space="preserve"> </w:t>
+      </w:r>
+      <w:r>
+        <w:t xml:space="preserve">and</w:t>
+      </w:r>
+      <w:r>
+        <w:t xml:space="preserve"> </w:t>
+      </w:r>
+      <w:r>
+        <w:rPr>
+          <w:i/>
+          <w:iCs/>
+        </w:rPr>
+        <w:t xml:space="preserve">Auparoparo</w:t>
+      </w:r>
+      <w:r>
+        <w:t xml:space="preserve"> </w:t>
+      </w:r>
+      <w:r>
+        <w:t xml:space="preserve">are geographically centered in the mainland New Guinea.</w:t>
+      </w:r>
+      <w:r>
+        <w:t xml:space="preserve"> </w:t>
+      </w:r>
+      <w:r>
+        <w:rPr>
+          <w:i/>
+          <w:iCs/>
+        </w:rPr>
+        <w:t xml:space="preserve">Oreophryne</w:t>
+      </w:r>
+      <w:r>
+        <w:t xml:space="preserve"> </w:t>
+      </w:r>
+      <w:r>
+        <w:t xml:space="preserve">extends southward to the Louisiade Archipelago and northward to the South Philippine Islands</w:t>
+      </w:r>
+      <w:r>
+        <w:t xml:space="preserve"> </w:t>
+      </w:r>
+      <w:r>
+        <w:t xml:space="preserve">(Hill et al. 2023b)</w:t>
+      </w:r>
+      <w:r>
+        <w:t xml:space="preserve">. Addition of the type species</w:t>
+      </w:r>
+      <w:r>
+        <w:t xml:space="preserve"> </w:t>
+      </w:r>
+      <w:r>
+        <w:rPr>
+          <w:i/>
+          <w:iCs/>
+        </w:rPr>
+        <w:t xml:space="preserve">Oreophryne senkenbergiana</w:t>
+      </w:r>
+      <w:r>
+        <w:t xml:space="preserve"> </w:t>
+      </w:r>
+      <w:r>
+        <w:t xml:space="preserve">and</w:t>
+      </w:r>
+      <w:r>
+        <w:t xml:space="preserve"> </w:t>
+      </w:r>
+      <w:r>
+        <w:rPr>
+          <w:i/>
+          <w:iCs/>
+        </w:rPr>
+        <w:t xml:space="preserve">O. frontifasciata</w:t>
+      </w:r>
+      <w:r>
+        <w:t xml:space="preserve"> </w:t>
+      </w:r>
+      <w:r>
+        <w:t xml:space="preserve">expands the known range eastward to North Maluku, Indonesia (</w:t>
       </w:r>
       <w:hyperlink w:anchor="fig-map">
         <w:r>
@@ -31116,1292 +32418,6 @@
         <w:pStyle w:val="BodyText"/>
       </w:pPr>
       <w:r>
-        <w:rPr>
-          <w:b/>
-          <w:bCs/>
-        </w:rPr>
-        <w:t xml:space="preserve">Etymology:</w:t>
-      </w:r>
-      <w:r>
-        <w:t xml:space="preserve"> </w:t>
-      </w:r>
-      <w:r>
-        <w:t xml:space="preserve">The generic name</w:t>
-      </w:r>
-      <w:r>
-        <w:t xml:space="preserve"> </w:t>
-      </w:r>
-      <w:r>
-        <w:rPr>
-          <w:i/>
-          <w:iCs/>
-        </w:rPr>
-        <w:t xml:space="preserve">Auparoparo</w:t>
-      </w:r>
-      <w:r>
-        <w:t xml:space="preserve"> </w:t>
-      </w:r>
-      <w:r>
-        <w:t xml:space="preserve">comes from the indigenous language, Motu, which is widely spoken in the region of Papua New Guinea in which this genus is found. It is a combination of the words</w:t>
-      </w:r>
-      <w:r>
-        <w:t xml:space="preserve"> </w:t>
-      </w:r>
-      <w:r>
-        <w:t xml:space="preserve">“au”</w:t>
-      </w:r>
-      <w:r>
-        <w:t xml:space="preserve"> </w:t>
-      </w:r>
-      <w:r>
-        <w:t xml:space="preserve">(tree) and</w:t>
-      </w:r>
-      <w:r>
-        <w:t xml:space="preserve"> </w:t>
-      </w:r>
-      <w:r>
-        <w:t xml:space="preserve">“paro paro”</w:t>
-      </w:r>
-      <w:r>
-        <w:t xml:space="preserve"> </w:t>
-      </w:r>
-      <w:r>
-        <w:t xml:space="preserve">(frog).</w:t>
-      </w:r>
-    </w:p>
-    <w:p>
-      <w:pPr>
-        <w:pStyle w:val="BodyText"/>
-      </w:pPr>
-      <w:r>
-        <w:rPr>
-          <w:b/>
-          <w:bCs/>
-        </w:rPr>
-        <w:t xml:space="preserve">Comment:</w:t>
-      </w:r>
-      <w:r>
-        <w:t xml:space="preserve"> </w:t>
-      </w:r>
-      <w:r>
-        <w:t xml:space="preserve">According to ICZN convention for nomenclature assignment, the genus</w:t>
-      </w:r>
-      <w:r>
-        <w:t xml:space="preserve"> </w:t>
-      </w:r>
-      <w:r>
-        <w:rPr>
-          <w:i/>
-          <w:iCs/>
-        </w:rPr>
-        <w:t xml:space="preserve">Aphantophryne</w:t>
-      </w:r>
-      <w:r>
-        <w:t xml:space="preserve">, which is newly confirmed to be contained within</w:t>
-      </w:r>
-      <w:r>
-        <w:t xml:space="preserve"> </w:t>
-      </w:r>
-      <w:r>
-        <w:rPr>
-          <w:i/>
-          <w:iCs/>
-        </w:rPr>
-        <w:t xml:space="preserve">Auparoparo</w:t>
-      </w:r>
-      <w:r>
-        <w:t xml:space="preserve"> </w:t>
-      </w:r>
-      <w:r>
-        <w:t xml:space="preserve">could be considered a name of priority (ICZN, 1999). However, based on the tremendous morphological and lifestyle differences between</w:t>
-      </w:r>
-      <w:r>
-        <w:t xml:space="preserve"> </w:t>
-      </w:r>
-      <w:r>
-        <w:rPr>
-          <w:i/>
-          <w:iCs/>
-        </w:rPr>
-        <w:t xml:space="preserve">Aphantophryne</w:t>
-      </w:r>
-      <w:r>
-        <w:t xml:space="preserve"> </w:t>
-      </w:r>
-      <w:r>
-        <w:t xml:space="preserve">and other species of</w:t>
-      </w:r>
-      <w:r>
-        <w:t xml:space="preserve"> </w:t>
-      </w:r>
-      <w:r>
-        <w:rPr>
-          <w:i/>
-          <w:iCs/>
-        </w:rPr>
-        <w:t xml:space="preserve">Auparoparo</w:t>
-      </w:r>
-      <w:r>
-        <w:t xml:space="preserve">, we do not consider this name to be representative of the entire clade and therefore recommend deprecation of</w:t>
-      </w:r>
-      <w:r>
-        <w:t xml:space="preserve"> </w:t>
-      </w:r>
-      <w:r>
-        <w:rPr>
-          <w:i/>
-          <w:iCs/>
-        </w:rPr>
-        <w:t xml:space="preserve">Aphantophryne</w:t>
-      </w:r>
-      <w:r>
-        <w:t xml:space="preserve"> </w:t>
-      </w:r>
-      <w:r>
-        <w:t xml:space="preserve">to a subgenus within</w:t>
-      </w:r>
-      <w:r>
-        <w:t xml:space="preserve"> </w:t>
-      </w:r>
-      <w:r>
-        <w:rPr>
-          <w:i/>
-          <w:iCs/>
-        </w:rPr>
-        <w:t xml:space="preserve">Auparoparo</w:t>
-      </w:r>
-      <w:r>
-        <w:t xml:space="preserve">.</w:t>
-      </w:r>
-    </w:p>
-    <w:p>
-      <w:pPr>
-        <w:pStyle w:val="BodyText"/>
-      </w:pPr>
-      <w:r>
-        <w:rPr>
-          <w:b/>
-          <w:bCs/>
-        </w:rPr>
-        <w:t xml:space="preserve">Subgenus Aphantophryne (Fry 1917)</w:t>
-      </w:r>
-    </w:p>
-    <w:p>
-      <w:pPr>
-        <w:pStyle w:val="BodyText"/>
-      </w:pPr>
-      <w:r>
-        <w:rPr>
-          <w:b/>
-          <w:bCs/>
-        </w:rPr>
-        <w:t xml:space="preserve">Diagnosis:</w:t>
-      </w:r>
-      <w:r>
-        <w:t xml:space="preserve"> </w:t>
-      </w:r>
-      <w:r>
-        <w:t xml:space="preserve">These species were previously designated as the genus</w:t>
-      </w:r>
-      <w:r>
-        <w:t xml:space="preserve"> </w:t>
-      </w:r>
-      <w:r>
-        <w:rPr>
-          <w:i/>
-          <w:iCs/>
-        </w:rPr>
-        <w:t xml:space="preserve">Aphantophryne</w:t>
-      </w:r>
-      <w:r>
-        <w:t xml:space="preserve"> </w:t>
-      </w:r>
-      <w:r>
-        <w:t xml:space="preserve">and have the following distinctive morphological traits including: (1) absence of clavicles and procoracoid; (3) loss of a sternum or presence of a vestigial sternum; (4) absence of digital pads; (5) unwebbed toes and rounded tips; (6) clicking calls (7) fossorial lifestyle.</w:t>
-      </w:r>
-    </w:p>
-    <w:p>
-      <w:pPr>
-        <w:pStyle w:val="BodyText"/>
-      </w:pPr>
-      <w:r>
-        <w:rPr>
-          <w:b/>
-          <w:bCs/>
-        </w:rPr>
-        <w:t xml:space="preserve">Content:</w:t>
-      </w:r>
-      <w:r>
-        <w:t xml:space="preserve"> </w:t>
-      </w:r>
-      <w:r>
-        <w:rPr>
-          <w:i/>
-          <w:iCs/>
-        </w:rPr>
-        <w:t xml:space="preserve">Aphantophryne</w:t>
-      </w:r>
-      <w:r>
-        <w:t xml:space="preserve"> </w:t>
-      </w:r>
-      <w:r>
-        <w:t xml:space="preserve">consists of three named species,</w:t>
-      </w:r>
-      <w:r>
-        <w:t xml:space="preserve"> </w:t>
-      </w:r>
-      <w:r>
-        <w:rPr>
-          <w:i/>
-          <w:iCs/>
-        </w:rPr>
-        <w:t xml:space="preserve">A. pansa</w:t>
-      </w:r>
-      <w:r>
-        <w:t xml:space="preserve">,</w:t>
-      </w:r>
-      <w:r>
-        <w:t xml:space="preserve"> </w:t>
-      </w:r>
-      <w:r>
-        <w:rPr>
-          <w:i/>
-          <w:iCs/>
-        </w:rPr>
-        <w:t xml:space="preserve">A. sabini</w:t>
-      </w:r>
-      <w:r>
-        <w:t xml:space="preserve">, and</w:t>
-      </w:r>
-      <w:r>
-        <w:t xml:space="preserve"> </w:t>
-      </w:r>
-      <w:r>
-        <w:rPr>
-          <w:i/>
-          <w:iCs/>
-        </w:rPr>
-        <w:t xml:space="preserve">A. minuta</w:t>
-      </w:r>
-      <w:r>
-        <w:t xml:space="preserve">. Zweifel and Parker (1989) mentioned the species A. minuta differs from the other two in its small size and relatively smaller first finger in proportion. Currently, no sample or phylogenetic data of</w:t>
-      </w:r>
-      <w:r>
-        <w:t xml:space="preserve"> </w:t>
-      </w:r>
-      <w:r>
-        <w:rPr>
-          <w:i/>
-          <w:iCs/>
-        </w:rPr>
-        <w:t xml:space="preserve">A. minuta</w:t>
-      </w:r>
-      <w:r>
-        <w:t xml:space="preserve"> </w:t>
-      </w:r>
-      <w:r>
-        <w:t xml:space="preserve">was obtained and thus this species is not included in this analysis. Given that</w:t>
-      </w:r>
-      <w:r>
-        <w:t xml:space="preserve"> </w:t>
-      </w:r>
-      <w:r>
-        <w:rPr>
-          <w:i/>
-          <w:iCs/>
-        </w:rPr>
-        <w:t xml:space="preserve">A. pansa</w:t>
-      </w:r>
-      <w:r>
-        <w:t xml:space="preserve"> </w:t>
-      </w:r>
-      <w:r>
-        <w:t xml:space="preserve">(Fry 1917)</w:t>
-      </w:r>
-      <w:r>
-        <w:t xml:space="preserve"> </w:t>
-      </w:r>
-      <w:r>
-        <w:t xml:space="preserve">is the type species of the genus</w:t>
-      </w:r>
-      <w:r>
-        <w:t xml:space="preserve"> </w:t>
-      </w:r>
-      <w:r>
-        <w:rPr>
-          <w:i/>
-          <w:iCs/>
-        </w:rPr>
-        <w:t xml:space="preserve">Aphantophryne</w:t>
-      </w:r>
-      <w:r>
-        <w:t xml:space="preserve">, we deprecate</w:t>
-      </w:r>
-      <w:r>
-        <w:t xml:space="preserve"> </w:t>
-      </w:r>
-      <w:r>
-        <w:rPr>
-          <w:i/>
-          <w:iCs/>
-        </w:rPr>
-        <w:t xml:space="preserve">Aphantophryne</w:t>
-      </w:r>
-      <w:r>
-        <w:t xml:space="preserve"> </w:t>
-      </w:r>
-      <w:r>
-        <w:t xml:space="preserve">to a subgenus within</w:t>
-      </w:r>
-      <w:r>
-        <w:t xml:space="preserve"> </w:t>
-      </w:r>
-      <w:r>
-        <w:rPr>
-          <w:i/>
-          <w:iCs/>
-        </w:rPr>
-        <w:t xml:space="preserve">Auparoparo</w:t>
-      </w:r>
-      <w:r>
-        <w:t xml:space="preserve">.</w:t>
-      </w:r>
-    </w:p>
-    <w:bookmarkEnd w:id="54"/>
-    <w:bookmarkEnd w:id="55"/>
-    <w:bookmarkStart w:id="60" w:name="discussion"/>
-    <w:p>
-      <w:pPr>
-        <w:pStyle w:val="Heading1"/>
-      </w:pPr>
-      <w:r>
-        <w:t xml:space="preserve">Discussion</w:t>
-      </w:r>
-    </w:p>
-    <w:bookmarkStart w:id="56" w:name="phenotypic-characters-and-diagnoses"/>
-    <w:p>
-      <w:pPr>
-        <w:pStyle w:val="Heading2"/>
-      </w:pPr>
-      <w:r>
-        <w:t xml:space="preserve">Phenotypic Characters and Diagnoses</w:t>
-      </w:r>
-    </w:p>
-    <w:p>
-      <w:pPr>
-        <w:pStyle w:val="FirstParagraph"/>
-      </w:pPr>
-      <w:r>
-        <w:t xml:space="preserve">Our phylogenetic results</w:t>
-      </w:r>
-      <w:r>
-        <w:t xml:space="preserve"> </w:t>
-      </w:r>
-      <w:r>
-        <w:t xml:space="preserve">(Hill et al. 2022; 2023b, this study)</w:t>
-      </w:r>
-      <w:r>
-        <w:t xml:space="preserve"> </w:t>
-      </w:r>
-      <w:r>
-        <w:t xml:space="preserve">provide clarity on the classification of the problematic genus</w:t>
-      </w:r>
-      <w:r>
-        <w:t xml:space="preserve"> </w:t>
-      </w:r>
-      <w:r>
-        <w:rPr>
-          <w:i/>
-          <w:iCs/>
-        </w:rPr>
-        <w:t xml:space="preserve">Oreophryne</w:t>
-      </w:r>
-      <w:r>
-        <w:t xml:space="preserve"> </w:t>
-      </w:r>
-      <w:r>
-        <w:t xml:space="preserve">sensu lato. We confirm that</w:t>
-      </w:r>
-      <w:r>
-        <w:t xml:space="preserve"> </w:t>
-      </w:r>
-      <w:r>
-        <w:rPr>
-          <w:i/>
-          <w:iCs/>
-        </w:rPr>
-        <w:t xml:space="preserve">Oreophryne</w:t>
-      </w:r>
-      <w:r>
-        <w:t xml:space="preserve"> </w:t>
-      </w:r>
-      <w:r>
-        <w:t xml:space="preserve">sensu lato is polyphyletic and consists of two reciprocally monophyletic clades,</w:t>
-      </w:r>
-      <w:r>
-        <w:t xml:space="preserve"> </w:t>
-      </w:r>
-      <w:r>
-        <w:t xml:space="preserve">“Oreophryne A”</w:t>
-      </w:r>
-      <w:r>
-        <w:t xml:space="preserve"> </w:t>
-      </w:r>
-      <w:r>
-        <w:t xml:space="preserve">and</w:t>
-      </w:r>
-      <w:r>
-        <w:t xml:space="preserve"> </w:t>
-      </w:r>
-      <w:r>
-        <w:t xml:space="preserve">“B”</w:t>
-      </w:r>
-      <w:r>
-        <w:t xml:space="preserve"> </w:t>
-      </w:r>
-      <w:r>
-        <w:t xml:space="preserve">(of Hill et al. 2022)</w:t>
-      </w:r>
-      <w:r>
-        <w:t xml:space="preserve">, originating 18 and 16 MYA, respectively (Figure 1). Here we designate</w:t>
-      </w:r>
-      <w:r>
-        <w:t xml:space="preserve"> </w:t>
-      </w:r>
-      <w:r>
-        <w:t xml:space="preserve">“Oreophryne A”</w:t>
-      </w:r>
-      <w:r>
-        <w:t xml:space="preserve"> </w:t>
-      </w:r>
-      <w:r>
-        <w:t xml:space="preserve">as retaining the name</w:t>
-      </w:r>
-      <w:r>
-        <w:t xml:space="preserve"> </w:t>
-      </w:r>
-      <w:r>
-        <w:rPr>
-          <w:i/>
-          <w:iCs/>
-        </w:rPr>
-        <w:t xml:space="preserve">Oreophryne</w:t>
-      </w:r>
-      <w:r>
-        <w:t xml:space="preserve"> </w:t>
-      </w:r>
-      <w:r>
-        <w:t xml:space="preserve">based on its containing the type species</w:t>
-      </w:r>
-      <w:r>
-        <w:t xml:space="preserve"> </w:t>
-      </w:r>
-      <w:r>
-        <w:rPr>
-          <w:i/>
-          <w:iCs/>
-        </w:rPr>
-        <w:t xml:space="preserve">Oreophryne senckenbergiana</w:t>
-      </w:r>
-      <w:r>
-        <w:t xml:space="preserve"> </w:t>
-      </w:r>
-      <w:r>
-        <w:t xml:space="preserve">(Peters and Doria 1878)</w:t>
-      </w:r>
-      <w:r>
-        <w:t xml:space="preserve"> </w:t>
-      </w:r>
-      <w:r>
-        <w:t xml:space="preserve">with high support.</w:t>
-      </w:r>
-      <w:r>
-        <w:t xml:space="preserve"> </w:t>
-      </w:r>
-      <w:r>
-        <w:rPr>
-          <w:i/>
-          <w:iCs/>
-        </w:rPr>
-        <w:t xml:space="preserve">Oreophryne</w:t>
-      </w:r>
-      <w:r>
-        <w:t xml:space="preserve"> </w:t>
-      </w:r>
-      <w:r>
-        <w:t xml:space="preserve">is the earliest diverged genus in subfamily Asterophryinae, sister to all the other genera. The second clade,</w:t>
-      </w:r>
-      <w:r>
-        <w:t xml:space="preserve"> </w:t>
-      </w:r>
-      <w:r>
-        <w:t xml:space="preserve">“Oreophryne B”</w:t>
-      </w:r>
-      <w:r>
-        <w:t xml:space="preserve">, is highly supported as a separate, unrelated genus, which contains no known species with historical generic priority. Thus, we designate this genus as</w:t>
-      </w:r>
-      <w:r>
-        <w:t xml:space="preserve"> </w:t>
-      </w:r>
-      <w:r>
-        <w:rPr>
-          <w:i/>
-          <w:iCs/>
-        </w:rPr>
-        <w:t xml:space="preserve">Auparoparo</w:t>
-      </w:r>
-      <w:r>
-        <w:t xml:space="preserve">, a nominal tribute to the Motu language of the indigenous peoples of the region.</w:t>
-      </w:r>
-    </w:p>
-    <w:bookmarkEnd w:id="56"/>
-    <w:bookmarkStart w:id="57" w:name="the-difficulty-with-cryptic-genera"/>
-    <w:p>
-      <w:pPr>
-        <w:pStyle w:val="Heading2"/>
-      </w:pPr>
-      <w:r>
-        <w:t xml:space="preserve">The Difficulty with Cryptic Genera</w:t>
-      </w:r>
-    </w:p>
-    <w:p>
-      <w:pPr>
-        <w:pStyle w:val="FirstParagraph"/>
-      </w:pPr>
-      <w:r>
-        <w:t xml:space="preserve">Perhaps the greatest testament to the crypticism of</w:t>
-      </w:r>
-      <w:r>
-        <w:t xml:space="preserve"> </w:t>
-      </w:r>
-      <w:r>
-        <w:rPr>
-          <w:i/>
-          <w:iCs/>
-        </w:rPr>
-        <w:t xml:space="preserve">Oreophryne</w:t>
-      </w:r>
-      <w:r>
-        <w:t xml:space="preserve"> </w:t>
-      </w:r>
-      <w:r>
-        <w:t xml:space="preserve">(CCN) vs. </w:t>
-      </w:r>
-      <w:r>
-        <w:rPr>
-          <w:i/>
-          <w:iCs/>
-        </w:rPr>
-        <w:t xml:space="preserve">Auparoparo</w:t>
-      </w:r>
-      <w:r>
-        <w:t xml:space="preserve"> </w:t>
-      </w:r>
-      <w:r>
-        <w:t xml:space="preserve">(NCN) is that no taxonomist was able to distinguish that they are separate clades, independently evolved, in the 130 years between their discovery and molecular sequencing</w:t>
-      </w:r>
-      <w:r>
-        <w:t xml:space="preserve"> </w:t>
-      </w:r>
-      <w:r>
-        <w:t xml:space="preserve">(Boettger 1895; Rivera et al. 2017)</w:t>
-      </w:r>
-      <w:r>
-        <w:t xml:space="preserve">. These species are indeed morphologically very similar and our results provide some clues as to why</w:t>
-      </w:r>
-      <w:r>
-        <w:t xml:space="preserve"> </w:t>
-      </w:r>
-      <w:r>
-        <w:rPr>
-          <w:i/>
-          <w:iCs/>
-        </w:rPr>
-        <w:t xml:space="preserve">Oreophryne</w:t>
-      </w:r>
-      <w:r>
-        <w:t xml:space="preserve"> </w:t>
-      </w:r>
-      <w:r>
-        <w:t xml:space="preserve">taxonomy has been so difficult.</w:t>
-      </w:r>
-      <w:r>
-        <w:t xml:space="preserve"> </w:t>
-      </w:r>
-      <w:r>
-        <w:t xml:space="preserve">We found no morphological synapomorphy for neither</w:t>
-      </w:r>
-      <w:r>
-        <w:t xml:space="preserve"> </w:t>
-      </w:r>
-      <w:r>
-        <w:rPr>
-          <w:i/>
-          <w:iCs/>
-        </w:rPr>
-        <w:t xml:space="preserve">Auparoparo</w:t>
-      </w:r>
-      <w:r>
-        <w:t xml:space="preserve"> </w:t>
-      </w:r>
-      <w:r>
-        <w:t xml:space="preserve">nor</w:t>
-      </w:r>
-      <w:r>
-        <w:t xml:space="preserve"> </w:t>
-      </w:r>
-      <w:r>
-        <w:rPr>
-          <w:i/>
-          <w:iCs/>
-        </w:rPr>
-        <w:t xml:space="preserve">Oreophryne</w:t>
-      </w:r>
-      <w:r>
-        <w:t xml:space="preserve">, and moreover, no morphological feature that can diagnose either clade or both in combination.</w:t>
-      </w:r>
-    </w:p>
-    <w:p>
-      <w:pPr>
-        <w:pStyle w:val="BodyText"/>
-      </w:pPr>
-      <w:r>
-        <w:t xml:space="preserve">The traditional basis for generic designation of species to</w:t>
-      </w:r>
-      <w:r>
-        <w:t xml:space="preserve"> </w:t>
-      </w:r>
-      <w:r>
-        <w:rPr>
-          <w:i/>
-          <w:iCs/>
-        </w:rPr>
-        <w:t xml:space="preserve">Oreophryne</w:t>
-      </w:r>
-      <w:r>
-        <w:t xml:space="preserve"> </w:t>
-      </w:r>
-      <w:r>
-        <w:t xml:space="preserve">has primarily relied on a signature pectoral anatomy</w:t>
-      </w:r>
-      <w:r>
-        <w:t xml:space="preserve"> </w:t>
-      </w:r>
-      <w:r>
-        <w:t xml:space="preserve">(whether original or revised diagnosis, Parker 1934; Zweifel 2003)</w:t>
-      </w:r>
-      <w:r>
-        <w:t xml:space="preserve">. Our phylogenetic results clearly show that this trait appears more than once, in both</w:t>
-      </w:r>
-      <w:r>
-        <w:t xml:space="preserve"> </w:t>
-      </w:r>
-      <w:r>
-        <w:rPr>
-          <w:i/>
-          <w:iCs/>
-        </w:rPr>
-        <w:t xml:space="preserve">Oreophryne</w:t>
-      </w:r>
-      <w:r>
-        <w:t xml:space="preserve"> </w:t>
-      </w:r>
-      <w:r>
-        <w:t xml:space="preserve">and</w:t>
-      </w:r>
-      <w:r>
-        <w:t xml:space="preserve"> </w:t>
-      </w:r>
-      <w:r>
-        <w:rPr>
-          <w:i/>
-          <w:iCs/>
-        </w:rPr>
-        <w:t xml:space="preserve">Auparaparo</w:t>
-      </w:r>
-      <w:r>
-        <w:t xml:space="preserve">, and rather than being a highly conserved trait, it is either a symplesiomorphy (shared ancestral character) or a result of convergent or parallel evolution, and perhaps adaptive for arboreality. Thus, the pectoral anatomy is not a reliable diagnostic character in differentiating between</w:t>
-      </w:r>
-      <w:r>
-        <w:t xml:space="preserve"> </w:t>
-      </w:r>
-      <w:r>
-        <w:rPr>
-          <w:i/>
-          <w:iCs/>
-        </w:rPr>
-        <w:t xml:space="preserve">Oreophryne</w:t>
-      </w:r>
-      <w:r>
-        <w:t xml:space="preserve"> </w:t>
-      </w:r>
-      <w:r>
-        <w:t xml:space="preserve">and</w:t>
-      </w:r>
-      <w:r>
-        <w:t xml:space="preserve"> </w:t>
-      </w:r>
-      <w:r>
-        <w:rPr>
-          <w:i/>
-          <w:iCs/>
-        </w:rPr>
-        <w:t xml:space="preserve">Auparoparo</w:t>
-      </w:r>
-      <w:r>
-        <w:t xml:space="preserve">. In studies across a wide diversity of anurans,</w:t>
-      </w:r>
-      <w:r>
-        <w:t xml:space="preserve"> </w:t>
-      </w:r>
-      <w:r>
-        <w:t xml:space="preserve">Soliz et al. (2025)</w:t>
-      </w:r>
-      <w:r>
-        <w:t xml:space="preserve"> </w:t>
-      </w:r>
-      <w:r>
-        <w:t xml:space="preserve">found that anatomical variation of the pectoral girdle corresponds with functional and ecological lifestyle demands, whereas</w:t>
-      </w:r>
-      <w:r>
-        <w:t xml:space="preserve"> </w:t>
-      </w:r>
-      <w:r>
-        <w:t xml:space="preserve">Engelkes et al. (2020)</w:t>
-      </w:r>
-      <w:r>
-        <w:t xml:space="preserve"> </w:t>
-      </w:r>
-      <w:r>
-        <w:t xml:space="preserve">found strong phylogenetic influence in the shape of the pectoral girdle. This point would be excellent for further study within Asterophryinae, as there are high elevation terrestrial species of</w:t>
-      </w:r>
-      <w:r>
-        <w:t xml:space="preserve"> </w:t>
-      </w:r>
-      <w:r>
-        <w:rPr>
-          <w:i/>
-          <w:iCs/>
-        </w:rPr>
-        <w:t xml:space="preserve">Oreophryne</w:t>
-      </w:r>
-      <w:r>
-        <w:t xml:space="preserve"> </w:t>
-      </w:r>
-      <w:r>
-        <w:t xml:space="preserve">sensu lato that possess the same pectoral trait</w:t>
-      </w:r>
-      <w:r>
-        <w:t xml:space="preserve"> </w:t>
-      </w:r>
-      <w:r>
-        <w:t xml:space="preserve">(Zweifel et al. 2009)</w:t>
-      </w:r>
-      <w:r>
-        <w:t xml:space="preserve">,as well as a few arboreal species within other genera (</w:t>
-      </w:r>
-      <w:r>
-        <w:rPr>
-          <w:i/>
-          <w:iCs/>
-        </w:rPr>
-        <w:t xml:space="preserve">Cophixalus</w:t>
-      </w:r>
-      <w:r>
-        <w:t xml:space="preserve">,</w:t>
-      </w:r>
-      <w:r>
-        <w:t xml:space="preserve"> </w:t>
-      </w:r>
-      <w:r>
-        <w:rPr>
-          <w:i/>
-          <w:iCs/>
-        </w:rPr>
-        <w:t xml:space="preserve">Asterophrys</w:t>
-      </w:r>
-      <w:r>
-        <w:t xml:space="preserve">,</w:t>
-      </w:r>
-      <w:r>
-        <w:t xml:space="preserve"> </w:t>
-      </w:r>
-      <w:r>
-        <w:rPr>
-          <w:i/>
-          <w:iCs/>
-        </w:rPr>
-        <w:t xml:space="preserve">Xenorhina</w:t>
-      </w:r>
-      <w:r>
-        <w:t xml:space="preserve">) with unknown pectoral morphology.</w:t>
-      </w:r>
-    </w:p>
-    <w:p>
-      <w:pPr>
-        <w:pStyle w:val="BodyText"/>
-      </w:pPr>
-      <w:r>
-        <w:t xml:space="preserve">We further rexamined additional characters previously used to diangnose</w:t>
-      </w:r>
-      <w:r>
-        <w:t xml:space="preserve"> </w:t>
-      </w:r>
-      <w:r>
-        <w:rPr>
-          <w:i/>
-          <w:iCs/>
-        </w:rPr>
-        <w:t xml:space="preserve">Oreophryne</w:t>
-      </w:r>
-      <w:r>
-        <w:t xml:space="preserve"> </w:t>
-      </w:r>
-      <w:r>
-        <w:t xml:space="preserve">as well as characters conventionally used to diagnose species of frogs. We conclude that pectoral girdle connector type</w:t>
-      </w:r>
-      <w:r>
-        <w:t xml:space="preserve"> </w:t>
-      </w:r>
-      <w:r>
-        <w:t xml:space="preserve">(Parker 1934)</w:t>
-      </w:r>
-      <w:r>
-        <w:t xml:space="preserve"> </w:t>
-      </w:r>
-      <w:r>
-        <w:t xml:space="preserve">and relative lengths of the 3rd and 5th toe are uninformative and the degree of toe webbing is subjective. It was previously suggested that species in</w:t>
-      </w:r>
-      <w:r>
-        <w:t xml:space="preserve"> </w:t>
-      </w:r>
-      <w:r>
-        <w:rPr>
-          <w:i/>
-          <w:iCs/>
-        </w:rPr>
-        <w:t xml:space="preserve">Oreophryne</w:t>
-      </w:r>
-      <w:r>
-        <w:t xml:space="preserve"> </w:t>
-      </w:r>
-      <w:r>
-        <w:t xml:space="preserve">sensu lato could be divided into two groups based on the type of connection between the procoracoid cartilages and the scapula</w:t>
-      </w:r>
-      <w:r>
-        <w:t xml:space="preserve"> </w:t>
-      </w:r>
-      <w:r>
-        <w:t xml:space="preserve">(Kraus 2013)</w:t>
-      </w:r>
-      <w:r>
-        <w:t xml:space="preserve">, with roughly half possessing a cartilaginous rod extending to the scapula and others a ligamentous connection</w:t>
-      </w:r>
-      <w:r>
-        <w:t xml:space="preserve"> </w:t>
-      </w:r>
-      <w:r>
-        <w:t xml:space="preserve">(Parker 1934)</w:t>
-      </w:r>
-      <w:r>
-        <w:t xml:space="preserve">. However, our phylogenetic evidence shows that these traits readily evolve and are not synapmorphies and therefore not reliable indicators of monophyletic groups. Ligamentous connectors are most common across both genera (Table 4). Of species with toe webbing,</w:t>
-      </w:r>
-      <w:r>
-        <w:t xml:space="preserve"> </w:t>
-      </w:r>
-      <w:r>
-        <w:rPr>
-          <w:i/>
-          <w:iCs/>
-        </w:rPr>
-        <w:t xml:space="preserve">Oreophryne</w:t>
-      </w:r>
-      <w:r>
-        <w:t xml:space="preserve"> </w:t>
-      </w:r>
-      <w:r>
-        <w:t xml:space="preserve">tends to be described as having</w:t>
-      </w:r>
-      <w:r>
-        <w:t xml:space="preserve"> </w:t>
-      </w:r>
-      <w:r>
-        <w:t xml:space="preserve">“well webbed”</w:t>
-      </w:r>
-      <w:r>
-        <w:t xml:space="preserve"> </w:t>
-      </w:r>
-      <w:r>
-        <w:t xml:space="preserve">toes compared to</w:t>
-      </w:r>
-      <w:r>
-        <w:t xml:space="preserve"> </w:t>
-      </w:r>
-      <w:r>
-        <w:rPr>
-          <w:i/>
-          <w:iCs/>
-        </w:rPr>
-        <w:t xml:space="preserve">Auparoparo</w:t>
-      </w:r>
-      <w:r>
-        <w:t xml:space="preserve">’s</w:t>
-      </w:r>
-      <w:r>
-        <w:t xml:space="preserve"> </w:t>
-      </w:r>
-      <w:r>
-        <w:t xml:space="preserve">“basal”</w:t>
-      </w:r>
-      <w:r>
-        <w:t xml:space="preserve"> </w:t>
-      </w:r>
-      <w:r>
-        <w:t xml:space="preserve">webbing (Table 4). However, intra-specific variability combined with the subjective nature of these descriptions and inconsistency between specific markers when used (</w:t>
-      </w:r>
-      <w:r>
-        <w:t xml:space="preserve">“reaching the penultimate tubercle”</w:t>
-      </w:r>
-      <w:r>
-        <w:t xml:space="preserve">,</w:t>
-      </w:r>
-      <w:r>
-        <w:t xml:space="preserve"> </w:t>
-      </w:r>
-      <w:r>
-        <w:t xml:space="preserve">“webbed 1/3 length of 5th toe”</w:t>
-      </w:r>
-      <w:r>
-        <w:t xml:space="preserve">, etc.), makes this feature difficult to standardize for generic diagnostic use. Many of the morphological traits proposed by</w:t>
-      </w:r>
-      <w:r>
-        <w:t xml:space="preserve"> </w:t>
-      </w:r>
-      <w:r>
-        <w:t xml:space="preserve">Parker (1934)</w:t>
-      </w:r>
-      <w:r>
-        <w:t xml:space="preserve"> </w:t>
-      </w:r>
-      <w:r>
-        <w:t xml:space="preserve">and</w:t>
-      </w:r>
-      <w:r>
-        <w:t xml:space="preserve"> </w:t>
-      </w:r>
-      <w:r>
-        <w:t xml:space="preserve">Zweifel (2003)</w:t>
-      </w:r>
-      <w:r>
-        <w:t xml:space="preserve"> </w:t>
-      </w:r>
-      <w:r>
-        <w:t xml:space="preserve">may in fact be a result of homoplasy to evolutionary pressures imposed by lifestyle or parallel evolution, and while they may prove useful for ecomorphological identification or species diagnoses in combination with other traits, are not informative for generic diagnosis.</w:t>
-      </w:r>
-    </w:p>
-    <w:p>
-      <w:pPr>
-        <w:pStyle w:val="BodyText"/>
-      </w:pPr>
-      <w:r>
-        <w:t xml:space="preserve">We found only two characters with potential for imperfectly identifying genera: relative digital pad size</w:t>
-      </w:r>
-      <w:r>
-        <w:t xml:space="preserve"> </w:t>
-      </w:r>
-      <w:r>
-        <w:t xml:space="preserve">(Parker 1934; Zweifel 1956)</w:t>
-      </w:r>
-      <w:r>
-        <w:t xml:space="preserve">, and call type</w:t>
-      </w:r>
-      <w:r>
-        <w:t xml:space="preserve"> </w:t>
-      </w:r>
-      <w:r>
-        <w:t xml:space="preserve">(e.g., Kraus 2016)</w:t>
-      </w:r>
-      <w:r>
-        <w:t xml:space="preserve">. We found that the relative widths of the digit pads differs between genera:</w:t>
-      </w:r>
-      <w:r>
-        <w:t xml:space="preserve"> </w:t>
-      </w:r>
-      <w:r>
-        <w:rPr>
-          <w:i/>
-          <w:iCs/>
-        </w:rPr>
-        <w:t xml:space="preserve">Auparoparo</w:t>
-      </w:r>
-      <w:r>
-        <w:t xml:space="preserve"> </w:t>
-      </w:r>
-      <w:r>
-        <w:t xml:space="preserve">tends to have visibly larger finger pads in comparison to toe pads, whereas in</w:t>
-      </w:r>
-      <w:r>
-        <w:t xml:space="preserve"> </w:t>
-      </w:r>
-      <w:r>
-        <w:rPr>
-          <w:i/>
-          <w:iCs/>
-        </w:rPr>
-        <w:t xml:space="preserve">Oreophryne</w:t>
-      </w:r>
-      <w:r>
-        <w:t xml:space="preserve"> </w:t>
-      </w:r>
-      <w:r>
-        <w:t xml:space="preserve">the finger and toe pads are roughly equal in size, although there is some overlap in finger to toe pad ratio (</w:t>
-      </w:r>
-      <w:hyperlink w:anchor="tbl-morph">
-        <w:r>
-          <w:rPr>
-            <w:rStyle w:val="Hyperlink"/>
-          </w:rPr>
-          <w:t xml:space="preserve">Table 3</w:t>
-        </w:r>
-      </w:hyperlink>
-      <w:r>
-        <w:t xml:space="preserve">). In some cases,</w:t>
-      </w:r>
-      <w:r>
-        <w:t xml:space="preserve"> </w:t>
-      </w:r>
-      <w:r>
-        <w:rPr>
-          <w:i/>
-          <w:iCs/>
-        </w:rPr>
-        <w:t xml:space="preserve">Auparoparo</w:t>
-      </w:r>
-      <w:r>
-        <w:t xml:space="preserve">’s finger pads display T-shapes while the toes are often rounder and narrower. Whether there is any performance advantage in larger finger pads compared to toes is unknown. Furthermore, a handful of high-elevation species not included in our phylogeny have evolved terrestrial or fossorial habits and possess smaller digital pads compared to their presumed arboreal relatives</w:t>
-      </w:r>
-      <w:r>
-        <w:t xml:space="preserve"> </w:t>
-      </w:r>
-      <w:r>
-        <w:t xml:space="preserve">(Zweifel et al. 2009)</w:t>
-      </w:r>
-      <w:r>
-        <w:t xml:space="preserve">.</w:t>
-      </w:r>
-    </w:p>
-    <w:p>
-      <w:pPr>
-        <w:pStyle w:val="BodyText"/>
-      </w:pPr>
-      <w:r>
-        <w:t xml:space="preserve">Call features are increasingly used for diagnosing species of</w:t>
-      </w:r>
-      <w:r>
-        <w:t xml:space="preserve"> </w:t>
-      </w:r>
-      <w:r>
-        <w:rPr>
-          <w:i/>
-          <w:iCs/>
-        </w:rPr>
-        <w:t xml:space="preserve">Oreophryne</w:t>
-      </w:r>
-      <w:r>
-        <w:t xml:space="preserve">, with advertisement call types commonly categorized as rattle, honk, whinny, peeping, or clicking</w:t>
-      </w:r>
-      <w:r>
-        <w:t xml:space="preserve"> </w:t>
-      </w:r>
-      <w:r>
-        <w:t xml:space="preserve">(Kraus 2016)</w:t>
-      </w:r>
-      <w:r>
-        <w:t xml:space="preserve">. We found honk or peep call types are only found in</w:t>
-      </w:r>
-      <w:r>
-        <w:t xml:space="preserve"> </w:t>
-      </w:r>
-      <w:r>
-        <w:rPr>
-          <w:i/>
-          <w:iCs/>
-        </w:rPr>
-        <w:t xml:space="preserve">Oroephryne</w:t>
-      </w:r>
-      <w:r>
-        <w:t xml:space="preserve"> </w:t>
-      </w:r>
-      <w:r>
-        <w:t xml:space="preserve">species in our sample, while whinny calls are only found in</w:t>
-      </w:r>
-      <w:r>
-        <w:t xml:space="preserve"> </w:t>
-      </w:r>
-      <w:r>
-        <w:rPr>
-          <w:i/>
-          <w:iCs/>
-        </w:rPr>
-        <w:t xml:space="preserve">Auparoparo</w:t>
-      </w:r>
-      <w:r>
-        <w:t xml:space="preserve"> </w:t>
-      </w:r>
-      <w:r>
-        <w:t xml:space="preserve">species, and rattle calls are found in both genera (</w:t>
-      </w:r>
-      <w:hyperlink w:anchor="tbl-morph">
-        <w:r>
-          <w:rPr>
-            <w:rStyle w:val="Hyperlink"/>
-          </w:rPr>
-          <w:t xml:space="preserve">Table 3</w:t>
-        </w:r>
-      </w:hyperlink>
-      <w:r>
-        <w:t xml:space="preserve">). We note that several authors described species of each genus, thus the difference between genera cannot be attributed to the investigator. However, more complete sampling may add further complexity. As far as we are aware there has been no comprehensive acoustic analysis across</w:t>
-      </w:r>
-      <w:r>
-        <w:t xml:space="preserve"> </w:t>
-      </w:r>
-      <w:r>
-        <w:rPr>
-          <w:i/>
-          <w:iCs/>
-        </w:rPr>
-        <w:t xml:space="preserve">Oreophryne</w:t>
-      </w:r>
-      <w:r>
-        <w:t xml:space="preserve"> </w:t>
-      </w:r>
-      <w:r>
-        <w:t xml:space="preserve">sensu lato. More research is needed to explore call diversity both between species and across genera to undertand call evolution and whether there any features that are distinctive of genera.</w:t>
-      </w:r>
-    </w:p>
-    <w:bookmarkEnd w:id="57"/>
-    <w:bookmarkStart w:id="58" w:name="geographic-distribution-1"/>
-    <w:p>
-      <w:pPr>
-        <w:pStyle w:val="Heading2"/>
-      </w:pPr>
-      <w:r>
-        <w:t xml:space="preserve">Geographic Distribution</w:t>
-      </w:r>
-    </w:p>
-    <w:p>
-      <w:pPr>
-        <w:pStyle w:val="FirstParagraph"/>
-      </w:pPr>
-      <w:r>
-        <w:t xml:space="preserve">Both</w:t>
-      </w:r>
-      <w:r>
-        <w:t xml:space="preserve"> </w:t>
-      </w:r>
-      <w:r>
-        <w:rPr>
-          <w:i/>
-          <w:iCs/>
-        </w:rPr>
-        <w:t xml:space="preserve">Oreophryne</w:t>
-      </w:r>
-      <w:r>
-        <w:t xml:space="preserve"> </w:t>
-      </w:r>
-      <w:r>
-        <w:t xml:space="preserve">and</w:t>
-      </w:r>
-      <w:r>
-        <w:t xml:space="preserve"> </w:t>
-      </w:r>
-      <w:r>
-        <w:rPr>
-          <w:i/>
-          <w:iCs/>
-        </w:rPr>
-        <w:t xml:space="preserve">Auparoparo</w:t>
-      </w:r>
-      <w:r>
-        <w:t xml:space="preserve"> </w:t>
-      </w:r>
-      <w:r>
-        <w:t xml:space="preserve">are geographically centered in the mainland New Guinea.</w:t>
-      </w:r>
-      <w:r>
-        <w:t xml:space="preserve"> </w:t>
-      </w:r>
-      <w:r>
-        <w:rPr>
-          <w:i/>
-          <w:iCs/>
-        </w:rPr>
-        <w:t xml:space="preserve">Oreophryne</w:t>
-      </w:r>
-      <w:r>
-        <w:t xml:space="preserve"> </w:t>
-      </w:r>
-      <w:r>
-        <w:t xml:space="preserve">extends southward to the Louisiade Archipelago and northward to the South Philippine Islands</w:t>
-      </w:r>
-      <w:r>
-        <w:t xml:space="preserve"> </w:t>
-      </w:r>
-      <w:r>
-        <w:t xml:space="preserve">(Hill et al. 2023b)</w:t>
-      </w:r>
-      <w:r>
-        <w:t xml:space="preserve">. Addition of the type species</w:t>
-      </w:r>
-      <w:r>
-        <w:t xml:space="preserve"> </w:t>
-      </w:r>
-      <w:r>
-        <w:rPr>
-          <w:i/>
-          <w:iCs/>
-        </w:rPr>
-        <w:t xml:space="preserve">Oreophryne senkenbergiana</w:t>
-      </w:r>
-      <w:r>
-        <w:t xml:space="preserve"> </w:t>
-      </w:r>
-      <w:r>
-        <w:t xml:space="preserve">and</w:t>
-      </w:r>
-      <w:r>
-        <w:t xml:space="preserve"> </w:t>
-      </w:r>
-      <w:r>
-        <w:rPr>
-          <w:i/>
-          <w:iCs/>
-        </w:rPr>
-        <w:t xml:space="preserve">O. frontifasciata</w:t>
-      </w:r>
-      <w:r>
-        <w:t xml:space="preserve"> </w:t>
-      </w:r>
-      <w:r>
-        <w:t xml:space="preserve">expands the known range eastward to North Maluku, Indonesia (</w:t>
-      </w:r>
-      <w:hyperlink w:anchor="fig-map">
-        <w:r>
-          <w:rPr>
-            <w:rStyle w:val="Hyperlink"/>
-          </w:rPr>
-          <w:t xml:space="preserve">Figure 3</w:t>
-        </w:r>
-      </w:hyperlink>
-      <w:r>
-        <w:t xml:space="preserve">).</w:t>
-      </w:r>
-    </w:p>
-    <w:p>
-      <w:pPr>
-        <w:pStyle w:val="BodyText"/>
-      </w:pPr>
-      <w:r>
         <w:t xml:space="preserve">The known distribution of</w:t>
       </w:r>
       <w:r>
@@ -33295,7 +33311,7 @@
       </w:r>
     </w:p>
     <w:bookmarkEnd w:id="61"/>
-    <w:bookmarkStart w:id="157" w:name="citations"/>
+    <w:bookmarkStart w:id="156" w:name="citations"/>
     <w:p>
       <w:pPr>
         <w:pStyle w:val="Heading1"/>
@@ -33304,7 +33320,7 @@
         <w:t xml:space="preserve">Citations</w:t>
       </w:r>
     </w:p>
-    <w:bookmarkStart w:id="156" w:name="refs"/>
+    <w:bookmarkStart w:id="155" w:name="refs"/>
     <w:bookmarkStart w:id="62" w:name="ref-Ahl:1933"/>
     <w:p>
       <w:pPr>
@@ -33658,28 +33674,18 @@
       </w:r>
     </w:p>
     <w:bookmarkEnd w:id="87"/>
-    <w:bookmarkStart w:id="88" w:name="ref-Fry:1917"/>
+    <w:bookmarkStart w:id="89" w:name="ref-Gillman:2020"/>
     <w:p>
       <w:pPr>
         <w:pStyle w:val="Bibliography"/>
       </w:pPr>
       <w:r>
-        <w:t xml:space="preserve">Fry, D. B. 1917. Description of aphantophryne, a new batrachian genus from new guinea; with comparative notes on the pectoral musculature. Proceedings of the Linnean Society of New South Wales 41:770–785.</w:t>
-      </w:r>
-    </w:p>
-    <w:bookmarkEnd w:id="88"/>
-    <w:bookmarkStart w:id="90" w:name="ref-Gillman:2020"/>
-    <w:p>
-      <w:pPr>
-        <w:pStyle w:val="Bibliography"/>
-      </w:pPr>
-      <w:r>
         <w:t xml:space="preserve">Gillman, L. N., and S. D. Wright. 2020.</w:t>
       </w:r>
       <w:r>
         <w:t xml:space="preserve"> </w:t>
       </w:r>
-      <w:hyperlink r:id="rId89">
+      <w:hyperlink r:id="rId88">
         <w:r>
           <w:rPr>
             <w:rStyle w:val="Hyperlink"/>
@@ -33691,8 +33697,8 @@
         <w:t xml:space="preserve">. Communications Biology 3:609.</w:t>
       </w:r>
     </w:p>
-    <w:bookmarkEnd w:id="90"/>
-    <w:bookmarkStart w:id="92" w:name="ref-Green:1986"/>
+    <w:bookmarkEnd w:id="89"/>
+    <w:bookmarkStart w:id="91" w:name="ref-Green:1986"/>
     <w:p>
       <w:pPr>
         <w:pStyle w:val="Bibliography"/>
@@ -33703,7 +33709,7 @@
       <w:r>
         <w:t xml:space="preserve"> </w:t>
       </w:r>
-      <w:hyperlink r:id="rId91">
+      <w:hyperlink r:id="rId90">
         <w:r>
           <w:rPr>
             <w:rStyle w:val="Hyperlink"/>
@@ -33715,8 +33721,8 @@
         <w:t xml:space="preserve">. Australian Journal of Zoology 34:135–145.</w:t>
       </w:r>
     </w:p>
-    <w:bookmarkEnd w:id="92"/>
-    <w:bookmarkStart w:id="94" w:name="ref-Gunther:2023"/>
+    <w:bookmarkEnd w:id="91"/>
+    <w:bookmarkStart w:id="93" w:name="ref-Gunther:2023"/>
     <w:p>
       <w:pPr>
         <w:pStyle w:val="Bibliography"/>
@@ -33727,7 +33733,7 @@
       <w:r>
         <w:t xml:space="preserve"> </w:t>
       </w:r>
-      <w:hyperlink r:id="rId93">
+      <w:hyperlink r:id="rId92">
         <w:r>
           <w:rPr>
             <w:rStyle w:val="Hyperlink"/>
@@ -33771,8 +33777,8 @@
         <w:t xml:space="preserve">r Naturforschung.</w:t>
       </w:r>
     </w:p>
-    <w:bookmarkEnd w:id="94"/>
-    <w:bookmarkStart w:id="95" w:name="ref-Gunther:2011"/>
+    <w:bookmarkEnd w:id="93"/>
+    <w:bookmarkStart w:id="94" w:name="ref-Gunther:2011"/>
     <w:p>
       <w:pPr>
         <w:pStyle w:val="Bibliography"/>
@@ -33781,8 +33787,8 @@
         <w:t xml:space="preserve">Günther, R., and S. J. Richards. 2011. Five new microhylid frog species from enga province, papua new guinea, and remarks on albericus alpestris (anura, microhylidae). VERTEBRATE ZOOLOGY 61:343–372.</w:t>
       </w:r>
     </w:p>
-    <w:bookmarkEnd w:id="95"/>
-    <w:bookmarkStart w:id="96" w:name="ref-Gunther:2001"/>
+    <w:bookmarkEnd w:id="94"/>
+    <w:bookmarkStart w:id="95" w:name="ref-Gunther:2001"/>
     <w:p>
       <w:pPr>
         <w:pStyle w:val="Bibliography"/>
@@ -33791,8 +33797,8 @@
         <w:t xml:space="preserve">Günther, R., S. Richards, and D. T. Iskandar. 2001. Two new species of the genus oreophryne from irian jaya, indonesia (amphibia, anura, microhylidae). Spixiana 24:257–274.</w:t>
       </w:r>
     </w:p>
-    <w:bookmarkEnd w:id="96"/>
-    <w:bookmarkStart w:id="98" w:name="ref-Hill:2022"/>
+    <w:bookmarkEnd w:id="95"/>
+    <w:bookmarkStart w:id="97" w:name="ref-Hill:2022"/>
     <w:p>
       <w:pPr>
         <w:pStyle w:val="Bibliography"/>
@@ -33803,7 +33809,7 @@
       <w:r>
         <w:t xml:space="preserve"> </w:t>
       </w:r>
-      <w:hyperlink r:id="rId97">
+      <w:hyperlink r:id="rId96">
         <w:r>
           <w:rPr>
             <w:rStyle w:val="Hyperlink"/>
@@ -33815,8 +33821,8 @@
         <w:t xml:space="preserve">. Molecular Phylogenetics and Evolution 177. Academic Press Inc.</w:t>
       </w:r>
     </w:p>
-    <w:bookmarkEnd w:id="98"/>
-    <w:bookmarkStart w:id="99" w:name="ref-Hill:2023a"/>
+    <w:bookmarkEnd w:id="97"/>
+    <w:bookmarkStart w:id="98" w:name="ref-Hill:2023a"/>
     <w:p>
       <w:pPr>
         <w:pStyle w:val="Bibliography"/>
@@ -33825,8 +33831,8 @@
         <w:t xml:space="preserve">Hill, E. C., D. F. Gao, D. A. Polhemus, C. J. Fraser, B. Iova, A. Allison, and M. A. Butler. 2023a. Testing geology with biology: Plate tectonics and the diversification of microhylid frogs in the papuan region. Integrative Organismal Biology.</w:t>
       </w:r>
     </w:p>
-    <w:bookmarkEnd w:id="99"/>
-    <w:bookmarkStart w:id="101" w:name="ref-Hill:2023"/>
+    <w:bookmarkEnd w:id="98"/>
+    <w:bookmarkStart w:id="100" w:name="ref-Hill:2023"/>
     <w:p>
       <w:pPr>
         <w:pStyle w:val="Bibliography"/>
@@ -33837,7 +33843,7 @@
       <w:r>
         <w:t xml:space="preserve"> </w:t>
       </w:r>
-      <w:hyperlink r:id="rId100">
+      <w:hyperlink r:id="rId99">
         <w:r>
           <w:rPr>
             <w:rStyle w:val="Hyperlink"/>
@@ -33849,8 +33855,8 @@
         <w:t xml:space="preserve">. Data in Brief 47:108987.</w:t>
       </w:r>
     </w:p>
-    <w:bookmarkEnd w:id="101"/>
-    <w:bookmarkStart w:id="103" w:name="ref-VanKampen:1923"/>
+    <w:bookmarkEnd w:id="100"/>
+    <w:bookmarkStart w:id="102" w:name="ref-VanKampen:1923"/>
     <w:p>
       <w:pPr>
         <w:pStyle w:val="Bibliography"/>
@@ -33861,7 +33867,7 @@
       <w:r>
         <w:t xml:space="preserve"> </w:t>
       </w:r>
-      <w:hyperlink r:id="rId102">
+      <w:hyperlink r:id="rId101">
         <w:r>
           <w:rPr>
             <w:rStyle w:val="Hyperlink"/>
@@ -33873,8 +33879,8 @@
         <w:t xml:space="preserve">. E. J. Brill, ltd, Leiden.</w:t>
       </w:r>
     </w:p>
-    <w:bookmarkEnd w:id="103"/>
-    <w:bookmarkStart w:id="105" w:name="ref-Koehler:2008"/>
+    <w:bookmarkEnd w:id="102"/>
+    <w:bookmarkStart w:id="104" w:name="ref-Koehler:2008"/>
     <w:p>
       <w:pPr>
         <w:pStyle w:val="Bibliography"/>
@@ -33885,7 +33891,7 @@
       <w:r>
         <w:t xml:space="preserve"> </w:t>
       </w:r>
-      <w:hyperlink r:id="rId104">
+      <w:hyperlink r:id="rId103">
         <w:r>
           <w:rPr>
             <w:rStyle w:val="Hyperlink"/>
@@ -33897,8 +33903,8 @@
         <w:t xml:space="preserve">. Molecular Phylogenetics and Evolution 47:353–365. ACADEMIC PRESS INC ELSEVIER SCIENCE, 525 B ST, STE 1900, SAN DIEGO, CA 92101-4495 USA.</w:t>
       </w:r>
     </w:p>
-    <w:bookmarkEnd w:id="105"/>
-    <w:bookmarkStart w:id="107" w:name="ref-Kraus:2016"/>
+    <w:bookmarkEnd w:id="104"/>
+    <w:bookmarkStart w:id="106" w:name="ref-Kraus:2016"/>
     <w:p>
       <w:pPr>
         <w:pStyle w:val="Bibliography"/>
@@ -33909,7 +33915,7 @@
       <w:r>
         <w:t xml:space="preserve"> </w:t>
       </w:r>
-      <w:hyperlink r:id="rId106">
+      <w:hyperlink r:id="rId105">
         <w:r>
           <w:rPr>
             <w:rStyle w:val="Hyperlink"/>
@@ -33921,8 +33927,8 @@
         <w:t xml:space="preserve">. Zootaxa 4195:1–68. Magnolia Press.</w:t>
       </w:r>
     </w:p>
-    <w:bookmarkEnd w:id="107"/>
-    <w:bookmarkStart w:id="109" w:name="ref-Kraus:2013"/>
+    <w:bookmarkEnd w:id="106"/>
+    <w:bookmarkStart w:id="108" w:name="ref-Kraus:2013"/>
     <w:p>
       <w:pPr>
         <w:pStyle w:val="Bibliography"/>
@@ -33933,7 +33939,7 @@
       <w:r>
         <w:t xml:space="preserve"> </w:t>
       </w:r>
-      <w:hyperlink r:id="rId108">
+      <w:hyperlink r:id="rId107">
         <w:r>
           <w:rPr>
             <w:rStyle w:val="Hyperlink"/>
@@ -33945,8 +33951,8 @@
         <w:t xml:space="preserve">. ZOOKEYS 93–121.</w:t>
       </w:r>
     </w:p>
-    <w:bookmarkEnd w:id="109"/>
-    <w:bookmarkStart w:id="111" w:name="ref-Kraus:2009"/>
+    <w:bookmarkEnd w:id="108"/>
+    <w:bookmarkStart w:id="110" w:name="ref-Kraus:2009"/>
     <w:p>
       <w:pPr>
         <w:pStyle w:val="Bibliography"/>
@@ -33957,7 +33963,7 @@
       <w:r>
         <w:t xml:space="preserve"> </w:t>
       </w:r>
-      <w:hyperlink r:id="rId110">
+      <w:hyperlink r:id="rId109">
         <w:r>
           <w:rPr>
             <w:rStyle w:val="Hyperlink"/>
@@ -33969,8 +33975,8 @@
         <w:t xml:space="preserve">. ZooKeys 26:53–76.</w:t>
       </w:r>
     </w:p>
-    <w:bookmarkEnd w:id="111"/>
-    <w:bookmarkStart w:id="112" w:name="ref-Kraus:2004"/>
+    <w:bookmarkEnd w:id="110"/>
+    <w:bookmarkStart w:id="111" w:name="ref-Kraus:2004"/>
     <w:p>
       <w:pPr>
         <w:pStyle w:val="Bibliography"/>
@@ -33979,8 +33985,8 @@
         <w:t xml:space="preserve">Kraus, F., and A. Allison. 2004. Notes on poorly known new guinea frogs. I. Microhylids from the d’entrecasteaux islands. HERPETOFAUNA-SYDNEY- 34:26–39. AUSTRALASIAN AFFILIATION OF HERPETOLOGICAL.</w:t>
       </w:r>
     </w:p>
-    <w:bookmarkEnd w:id="112"/>
-    <w:bookmarkStart w:id="114" w:name="ref-Lanfear:2012"/>
+    <w:bookmarkEnd w:id="111"/>
+    <w:bookmarkStart w:id="113" w:name="ref-Lanfear:2012"/>
     <w:p>
       <w:pPr>
         <w:pStyle w:val="Bibliography"/>
@@ -33991,7 +33997,7 @@
       <w:r>
         <w:t xml:space="preserve"> </w:t>
       </w:r>
-      <w:hyperlink r:id="rId113">
+      <w:hyperlink r:id="rId112">
         <w:r>
           <w:rPr>
             <w:rStyle w:val="Hyperlink"/>
@@ -34003,8 +34009,8 @@
         <w:t xml:space="preserve">. Molecular Biology and Evolution 29:1695–1701.</w:t>
       </w:r>
     </w:p>
-    <w:bookmarkEnd w:id="114"/>
-    <w:bookmarkStart w:id="116" w:name="ref-Maddison:2023"/>
+    <w:bookmarkEnd w:id="113"/>
+    <w:bookmarkStart w:id="115" w:name="ref-Maddison:2023"/>
     <w:p>
       <w:pPr>
         <w:pStyle w:val="Bibliography"/>
@@ -34015,7 +34021,7 @@
       <w:r>
         <w:t xml:space="preserve"> </w:t>
       </w:r>
-      <w:hyperlink r:id="rId115">
+      <w:hyperlink r:id="rId114">
         <w:r>
           <w:rPr>
             <w:rStyle w:val="Hyperlink"/>
@@ -34027,8 +34033,8 @@
         <w:t xml:space="preserve">.</w:t>
       </w:r>
     </w:p>
-    <w:bookmarkEnd w:id="116"/>
-    <w:bookmarkStart w:id="117" w:name="ref-Mehely:1897"/>
+    <w:bookmarkEnd w:id="115"/>
+    <w:bookmarkStart w:id="116" w:name="ref-Mehely:1897"/>
     <w:p>
       <w:pPr>
         <w:pStyle w:val="Bibliography"/>
@@ -34049,8 +34055,8 @@
         <w:t xml:space="preserve">zetek 20:398–419.</w:t>
       </w:r>
     </w:p>
-    <w:bookmarkEnd w:id="117"/>
-    <w:bookmarkStart w:id="118" w:name="ref-Menzies:2006"/>
+    <w:bookmarkEnd w:id="116"/>
+    <w:bookmarkStart w:id="117" w:name="ref-Menzies:2006"/>
     <w:p>
       <w:pPr>
         <w:pStyle w:val="Bibliography"/>
@@ -34059,8 +34065,8 @@
         <w:t xml:space="preserve">Menzies, J. 2006. The frogs of new guinea and the solomon islands. Pensoft Publishers.</w:t>
       </w:r>
     </w:p>
-    <w:bookmarkEnd w:id="118"/>
-    <w:bookmarkStart w:id="120" w:name="ref-Minh:2020"/>
+    <w:bookmarkEnd w:id="117"/>
+    <w:bookmarkStart w:id="119" w:name="ref-Minh:2020"/>
     <w:p>
       <w:pPr>
         <w:pStyle w:val="Bibliography"/>
@@ -34071,7 +34077,7 @@
       <w:r>
         <w:t xml:space="preserve"> </w:t>
       </w:r>
-      <w:hyperlink r:id="rId119">
+      <w:hyperlink r:id="rId118">
         <w:r>
           <w:rPr>
             <w:rStyle w:val="Hyperlink"/>
@@ -34083,8 +34089,8 @@
         <w:t xml:space="preserve">. Molecular Biology and Evolution 37:1530–1534.</w:t>
       </w:r>
     </w:p>
-    <w:bookmarkEnd w:id="120"/>
-    <w:bookmarkStart w:id="121" w:name="ref-Muller:1894"/>
+    <w:bookmarkEnd w:id="119"/>
+    <w:bookmarkStart w:id="120" w:name="ref-Muller:1894"/>
     <w:p>
       <w:pPr>
         <w:pStyle w:val="Bibliography"/>
@@ -34093,8 +34099,8 @@
         <w:t xml:space="preserve">Müller, F. 1894. Reptilien und amphibien aus celebes. Verhandlungen der Naturforschenden Gesellschaft in Basel 10:825–843.</w:t>
       </w:r>
     </w:p>
-    <w:bookmarkEnd w:id="121"/>
-    <w:bookmarkStart w:id="122" w:name="ref-Parker:1934"/>
+    <w:bookmarkEnd w:id="120"/>
+    <w:bookmarkStart w:id="121" w:name="ref-Parker:1934"/>
     <w:p>
       <w:pPr>
         <w:pStyle w:val="Bibliography"/>
@@ -34103,8 +34109,8 @@
         <w:t xml:space="preserve">Parker, H. W. 1934. A monograph of the frogs of the family microhylidae. London: Trustees of the British Museum.</w:t>
       </w:r>
     </w:p>
-    <w:bookmarkEnd w:id="122"/>
-    <w:bookmarkStart w:id="123" w:name="ref-Peters:1878"/>
+    <w:bookmarkEnd w:id="121"/>
+    <w:bookmarkStart w:id="122" w:name="ref-Peters:1878"/>
     <w:p>
       <w:pPr>
         <w:pStyle w:val="Bibliography"/>
@@ -34113,8 +34119,8 @@
         <w:t xml:space="preserve">Peters, W. C. H., and G. Doria. 1878. Catalogo dei rettili e dei batraci raccolti da o. Beccari, l.m. D’albertis a.a. Bruijn nella sotto-regione austro-malese. Annali del Museo civico di storia naturale di Genova 13:323–450.</w:t>
       </w:r>
     </w:p>
-    <w:bookmarkEnd w:id="123"/>
-    <w:bookmarkStart w:id="125" w:name="ref-Putri:2023"/>
+    <w:bookmarkEnd w:id="122"/>
+    <w:bookmarkStart w:id="124" w:name="ref-Putri:2023"/>
     <w:p>
       <w:pPr>
         <w:pStyle w:val="Bibliography"/>
@@ -34125,7 +34131,7 @@
       <w:r>
         <w:t xml:space="preserve"> </w:t>
       </w:r>
-      <w:hyperlink r:id="rId124">
+      <w:hyperlink r:id="rId123">
         <w:r>
           <w:rPr>
             <w:rStyle w:val="Hyperlink"/>
@@ -34137,8 +34143,8 @@
         <w:t xml:space="preserve">. Zootaxa 5353:455–467.</w:t>
       </w:r>
     </w:p>
-    <w:bookmarkEnd w:id="125"/>
-    <w:bookmarkStart w:id="127" w:name="ref-R:2024"/>
+    <w:bookmarkEnd w:id="124"/>
+    <w:bookmarkStart w:id="126" w:name="ref-R:2024"/>
     <w:p>
       <w:pPr>
         <w:pStyle w:val="Bibliography"/>
@@ -34149,7 +34155,7 @@
       <w:r>
         <w:t xml:space="preserve"> </w:t>
       </w:r>
-      <w:hyperlink r:id="rId126">
+      <w:hyperlink r:id="rId125">
         <w:r>
           <w:rPr>
             <w:rStyle w:val="Hyperlink"/>
@@ -34161,8 +34167,8 @@
         <w:t xml:space="preserve">. R Foundation for Statistical Computing, Vienna, Austria.</w:t>
       </w:r>
     </w:p>
-    <w:bookmarkEnd w:id="127"/>
-    <w:bookmarkStart w:id="129" w:name="ref-Revell:2012"/>
+    <w:bookmarkEnd w:id="126"/>
+    <w:bookmarkStart w:id="128" w:name="ref-Revell:2012"/>
     <w:p>
       <w:pPr>
         <w:pStyle w:val="Bibliography"/>
@@ -34173,7 +34179,7 @@
       <w:r>
         <w:t xml:space="preserve"> </w:t>
       </w:r>
-      <w:hyperlink r:id="rId128">
+      <w:hyperlink r:id="rId127">
         <w:r>
           <w:rPr>
             <w:rStyle w:val="Hyperlink"/>
@@ -34185,8 +34191,8 @@
         <w:t xml:space="preserve">. Methods in Ecology and Evolution 3:217–223.</w:t>
       </w:r>
     </w:p>
-    <w:bookmarkEnd w:id="129"/>
-    <w:bookmarkStart w:id="131" w:name="ref-Rivera:2017"/>
+    <w:bookmarkEnd w:id="128"/>
+    <w:bookmarkStart w:id="130" w:name="ref-Rivera:2017"/>
     <w:p>
       <w:pPr>
         <w:pStyle w:val="Bibliography"/>
@@ -34197,7 +34203,7 @@
       <w:r>
         <w:t xml:space="preserve"> </w:t>
       </w:r>
-      <w:hyperlink r:id="rId130">
+      <w:hyperlink r:id="rId129">
         <w:r>
           <w:rPr>
             <w:rStyle w:val="Hyperlink"/>
@@ -34209,8 +34215,8 @@
         <w:t xml:space="preserve">. Molecular Phylogenetics and Evolution 112:1–11. Academic Press Inc.</w:t>
       </w:r>
     </w:p>
-    <w:bookmarkEnd w:id="131"/>
-    <w:bookmarkStart w:id="133" w:name="ref-Setiadi:2010"/>
+    <w:bookmarkEnd w:id="130"/>
+    <w:bookmarkStart w:id="132" w:name="ref-Setiadi:2010"/>
     <w:p>
       <w:pPr>
         <w:pStyle w:val="Bibliography"/>
@@ -34221,7 +34227,7 @@
       <w:r>
         <w:t xml:space="preserve"> </w:t>
       </w:r>
-      <w:hyperlink r:id="rId132">
+      <w:hyperlink r:id="rId131">
         <w:r>
           <w:rPr>
             <w:rStyle w:val="Hyperlink"/>
@@ -34233,8 +34239,8 @@
         <w:t xml:space="preserve">. Conservation Biology 24:553–562.</w:t>
       </w:r>
     </w:p>
-    <w:bookmarkEnd w:id="133"/>
-    <w:bookmarkStart w:id="135" w:name="ref-Soliz:2025"/>
+    <w:bookmarkEnd w:id="132"/>
+    <w:bookmarkStart w:id="134" w:name="ref-Soliz:2025"/>
     <w:p>
       <w:pPr>
         <w:pStyle w:val="Bibliography"/>
@@ -34245,7 +34251,7 @@
       <w:r>
         <w:t xml:space="preserve"> </w:t>
       </w:r>
-      <w:hyperlink r:id="rId134">
+      <w:hyperlink r:id="rId133">
         <w:r>
           <w:rPr>
             <w:rStyle w:val="Hyperlink"/>
@@ -34257,8 +34263,8 @@
         <w:t xml:space="preserve">. Acta Zoologica 106:38–54.</w:t>
       </w:r>
     </w:p>
-    <w:bookmarkEnd w:id="135"/>
-    <w:bookmarkStart w:id="137" w:name="ref-Tu:2018"/>
+    <w:bookmarkEnd w:id="134"/>
+    <w:bookmarkStart w:id="136" w:name="ref-Tu:2018"/>
     <w:p>
       <w:pPr>
         <w:pStyle w:val="Bibliography"/>
@@ -34269,7 +34275,7 @@
       <w:r>
         <w:t xml:space="preserve"> </w:t>
       </w:r>
-      <w:hyperlink r:id="rId136">
+      <w:hyperlink r:id="rId135">
         <w:r>
           <w:rPr>
             <w:rStyle w:val="Hyperlink"/>
@@ -34281,8 +34287,8 @@
         <w:t xml:space="preserve">. Mol Phylogenet Evol 126:85–91.</w:t>
       </w:r>
     </w:p>
-    <w:bookmarkEnd w:id="137"/>
-    <w:bookmarkStart w:id="139" w:name="ref-Werner:1898"/>
+    <w:bookmarkEnd w:id="136"/>
+    <w:bookmarkStart w:id="138" w:name="ref-Werner:1898"/>
     <w:p>
       <w:pPr>
         <w:pStyle w:val="Bibliography"/>
@@ -34293,7 +34299,7 @@
       <w:r>
         <w:t xml:space="preserve"> </w:t>
       </w:r>
-      <w:hyperlink r:id="rId138">
+      <w:hyperlink r:id="rId137">
         <w:r>
           <w:rPr>
             <w:rStyle w:val="Hyperlink"/>
@@ -34335,8 +34341,8 @@
         <w:t xml:space="preserve">. Zoologischer Anzeiger 21:552–556. Jena VEB Gustav Fischer Verlag.</w:t>
       </w:r>
     </w:p>
-    <w:bookmarkEnd w:id="139"/>
-    <w:bookmarkStart w:id="141" w:name="ref-Wickham:2016"/>
+    <w:bookmarkEnd w:id="138"/>
+    <w:bookmarkStart w:id="140" w:name="ref-Wickham:2016"/>
     <w:p>
       <w:pPr>
         <w:pStyle w:val="Bibliography"/>
@@ -34347,7 +34353,7 @@
       <w:r>
         <w:t xml:space="preserve"> </w:t>
       </w:r>
-      <w:hyperlink r:id="rId140">
+      <w:hyperlink r:id="rId139">
         <w:r>
           <w:rPr>
             <w:rStyle w:val="Hyperlink"/>
@@ -34359,8 +34365,8 @@
         <w:t xml:space="preserve">. Springer-Verlag New York.</w:t>
       </w:r>
     </w:p>
-    <w:bookmarkEnd w:id="141"/>
-    <w:bookmarkStart w:id="143" w:name="ref-Ye:2012"/>
+    <w:bookmarkEnd w:id="140"/>
+    <w:bookmarkStart w:id="142" w:name="ref-Ye:2012"/>
     <w:p>
       <w:pPr>
         <w:pStyle w:val="Bibliography"/>
@@ -34371,7 +34377,7 @@
       <w:r>
         <w:t xml:space="preserve"> </w:t>
       </w:r>
-      <w:hyperlink r:id="rId142">
+      <w:hyperlink r:id="rId141">
         <w:r>
           <w:rPr>
             <w:rStyle w:val="Hyperlink"/>
@@ -34383,8 +34389,8 @@
         <w:t xml:space="preserve">. BMC Bioinformatics 13:134.</w:t>
       </w:r>
     </w:p>
-    <w:bookmarkEnd w:id="143"/>
-    <w:bookmarkStart w:id="145" w:name="ref-Yu:2020"/>
+    <w:bookmarkEnd w:id="142"/>
+    <w:bookmarkStart w:id="144" w:name="ref-Yu:2020"/>
     <w:p>
       <w:pPr>
         <w:pStyle w:val="Bibliography"/>
@@ -34395,7 +34401,7 @@
       <w:r>
         <w:t xml:space="preserve"> </w:t>
       </w:r>
-      <w:hyperlink r:id="rId144">
+      <w:hyperlink r:id="rId143">
         <w:r>
           <w:rPr>
             <w:rStyle w:val="Hyperlink"/>
@@ -34407,8 +34413,8 @@
         <w:t xml:space="preserve">. Current Protocols in Bioinformatics 69:e96.</w:t>
       </w:r>
     </w:p>
-    <w:bookmarkEnd w:id="145"/>
-    <w:bookmarkStart w:id="147" w:name="ref-Yu:2017"/>
+    <w:bookmarkEnd w:id="144"/>
+    <w:bookmarkStart w:id="146" w:name="ref-Yu:2017"/>
     <w:p>
       <w:pPr>
         <w:pStyle w:val="Bibliography"/>
@@ -34419,7 +34425,7 @@
       <w:r>
         <w:t xml:space="preserve"> </w:t>
       </w:r>
-      <w:hyperlink r:id="rId146">
+      <w:hyperlink r:id="rId145">
         <w:r>
           <w:rPr>
             <w:rStyle w:val="Hyperlink"/>
@@ -34431,8 +34437,8 @@
         <w:t xml:space="preserve"> Methods in Ecology and Evolution 8:28–36.</w:t>
       </w:r>
     </w:p>
-    <w:bookmarkEnd w:id="147"/>
-    <w:bookmarkStart w:id="149" w:name="ref-ICZN:1999"/>
+    <w:bookmarkEnd w:id="146"/>
+    <w:bookmarkStart w:id="148" w:name="ref-ICZN:1999"/>
     <w:p>
       <w:pPr>
         <w:pStyle w:val="Bibliography"/>
@@ -34443,7 +34449,7 @@
       <w:r>
         <w:t xml:space="preserve"> </w:t>
       </w:r>
-      <w:hyperlink r:id="rId148">
+      <w:hyperlink r:id="rId147">
         <w:r>
           <w:rPr>
             <w:rStyle w:val="Hyperlink"/>
@@ -34455,8 +34461,8 @@
         <w:t xml:space="preserve">. London, International Trust for Zoological Nomenclature, c/o Natural History Museum, 1999.</w:t>
       </w:r>
     </w:p>
-    <w:bookmarkEnd w:id="149"/>
-    <w:bookmarkStart w:id="150" w:name="ref-Zweifel:2003"/>
+    <w:bookmarkEnd w:id="148"/>
+    <w:bookmarkStart w:id="149" w:name="ref-Zweifel:2003"/>
     <w:p>
       <w:pPr>
         <w:pStyle w:val="Bibliography"/>
@@ -34465,8 +34471,8 @@
         <w:t xml:space="preserve">Zweifel, R. G. 2003. A new species of microhylid frog, genus oreophryne, from papua new guinea. American Museum Novitates 1–8.</w:t>
       </w:r>
     </w:p>
-    <w:bookmarkEnd w:id="150"/>
-    <w:bookmarkStart w:id="151" w:name="ref-Zweifel:1956"/>
+    <w:bookmarkEnd w:id="149"/>
+    <w:bookmarkStart w:id="150" w:name="ref-Zweifel:1956"/>
     <w:p>
       <w:pPr>
         <w:pStyle w:val="Bibliography"/>
@@ -34475,8 +34481,8 @@
         <w:t xml:space="preserve">Zweifel, R. G. 1956. Microhylid frogs from new guinea, with descriptions of new species. American Museum Novitates 1–49.</w:t>
       </w:r>
     </w:p>
-    <w:bookmarkEnd w:id="151"/>
-    <w:bookmarkStart w:id="153" w:name="ref-Zweifel:2005"/>
+    <w:bookmarkEnd w:id="150"/>
+    <w:bookmarkStart w:id="152" w:name="ref-Zweifel:2005"/>
     <w:p>
       <w:pPr>
         <w:pStyle w:val="Bibliography"/>
@@ -34487,7 +34493,7 @@
       <w:r>
         <w:t xml:space="preserve"> </w:t>
       </w:r>
-      <w:hyperlink r:id="rId152">
+      <w:hyperlink r:id="rId151">
         <w:r>
           <w:rPr>
             <w:rStyle w:val="Hyperlink"/>
@@ -34499,8 +34505,8 @@
         <w:t xml:space="preserve">. American Museum Novitates 3495:1–25.</w:t>
       </w:r>
     </w:p>
-    <w:bookmarkEnd w:id="153"/>
-    <w:bookmarkStart w:id="155" w:name="ref-Zweifel:2003a"/>
+    <w:bookmarkEnd w:id="152"/>
+    <w:bookmarkStart w:id="154" w:name="ref-Zweifel:2003a"/>
     <w:p>
       <w:pPr>
         <w:pStyle w:val="Bibliography"/>
@@ -34511,7 +34517,7 @@
       <w:r>
         <w:t xml:space="preserve"> </w:t>
       </w:r>
-      <w:hyperlink r:id="rId154">
+      <w:hyperlink r:id="rId153">
         <w:r>
           <w:rPr>
             <w:rStyle w:val="Hyperlink"/>
@@ -34523,9 +34529,9 @@
         <w:t xml:space="preserve">. AMERICAN MUSEUM NOVITATES 1–31.</w:t>
       </w:r>
     </w:p>
+    <w:bookmarkEnd w:id="154"/>
     <w:bookmarkEnd w:id="155"/>
     <w:bookmarkEnd w:id="156"/>
-    <w:bookmarkEnd w:id="157"/>
     <w:sectPr/>
   </w:body>
 </w:document>

</xml_diff>

<commit_message>
updated README, cleaned up files
</commit_message>
<xml_diff>
--- a/Products/oreo-taxonomy.docx
+++ b/Products/oreo-taxonomy.docx
@@ -55,7 +55,7 @@
         <w:pStyle w:val="Date"/>
       </w:pPr>
       <w:r>
-        <w:t xml:space="preserve">2025-04-16</w:t>
+        <w:t xml:space="preserve">2025-04-18</w:t>
       </w:r>
     </w:p>
     <w:p>
@@ -129,7 +129,7 @@
         <w:t xml:space="preserve"> </w:t>
       </w:r>
       <w:r>
-        <w:t xml:space="preserve">is a large genus (73 species) with a surprisingly expansive distribution across Papua New Guinea to Southeast Asia, representing nearly all of the arboreal species in Asterophryinae. A recent molecular phylogeny has demonstrated that Oreophryne as currently recognized is polyphyletic and consists of two reciprocally monophyletic genera, one of which is highly supported as being the most basal of the entire subfamily whereas the other unrelated genus is ~2M years younger. Our acquisition of four samples from North Maluku Island, Indonesia, including a specimen of the type species,</w:t>
+        <w:t xml:space="preserve">is a large genus (73 or 75? species) with a surprisingly expansive distribution across Papua New Guinea to Southeast Asia, representing nearly all of the arboreal species in the microhylid subfamily Asterophryinae. A recent molecular phylogeny has demonstrated that Oreophryne as currently recognized is polyphyletic and consists of two reciprocally monophyletic genera, one of which is highly supported as being the most basal of the entire subfamily whereas the other unrelated genus is ~2M years younger. Our acquisition of four samples from North Maluku Island, Indonesia, including a specimen of the type species,</w:t>
       </w:r>
       <w:r>
         <w:t xml:space="preserve"> </w:t>
@@ -233,7 +233,7 @@
       </w:r>
     </w:p>
     <w:bookmarkEnd w:id="21"/>
-    <w:bookmarkStart w:id="29" w:name="introduction"/>
+    <w:bookmarkStart w:id="27" w:name="introduction"/>
     <w:p>
       <w:pPr>
         <w:pStyle w:val="Heading1"/>
@@ -443,7 +443,7 @@
         <w:pStyle w:val="BodyText"/>
       </w:pPr>
       <w:r>
-        <w:t xml:space="preserve">Although the generic taxonomy of Asterophryinae has had a turbulent history</w:t>
+        <w:t xml:space="preserve">Although the generic taxonomy of the subfamily Asterophryinae has had a turbulent history</w:t>
       </w:r>
       <w:r>
         <w:t xml:space="preserve"> </w:t>
@@ -468,7 +468,7 @@
         <w:t xml:space="preserve"> </w:t>
       </w:r>
       <w:r>
-        <w:t xml:space="preserve">sensu lato has been comparatively stable until recently. Generic designation to</w:t>
+        <w:t xml:space="preserve">sensu lato in particular has been comparatively stable until recently. Generic designation to</w:t>
       </w:r>
       <w:r>
         <w:t xml:space="preserve"> </w:t>
@@ -493,30 +493,35 @@
         <w:t xml:space="preserve">(Parker 1934; Zweifel 2003)</w:t>
       </w:r>
       <w:r>
-        <w:t xml:space="preserve">. However, this trait has never been demonstrated to be a synapomorphy.</w:t>
-      </w:r>
-      <w:r>
-        <w:t xml:space="preserve"> </w:t>
-      </w:r>
-      <w:hyperlink r:id="rId22">
-        <w:r>
-          <w:rPr>
-            <w:rStyle w:val="Hyperlink"/>
-          </w:rPr>
-          <w:t xml:space="preserve">– Cut Aphantophryne text 1 –</w:t>
-        </w:r>
-      </w:hyperlink>
-      <w:r>
-        <w:t xml:space="preserve"> </w:t>
-      </w:r>
-      <w:r>
-        <w:t xml:space="preserve">(Hill et al. 2022, 2023b)</w:t>
-      </w:r>
-      <w:r>
-        <w:t xml:space="preserve"> </w:t>
-      </w:r>
-      <w:r>
-        <w:t xml:space="preserve">established that Oreophryne sensu lato represents two reciprocally monophyletic groups, temporarily labeled</w:t>
+        <w:t xml:space="preserve">. However, this trait has never been demonstrated to be a synapomorphy. Hill et. al</w:t>
+      </w:r>
+      <w:r>
+        <w:t xml:space="preserve"> </w:t>
+      </w:r>
+      <w:r>
+        <w:t xml:space="preserve">(2022, 2023b)</w:t>
+      </w:r>
+      <w:r>
+        <w:t xml:space="preserve"> </w:t>
+      </w:r>
+      <w:r>
+        <w:t xml:space="preserve">established that</w:t>
+      </w:r>
+      <w:r>
+        <w:t xml:space="preserve"> </w:t>
+      </w:r>
+      <w:r>
+        <w:rPr>
+          <w:i/>
+          <w:iCs/>
+        </w:rPr>
+        <w:t xml:space="preserve">Oreophryne</w:t>
+      </w:r>
+      <w:r>
+        <w:t xml:space="preserve"> </w:t>
+      </w:r>
+      <w:r>
+        <w:t xml:space="preserve">sensu lato represents two reciprocally monophyletic groups, temporarily labeled</w:t>
       </w:r>
       <w:r>
         <w:t xml:space="preserve"> </w:t>
@@ -569,86 +574,10 @@
         <w:t xml:space="preserve">.</w:t>
       </w:r>
     </w:p>
+    <w:bookmarkStart w:id="26" w:name="taxonomic-history"/>
     <w:p>
       <w:pPr>
-        <w:pStyle w:val="BodyText"/>
-      </w:pPr>
-      <w:r>
-        <w:t xml:space="preserve">The aims of this study are to include the type species of</w:t>
-      </w:r>
-      <w:r>
-        <w:t xml:space="preserve"> </w:t>
-      </w:r>
-      <w:r>
-        <w:rPr>
-          <w:i/>
-          <w:iCs/>
-        </w:rPr>
-        <w:t xml:space="preserve">Oreophryne</w:t>
-      </w:r>
-      <w:r>
-        <w:t xml:space="preserve"> </w:t>
-      </w:r>
-      <w:r>
-        <w:t xml:space="preserve">(</w:t>
-      </w:r>
-      <w:r>
-        <w:rPr>
-          <w:i/>
-          <w:iCs/>
-        </w:rPr>
-        <w:t xml:space="preserve">Oreophryne senkenbergiana</w:t>
-      </w:r>
-      <w:r>
-        <w:t xml:space="preserve">) and its close sister taxon (</w:t>
-      </w:r>
-      <w:r>
-        <w:rPr>
-          <w:i/>
-          <w:iCs/>
-        </w:rPr>
-        <w:t xml:space="preserve">Oreophryne frontifasciata</w:t>
-      </w:r>
-      <w:r>
-        <w:t xml:space="preserve">) into a large Asterophrinae (subfamily-level) phylogeny, to develop a phylogenetic definition of</w:t>
-      </w:r>
-      <w:r>
-        <w:t xml:space="preserve"> </w:t>
-      </w:r>
-      <w:r>
-        <w:rPr>
-          <w:i/>
-          <w:iCs/>
-        </w:rPr>
-        <w:t xml:space="preserve">Oreophryne</w:t>
-      </w:r>
-      <w:r>
-        <w:t xml:space="preserve"> </w:t>
-      </w:r>
-      <w:r>
-        <w:t xml:space="preserve">and the new genus, and to name and describe the new genus. Furthermore, we analyze the morphological characteristics and distribution of these genera to assist collectors when identifying putative</w:t>
-      </w:r>
-      <w:r>
-        <w:t xml:space="preserve"> </w:t>
-      </w:r>
-      <w:r>
-        <w:rPr>
-          <w:i/>
-          <w:iCs/>
-        </w:rPr>
-        <w:t xml:space="preserve">Oreophryne</w:t>
-      </w:r>
-      <w:r>
-        <w:t xml:space="preserve"> </w:t>
-      </w:r>
-      <w:r>
-        <w:t xml:space="preserve">in the field, and discuss the evolutionary patterns and taxonomic utility of these morphological characters.</w:t>
-      </w:r>
-    </w:p>
-    <w:bookmarkStart w:id="28" w:name="taxonomic-history"/>
-    <w:p>
-      <w:pPr>
-        <w:pStyle w:val="Heading3"/>
+        <w:pStyle w:val="Heading4"/>
       </w:pPr>
       <w:r>
         <w:t xml:space="preserve">Taxonomic History:</w:t>
@@ -753,19 +682,6 @@
       <w:r>
         <w:t xml:space="preserve">.</w:t>
       </w:r>
-    </w:p>
-    <w:p>
-      <w:pPr>
-        <w:pStyle w:val="BodyText"/>
-      </w:pPr>
-      <w:hyperlink r:id="rId23">
-        <w:r>
-          <w:rPr>
-            <w:rStyle w:val="Hyperlink"/>
-          </w:rPr>
-          <w:t xml:space="preserve">– Cut Aphantophryne text 2 –</w:t>
-        </w:r>
-      </w:hyperlink>
     </w:p>
     <w:tbl>
       <w:tblPr>
@@ -780,7 +696,7 @@
       <w:tr>
         <w:tc>
           <w:tcPr/>
-          <w:bookmarkStart w:id="27" w:name="fig-morph"/>
+          <w:bookmarkStart w:id="25" w:name="fig-morph"/>
           <w:p>
             <w:pPr>
               <w:pStyle w:val="Compact"/>
@@ -791,18 +707,18 @@
                 <wp:inline>
                   <wp:extent cx="5334000" cy="4342140"/>
                   <wp:effectExtent b="0" l="0" r="0" t="0"/>
-                  <wp:docPr descr="" title="" id="25" name="Picture"/>
+                  <wp:docPr descr="" title="" id="23" name="Picture"/>
                   <a:graphic>
                     <a:graphicData uri="http://schemas.openxmlformats.org/drawingml/2006/picture">
                       <pic:pic>
                         <pic:nvPicPr>
-                          <pic:cNvPr descr="Figures/morphology_plate.png" id="26" name="Picture"/>
+                          <pic:cNvPr descr="Figures/morphology_plate.png" id="24" name="Picture"/>
                           <pic:cNvPicPr>
                             <a:picLocks noChangeArrowheads="1" noChangeAspect="1"/>
                           </pic:cNvPicPr>
                         </pic:nvPicPr>
                         <pic:blipFill>
-                          <a:blip r:embed="rId24"/>
+                          <a:blip r:embed="rId22"/>
                           <a:stretch>
                             <a:fillRect/>
                           </a:stretch>
@@ -967,7 +883,7 @@
               <w:t xml:space="preserve">in life, and (D) toe pads of the fore and hind limbs.</w:t>
             </w:r>
           </w:p>
-          <w:bookmarkEnd w:id="27"/>
+          <w:bookmarkEnd w:id="25"/>
         </w:tc>
       </w:tr>
     </w:tbl>
@@ -1001,7 +917,7 @@
         <w:t xml:space="preserve">(Hill et al. 2022, 2023b)</w:t>
       </w:r>
       <w:r>
-        <w:t xml:space="preserve">. Early molecular phylogenetic studies suggested monophyly but only included few taxa within a larger-scale study</w:t>
+        <w:t xml:space="preserve">. Early molecular phylogenetic studies suggested monophyly but only included a few taxa within a larger-scale study</w:t>
       </w:r>
       <w:r>
         <w:t xml:space="preserve"> </w:t>
@@ -1152,9 +1068,85 @@
         <w:t xml:space="preserve">most basal to the rest of the subfamily.</w:t>
       </w:r>
     </w:p>
-    <w:bookmarkEnd w:id="28"/>
-    <w:bookmarkEnd w:id="29"/>
-    <w:bookmarkStart w:id="40" w:name="materials-and-methods"/>
+    <w:p>
+      <w:pPr>
+        <w:pStyle w:val="BodyText"/>
+      </w:pPr>
+      <w:r>
+        <w:t xml:space="preserve">The aims of this study are to include the type species of</w:t>
+      </w:r>
+      <w:r>
+        <w:t xml:space="preserve"> </w:t>
+      </w:r>
+      <w:r>
+        <w:rPr>
+          <w:i/>
+          <w:iCs/>
+        </w:rPr>
+        <w:t xml:space="preserve">Oreophryne</w:t>
+      </w:r>
+      <w:r>
+        <w:t xml:space="preserve"> </w:t>
+      </w:r>
+      <w:r>
+        <w:t xml:space="preserve">(</w:t>
+      </w:r>
+      <w:r>
+        <w:rPr>
+          <w:i/>
+          <w:iCs/>
+        </w:rPr>
+        <w:t xml:space="preserve">Oreophryne senkenbergiana</w:t>
+      </w:r>
+      <w:r>
+        <w:t xml:space="preserve">) and its close sister taxon (</w:t>
+      </w:r>
+      <w:r>
+        <w:rPr>
+          <w:i/>
+          <w:iCs/>
+        </w:rPr>
+        <w:t xml:space="preserve">Oreophryne frontifasciata</w:t>
+      </w:r>
+      <w:r>
+        <w:t xml:space="preserve">) into a large Asterophrinae (subfamily-level) phylogeny, to develop a phylogenetic definition of</w:t>
+      </w:r>
+      <w:r>
+        <w:t xml:space="preserve"> </w:t>
+      </w:r>
+      <w:r>
+        <w:rPr>
+          <w:i/>
+          <w:iCs/>
+        </w:rPr>
+        <w:t xml:space="preserve">Oreophryne</w:t>
+      </w:r>
+      <w:r>
+        <w:t xml:space="preserve"> </w:t>
+      </w:r>
+      <w:r>
+        <w:t xml:space="preserve">and the new genus, and to name and describe the new genus. Furthermore, we analyze the morphological characteristics and distribution of these genera to assist collectors when identifying putative</w:t>
+      </w:r>
+      <w:r>
+        <w:t xml:space="preserve"> </w:t>
+      </w:r>
+      <w:r>
+        <w:rPr>
+          <w:i/>
+          <w:iCs/>
+        </w:rPr>
+        <w:t xml:space="preserve">Oreophryne</w:t>
+      </w:r>
+      <w:r>
+        <w:t xml:space="preserve"> </w:t>
+      </w:r>
+      <w:r>
+        <w:t xml:space="preserve">in the field, and discuss the evolutionary patterns and taxonomic utility of these morphological characters.</w:t>
+      </w:r>
+    </w:p>
+    <w:bookmarkEnd w:id="26"/>
+    <w:bookmarkEnd w:id="27"/>
+    <w:bookmarkStart w:id="37" w:name="materials-and-methods"/>
     <w:p>
       <w:pPr>
         <w:pStyle w:val="Heading1"/>
@@ -1171,7 +1163,7 @@
         <w:t xml:space="preserve">NOTE: M&amp;M IS FROM THE NEW OREOPHRYNE MANUSCRIPT - CHECK IF ANYTHING NEEDS TO BE BROUGHT OVER FROM THE GOOGLE DOC.</w:t>
       </w:r>
     </w:p>
-    <w:bookmarkStart w:id="31" w:name="taxon-sampling"/>
+    <w:bookmarkStart w:id="32" w:name="taxon-sampling"/>
     <w:p>
       <w:pPr>
         <w:pStyle w:val="Heading2"/>
@@ -1331,26 +1323,6 @@
       </w:r>
       <w:r>
         <w:t xml:space="preserve">.</w:t>
-      </w:r>
-    </w:p>
-    <w:p>
-      <w:pPr>
-        <w:pStyle w:val="SourceCode"/>
-      </w:pPr>
-      <w:r>
-        <w:rPr>
-          <w:rStyle w:val="VerbatimChar"/>
-        </w:rPr>
-        <w:t xml:space="preserve">Warning in read.table(file = file, header = header, sep = sep, quote = quote, :</w:t>
-      </w:r>
-      <w:r>
-        <w:br/>
-      </w:r>
-      <w:r>
-        <w:rPr>
-          <w:rStyle w:val="VerbatimChar"/>
-        </w:rPr>
-        <w:t xml:space="preserve">incomplete final line found by readTableHeader on '../Data/locality.csv'</w:t>
       </w:r>
     </w:p>
     <w:tbl>
@@ -1366,7 +1338,7 @@
       <w:tr>
         <w:tc>
           <w:tcPr/>
-          <w:bookmarkStart w:id="30" w:name="tbl-localities"/>
+          <w:bookmarkStart w:id="28" w:name="tbl-localities"/>
           <w:p>
             <w:pPr>
               <w:jc w:val="center"/>
@@ -2745,21 +2717,11 @@
               </w:tc>
             </w:tr>
           </w:tbl>
-          <w:bookmarkEnd w:id="30"/>
+          <w:bookmarkEnd w:id="28"/>
         </w:tc>
       </w:tr>
     </w:tbl>
-    <w:bookmarkEnd w:id="31"/>
-    <w:bookmarkStart w:id="35" w:name="data"/>
-    <w:p>
-      <w:pPr>
-        <w:pStyle w:val="Heading2"/>
-      </w:pPr>
-      <w:r>
-        <w:t xml:space="preserve">Data</w:t>
-      </w:r>
-    </w:p>
-    <w:bookmarkStart w:id="32" w:name="molecular-sequence"/>
+    <w:bookmarkStart w:id="29" w:name="molecular-sequence"/>
     <w:p>
       <w:pPr>
         <w:pStyle w:val="Heading3"/>
@@ -2902,8 +2864,8 @@
         <w:t xml:space="preserve">sensu lato was not available for this molecular diagnosis.</w:t>
       </w:r>
     </w:p>
-    <w:bookmarkEnd w:id="32"/>
-    <w:bookmarkStart w:id="34" w:name="X891284e0a0cb4c95d3f14f43be5136f71288feb"/>
+    <w:bookmarkEnd w:id="29"/>
+    <w:bookmarkStart w:id="31" w:name="X891284e0a0cb4c95d3f14f43be5136f71288feb"/>
     <w:p>
       <w:pPr>
         <w:pStyle w:val="Heading3"/>
@@ -3030,7 +2992,7 @@
       <w:tr>
         <w:tc>
           <w:tcPr/>
-          <w:bookmarkStart w:id="33" w:name="tbl-morphcharacters"/>
+          <w:bookmarkStart w:id="30" w:name="tbl-morphcharacters"/>
           <w:p>
             <w:pPr>
               <w:jc w:val="center"/>
@@ -4745,13 +4707,13 @@
               </w:tc>
             </w:tr>
           </w:tbl>
-          <w:bookmarkEnd w:id="33"/>
+          <w:bookmarkEnd w:id="30"/>
         </w:tc>
       </w:tr>
     </w:tbl>
-    <w:bookmarkEnd w:id="34"/>
-    <w:bookmarkEnd w:id="35"/>
-    <w:bookmarkStart w:id="36" w:name="nomenclature"/>
+    <w:bookmarkEnd w:id="31"/>
+    <w:bookmarkEnd w:id="32"/>
+    <w:bookmarkStart w:id="33" w:name="nomenclature"/>
     <w:p>
       <w:pPr>
         <w:pStyle w:val="Heading2"/>
@@ -4869,8 +4831,8 @@
         <w:t xml:space="preserve">.</w:t>
       </w:r>
     </w:p>
-    <w:bookmarkEnd w:id="36"/>
-    <w:bookmarkStart w:id="37" w:name="phylogenetic-reconstruction"/>
+    <w:bookmarkEnd w:id="33"/>
+    <w:bookmarkStart w:id="34" w:name="phylogenetic-reconstruction"/>
     <w:p>
       <w:pPr>
         <w:pStyle w:val="Heading2"/>
@@ -4896,8 +4858,8 @@
         <w:t xml:space="preserve">. We tested models partitioned by both locus and codon versus by loci only (15 vs. 5 partition scheme), and found that the locus and codon model was superior by the Akaike Information Criterion. Nodal support values for the ML tree were inferred using 2000 bootstrap replicates.</w:t>
       </w:r>
     </w:p>
-    <w:bookmarkEnd w:id="37"/>
-    <w:bookmarkStart w:id="38" w:name="phylogenetic-definition"/>
+    <w:bookmarkEnd w:id="34"/>
+    <w:bookmarkStart w:id="35" w:name="phylogenetic-definition"/>
     <w:p>
       <w:pPr>
         <w:pStyle w:val="Heading2"/>
@@ -4923,8 +4885,8 @@
         <w:t xml:space="preserve">, specifically, the largest crown clade originating with the most recent common ancestor of the reference species for the clade (e.g., the type species of the genus), and all extant species of the clade more recently than they do with reference species of other clades (i.e., in this study, other generic-level clades). This definition is robust to uncertainty in basal relationships such as in the case of adaptive radiations with short branch lengths along the backbone as in Asterophryinae, as well as being robust to identification of new species and new clades.</w:t>
       </w:r>
     </w:p>
-    <w:bookmarkEnd w:id="38"/>
-    <w:bookmarkStart w:id="39" w:name="Xd1f882dcb3586d0cf347d8ecffd42cfce6c9b61"/>
+    <w:bookmarkEnd w:id="35"/>
+    <w:bookmarkStart w:id="36" w:name="Xd1f882dcb3586d0cf347d8ecffd42cfce6c9b61"/>
     <w:p>
       <w:pPr>
         <w:pStyle w:val="Heading2"/>
@@ -5105,9 +5067,9 @@
         <w:t xml:space="preserve">. All data, alignments, and code to reproduce analyses are available in the public repository …</w:t>
       </w:r>
     </w:p>
-    <w:bookmarkEnd w:id="39"/>
-    <w:bookmarkEnd w:id="40"/>
-    <w:bookmarkStart w:id="55" w:name="results"/>
+    <w:bookmarkEnd w:id="36"/>
+    <w:bookmarkEnd w:id="37"/>
+    <w:bookmarkStart w:id="52" w:name="results"/>
     <w:p>
       <w:pPr>
         <w:pStyle w:val="Heading1"/>
@@ -5116,7 +5078,7 @@
         <w:t xml:space="preserve">Results</w:t>
       </w:r>
     </w:p>
-    <w:bookmarkStart w:id="45" w:name="phylogeny-and-phylogenetic-taxonomy"/>
+    <w:bookmarkStart w:id="42" w:name="phylogeny-and-phylogenetic-taxonomy"/>
     <w:p>
       <w:pPr>
         <w:pStyle w:val="Heading2"/>
@@ -5340,7 +5302,7 @@
       <w:tr>
         <w:tc>
           <w:tcPr/>
-          <w:bookmarkStart w:id="44" w:name="fig-phylo"/>
+          <w:bookmarkStart w:id="41" w:name="fig-phylo"/>
           <w:p>
             <w:pPr>
               <w:pStyle w:val="Compact"/>
@@ -5351,18 +5313,18 @@
                 <wp:inline>
                   <wp:extent cx="5334000" cy="7620000"/>
                   <wp:effectExtent b="0" l="0" r="0" t="0"/>
-                  <wp:docPr descr="" title="" id="42" name="Picture"/>
+                  <wp:docPr descr="" title="" id="39" name="Picture"/>
                   <a:graphic>
                     <a:graphicData uri="http://schemas.openxmlformats.org/drawingml/2006/picture">
                       <pic:pic>
                         <pic:nvPicPr>
-                          <pic:cNvPr descr="Figures/FullTree_support_highlight.png" id="43" name="Picture"/>
+                          <pic:cNvPr descr="Figures/FullTree_support_highlight.png" id="40" name="Picture"/>
                           <pic:cNvPicPr>
                             <a:picLocks noChangeArrowheads="1" noChangeAspect="1"/>
                           </pic:cNvPicPr>
                         </pic:nvPicPr>
                         <pic:blipFill>
-                          <a:blip r:embed="rId41"/>
+                          <a:blip r:embed="rId38"/>
                           <a:stretch>
                             <a:fillRect/>
                           </a:stretch>
@@ -5460,35 +5422,6 @@
               <w:t xml:space="preserve">Oreophryne senkenbergiana</w:t>
             </w:r>
             <w:r>
-              <w:t xml:space="preserve">. The former genus</w:t>
-            </w:r>
-            <w:r>
-              <w:t xml:space="preserve"> </w:t>
-            </w:r>
-            <w:r>
-              <w:rPr>
-                <w:i/>
-                <w:iCs/>
-              </w:rPr>
-              <w:t xml:space="preserve">Aphantophryne</w:t>
-            </w:r>
-            <w:r>
-              <w:t xml:space="preserve"> </w:t>
-            </w:r>
-            <w:r>
-              <w:t xml:space="preserve">(node C) is a monophyletic clade nested within</w:t>
-            </w:r>
-            <w:r>
-              <w:t xml:space="preserve"> </w:t>
-            </w:r>
-            <w:r>
-              <w:rPr>
-                <w:i/>
-                <w:iCs/>
-              </w:rPr>
-              <w:t xml:space="preserve">Auparoparo</w:t>
-            </w:r>
-            <w:r>
               <w:t xml:space="preserve">. Based on two mitochondrial and three nuclear markers following</w:t>
             </w:r>
             <w:r>
@@ -5510,12 +5443,12 @@
               <w:t xml:space="preserve">. Nodal support: black dots indicate ML boostrap support &gt;= 95%, grey dots &gt;= 75%, numeric values given for nodes below 75% support. Outgroup taxa excluded.</w:t>
             </w:r>
           </w:p>
-          <w:bookmarkEnd w:id="44"/>
+          <w:bookmarkEnd w:id="41"/>
         </w:tc>
       </w:tr>
     </w:tbl>
-    <w:bookmarkEnd w:id="45"/>
-    <w:bookmarkStart w:id="47" w:name="morphology-behavior-and-ranked-taxonomy"/>
+    <w:bookmarkEnd w:id="42"/>
+    <w:bookmarkStart w:id="44" w:name="morphology-behavior-and-ranked-taxonomy"/>
     <w:p>
       <w:pPr>
         <w:pStyle w:val="Heading2"/>
@@ -5529,7 +5462,7 @@
         <w:pStyle w:val="FirstParagraph"/>
       </w:pPr>
       <w:r>
-        <w:t xml:space="preserve">We find no morphological synapomorphies that unite</w:t>
+        <w:t xml:space="preserve">We find no morphological synapomorphies that distinguish</w:t>
       </w:r>
       <w:r>
         <w:t xml:space="preserve"> </w:t>
@@ -5545,7 +5478,61 @@
         <w:t xml:space="preserve"> </w:t>
       </w:r>
       <w:r>
-        <w:t xml:space="preserve">nor distinguish</w:t>
+        <w:t xml:space="preserve">from</w:t>
+      </w:r>
+      <w:r>
+        <w:t xml:space="preserve"> </w:t>
+      </w:r>
+      <w:r>
+        <w:rPr>
+          <w:i/>
+          <w:iCs/>
+        </w:rPr>
+        <w:t xml:space="preserve">Oreophryne</w:t>
+      </w:r>
+      <w:r>
+        <w:t xml:space="preserve">.</w:t>
+      </w:r>
+      <w:r>
+        <w:t xml:space="preserve"> </w:t>
+      </w:r>
+      <w:r>
+        <w:rPr>
+          <w:i/>
+          <w:iCs/>
+        </w:rPr>
+        <w:t xml:space="preserve">Oreophryne</w:t>
+      </w:r>
+      <w:r>
+        <w:t xml:space="preserve"> </w:t>
+      </w:r>
+      <w:r>
+        <w:t xml:space="preserve">sensu lato is diagnosed by characters of the pectoral girdle: posessing highly reduced, curved procoracoid cartilages and clavicles, and lacking an omosternum</w:t>
+      </w:r>
+      <w:r>
+        <w:t xml:space="preserve"> </w:t>
+      </w:r>
+      <w:r>
+        <w:t xml:space="preserve">(Parker 1934; Zweifel 2003)</w:t>
+      </w:r>
+      <w:r>
+        <w:t xml:space="preserve">. We found that this suite of characters are present in both</w:t>
+      </w:r>
+      <w:r>
+        <w:t xml:space="preserve"> </w:t>
+      </w:r>
+      <w:r>
+        <w:rPr>
+          <w:i/>
+          <w:iCs/>
+        </w:rPr>
+        <w:t xml:space="preserve">Oreophryne</w:t>
+      </w:r>
+      <w:r>
+        <w:t xml:space="preserve"> </w:t>
+      </w:r>
+      <w:r>
+        <w:t xml:space="preserve">and</w:t>
       </w:r>
       <w:r>
         <w:t xml:space="preserve"> </w:t>
@@ -5558,10 +5545,7 @@
         <w:t xml:space="preserve">Auparoparo</w:t>
       </w:r>
       <w:r>
-        <w:t xml:space="preserve"> </w:t>
-      </w:r>
-      <w:r>
-        <w:t xml:space="preserve">from</w:t>
+        <w:t xml:space="preserve">, and therefore is not diagnostic for neither</w:t>
       </w:r>
       <w:r>
         <w:t xml:space="preserve"> </w:t>
@@ -5574,50 +5558,10 @@
         <w:t xml:space="preserve">Oreophryne</w:t>
       </w:r>
       <w:r>
-        <w:t xml:space="preserve">.</w:t>
-      </w:r>
-    </w:p>
-    <w:p>
-      <w:pPr>
-        <w:pStyle w:val="BodyText"/>
-      </w:pPr>
-      <w:r>
-        <w:rPr>
-          <w:i/>
-          <w:iCs/>
-        </w:rPr>
-        <w:t xml:space="preserve">Oreophryne</w:t>
-      </w:r>
-      <w:r>
-        <w:t xml:space="preserve"> </w:t>
-      </w:r>
-      <w:r>
-        <w:t xml:space="preserve">sensu lato is diagnosed by characters of the pectoral girdle: posessing highly reduced, curved procoracoid cartilages and clavicles, and lacking an omosternum</w:t>
-      </w:r>
-      <w:r>
-        <w:t xml:space="preserve"> </w:t>
-      </w:r>
-      <w:r>
-        <w:t xml:space="preserve">(Parker 1934; Zweifel 2003)</w:t>
-      </w:r>
-      <w:r>
-        <w:t xml:space="preserve">. We found that this suite of characters are present in both</w:t>
-      </w:r>
-      <w:r>
-        <w:t xml:space="preserve"> </w:t>
-      </w:r>
-      <w:r>
-        <w:rPr>
-          <w:i/>
-          <w:iCs/>
-        </w:rPr>
-        <w:t xml:space="preserve">Oreophryne</w:t>
-      </w:r>
-      <w:r>
-        <w:t xml:space="preserve"> </w:t>
-      </w:r>
-      <w:r>
-        <w:t xml:space="preserve">and</w:t>
+        <w:t xml:space="preserve"> </w:t>
+      </w:r>
+      <w:r>
+        <w:t xml:space="preserve">nor</w:t>
       </w:r>
       <w:r>
         <w:t xml:space="preserve"> </w:t>
@@ -5630,52 +5574,10 @@
         <w:t xml:space="preserve">Auparoparo</w:t>
       </w:r>
       <w:r>
-        <w:t xml:space="preserve">, but not</w:t>
-      </w:r>
-      <w:r>
-        <w:t xml:space="preserve"> </w:t>
-      </w:r>
-      <w:r>
-        <w:rPr>
-          <w:i/>
-          <w:iCs/>
-        </w:rPr>
-        <w:t xml:space="preserve">Aphantophryne</w:t>
-      </w:r>
-      <w:r>
-        <w:t xml:space="preserve">, and therefore is not diagnostic for</w:t>
-      </w:r>
-      <w:r>
-        <w:t xml:space="preserve"> </w:t>
-      </w:r>
-      <w:r>
-        <w:rPr>
-          <w:i/>
-          <w:iCs/>
-        </w:rPr>
-        <w:t xml:space="preserve">Oreophryne</w:t>
-      </w:r>
-      <w:r>
-        <w:t xml:space="preserve"> </w:t>
-      </w:r>
-      <w:r>
-        <w:t xml:space="preserve">nor</w:t>
-      </w:r>
-      <w:r>
-        <w:t xml:space="preserve"> </w:t>
-      </w:r>
-      <w:r>
-        <w:rPr>
-          <w:i/>
-          <w:iCs/>
-        </w:rPr>
-        <w:t xml:space="preserve">Auparoparo</w:t>
-      </w:r>
-      <w:r>
-        <w:t xml:space="preserve"> </w:t>
-      </w:r>
-      <w:r>
-        <w:t xml:space="preserve">either separately nor for both clades together (</w:t>
+        <w:t xml:space="preserve"> </w:t>
+      </w:r>
+      <w:r>
+        <w:t xml:space="preserve">(</w:t>
       </w:r>
       <w:hyperlink w:anchor="tbl-morph">
         <w:r>
@@ -5688,22 +5590,6 @@
       <w:r>
         <w:t xml:space="preserve">).</w:t>
       </w:r>
-      <w:r>
-        <w:t xml:space="preserve"> </w:t>
-      </w:r>
-      <w:r>
-        <w:rPr>
-          <w:i/>
-          <w:iCs/>
-        </w:rPr>
-        <w:t xml:space="preserve">Aphantophryne</w:t>
-      </w:r>
-      <w:r>
-        <w:t xml:space="preserve"> </w:t>
-      </w:r>
-      <w:r>
-        <w:t xml:space="preserve">in contrast, lacks clavicles as well as procoracoid cartilages and an omasternum.</w:t>
-      </w:r>
     </w:p>
     <w:p>
       <w:pPr>
@@ -5731,34 +5617,29 @@
           <w:i/>
           <w:iCs/>
         </w:rPr>
-        <w:t xml:space="preserve">Aphantophryne</w:t>
-      </w:r>
-      <w:r>
-        <w:t xml:space="preserve"> </w:t>
-      </w:r>
-      <w:r>
-        <w:t xml:space="preserve">is a small, high-elevation fosssorial clade that call using</w:t>
-      </w:r>
-      <w:r>
-        <w:t xml:space="preserve"> </w:t>
-      </w:r>
-      <w:r>
-        <w:t xml:space="preserve">“clicks”</w:t>
-      </w:r>
-      <w:r>
-        <w:t xml:space="preserve"> </w:t>
-      </w:r>
-      <w:r>
-        <w:t xml:space="preserve">and have no toe pads. They have undifferentiated toe tips with ordinary squamous epithelium</w:t>
-      </w:r>
-      <w:r>
-        <w:t xml:space="preserve"> </w:t>
-      </w:r>
-      <w:r>
-        <w:t xml:space="preserve">(Green and Simon 1986)</w:t>
-      </w:r>
-      <w:r>
-        <w:t xml:space="preserve">.</w:t>
+        <w:t xml:space="preserve">Oreophryne</w:t>
+      </w:r>
+      <w:r>
+        <w:t xml:space="preserve"> </w:t>
+      </w:r>
+      <w:r>
+        <w:t xml:space="preserve">is an arboreal clade with expanded digital pads of roughly equal width between the fingers and toes, whereas</w:t>
+      </w:r>
+      <w:r>
+        <w:t xml:space="preserve"> </w:t>
+      </w:r>
+      <w:r>
+        <w:rPr>
+          <w:i/>
+          <w:iCs/>
+        </w:rPr>
+        <w:t xml:space="preserve">Auparoparo</w:t>
+      </w:r>
+      <w:r>
+        <w:t xml:space="preserve"> </w:t>
+      </w:r>
+      <w:r>
+        <w:t xml:space="preserve">have visibly larger finger pads, with finger pads roughly 20-30% wider than toes. Both</w:t>
       </w:r>
       <w:r>
         <w:t xml:space="preserve"> </w:t>
@@ -5774,7 +5655,7 @@
         <w:t xml:space="preserve"> </w:t>
       </w:r>
       <w:r>
-        <w:t xml:space="preserve">is an arboreal clade with expanded digital pads of roughly equal width between the fingers and toes, whereas</w:t>
+        <w:t xml:space="preserve">and</w:t>
       </w:r>
       <w:r>
         <w:t xml:space="preserve"> </w:t>
@@ -5790,23 +5671,31 @@
         <w:t xml:space="preserve"> </w:t>
       </w:r>
       <w:r>
-        <w:t xml:space="preserve">excluding</w:t>
-      </w:r>
-      <w:r>
-        <w:t xml:space="preserve"> </w:t>
-      </w:r>
-      <w:r>
-        <w:rPr>
-          <w:i/>
-          <w:iCs/>
-        </w:rPr>
-        <w:t xml:space="preserve">Aphantophryne</w:t>
-      </w:r>
-      <w:r>
-        <w:t xml:space="preserve"> </w:t>
-      </w:r>
-      <w:r>
-        <w:t xml:space="preserve">have visibly larger finger pads, with finger pads roughly 20-30% wider than toes. Both</w:t>
+        <w:t xml:space="preserve">use a variety of call types, with</w:t>
+      </w:r>
+      <w:r>
+        <w:t xml:space="preserve"> </w:t>
+      </w:r>
+      <w:r>
+        <w:t xml:space="preserve">“honks”</w:t>
+      </w:r>
+      <w:r>
+        <w:t xml:space="preserve"> </w:t>
+      </w:r>
+      <w:r>
+        <w:t xml:space="preserve">or</w:t>
+      </w:r>
+      <w:r>
+        <w:t xml:space="preserve"> </w:t>
+      </w:r>
+      <w:r>
+        <w:t xml:space="preserve">“peeps”</w:t>
+      </w:r>
+      <w:r>
+        <w:t xml:space="preserve"> </w:t>
+      </w:r>
+      <w:r>
+        <w:t xml:space="preserve">used only by</w:t>
       </w:r>
       <w:r>
         <w:t xml:space="preserve"> </w:t>
@@ -5819,10 +5708,19 @@
         <w:t xml:space="preserve">Oreophryne</w:t>
       </w:r>
       <w:r>
-        <w:t xml:space="preserve"> </w:t>
-      </w:r>
-      <w:r>
-        <w:t xml:space="preserve">and</w:t>
+        <w:t xml:space="preserve">, whereas</w:t>
+      </w:r>
+      <w:r>
+        <w:t xml:space="preserve"> </w:t>
+      </w:r>
+      <w:r>
+        <w:t xml:space="preserve">“whinny”</w:t>
+      </w:r>
+      <w:r>
+        <w:t xml:space="preserve"> </w:t>
+      </w:r>
+      <w:r>
+        <w:t xml:space="preserve">calls are used only by arboreal</w:t>
       </w:r>
       <w:r>
         <w:t xml:space="preserve"> </w:t>
@@ -5835,87 +5733,6 @@
         <w:t xml:space="preserve">Auparoparo</w:t>
       </w:r>
       <w:r>
-        <w:t xml:space="preserve"> </w:t>
-      </w:r>
-      <w:r>
-        <w:t xml:space="preserve">excluding</w:t>
-      </w:r>
-      <w:r>
-        <w:t xml:space="preserve"> </w:t>
-      </w:r>
-      <w:r>
-        <w:rPr>
-          <w:i/>
-          <w:iCs/>
-        </w:rPr>
-        <w:t xml:space="preserve">Aphantophryne</w:t>
-      </w:r>
-      <w:r>
-        <w:t xml:space="preserve"> </w:t>
-      </w:r>
-      <w:r>
-        <w:t xml:space="preserve">use a variety of call types, with</w:t>
-      </w:r>
-      <w:r>
-        <w:t xml:space="preserve"> </w:t>
-      </w:r>
-      <w:r>
-        <w:t xml:space="preserve">“honks”</w:t>
-      </w:r>
-      <w:r>
-        <w:t xml:space="preserve"> </w:t>
-      </w:r>
-      <w:r>
-        <w:t xml:space="preserve">or</w:t>
-      </w:r>
-      <w:r>
-        <w:t xml:space="preserve"> </w:t>
-      </w:r>
-      <w:r>
-        <w:t xml:space="preserve">“peeps”</w:t>
-      </w:r>
-      <w:r>
-        <w:t xml:space="preserve"> </w:t>
-      </w:r>
-      <w:r>
-        <w:t xml:space="preserve">used only by</w:t>
-      </w:r>
-      <w:r>
-        <w:t xml:space="preserve"> </w:t>
-      </w:r>
-      <w:r>
-        <w:rPr>
-          <w:i/>
-          <w:iCs/>
-        </w:rPr>
-        <w:t xml:space="preserve">Oreophryne</w:t>
-      </w:r>
-      <w:r>
-        <w:t xml:space="preserve">, whereas</w:t>
-      </w:r>
-      <w:r>
-        <w:t xml:space="preserve"> </w:t>
-      </w:r>
-      <w:r>
-        <w:t xml:space="preserve">“whinny”</w:t>
-      </w:r>
-      <w:r>
-        <w:t xml:space="preserve"> </w:t>
-      </w:r>
-      <w:r>
-        <w:t xml:space="preserve">calls are used only by arboreal</w:t>
-      </w:r>
-      <w:r>
-        <w:t xml:space="preserve"> </w:t>
-      </w:r>
-      <w:r>
-        <w:rPr>
-          <w:i/>
-          <w:iCs/>
-        </w:rPr>
-        <w:t xml:space="preserve">Auparoparo</w:t>
-      </w:r>
-      <w:r>
         <w:t xml:space="preserve">. A minority of species in both groups use the</w:t>
       </w:r>
       <w:r>
@@ -5928,39 +5745,7 @@
         <w:t xml:space="preserve"> </w:t>
       </w:r>
       <w:r>
-        <w:t xml:space="preserve">call type. Aside from the fact that</w:t>
-      </w:r>
-      <w:r>
-        <w:t xml:space="preserve"> </w:t>
-      </w:r>
-      <w:r>
-        <w:rPr>
-          <w:i/>
-          <w:iCs/>
-        </w:rPr>
-        <w:t xml:space="preserve">Aphantophryne</w:t>
-      </w:r>
-      <w:r>
-        <w:t xml:space="preserve"> </w:t>
-      </w:r>
-      <w:r>
-        <w:t xml:space="preserve">and</w:t>
-      </w:r>
-      <w:r>
-        <w:t xml:space="preserve"> </w:t>
-      </w:r>
-      <w:r>
-        <w:rPr>
-          <w:i/>
-          <w:iCs/>
-        </w:rPr>
-        <w:t xml:space="preserve">Auparoparo</w:t>
-      </w:r>
-      <w:r>
-        <w:t xml:space="preserve"> </w:t>
-      </w:r>
-      <w:r>
-        <w:t xml:space="preserve">are so phenotypically distinct that no diagnostic traits identify them as a group, both toe pad width and call type are variable traits with some overlap and thus not reliable for diagnosis. Furthermore, toe pad is clearly an adaptive trait for arboreality.</w:t>
+        <w:t xml:space="preserve">call type. Both toe pad width and call type are variable traits with some overlap and thus not reliable for diagnosis. Furthermore, toe pad is clearly an adaptive trait for arboreality.</w:t>
       </w:r>
     </w:p>
     <w:tbl>
@@ -5976,7 +5761,7 @@
       <w:tr>
         <w:tc>
           <w:tcPr/>
-          <w:bookmarkStart w:id="46" w:name="tbl-morph"/>
+          <w:bookmarkStart w:id="43" w:name="tbl-morph"/>
           <w:p>
             <w:pPr>
               <w:jc w:val="center"/>
@@ -26842,12 +26627,12 @@
               </w:tc>
             </w:tr>
           </w:tbl>
-          <w:bookmarkEnd w:id="46"/>
+          <w:bookmarkEnd w:id="43"/>
         </w:tc>
       </w:tr>
     </w:tbl>
-    <w:bookmarkEnd w:id="47"/>
-    <w:bookmarkStart w:id="52" w:name="geographic-distribution"/>
+    <w:bookmarkEnd w:id="44"/>
+    <w:bookmarkStart w:id="49" w:name="geographic-distribution"/>
     <w:p>
       <w:pPr>
         <w:pStyle w:val="Heading2"/>
@@ -26923,7 +26708,7 @@
       <w:tr>
         <w:tc>
           <w:tcPr/>
-          <w:bookmarkStart w:id="51" w:name="fig-map"/>
+          <w:bookmarkStart w:id="48" w:name="fig-map"/>
           <w:p>
             <w:pPr>
               <w:pStyle w:val="Compact"/>
@@ -26934,18 +26719,18 @@
                 <wp:inline>
                   <wp:extent cx="5334000" cy="3556000"/>
                   <wp:effectExtent b="0" l="0" r="0" t="0"/>
-                  <wp:docPr descr="" title="" id="49" name="Picture"/>
+                  <wp:docPr descr="" title="" id="46" name="Picture"/>
                   <a:graphic>
                     <a:graphicData uri="http://schemas.openxmlformats.org/drawingml/2006/picture">
                       <pic:pic>
                         <pic:nvPicPr>
-                          <pic:cNvPr descr="Figures/map.png" id="50" name="Picture"/>
+                          <pic:cNvPr descr="Figures/map.png" id="47" name="Picture"/>
                           <pic:cNvPicPr>
                             <a:picLocks noChangeArrowheads="1" noChangeAspect="1"/>
                           </pic:cNvPicPr>
                         </pic:nvPicPr>
                         <pic:blipFill>
-                          <a:blip r:embed="rId48"/>
+                          <a:blip r:embed="rId45"/>
                           <a:stretch>
                             <a:fillRect/>
                           </a:stretch>
@@ -27017,12 +26802,12 @@
               <w:t xml:space="preserve">(blue).</w:t>
             </w:r>
           </w:p>
-          <w:bookmarkEnd w:id="51"/>
+          <w:bookmarkEnd w:id="48"/>
         </w:tc>
       </w:tr>
     </w:tbl>
-    <w:bookmarkEnd w:id="52"/>
-    <w:bookmarkStart w:id="54" w:name="taxonomy"/>
+    <w:bookmarkEnd w:id="49"/>
+    <w:bookmarkStart w:id="51" w:name="taxonomy"/>
     <w:p>
       <w:pPr>
         <w:pStyle w:val="Heading2"/>
@@ -27794,7 +27579,7 @@
       <w:tr>
         <w:tc>
           <w:tcPr/>
-          <w:bookmarkStart w:id="53" w:name="tbl-genera-types"/>
+          <w:bookmarkStart w:id="50" w:name="tbl-genera-types"/>
           <w:p>
             <w:pPr>
               <w:jc w:val="center"/>
@@ -30111,7 +29896,7 @@
               </w:tc>
             </w:tr>
           </w:tbl>
-          <w:bookmarkEnd w:id="53"/>
+          <w:bookmarkEnd w:id="50"/>
         </w:tc>
       </w:tr>
     </w:tbl>
@@ -30178,7 +29963,13 @@
         <w:t xml:space="preserve"> </w:t>
       </w:r>
       <w:r>
-        <w:t xml:space="preserve">(Stejneger, 1908),</w:t>
+        <w:t xml:space="preserve">(</w:t>
+      </w:r>
+      <w:r>
+        <w:t xml:space="preserve">(Stejneger 1908)</w:t>
+      </w:r>
+      <w:r>
+        <w:t xml:space="preserve">),</w:t>
       </w:r>
       <w:r>
         <w:t xml:space="preserve"> </w:t>
@@ -30242,7 +30033,7 @@
         <w:t xml:space="preserve"> </w:t>
       </w:r>
       <w:r>
-        <w:t xml:space="preserve">(Kraus, 2013),</w:t>
+        <w:t xml:space="preserve">([Kraus, 2013]),</w:t>
       </w:r>
       <w:r>
         <w:t xml:space="preserve"> </w:t>
@@ -30306,7 +30097,10 @@
         <w:t xml:space="preserve"> </w:t>
       </w:r>
       <w:r>
-        <w:t xml:space="preserve">(Zweifel, 1956),</w:t>
+        <w:t xml:space="preserve">(Zweifel 1956)</w:t>
+      </w:r>
+      <w:r>
+        <w:t xml:space="preserve">,</w:t>
       </w:r>
       <w:r>
         <w:t xml:space="preserve"> </w:t>
@@ -30588,28 +30382,20 @@
           <w:b/>
           <w:bCs/>
         </w:rPr>
-        <w:t xml:space="preserve">Family Microhylidae Günther, 1858.</w:t>
+        <w:t xml:space="preserve">Family Microhylidae Günther, 1858</w:t>
+      </w:r>
+      <w:r>
+        <w:br/>
       </w:r>
       <w:r>
         <w:rPr>
           <w:b/>
           <w:bCs/>
         </w:rPr>
-        <w:t xml:space="preserve"> </w:t>
-      </w:r>
-      <w:r>
-        <w:rPr>
-          <w:b/>
-          <w:bCs/>
-        </w:rPr>
-        <w:t xml:space="preserve">Subfamily Asterophryinae Günther, 1858.</w:t>
-      </w:r>
-      <w:r>
-        <w:rPr>
-          <w:b/>
-          <w:bCs/>
-        </w:rPr>
-        <w:t xml:space="preserve"> </w:t>
+        <w:t xml:space="preserve">Subfamily Asterophryinae Günther, 1858</w:t>
+      </w:r>
+      <w:r>
+        <w:br/>
       </w:r>
       <w:r>
         <w:rPr>
@@ -30619,7 +30405,7 @@
         <w:t xml:space="preserve">Genus Auparoparo gen. Nov.</w:t>
       </w:r>
       <w:r>
-        <w:t xml:space="preserve"> </w:t>
+        <w:br/>
       </w:r>
       <w:r>
         <w:rPr>
@@ -30635,7 +30421,7 @@
         <w:t xml:space="preserve">Boettger, 1895</w:t>
       </w:r>
       <w:r>
-        <w:t xml:space="preserve"> </w:t>
+        <w:br/>
       </w:r>
       <w:r>
         <w:rPr>
@@ -30651,7 +30437,7 @@
         <w:t xml:space="preserve">Fry, 1917</w:t>
       </w:r>
       <w:r>
-        <w:t xml:space="preserve"> </w:t>
+        <w:br/>
       </w:r>
       <w:r>
         <w:rPr>
@@ -30667,7 +30453,7 @@
         <w:t xml:space="preserve">(anthonyi) Boulenger, 1897</w:t>
       </w:r>
       <w:r>
-        <w:t xml:space="preserve"> </w:t>
+        <w:br/>
       </w:r>
       <w:r>
         <w:t xml:space="preserve">Type species</w:t>
@@ -30696,7 +30482,7 @@
         <w:t xml:space="preserve">Auparoparo penelopeia</w:t>
       </w:r>
       <w:r>
-        <w:t xml:space="preserve">].</w:t>
+        <w:t xml:space="preserve">]</w:t>
       </w:r>
     </w:p>
     <w:p>
@@ -31366,22 +31152,44 @@
         <w:t xml:space="preserve">(frog).</w:t>
       </w:r>
     </w:p>
+    <w:bookmarkEnd w:id="51"/>
+    <w:bookmarkEnd w:id="52"/>
+    <w:bookmarkStart w:id="57" w:name="discussion"/>
     <w:p>
       <w:pPr>
-        <w:pStyle w:val="BodyText"/>
+        <w:pStyle w:val="Heading1"/>
       </w:pPr>
       <w:r>
-        <w:rPr>
-          <w:b/>
-          <w:bCs/>
-        </w:rPr>
-        <w:t xml:space="preserve">Comment:</w:t>
-      </w:r>
-      <w:r>
-        <w:t xml:space="preserve"> </w:t>
-      </w:r>
-      <w:r>
-        <w:t xml:space="preserve">According to ICZN convention for nomenclature assignment, the presence of one</w:t>
+        <w:t xml:space="preserve">Discussion</w:t>
+      </w:r>
+    </w:p>
+    <w:bookmarkStart w:id="53" w:name="phenotypic-characters-and-diagnoses"/>
+    <w:p>
+      <w:pPr>
+        <w:pStyle w:val="Heading2"/>
+      </w:pPr>
+      <w:r>
+        <w:t xml:space="preserve">Phenotypic Characters and Diagnoses</w:t>
+      </w:r>
+    </w:p>
+    <w:p>
+      <w:pPr>
+        <w:pStyle w:val="FirstParagraph"/>
+      </w:pPr>
+      <w:r>
+        <w:t xml:space="preserve">Our phylogenetic results</w:t>
+      </w:r>
+      <w:r>
+        <w:t xml:space="preserve"> </w:t>
+      </w:r>
+      <w:r>
+        <w:t xml:space="preserve">(Hill et al. 2022; 2023b, this study)</w:t>
+      </w:r>
+      <w:r>
+        <w:t xml:space="preserve"> </w:t>
+      </w:r>
+      <w:r>
+        <w:t xml:space="preserve">provide clarity on the classification of the problematic genus</w:t>
       </w:r>
       <w:r>
         <w:t xml:space="preserve"> </w:t>
@@ -31391,13 +31199,131 @@
           <w:i/>
           <w:iCs/>
         </w:rPr>
-        <w:t xml:space="preserve">Aphantophryne pansa</w:t>
-      </w:r>
-      <w:r>
-        <w:t xml:space="preserve"> </w:t>
-      </w:r>
-      <w:r>
-        <w:t xml:space="preserve">sequence grouped within</w:t>
+        <w:t xml:space="preserve">Oreophryne</w:t>
+      </w:r>
+      <w:r>
+        <w:t xml:space="preserve"> </w:t>
+      </w:r>
+      <w:r>
+        <w:t xml:space="preserve">sensu lato. We confirm that</w:t>
+      </w:r>
+      <w:r>
+        <w:t xml:space="preserve"> </w:t>
+      </w:r>
+      <w:r>
+        <w:rPr>
+          <w:i/>
+          <w:iCs/>
+        </w:rPr>
+        <w:t xml:space="preserve">Oreophryne</w:t>
+      </w:r>
+      <w:r>
+        <w:t xml:space="preserve"> </w:t>
+      </w:r>
+      <w:r>
+        <w:t xml:space="preserve">sensu lato is polyphyletic and consists of two reciprocally monophyletic clades,</w:t>
+      </w:r>
+      <w:r>
+        <w:t xml:space="preserve"> </w:t>
+      </w:r>
+      <w:r>
+        <w:t xml:space="preserve">“Oreophryne A”</w:t>
+      </w:r>
+      <w:r>
+        <w:t xml:space="preserve"> </w:t>
+      </w:r>
+      <w:r>
+        <w:t xml:space="preserve">and</w:t>
+      </w:r>
+      <w:r>
+        <w:t xml:space="preserve"> </w:t>
+      </w:r>
+      <w:r>
+        <w:t xml:space="preserve">“B”</w:t>
+      </w:r>
+      <w:r>
+        <w:t xml:space="preserve"> </w:t>
+      </w:r>
+      <w:r>
+        <w:t xml:space="preserve">(of Hill et al. 2022)</w:t>
+      </w:r>
+      <w:r>
+        <w:t xml:space="preserve">, originating 18 and 16 MYA, respectively (Figure 1). Here we designate</w:t>
+      </w:r>
+      <w:r>
+        <w:t xml:space="preserve"> </w:t>
+      </w:r>
+      <w:r>
+        <w:t xml:space="preserve">“Oreophryne A”</w:t>
+      </w:r>
+      <w:r>
+        <w:t xml:space="preserve"> </w:t>
+      </w:r>
+      <w:r>
+        <w:t xml:space="preserve">as retaining the name</w:t>
+      </w:r>
+      <w:r>
+        <w:t xml:space="preserve"> </w:t>
+      </w:r>
+      <w:r>
+        <w:rPr>
+          <w:i/>
+          <w:iCs/>
+        </w:rPr>
+        <w:t xml:space="preserve">Oreophryne</w:t>
+      </w:r>
+      <w:r>
+        <w:t xml:space="preserve"> </w:t>
+      </w:r>
+      <w:r>
+        <w:t xml:space="preserve">based on its containing the type species</w:t>
+      </w:r>
+      <w:r>
+        <w:t xml:space="preserve"> </w:t>
+      </w:r>
+      <w:r>
+        <w:rPr>
+          <w:i/>
+          <w:iCs/>
+        </w:rPr>
+        <w:t xml:space="preserve">Oreophryne senckenbergiana</w:t>
+      </w:r>
+      <w:r>
+        <w:t xml:space="preserve"> </w:t>
+      </w:r>
+      <w:r>
+        <w:t xml:space="preserve">(Peters and Doria 1878)</w:t>
+      </w:r>
+      <w:r>
+        <w:t xml:space="preserve"> </w:t>
+      </w:r>
+      <w:r>
+        <w:t xml:space="preserve">with high support.</w:t>
+      </w:r>
+      <w:r>
+        <w:t xml:space="preserve"> </w:t>
+      </w:r>
+      <w:r>
+        <w:rPr>
+          <w:i/>
+          <w:iCs/>
+        </w:rPr>
+        <w:t xml:space="preserve">Oreophryne</w:t>
+      </w:r>
+      <w:r>
+        <w:t xml:space="preserve"> </w:t>
+      </w:r>
+      <w:r>
+        <w:t xml:space="preserve">is the earliest diverged genus in subfamily Asterophryinae, sister to all the other genera. The second clade,</w:t>
+      </w:r>
+      <w:r>
+        <w:t xml:space="preserve"> </w:t>
+      </w:r>
+      <w:r>
+        <w:t xml:space="preserve">“Oreophryne B”</w:t>
+      </w:r>
+      <w:r>
+        <w:t xml:space="preserve">, is highly supported as a separate, unrelated genus, which contains no known species with historical generic priority. Thus, we designate this genus as</w:t>
       </w:r>
       <w:r>
         <w:t xml:space="preserve"> </w:t>
@@ -31410,19 +31336,25 @@
         <w:t xml:space="preserve">Auparoparo</w:t>
       </w:r>
       <w:r>
-        <w:t xml:space="preserve"> </w:t>
-      </w:r>
-      <w:r>
-        <w:t xml:space="preserve">could be considered a name of priority</w:t>
-      </w:r>
-      <w:r>
-        <w:t xml:space="preserve"> </w:t>
-      </w:r>
-      <w:r>
-        <w:t xml:space="preserve">(Zoological Nomenclature et al. 1999)</w:t>
-      </w:r>
-      <w:r>
-        <w:t xml:space="preserve">. However, we suspect that</w:t>
+        <w:t xml:space="preserve">, a nominal tribute to the Motu language of the indigenous peoples of the region.</w:t>
+      </w:r>
+    </w:p>
+    <w:bookmarkEnd w:id="53"/>
+    <w:bookmarkStart w:id="54" w:name="the-difficulty-with-cryptic-genera"/>
+    <w:p>
+      <w:pPr>
+        <w:pStyle w:val="Heading2"/>
+      </w:pPr>
+      <w:r>
+        <w:t xml:space="preserve">The Difficulty with Cryptic Genera</w:t>
+      </w:r>
+    </w:p>
+    <w:p>
+      <w:pPr>
+        <w:pStyle w:val="FirstParagraph"/>
+      </w:pPr>
+      <w:r>
+        <w:t xml:space="preserve">Perhaps the greatest testament to the crypticism of</w:t>
       </w:r>
       <w:r>
         <w:t xml:space="preserve"> </w:t>
@@ -31432,45 +31364,13 @@
           <w:i/>
           <w:iCs/>
         </w:rPr>
-        <w:t xml:space="preserve">Aphantophryne</w:t>
-      </w:r>
-      <w:r>
-        <w:t xml:space="preserve"> </w:t>
-      </w:r>
-      <w:r>
-        <w:t xml:space="preserve">may actually represent a highly specialized morphotypic group with members belonging to other clades, which would invalidate its generic status. Future research is needed to clarify the placement and integrity of</w:t>
-      </w:r>
-      <w:r>
-        <w:t xml:space="preserve"> </w:t>
-      </w:r>
-      <w:r>
-        <w:rPr>
-          <w:i/>
-          <w:iCs/>
-        </w:rPr>
-        <w:t xml:space="preserve">Aphantophryne</w:t>
-      </w:r>
-      <w:r>
-        <w:t xml:space="preserve">. Furthermore, based on the tremendous morphological and lifestyle differences between</w:t>
-      </w:r>
-      <w:r>
-        <w:t xml:space="preserve"> </w:t>
-      </w:r>
-      <w:r>
-        <w:rPr>
-          <w:i/>
-          <w:iCs/>
-        </w:rPr>
-        <w:t xml:space="preserve">Aphantophryne pansa</w:t>
-      </w:r>
-      <w:r>
-        <w:t xml:space="preserve"> </w:t>
-      </w:r>
-      <w:r>
-        <w:t xml:space="preserve">and other species of</w:t>
-      </w:r>
-      <w:r>
-        <w:t xml:space="preserve"> </w:t>
+        <w:t xml:space="preserve">Oreophryne</w:t>
+      </w:r>
+      <w:r>
+        <w:t xml:space="preserve"> </w:t>
+      </w:r>
+      <w:r>
+        <w:t xml:space="preserve">(CCN) vs. </w:t>
       </w:r>
       <w:r>
         <w:rPr>
@@ -31480,47 +31380,19 @@
         <w:t xml:space="preserve">Auparoparo</w:t>
       </w:r>
       <w:r>
-        <w:t xml:space="preserve">, we do not consider this name to be representative of the entire clade.</w:t>
-      </w:r>
-    </w:p>
-    <w:bookmarkEnd w:id="54"/>
-    <w:bookmarkEnd w:id="55"/>
-    <w:bookmarkStart w:id="60" w:name="discussion"/>
-    <w:p>
-      <w:pPr>
-        <w:pStyle w:val="Heading1"/>
-      </w:pPr>
-      <w:r>
-        <w:t xml:space="preserve">Discussion</w:t>
-      </w:r>
-    </w:p>
-    <w:bookmarkStart w:id="56" w:name="phenotypic-characters-and-diagnoses"/>
-    <w:p>
-      <w:pPr>
-        <w:pStyle w:val="Heading2"/>
-      </w:pPr>
-      <w:r>
-        <w:t xml:space="preserve">Phenotypic Characters and Diagnoses</w:t>
-      </w:r>
-    </w:p>
-    <w:p>
-      <w:pPr>
-        <w:pStyle w:val="FirstParagraph"/>
-      </w:pPr>
-      <w:r>
-        <w:t xml:space="preserve">Our phylogenetic results</w:t>
-      </w:r>
-      <w:r>
-        <w:t xml:space="preserve"> </w:t>
-      </w:r>
-      <w:r>
-        <w:t xml:space="preserve">(Hill et al. 2022; 2023b, this study)</w:t>
-      </w:r>
-      <w:r>
-        <w:t xml:space="preserve"> </w:t>
-      </w:r>
-      <w:r>
-        <w:t xml:space="preserve">provide clarity on the classification of the problematic genus</w:t>
+        <w:t xml:space="preserve"> </w:t>
+      </w:r>
+      <w:r>
+        <w:t xml:space="preserve">(NCN) is that no taxonomist was able to distinguish that they are separate clades, independently evolved, in the 130 years between their discovery and molecular sequencing</w:t>
+      </w:r>
+      <w:r>
+        <w:t xml:space="preserve"> </w:t>
+      </w:r>
+      <w:r>
+        <w:t xml:space="preserve">(Boettger 1895; Rivera et al. 2017)</w:t>
+      </w:r>
+      <w:r>
+        <w:t xml:space="preserve">. These species are indeed morphologically very similar and our results provide some clues as to why</w:t>
       </w:r>
       <w:r>
         <w:t xml:space="preserve"> </w:t>
@@ -31536,7 +31408,29 @@
         <w:t xml:space="preserve"> </w:t>
       </w:r>
       <w:r>
-        <w:t xml:space="preserve">sensu lato. We confirm that</w:t>
+        <w:t xml:space="preserve">taxonomy has been so difficult.</w:t>
+      </w:r>
+      <w:r>
+        <w:t xml:space="preserve"> </w:t>
+      </w:r>
+      <w:r>
+        <w:t xml:space="preserve">We found no morphological synapomorphy for neither</w:t>
+      </w:r>
+      <w:r>
+        <w:t xml:space="preserve"> </w:t>
+      </w:r>
+      <w:r>
+        <w:rPr>
+          <w:i/>
+          <w:iCs/>
+        </w:rPr>
+        <w:t xml:space="preserve">Auparoparo</w:t>
+      </w:r>
+      <w:r>
+        <w:t xml:space="preserve"> </w:t>
+      </w:r>
+      <w:r>
+        <w:t xml:space="preserve">nor</w:t>
       </w:r>
       <w:r>
         <w:t xml:space="preserve"> </w:t>
@@ -31549,49 +31443,15 @@
         <w:t xml:space="preserve">Oreophryne</w:t>
       </w:r>
       <w:r>
-        <w:t xml:space="preserve"> </w:t>
-      </w:r>
-      <w:r>
-        <w:t xml:space="preserve">sensu lato is polyphyletic and consists of two reciprocally monophyletic clades,</w:t>
-      </w:r>
-      <w:r>
-        <w:t xml:space="preserve"> </w:t>
-      </w:r>
-      <w:r>
-        <w:t xml:space="preserve">“Oreophryne A”</w:t>
-      </w:r>
-      <w:r>
-        <w:t xml:space="preserve"> </w:t>
-      </w:r>
-      <w:r>
-        <w:t xml:space="preserve">and</w:t>
-      </w:r>
-      <w:r>
-        <w:t xml:space="preserve"> </w:t>
-      </w:r>
-      <w:r>
-        <w:t xml:space="preserve">“B”</w:t>
-      </w:r>
-      <w:r>
-        <w:t xml:space="preserve"> </w:t>
-      </w:r>
-      <w:r>
-        <w:t xml:space="preserve">(of Hill et al. 2022)</w:t>
-      </w:r>
-      <w:r>
-        <w:t xml:space="preserve">, originating 18 and 16 MYA, respectively (Figure 1). Here we designate</w:t>
-      </w:r>
-      <w:r>
-        <w:t xml:space="preserve"> </w:t>
-      </w:r>
-      <w:r>
-        <w:t xml:space="preserve">“Oreophryne A”</w:t>
-      </w:r>
-      <w:r>
-        <w:t xml:space="preserve"> </w:t>
-      </w:r>
-      <w:r>
-        <w:t xml:space="preserve">as retaining the name</w:t>
+        <w:t xml:space="preserve">, and moreover, no morphological feature that can diagnose either clade or both in combination.</w:t>
+      </w:r>
+    </w:p>
+    <w:p>
+      <w:pPr>
+        <w:pStyle w:val="BodyText"/>
+      </w:pPr>
+      <w:r>
+        <w:t xml:space="preserve">The traditional basis for generic designation of species to</w:t>
       </w:r>
       <w:r>
         <w:t xml:space="preserve"> </w:t>
@@ -31607,29 +31467,16 @@
         <w:t xml:space="preserve"> </w:t>
       </w:r>
       <w:r>
-        <w:t xml:space="preserve">based on its containing the type species</w:t>
-      </w:r>
-      <w:r>
-        <w:t xml:space="preserve"> </w:t>
-      </w:r>
-      <w:r>
-        <w:rPr>
-          <w:i/>
-          <w:iCs/>
-        </w:rPr>
-        <w:t xml:space="preserve">Oreophryne senckenbergiana</w:t>
-      </w:r>
-      <w:r>
-        <w:t xml:space="preserve"> </w:t>
-      </w:r>
-      <w:r>
-        <w:t xml:space="preserve">(Peters and Doria 1878)</w:t>
-      </w:r>
-      <w:r>
-        <w:t xml:space="preserve"> </w:t>
-      </w:r>
-      <w:r>
-        <w:t xml:space="preserve">with high support.</w:t>
+        <w:t xml:space="preserve">has primarily relied on a signature pectoral anatomy</w:t>
+      </w:r>
+      <w:r>
+        <w:t xml:space="preserve"> </w:t>
+      </w:r>
+      <w:r>
+        <w:t xml:space="preserve">(whether original or revised diagnosis, Parker 1934; Zweifel 2003)</w:t>
+      </w:r>
+      <w:r>
+        <w:t xml:space="preserve">. Our phylogenetic results clearly show that this trait appears more than once, in both</w:t>
       </w:r>
       <w:r>
         <w:t xml:space="preserve"> </w:t>
@@ -31645,16 +31492,36 @@
         <w:t xml:space="preserve"> </w:t>
       </w:r>
       <w:r>
-        <w:t xml:space="preserve">is the earliest diverged genus in subfamily Asterophryinae, sister to all the other genera. The second clade,</w:t>
-      </w:r>
-      <w:r>
-        <w:t xml:space="preserve"> </w:t>
-      </w:r>
-      <w:r>
-        <w:t xml:space="preserve">“Oreophryne B”</w:t>
-      </w:r>
-      <w:r>
-        <w:t xml:space="preserve">, is highly supported as a separate, unrelated genus, which contains no known species with historical generic priority. Thus, we designate this genus as</w:t>
+        <w:t xml:space="preserve">and</w:t>
+      </w:r>
+      <w:r>
+        <w:t xml:space="preserve"> </w:t>
+      </w:r>
+      <w:r>
+        <w:rPr>
+          <w:i/>
+          <w:iCs/>
+        </w:rPr>
+        <w:t xml:space="preserve">Auparaparo</w:t>
+      </w:r>
+      <w:r>
+        <w:t xml:space="preserve">, and rather than being a highly conserved trait, it is either a symplesiomorphy (shared ancestral character) or a result of convergent or parallel evolution, and perhaps adaptive for arboreality. Thus, the pectoral anatomy is not a reliable diagnostic character in differentiating between</w:t>
+      </w:r>
+      <w:r>
+        <w:t xml:space="preserve"> </w:t>
+      </w:r>
+      <w:r>
+        <w:rPr>
+          <w:i/>
+          <w:iCs/>
+        </w:rPr>
+        <w:t xml:space="preserve">Oreophryne</w:t>
+      </w:r>
+      <w:r>
+        <w:t xml:space="preserve"> </w:t>
+      </w:r>
+      <w:r>
+        <w:t xml:space="preserve">and</w:t>
       </w:r>
       <w:r>
         <w:t xml:space="preserve"> </w:t>
@@ -31667,25 +31534,31 @@
         <w:t xml:space="preserve">Auparoparo</w:t>
       </w:r>
       <w:r>
-        <w:t xml:space="preserve">, a nominal tribute to the Motu language of the indigenous peoples of the region.</w:t>
-      </w:r>
-    </w:p>
-    <w:bookmarkEnd w:id="56"/>
-    <w:bookmarkStart w:id="57" w:name="the-difficulty-with-cryptic-genera"/>
-    <w:p>
-      <w:pPr>
-        <w:pStyle w:val="Heading2"/>
-      </w:pPr>
-      <w:r>
-        <w:t xml:space="preserve">The Difficulty with Cryptic Genera</w:t>
-      </w:r>
-    </w:p>
-    <w:p>
-      <w:pPr>
-        <w:pStyle w:val="FirstParagraph"/>
-      </w:pPr>
-      <w:r>
-        <w:t xml:space="preserve">Perhaps the greatest testament to the crypticism of</w:t>
+        <w:t xml:space="preserve">. In studies across a wide diversity of anurans,</w:t>
+      </w:r>
+      <w:r>
+        <w:t xml:space="preserve"> </w:t>
+      </w:r>
+      <w:r>
+        <w:t xml:space="preserve">Soliz et al. (2025)</w:t>
+      </w:r>
+      <w:r>
+        <w:t xml:space="preserve"> </w:t>
+      </w:r>
+      <w:r>
+        <w:t xml:space="preserve">found that anatomical variation of the pectoral girdle corresponds with functional and ecological lifestyle demands, whereas</w:t>
+      </w:r>
+      <w:r>
+        <w:t xml:space="preserve"> </w:t>
+      </w:r>
+      <w:r>
+        <w:t xml:space="preserve">Engelkes et al. (2020)</w:t>
+      </w:r>
+      <w:r>
+        <w:t xml:space="preserve"> </w:t>
+      </w:r>
+      <w:r>
+        <w:t xml:space="preserve">found strong phylogenetic influence in the shape of the pectoral girdle. This point would be excellent for further study within Asterophryinae, as there are high elevation terrestrial species of</w:t>
       </w:r>
       <w:r>
         <w:t xml:space="preserve"> </w:t>
@@ -31701,29 +31574,60 @@
         <w:t xml:space="preserve"> </w:t>
       </w:r>
       <w:r>
-        <w:t xml:space="preserve">(CCN) vs. </w:t>
+        <w:t xml:space="preserve">sensu lato that possess the same pectoral trait</w:t>
+      </w:r>
+      <w:r>
+        <w:t xml:space="preserve"> </w:t>
+      </w:r>
+      <w:r>
+        <w:t xml:space="preserve">(Zweifel et al. 2009)</w:t>
+      </w:r>
+      <w:r>
+        <w:t xml:space="preserve">,as well as a few arboreal species within other genera (</w:t>
       </w:r>
       <w:r>
         <w:rPr>
           <w:i/>
           <w:iCs/>
         </w:rPr>
-        <w:t xml:space="preserve">Auparoparo</w:t>
-      </w:r>
-      <w:r>
-        <w:t xml:space="preserve"> </w:t>
-      </w:r>
-      <w:r>
-        <w:t xml:space="preserve">(NCN) is that no taxonomist was able to distinguish that they are separate clades, independently evolved, in the 130 years between their discovery and molecular sequencing</w:t>
-      </w:r>
-      <w:r>
-        <w:t xml:space="preserve"> </w:t>
-      </w:r>
-      <w:r>
-        <w:t xml:space="preserve">(Boettger 1895; Rivera et al. 2017)</w:t>
-      </w:r>
-      <w:r>
-        <w:t xml:space="preserve">. These species are indeed morphologically very similar and our results provide some clues as to why</w:t>
+        <w:t xml:space="preserve">Cophixalus</w:t>
+      </w:r>
+      <w:r>
+        <w:t xml:space="preserve">,</w:t>
+      </w:r>
+      <w:r>
+        <w:t xml:space="preserve"> </w:t>
+      </w:r>
+      <w:r>
+        <w:rPr>
+          <w:i/>
+          <w:iCs/>
+        </w:rPr>
+        <w:t xml:space="preserve">Asterophrys</w:t>
+      </w:r>
+      <w:r>
+        <w:t xml:space="preserve">,</w:t>
+      </w:r>
+      <w:r>
+        <w:t xml:space="preserve"> </w:t>
+      </w:r>
+      <w:r>
+        <w:rPr>
+          <w:i/>
+          <w:iCs/>
+        </w:rPr>
+        <w:t xml:space="preserve">Xenorhina</w:t>
+      </w:r>
+      <w:r>
+        <w:t xml:space="preserve">) with unknown pectoral morphology.</w:t>
+      </w:r>
+    </w:p>
+    <w:p>
+      <w:pPr>
+        <w:pStyle w:val="BodyText"/>
+      </w:pPr>
+      <w:r>
+        <w:t xml:space="preserve">We further rexamined additional characters previously used to diangnose</w:t>
       </w:r>
       <w:r>
         <w:t xml:space="preserve"> </w:t>
@@ -31739,29 +31643,19 @@
         <w:t xml:space="preserve"> </w:t>
       </w:r>
       <w:r>
-        <w:t xml:space="preserve">taxonomy has been so difficult.</w:t>
-      </w:r>
-      <w:r>
-        <w:t xml:space="preserve"> </w:t>
-      </w:r>
-      <w:r>
-        <w:t xml:space="preserve">We found no morphological synapomorphy for neither</w:t>
-      </w:r>
-      <w:r>
-        <w:t xml:space="preserve"> </w:t>
-      </w:r>
-      <w:r>
-        <w:rPr>
-          <w:i/>
-          <w:iCs/>
-        </w:rPr>
-        <w:t xml:space="preserve">Auparoparo</w:t>
-      </w:r>
-      <w:r>
-        <w:t xml:space="preserve"> </w:t>
-      </w:r>
-      <w:r>
-        <w:t xml:space="preserve">nor</w:t>
+        <w:t xml:space="preserve">as well as characters conventionally used to diagnose species of frogs. We conclude that pectoral girdle connector type</w:t>
+      </w:r>
+      <w:r>
+        <w:t xml:space="preserve"> </w:t>
+      </w:r>
+      <w:r>
+        <w:t xml:space="preserve">(Parker 1934)</w:t>
+      </w:r>
+      <w:r>
+        <w:t xml:space="preserve"> </w:t>
+      </w:r>
+      <w:r>
+        <w:t xml:space="preserve">and relative lengths of the 3rd and 5th toe are uninformative and the degree of toe webbing is subjective. It was previously suggested that species in</w:t>
       </w:r>
       <w:r>
         <w:t xml:space="preserve"> </w:t>
@@ -31774,207 +31668,19 @@
         <w:t xml:space="preserve">Oreophryne</w:t>
       </w:r>
       <w:r>
-        <w:t xml:space="preserve">, and moreover, no morphological feature that can diagnose either clade or both in combination.</w:t>
-      </w:r>
-    </w:p>
-    <w:p>
-      <w:pPr>
-        <w:pStyle w:val="BodyText"/>
-      </w:pPr>
-      <w:r>
-        <w:t xml:space="preserve">The traditional basis for generic designation of species to</w:t>
-      </w:r>
-      <w:r>
-        <w:t xml:space="preserve"> </w:t>
-      </w:r>
-      <w:r>
-        <w:rPr>
-          <w:i/>
-          <w:iCs/>
-        </w:rPr>
-        <w:t xml:space="preserve">Oreophryne</w:t>
-      </w:r>
-      <w:r>
-        <w:t xml:space="preserve"> </w:t>
-      </w:r>
-      <w:r>
-        <w:t xml:space="preserve">has primarily relied on a signature pectoral anatomy</w:t>
-      </w:r>
-      <w:r>
-        <w:t xml:space="preserve"> </w:t>
-      </w:r>
-      <w:r>
-        <w:t xml:space="preserve">(whether original or revised diagnosis, Parker 1934; Zweifel 2003)</w:t>
-      </w:r>
-      <w:r>
-        <w:t xml:space="preserve">. Our phylogenetic results clearly show that this trait appears more than once, in both</w:t>
-      </w:r>
-      <w:r>
-        <w:t xml:space="preserve"> </w:t>
-      </w:r>
-      <w:r>
-        <w:rPr>
-          <w:i/>
-          <w:iCs/>
-        </w:rPr>
-        <w:t xml:space="preserve">Oreophryne</w:t>
-      </w:r>
-      <w:r>
-        <w:t xml:space="preserve"> </w:t>
-      </w:r>
-      <w:r>
-        <w:t xml:space="preserve">and</w:t>
-      </w:r>
-      <w:r>
-        <w:t xml:space="preserve"> </w:t>
-      </w:r>
-      <w:r>
-        <w:rPr>
-          <w:i/>
-          <w:iCs/>
-        </w:rPr>
-        <w:t xml:space="preserve">Auparaparo</w:t>
-      </w:r>
-      <w:r>
-        <w:t xml:space="preserve">, and rather than being a highly conserved trait, it is either a symplesiomorphy (shared ancestral character) or a result of convergent or parallel evolution, and perhaps adaptive for arboreality. Thus, the pectoral anatomy is not a reliable diagnostic character in differentiating between</w:t>
-      </w:r>
-      <w:r>
-        <w:t xml:space="preserve"> </w:t>
-      </w:r>
-      <w:r>
-        <w:rPr>
-          <w:i/>
-          <w:iCs/>
-        </w:rPr>
-        <w:t xml:space="preserve">Oreophryne</w:t>
-      </w:r>
-      <w:r>
-        <w:t xml:space="preserve"> </w:t>
-      </w:r>
-      <w:r>
-        <w:t xml:space="preserve">and</w:t>
-      </w:r>
-      <w:r>
-        <w:t xml:space="preserve"> </w:t>
-      </w:r>
-      <w:r>
-        <w:rPr>
-          <w:i/>
-          <w:iCs/>
-        </w:rPr>
-        <w:t xml:space="preserve">Auparoparo</w:t>
-      </w:r>
-      <w:r>
-        <w:t xml:space="preserve">. In studies across a wide diversity of anurans,</w:t>
-      </w:r>
-      <w:r>
-        <w:t xml:space="preserve"> </w:t>
-      </w:r>
-      <w:r>
-        <w:t xml:space="preserve">Soliz et al. (2025)</w:t>
-      </w:r>
-      <w:r>
-        <w:t xml:space="preserve"> </w:t>
-      </w:r>
-      <w:r>
-        <w:t xml:space="preserve">found that anatomical variation of the pectoral girdle corresponds with functional and ecological lifestyle demands, whereas</w:t>
-      </w:r>
-      <w:r>
-        <w:t xml:space="preserve"> </w:t>
-      </w:r>
-      <w:r>
-        <w:t xml:space="preserve">Engelkes et al. (2020)</w:t>
-      </w:r>
-      <w:r>
-        <w:t xml:space="preserve"> </w:t>
-      </w:r>
-      <w:r>
-        <w:t xml:space="preserve">found strong phylogenetic influence in the shape of the pectoral girdle. This point would be excellent for further study within Asterophryinae, as there are high elevation terrestrial species of</w:t>
-      </w:r>
-      <w:r>
-        <w:t xml:space="preserve"> </w:t>
-      </w:r>
-      <w:r>
-        <w:rPr>
-          <w:i/>
-          <w:iCs/>
-        </w:rPr>
-        <w:t xml:space="preserve">Oreophryne</w:t>
-      </w:r>
-      <w:r>
-        <w:t xml:space="preserve"> </w:t>
-      </w:r>
-      <w:r>
-        <w:t xml:space="preserve">sensu lato that possess the same pectoral trait</w:t>
-      </w:r>
-      <w:r>
-        <w:t xml:space="preserve"> </w:t>
-      </w:r>
-      <w:r>
-        <w:t xml:space="preserve">(Zweifel et al. 2009)</w:t>
-      </w:r>
-      <w:r>
-        <w:t xml:space="preserve">,as well as a few arboreal species within other genera (</w:t>
-      </w:r>
-      <w:r>
-        <w:rPr>
-          <w:i/>
-          <w:iCs/>
-        </w:rPr>
-        <w:t xml:space="preserve">Cophixalus</w:t>
-      </w:r>
-      <w:r>
-        <w:t xml:space="preserve">,</w:t>
-      </w:r>
-      <w:r>
-        <w:t xml:space="preserve"> </w:t>
-      </w:r>
-      <w:r>
-        <w:rPr>
-          <w:i/>
-          <w:iCs/>
-        </w:rPr>
-        <w:t xml:space="preserve">Asterophrys</w:t>
-      </w:r>
-      <w:r>
-        <w:t xml:space="preserve">,</w:t>
-      </w:r>
-      <w:r>
-        <w:t xml:space="preserve"> </w:t>
-      </w:r>
-      <w:r>
-        <w:rPr>
-          <w:i/>
-          <w:iCs/>
-        </w:rPr>
-        <w:t xml:space="preserve">Xenorhina</w:t>
-      </w:r>
-      <w:r>
-        <w:t xml:space="preserve">) with unknown pectoral morphology.</w:t>
-      </w:r>
-    </w:p>
-    <w:p>
-      <w:pPr>
-        <w:pStyle w:val="BodyText"/>
-      </w:pPr>
-      <w:r>
-        <w:t xml:space="preserve">We further rexamined additional characters previously used to diangnose</w:t>
-      </w:r>
-      <w:r>
-        <w:t xml:space="preserve"> </w:t>
-      </w:r>
-      <w:r>
-        <w:rPr>
-          <w:i/>
-          <w:iCs/>
-        </w:rPr>
-        <w:t xml:space="preserve">Oreophryne</w:t>
-      </w:r>
-      <w:r>
-        <w:t xml:space="preserve"> </w:t>
-      </w:r>
-      <w:r>
-        <w:t xml:space="preserve">as well as characters conventionally used to diagnose species of frogs. We conclude that pectoral girdle connector type</w:t>
+        <w:t xml:space="preserve"> </w:t>
+      </w:r>
+      <w:r>
+        <w:t xml:space="preserve">sensu lato could be divided into two groups based on the type of connection between the procoracoid cartilages and the scapula</w:t>
+      </w:r>
+      <w:r>
+        <w:t xml:space="preserve"> </w:t>
+      </w:r>
+      <w:r>
+        <w:t xml:space="preserve">(Kraus 2013)</w:t>
+      </w:r>
+      <w:r>
+        <w:t xml:space="preserve">, with roughly half possessing a cartilaginous rod extending to the scapula and others a ligamentous connection</w:t>
       </w:r>
       <w:r>
         <w:t xml:space="preserve"> </w:t>
@@ -31983,194 +31689,7 @@
         <w:t xml:space="preserve">(Parker 1934)</w:t>
       </w:r>
       <w:r>
-        <w:t xml:space="preserve"> </w:t>
-      </w:r>
-      <w:r>
-        <w:t xml:space="preserve">and relative lengths of the 3rd and 5th toe are uninformative and the degree of toe webbing is subjective. It was previously suggested that species in</w:t>
-      </w:r>
-      <w:r>
-        <w:t xml:space="preserve"> </w:t>
-      </w:r>
-      <w:r>
-        <w:rPr>
-          <w:i/>
-          <w:iCs/>
-        </w:rPr>
-        <w:t xml:space="preserve">Oreophryne</w:t>
-      </w:r>
-      <w:r>
-        <w:t xml:space="preserve"> </w:t>
-      </w:r>
-      <w:r>
-        <w:t xml:space="preserve">sensu lato could be divided into two groups based on the type of connection between the procoracoid cartilages and the scapula</w:t>
-      </w:r>
-      <w:r>
-        <w:t xml:space="preserve"> </w:t>
-      </w:r>
-      <w:r>
-        <w:t xml:space="preserve">(Kraus 2013)</w:t>
-      </w:r>
-      <w:r>
-        <w:t xml:space="preserve">, with roughly half possessing a cartilaginous rod extending to the scapula and others a ligamentous connection</w:t>
-      </w:r>
-      <w:r>
-        <w:t xml:space="preserve"> </w:t>
-      </w:r>
-      <w:r>
-        <w:t xml:space="preserve">(Parker 1934)</w:t>
-      </w:r>
-      <w:r>
-        <w:t xml:space="preserve">. However, our phylogenetic evidence shows that these traits readily evolve and are not synapmorphies and therefore not reliable indicators of monophyletic groups. Ligamentous connectors are most common across both genera (Table 4). Of species with toe webbing,</w:t>
-      </w:r>
-      <w:r>
-        <w:t xml:space="preserve"> </w:t>
-      </w:r>
-      <w:r>
-        <w:rPr>
-          <w:i/>
-          <w:iCs/>
-        </w:rPr>
-        <w:t xml:space="preserve">Oreophryne</w:t>
-      </w:r>
-      <w:r>
-        <w:t xml:space="preserve"> </w:t>
-      </w:r>
-      <w:r>
-        <w:t xml:space="preserve">tends to be described as having</w:t>
-      </w:r>
-      <w:r>
-        <w:t xml:space="preserve"> </w:t>
-      </w:r>
-      <w:r>
-        <w:t xml:space="preserve">“well webbed”</w:t>
-      </w:r>
-      <w:r>
-        <w:t xml:space="preserve"> </w:t>
-      </w:r>
-      <w:r>
-        <w:t xml:space="preserve">toes compared to</w:t>
-      </w:r>
-      <w:r>
-        <w:t xml:space="preserve"> </w:t>
-      </w:r>
-      <w:r>
-        <w:rPr>
-          <w:i/>
-          <w:iCs/>
-        </w:rPr>
-        <w:t xml:space="preserve">Auparoparo</w:t>
-      </w:r>
-      <w:r>
-        <w:t xml:space="preserve">’s</w:t>
-      </w:r>
-      <w:r>
-        <w:t xml:space="preserve"> </w:t>
-      </w:r>
-      <w:r>
-        <w:t xml:space="preserve">“basal”</w:t>
-      </w:r>
-      <w:r>
-        <w:t xml:space="preserve"> </w:t>
-      </w:r>
-      <w:r>
-        <w:t xml:space="preserve">webbing (Table 4). However, intra-specific variability combined with the subjective nature of these descriptions and inconsistency between specific markers when used (</w:t>
-      </w:r>
-      <w:r>
-        <w:t xml:space="preserve">“reaching the penultimate tubercle”</w:t>
-      </w:r>
-      <w:r>
-        <w:t xml:space="preserve">,</w:t>
-      </w:r>
-      <w:r>
-        <w:t xml:space="preserve"> </w:t>
-      </w:r>
-      <w:r>
-        <w:t xml:space="preserve">“webbed 1/3 length of 5th toe”</w:t>
-      </w:r>
-      <w:r>
-        <w:t xml:space="preserve">, etc.), makes this feature difficult to standardize for generic diagnostic use. Many of the morphological traits proposed by</w:t>
-      </w:r>
-      <w:r>
-        <w:t xml:space="preserve"> </w:t>
-      </w:r>
-      <w:r>
-        <w:t xml:space="preserve">Parker (1934)</w:t>
-      </w:r>
-      <w:r>
-        <w:t xml:space="preserve"> </w:t>
-      </w:r>
-      <w:r>
-        <w:t xml:space="preserve">and</w:t>
-      </w:r>
-      <w:r>
-        <w:t xml:space="preserve"> </w:t>
-      </w:r>
-      <w:r>
-        <w:t xml:space="preserve">Zweifel (2003)</w:t>
-      </w:r>
-      <w:r>
-        <w:t xml:space="preserve"> </w:t>
-      </w:r>
-      <w:r>
-        <w:t xml:space="preserve">may in fact be a result of homoplasy to evolutionary pressures imposed by lifestyle or parallel evolution, and while they may prove useful for ecomorphological identification or species diagnoses in combination with other traits, are not informative for generic diagnosis.</w:t>
-      </w:r>
-    </w:p>
-    <w:p>
-      <w:pPr>
-        <w:pStyle w:val="BodyText"/>
-      </w:pPr>
-      <w:r>
-        <w:t xml:space="preserve">We found only two characters with potential for imperfectly identifying genera: relative digital pad size</w:t>
-      </w:r>
-      <w:r>
-        <w:t xml:space="preserve"> </w:t>
-      </w:r>
-      <w:r>
-        <w:t xml:space="preserve">(Parker 1934; Zweifel 1956)</w:t>
-      </w:r>
-      <w:r>
-        <w:t xml:space="preserve">, and call type</w:t>
-      </w:r>
-      <w:r>
-        <w:t xml:space="preserve"> </w:t>
-      </w:r>
-      <w:r>
-        <w:t xml:space="preserve">(e.g., Kraus 2016)</w:t>
-      </w:r>
-      <w:r>
-        <w:t xml:space="preserve">. We found that the relative widths of the digit pads differs between genera:</w:t>
-      </w:r>
-      <w:r>
-        <w:t xml:space="preserve"> </w:t>
-      </w:r>
-      <w:r>
-        <w:rPr>
-          <w:i/>
-          <w:iCs/>
-        </w:rPr>
-        <w:t xml:space="preserve">Auparoparo</w:t>
-      </w:r>
-      <w:r>
-        <w:t xml:space="preserve"> </w:t>
-      </w:r>
-      <w:r>
-        <w:t xml:space="preserve">tends to have visibly larger finger pads in comparison to toe pads, whereas in</w:t>
-      </w:r>
-      <w:r>
-        <w:t xml:space="preserve"> </w:t>
-      </w:r>
-      <w:r>
-        <w:rPr>
-          <w:i/>
-          <w:iCs/>
-        </w:rPr>
-        <w:t xml:space="preserve">Oreophryne</w:t>
-      </w:r>
-      <w:r>
-        <w:t xml:space="preserve"> </w:t>
-      </w:r>
-      <w:r>
-        <w:t xml:space="preserve">the finger and toe pads are roughly equal in size, although there is some overlap in finger to toe pad ratio (</w:t>
+        <w:t xml:space="preserve">. However, our phylogenetic evidence shows that these traits readily evolve and are not synapmorphies and therefore not reliable indicators of monophyletic groups. Ligamentous connectors are common across both genera (</w:t>
       </w:r>
       <w:hyperlink w:anchor="tbl-morph">
         <w:r>
@@ -32181,7 +31700,35 @@
         </w:r>
       </w:hyperlink>
       <w:r>
-        <w:t xml:space="preserve">). In some cases,</w:t>
+        <w:t xml:space="preserve">). Of species with toe webbing,</w:t>
+      </w:r>
+      <w:r>
+        <w:t xml:space="preserve"> </w:t>
+      </w:r>
+      <w:r>
+        <w:rPr>
+          <w:i/>
+          <w:iCs/>
+        </w:rPr>
+        <w:t xml:space="preserve">Oreophryne</w:t>
+      </w:r>
+      <w:r>
+        <w:t xml:space="preserve"> </w:t>
+      </w:r>
+      <w:r>
+        <w:t xml:space="preserve">tends to be described as having</w:t>
+      </w:r>
+      <w:r>
+        <w:t xml:space="preserve"> </w:t>
+      </w:r>
+      <w:r>
+        <w:t xml:space="preserve">“well webbed”</w:t>
+      </w:r>
+      <w:r>
+        <w:t xml:space="preserve"> </w:t>
+      </w:r>
+      <w:r>
+        <w:t xml:space="preserve">toes compared to</w:t>
       </w:r>
       <w:r>
         <w:t xml:space="preserve"> </w:t>
@@ -32194,78 +31741,19 @@
         <w:t xml:space="preserve">Auparoparo</w:t>
       </w:r>
       <w:r>
-        <w:t xml:space="preserve">’s finger pads display T-shapes while the toes are often rounder and narrower. Whether there is any performance advantage in larger finger pads compared to toes is unknown. Furthermore, a handful of high-elevation species not included in our phylogeny have evolved terrestrial or fossorial habits and possess smaller digital pads compared to their presumed arboreal relatives</w:t>
-      </w:r>
-      <w:r>
-        <w:t xml:space="preserve"> </w:t>
-      </w:r>
-      <w:r>
-        <w:t xml:space="preserve">(Zweifel et al. 2009)</w:t>
-      </w:r>
-      <w:r>
-        <w:t xml:space="preserve">.</w:t>
-      </w:r>
-    </w:p>
-    <w:p>
-      <w:pPr>
-        <w:pStyle w:val="BodyText"/>
-      </w:pPr>
-      <w:r>
-        <w:t xml:space="preserve">Call features are increasingly used for diagnosing species of</w:t>
-      </w:r>
-      <w:r>
-        <w:t xml:space="preserve"> </w:t>
-      </w:r>
-      <w:r>
-        <w:rPr>
-          <w:i/>
-          <w:iCs/>
-        </w:rPr>
-        <w:t xml:space="preserve">Oreophryne</w:t>
-      </w:r>
-      <w:r>
-        <w:t xml:space="preserve">, with advertisement call types commonly categorized as rattle, honk, whinny, peeping, or clicking</w:t>
-      </w:r>
-      <w:r>
-        <w:t xml:space="preserve"> </w:t>
-      </w:r>
-      <w:r>
-        <w:t xml:space="preserve">(Kraus 2016)</w:t>
-      </w:r>
-      <w:r>
-        <w:t xml:space="preserve">. We found honk or peep call types are only found in</w:t>
-      </w:r>
-      <w:r>
-        <w:t xml:space="preserve"> </w:t>
-      </w:r>
-      <w:r>
-        <w:rPr>
-          <w:i/>
-          <w:iCs/>
-        </w:rPr>
-        <w:t xml:space="preserve">Oroephryne</w:t>
-      </w:r>
-      <w:r>
-        <w:t xml:space="preserve"> </w:t>
-      </w:r>
-      <w:r>
-        <w:t xml:space="preserve">species in our sample, while whinny calls are only found in</w:t>
-      </w:r>
-      <w:r>
-        <w:t xml:space="preserve"> </w:t>
-      </w:r>
-      <w:r>
-        <w:rPr>
-          <w:i/>
-          <w:iCs/>
-        </w:rPr>
-        <w:t xml:space="preserve">Auparoparo</w:t>
-      </w:r>
-      <w:r>
-        <w:t xml:space="preserve"> </w:t>
-      </w:r>
-      <w:r>
-        <w:t xml:space="preserve">species, and rattle calls are found in both genera (</w:t>
+        <w:t xml:space="preserve">’s</w:t>
+      </w:r>
+      <w:r>
+        <w:t xml:space="preserve"> </w:t>
+      </w:r>
+      <w:r>
+        <w:t xml:space="preserve">“basal”</w:t>
+      </w:r>
+      <w:r>
+        <w:t xml:space="preserve"> </w:t>
+      </w:r>
+      <w:r>
+        <w:t xml:space="preserve">webbing (</w:t>
       </w:r>
       <w:hyperlink w:anchor="tbl-morph">
         <w:r>
@@ -32276,7 +31764,88 @@
         </w:r>
       </w:hyperlink>
       <w:r>
-        <w:t xml:space="preserve">). We note that several authors described species of each genus, thus the difference between genera cannot be attributed to the investigator. However, more complete sampling may add further complexity. As far as we are aware there has been no comprehensive acoustic analysis across</w:t>
+        <w:t xml:space="preserve">). However, intra-specific variability combined with the subjective nature of these descriptions and inconsistency between specific markers when used (</w:t>
+      </w:r>
+      <w:r>
+        <w:t xml:space="preserve">“reaching the penultimate tubercle”</w:t>
+      </w:r>
+      <w:r>
+        <w:t xml:space="preserve">,</w:t>
+      </w:r>
+      <w:r>
+        <w:t xml:space="preserve"> </w:t>
+      </w:r>
+      <w:r>
+        <w:t xml:space="preserve">“webbed 1/3 length of 5th toe”</w:t>
+      </w:r>
+      <w:r>
+        <w:t xml:space="preserve">, etc.), makes this feature difficult to standardize for generic diagnostic use. Many of the morphological traits proposed by</w:t>
+      </w:r>
+      <w:r>
+        <w:t xml:space="preserve"> </w:t>
+      </w:r>
+      <w:r>
+        <w:t xml:space="preserve">Parker (1934)</w:t>
+      </w:r>
+      <w:r>
+        <w:t xml:space="preserve"> </w:t>
+      </w:r>
+      <w:r>
+        <w:t xml:space="preserve">and</w:t>
+      </w:r>
+      <w:r>
+        <w:t xml:space="preserve"> </w:t>
+      </w:r>
+      <w:r>
+        <w:t xml:space="preserve">Zweifel (2003)</w:t>
+      </w:r>
+      <w:r>
+        <w:t xml:space="preserve"> </w:t>
+      </w:r>
+      <w:r>
+        <w:t xml:space="preserve">may in fact be a result of homoplasy to evolutionary pressures imposed by lifestyle or parallel evolution, and while they may prove useful for ecomorphological identification or species diagnoses in combination with other traits, are not informative for generic diagnosis.</w:t>
+      </w:r>
+    </w:p>
+    <w:p>
+      <w:pPr>
+        <w:pStyle w:val="BodyText"/>
+      </w:pPr>
+      <w:r>
+        <w:t xml:space="preserve">We found only two characters with potential for imperfectly identifying genera: relative digital pad size</w:t>
+      </w:r>
+      <w:r>
+        <w:t xml:space="preserve"> </w:t>
+      </w:r>
+      <w:r>
+        <w:t xml:space="preserve">(Parker 1934; Zweifel 1956)</w:t>
+      </w:r>
+      <w:r>
+        <w:t xml:space="preserve">, and call type</w:t>
+      </w:r>
+      <w:r>
+        <w:t xml:space="preserve"> </w:t>
+      </w:r>
+      <w:r>
+        <w:t xml:space="preserve">(e.g., Kraus 2016)</w:t>
+      </w:r>
+      <w:r>
+        <w:t xml:space="preserve">. We found that the relative widths of the digit pads differs between genera:</w:t>
+      </w:r>
+      <w:r>
+        <w:t xml:space="preserve"> </w:t>
+      </w:r>
+      <w:r>
+        <w:rPr>
+          <w:i/>
+          <w:iCs/>
+        </w:rPr>
+        <w:t xml:space="preserve">Auparoparo</w:t>
+      </w:r>
+      <w:r>
+        <w:t xml:space="preserve"> </w:t>
+      </w:r>
+      <w:r>
+        <w:t xml:space="preserve">tends to have visibly larger finger pads in comparison to toe pads, whereas in</w:t>
       </w:r>
       <w:r>
         <w:t xml:space="preserve"> </w:t>
@@ -32292,11 +31861,133 @@
         <w:t xml:space="preserve"> </w:t>
       </w:r>
       <w:r>
+        <w:t xml:space="preserve">the finger and toe pads are roughly equal in size, although there is some overlap in finger to toe pad ratio (</w:t>
+      </w:r>
+      <w:hyperlink w:anchor="tbl-morph">
+        <w:r>
+          <w:rPr>
+            <w:rStyle w:val="Hyperlink"/>
+          </w:rPr>
+          <w:t xml:space="preserve">Table 3</w:t>
+        </w:r>
+      </w:hyperlink>
+      <w:r>
+        <w:t xml:space="preserve">). In some cases,</w:t>
+      </w:r>
+      <w:r>
+        <w:t xml:space="preserve"> </w:t>
+      </w:r>
+      <w:r>
+        <w:rPr>
+          <w:i/>
+          <w:iCs/>
+        </w:rPr>
+        <w:t xml:space="preserve">Auparoparo</w:t>
+      </w:r>
+      <w:r>
+        <w:t xml:space="preserve">’s finger pads display T-shapes while the toes are often rounder and narrower. Whether there is any performance advantage in larger finger pads compared to toes is unknown. Furthermore, a handful of high-elevation species not included in our phylogeny have evolved terrestrial or fossorial habits and possess smaller digital pads compared to their presumed arboreal relatives</w:t>
+      </w:r>
+      <w:r>
+        <w:t xml:space="preserve"> </w:t>
+      </w:r>
+      <w:r>
+        <w:t xml:space="preserve">(Zweifel et al. 2009)</w:t>
+      </w:r>
+      <w:r>
+        <w:t xml:space="preserve">.</w:t>
+      </w:r>
+    </w:p>
+    <w:p>
+      <w:pPr>
+        <w:pStyle w:val="BodyText"/>
+      </w:pPr>
+      <w:r>
+        <w:t xml:space="preserve">Call features are increasingly used for diagnosing species of</w:t>
+      </w:r>
+      <w:r>
+        <w:t xml:space="preserve"> </w:t>
+      </w:r>
+      <w:r>
+        <w:rPr>
+          <w:i/>
+          <w:iCs/>
+        </w:rPr>
+        <w:t xml:space="preserve">Oreophryne</w:t>
+      </w:r>
+      <w:r>
+        <w:t xml:space="preserve">, with advertisement call types commonly categorized as rattle, honk, whinny, peeping, or clicking</w:t>
+      </w:r>
+      <w:r>
+        <w:t xml:space="preserve"> </w:t>
+      </w:r>
+      <w:r>
+        <w:t xml:space="preserve">(Kraus 2016)</w:t>
+      </w:r>
+      <w:r>
+        <w:t xml:space="preserve">. We found honk or peep call types are only found in</w:t>
+      </w:r>
+      <w:r>
+        <w:t xml:space="preserve"> </w:t>
+      </w:r>
+      <w:r>
+        <w:rPr>
+          <w:i/>
+          <w:iCs/>
+        </w:rPr>
+        <w:t xml:space="preserve">Oroephryne</w:t>
+      </w:r>
+      <w:r>
+        <w:t xml:space="preserve"> </w:t>
+      </w:r>
+      <w:r>
+        <w:t xml:space="preserve">species in our sample, while whinny calls are only found in</w:t>
+      </w:r>
+      <w:r>
+        <w:t xml:space="preserve"> </w:t>
+      </w:r>
+      <w:r>
+        <w:rPr>
+          <w:i/>
+          <w:iCs/>
+        </w:rPr>
+        <w:t xml:space="preserve">Auparoparo</w:t>
+      </w:r>
+      <w:r>
+        <w:t xml:space="preserve"> </w:t>
+      </w:r>
+      <w:r>
+        <w:t xml:space="preserve">species, and rattle calls are found in both genera (</w:t>
+      </w:r>
+      <w:hyperlink w:anchor="tbl-morph">
+        <w:r>
+          <w:rPr>
+            <w:rStyle w:val="Hyperlink"/>
+          </w:rPr>
+          <w:t xml:space="preserve">Table 3</w:t>
+        </w:r>
+      </w:hyperlink>
+      <w:r>
+        <w:t xml:space="preserve">). We note that several authors described species of each genus, thus the difference between genera cannot be attributed to the investigator. However, more complete sampling may add further complexity. As far as we are aware there has been no comprehensive acoustic analysis across</w:t>
+      </w:r>
+      <w:r>
+        <w:t xml:space="preserve"> </w:t>
+      </w:r>
+      <w:r>
+        <w:rPr>
+          <w:i/>
+          <w:iCs/>
+        </w:rPr>
+        <w:t xml:space="preserve">Oreophryne</w:t>
+      </w:r>
+      <w:r>
+        <w:t xml:space="preserve"> </w:t>
+      </w:r>
+      <w:r>
         <w:t xml:space="preserve">sensu lato. More research is needed to explore call diversity both between species and across genera to undertand call evolution and whether there any features that are distinctive of genera.</w:t>
       </w:r>
     </w:p>
-    <w:bookmarkEnd w:id="57"/>
-    <w:bookmarkStart w:id="58" w:name="geographic-distribution-1"/>
+    <w:bookmarkEnd w:id="54"/>
+    <w:bookmarkStart w:id="55" w:name="geographic-distribution-1"/>
     <w:p>
       <w:pPr>
         <w:pStyle w:val="Heading2"/>
@@ -32434,7 +32125,7 @@
         <w:t xml:space="preserve"> </w:t>
       </w:r>
       <w:r>
-        <w:t xml:space="preserve">is mainly clustered in the southeastern tip of mainland Papua New Guinea (along the East Papuan Composite Terrane) and satellite islands with two species in Sulawesi, Indonesia. This suggests the existence of yet undescribed or undiscovered species of</w:t>
+        <w:t xml:space="preserve">is mainly clustered in the southeastern tip of mainland Papua New Guinea (in the East Papuan Composite Terrane) and satellite islands with two species in Sulawesi, Indonesia. This suggests the existence of yet undescribed or undiscovered species of</w:t>
       </w:r>
       <w:r>
         <w:t xml:space="preserve"> </w:t>
@@ -32614,8 +32305,8 @@
         <w:t xml:space="preserve">.</w:t>
       </w:r>
     </w:p>
-    <w:bookmarkEnd w:id="58"/>
-    <w:bookmarkStart w:id="59" w:name="phylogenetic-taxonomy"/>
+    <w:bookmarkEnd w:id="55"/>
+    <w:bookmarkStart w:id="56" w:name="phylogenetic-taxonomy"/>
     <w:p>
       <w:pPr>
         <w:pStyle w:val="Heading2"/>
@@ -32961,7 +32652,7 @@
         <w:t xml:space="preserve"> </w:t>
       </w:r>
       <w:r>
-        <w:t xml:space="preserve">revealing the very strong influence of plate tectonics for explaining the historical dispersal patterns of this group. Finally, it without stability in the naming of genera and the independent histories embodied by each, it becomes much more difficult to appreciate that the two clades represented by</w:t>
+        <w:t xml:space="preserve">revealing the very strong influence of plate tectonics for explaining the historical dispersal patterns of this group. Finally, without stability in the naming of genera and the independent histories embodied by each, it becomes much more difficult to appreciate that the two clades represented by</w:t>
       </w:r>
       <w:r>
         <w:t xml:space="preserve"> </w:t>
@@ -33013,9 +32704,9 @@
         <w:t xml:space="preserve">. This is especially true of Asterophryinae frogs, whose awe-inspiring diversity mirrors the rich cultural beauty and historical complexity of Papuan people.</w:t>
       </w:r>
     </w:p>
-    <w:bookmarkEnd w:id="59"/>
-    <w:bookmarkEnd w:id="60"/>
-    <w:bookmarkStart w:id="61" w:name="supplementary-table-1"/>
+    <w:bookmarkEnd w:id="56"/>
+    <w:bookmarkEnd w:id="57"/>
+    <w:bookmarkStart w:id="58" w:name="supplementary-table-1"/>
     <w:p>
       <w:pPr>
         <w:pStyle w:val="Heading1"/>
@@ -33310,8 +33001,8 @@
         <w:t xml:space="preserve">Oreophryne zimmeri Ahl, 1933</w:t>
       </w:r>
     </w:p>
-    <w:bookmarkEnd w:id="61"/>
-    <w:bookmarkStart w:id="156" w:name="citations"/>
+    <w:bookmarkEnd w:id="58"/>
+    <w:bookmarkStart w:id="152" w:name="citations"/>
     <w:p>
       <w:pPr>
         <w:pStyle w:val="Heading1"/>
@@ -33320,8 +33011,8 @@
         <w:t xml:space="preserve">Citations</w:t>
       </w:r>
     </w:p>
-    <w:bookmarkStart w:id="155" w:name="refs"/>
-    <w:bookmarkStart w:id="62" w:name="ref-Ahl:1933"/>
+    <w:bookmarkStart w:id="151" w:name="refs"/>
+    <w:bookmarkStart w:id="59" w:name="ref-Ahl:1933"/>
     <w:p>
       <w:pPr>
         <w:pStyle w:val="Bibliography"/>
@@ -33330,8 +33021,8 @@
         <w:t xml:space="preserve">Ahl, E. 1933. Ergebnisse der celebes-und halmaheira-expedition heinrich 1930–32. Mitteilungen aus dem Zoologischen Museum in Berlin 19:577–583.</w:t>
       </w:r>
     </w:p>
-    <w:bookmarkEnd w:id="62"/>
-    <w:bookmarkStart w:id="64" w:name="ref-Alcala:1986"/>
+    <w:bookmarkEnd w:id="59"/>
+    <w:bookmarkStart w:id="61" w:name="ref-Alcala:1986"/>
     <w:p>
       <w:pPr>
         <w:pStyle w:val="Bibliography"/>
@@ -33342,7 +33033,7 @@
       <w:r>
         <w:t xml:space="preserve"> </w:t>
       </w:r>
-      <w:hyperlink r:id="rId63">
+      <w:hyperlink r:id="rId60">
         <w:r>
           <w:rPr>
             <w:rStyle w:val="Hyperlink"/>
@@ -33354,8 +33045,8 @@
         <w:t xml:space="preserve">. Natural Resources Management Center, Ministry of Natural Resources; University of the Philippines.</w:t>
       </w:r>
     </w:p>
-    <w:bookmarkEnd w:id="64"/>
-    <w:bookmarkStart w:id="66" w:name="ref-Balinton:2015"/>
+    <w:bookmarkEnd w:id="61"/>
+    <w:bookmarkStart w:id="63" w:name="ref-Balinton:2015"/>
     <w:p>
       <w:pPr>
         <w:pStyle w:val="Bibliography"/>
@@ -33366,7 +33057,7 @@
       <w:r>
         <w:t xml:space="preserve"> </w:t>
       </w:r>
-      <w:hyperlink r:id="rId65">
+      <w:hyperlink r:id="rId62">
         <w:r>
           <w:rPr>
             <w:rStyle w:val="Hyperlink"/>
@@ -33378,8 +33069,8 @@
         <w:t xml:space="preserve">. The Herpetological Bulletin.</w:t>
       </w:r>
     </w:p>
-    <w:bookmarkEnd w:id="66"/>
-    <w:bookmarkStart w:id="67" w:name="ref-Boettger:1895"/>
+    <w:bookmarkEnd w:id="63"/>
+    <w:bookmarkStart w:id="64" w:name="ref-Boettger:1895"/>
     <w:p>
       <w:pPr>
         <w:pStyle w:val="Bibliography"/>
@@ -33394,8 +33085,8 @@
         <w:t xml:space="preserve">kenthal’s. Zoologischer Anzeiger 18:129–138.</w:t>
       </w:r>
     </w:p>
-    <w:bookmarkEnd w:id="67"/>
-    <w:bookmarkStart w:id="69" w:name="ref-Boulenger:1896"/>
+    <w:bookmarkEnd w:id="64"/>
+    <w:bookmarkStart w:id="66" w:name="ref-Boulenger:1896"/>
     <w:p>
       <w:pPr>
         <w:pStyle w:val="Bibliography"/>
@@ -33406,7 +33097,7 @@
       <w:r>
         <w:t xml:space="preserve"> </w:t>
       </w:r>
-      <w:hyperlink r:id="rId68">
+      <w:hyperlink r:id="rId65">
         <w:r>
           <w:rPr>
             <w:rStyle w:val="Hyperlink"/>
@@ -33418,8 +33109,8 @@
         <w:t xml:space="preserve">. The Annals and magazine of natural history; zoology, botany, and geology, Series 6 18:62–64.</w:t>
       </w:r>
     </w:p>
-    <w:bookmarkEnd w:id="69"/>
-    <w:bookmarkStart w:id="71" w:name="ref-Brown:2015"/>
+    <w:bookmarkEnd w:id="66"/>
+    <w:bookmarkStart w:id="68" w:name="ref-Brown:2015"/>
     <w:p>
       <w:pPr>
         <w:pStyle w:val="Bibliography"/>
@@ -33430,7 +33121,7 @@
       <w:r>
         <w:t xml:space="preserve"> </w:t>
       </w:r>
-      <w:hyperlink r:id="rId70">
+      <w:hyperlink r:id="rId67">
         <w:r>
           <w:rPr>
             <w:rStyle w:val="Hyperlink"/>
@@ -33442,8 +33133,8 @@
         <w:t xml:space="preserve">. Zoological Journal of the Linnean Society 174:130–168.</w:t>
       </w:r>
     </w:p>
-    <w:bookmarkEnd w:id="71"/>
-    <w:bookmarkStart w:id="73" w:name="ref-deQueiroz:2020"/>
+    <w:bookmarkEnd w:id="68"/>
+    <w:bookmarkStart w:id="70" w:name="ref-deQueiroz:2020"/>
     <w:p>
       <w:pPr>
         <w:pStyle w:val="Bibliography"/>
@@ -33454,7 +33145,7 @@
       <w:r>
         <w:t xml:space="preserve"> </w:t>
       </w:r>
-      <w:hyperlink r:id="rId72">
+      <w:hyperlink r:id="rId69">
         <w:r>
           <w:rPr>
             <w:rStyle w:val="Hyperlink"/>
@@ -33466,8 +33157,8 @@
         <w:t xml:space="preserve">. 1st ed. CRC Press.</w:t>
       </w:r>
     </w:p>
-    <w:bookmarkEnd w:id="73"/>
-    <w:bookmarkStart w:id="75" w:name="ref-deQueiroz:1992"/>
+    <w:bookmarkEnd w:id="70"/>
+    <w:bookmarkStart w:id="72" w:name="ref-deQueiroz:1992"/>
     <w:p>
       <w:pPr>
         <w:pStyle w:val="Bibliography"/>
@@ -33478,7 +33169,7 @@
       <w:r>
         <w:t xml:space="preserve"> </w:t>
       </w:r>
-      <w:hyperlink r:id="rId74">
+      <w:hyperlink r:id="rId71">
         <w:r>
           <w:rPr>
             <w:rStyle w:val="Hyperlink"/>
@@ -33502,8 +33193,8 @@
         <w:t xml:space="preserve">23:449–480.</w:t>
       </w:r>
     </w:p>
-    <w:bookmarkEnd w:id="75"/>
-    <w:bookmarkStart w:id="77" w:name="ref-deQueiroz:1990"/>
+    <w:bookmarkEnd w:id="72"/>
+    <w:bookmarkStart w:id="74" w:name="ref-deQueiroz:1990"/>
     <w:p>
       <w:pPr>
         <w:pStyle w:val="Bibliography"/>
@@ -33514,7 +33205,7 @@
       <w:r>
         <w:t xml:space="preserve"> </w:t>
       </w:r>
-      <w:hyperlink r:id="rId76">
+      <w:hyperlink r:id="rId73">
         <w:r>
           <w:rPr>
             <w:rStyle w:val="Hyperlink"/>
@@ -33526,8 +33217,8 @@
         <w:t xml:space="preserve">. Systematic Zoology 39:307–322.</w:t>
       </w:r>
     </w:p>
-    <w:bookmarkEnd w:id="77"/>
-    <w:bookmarkStart w:id="79" w:name="ref-deQueiroz:1994"/>
+    <w:bookmarkEnd w:id="74"/>
+    <w:bookmarkStart w:id="76" w:name="ref-deQueiroz:1994"/>
     <w:p>
       <w:pPr>
         <w:pStyle w:val="Bibliography"/>
@@ -33538,7 +33229,7 @@
       <w:r>
         <w:t xml:space="preserve"> </w:t>
       </w:r>
-      <w:hyperlink r:id="rId78">
+      <w:hyperlink r:id="rId75">
         <w:r>
           <w:rPr>
             <w:rStyle w:val="Hyperlink"/>
@@ -33562,8 +33253,8 @@
         <w:t xml:space="preserve">9:27–31.</w:t>
       </w:r>
     </w:p>
-    <w:bookmarkEnd w:id="79"/>
-    <w:bookmarkStart w:id="81" w:name="ref-deSa:2012"/>
+    <w:bookmarkEnd w:id="76"/>
+    <w:bookmarkStart w:id="78" w:name="ref-deSa:2012"/>
     <w:p>
       <w:pPr>
         <w:pStyle w:val="Bibliography"/>
@@ -33574,7 +33265,7 @@
       <w:r>
         <w:t xml:space="preserve"> </w:t>
       </w:r>
-      <w:hyperlink r:id="rId80">
+      <w:hyperlink r:id="rId77">
         <w:r>
           <w:rPr>
             <w:rStyle w:val="Hyperlink"/>
@@ -33601,8 +33292,8 @@
         <w:t xml:space="preserve">.</w:t>
       </w:r>
     </w:p>
-    <w:bookmarkEnd w:id="81"/>
-    <w:bookmarkStart w:id="83" w:name="ref-Edgar:2004"/>
+    <w:bookmarkEnd w:id="78"/>
+    <w:bookmarkStart w:id="80" w:name="ref-Edgar:2004"/>
     <w:p>
       <w:pPr>
         <w:pStyle w:val="Bibliography"/>
@@ -33613,7 +33304,7 @@
       <w:r>
         <w:t xml:space="preserve"> </w:t>
       </w:r>
-      <w:hyperlink r:id="rId82">
+      <w:hyperlink r:id="rId79">
         <w:r>
           <w:rPr>
             <w:rStyle w:val="Hyperlink"/>
@@ -33625,8 +33316,8 @@
         <w:t xml:space="preserve">. BMC Bioinformatics 5:113.</w:t>
       </w:r>
     </w:p>
-    <w:bookmarkEnd w:id="83"/>
-    <w:bookmarkStart w:id="85" w:name="ref-Engelkes:2020"/>
+    <w:bookmarkEnd w:id="80"/>
+    <w:bookmarkStart w:id="82" w:name="ref-Engelkes:2020"/>
     <w:p>
       <w:pPr>
         <w:pStyle w:val="Bibliography"/>
@@ -33637,7 +33328,7 @@
       <w:r>
         <w:t xml:space="preserve"> </w:t>
       </w:r>
-      <w:hyperlink r:id="rId84">
+      <w:hyperlink r:id="rId81">
         <w:r>
           <w:rPr>
             <w:rStyle w:val="Hyperlink"/>
@@ -33649,8 +33340,8 @@
         <w:t xml:space="preserve">. ECOLOGY AND EVOLUTION 10:11467–11487.</w:t>
       </w:r>
     </w:p>
-    <w:bookmarkEnd w:id="85"/>
-    <w:bookmarkStart w:id="87" w:name="ref-Frost:2024"/>
+    <w:bookmarkEnd w:id="82"/>
+    <w:bookmarkStart w:id="84" w:name="ref-Frost:2024"/>
     <w:p>
       <w:pPr>
         <w:pStyle w:val="Bibliography"/>
@@ -33661,7 +33352,7 @@
       <w:r>
         <w:t xml:space="preserve"> </w:t>
       </w:r>
-      <w:hyperlink r:id="rId86">
+      <w:hyperlink r:id="rId83">
         <w:r>
           <w:rPr>
             <w:rStyle w:val="Hyperlink"/>
@@ -33673,8 +33364,8 @@
         <w:t xml:space="preserve">.</w:t>
       </w:r>
     </w:p>
-    <w:bookmarkEnd w:id="87"/>
-    <w:bookmarkStart w:id="89" w:name="ref-Gillman:2020"/>
+    <w:bookmarkEnd w:id="84"/>
+    <w:bookmarkStart w:id="86" w:name="ref-Gillman:2020"/>
     <w:p>
       <w:pPr>
         <w:pStyle w:val="Bibliography"/>
@@ -33685,7 +33376,7 @@
       <w:r>
         <w:t xml:space="preserve"> </w:t>
       </w:r>
-      <w:hyperlink r:id="rId88">
+      <w:hyperlink r:id="rId85">
         <w:r>
           <w:rPr>
             <w:rStyle w:val="Hyperlink"/>
@@ -33697,43 +33388,19 @@
         <w:t xml:space="preserve">. Communications Biology 3:609.</w:t>
       </w:r>
     </w:p>
-    <w:bookmarkEnd w:id="89"/>
-    <w:bookmarkStart w:id="91" w:name="ref-Green:1986"/>
+    <w:bookmarkEnd w:id="86"/>
+    <w:bookmarkStart w:id="88" w:name="ref-Gunther:2023"/>
     <w:p>
       <w:pPr>
         <w:pStyle w:val="Bibliography"/>
       </w:pPr>
       <w:r>
-        <w:t xml:space="preserve">Green, D., and M. Simon. 1986.</w:t>
-      </w:r>
-      <w:r>
-        <w:t xml:space="preserve"> </w:t>
-      </w:r>
-      <w:hyperlink r:id="rId90">
-        <w:r>
-          <w:rPr>
-            <w:rStyle w:val="Hyperlink"/>
-          </w:rPr>
-          <w:t xml:space="preserve">Digital microstructure in ecologically diverse sympatric microhylid frogs, genera cophixalus and sphenophryne (amphibia, anura), from papua-new-guinea</w:t>
-        </w:r>
-      </w:hyperlink>
-      <w:r>
-        <w:t xml:space="preserve">. Australian Journal of Zoology 34:135–145.</w:t>
-      </w:r>
-    </w:p>
-    <w:bookmarkEnd w:id="91"/>
-    <w:bookmarkStart w:id="93" w:name="ref-Gunther:2023"/>
-    <w:p>
-      <w:pPr>
-        <w:pStyle w:val="Bibliography"/>
-      </w:pPr>
-      <w:r>
         <w:t xml:space="preserve">Günther, R., D. T. Iskandar, and S. J. Richards. 2023.</w:t>
       </w:r>
       <w:r>
         <w:t xml:space="preserve"> </w:t>
       </w:r>
-      <w:hyperlink r:id="rId92">
+      <w:hyperlink r:id="rId87">
         <w:r>
           <w:rPr>
             <w:rStyle w:val="Hyperlink"/>
@@ -33777,8 +33444,8 @@
         <w:t xml:space="preserve">r Naturforschung.</w:t>
       </w:r>
     </w:p>
-    <w:bookmarkEnd w:id="93"/>
-    <w:bookmarkStart w:id="94" w:name="ref-Gunther:2011"/>
+    <w:bookmarkEnd w:id="88"/>
+    <w:bookmarkStart w:id="89" w:name="ref-Gunther:2011"/>
     <w:p>
       <w:pPr>
         <w:pStyle w:val="Bibliography"/>
@@ -33787,8 +33454,8 @@
         <w:t xml:space="preserve">Günther, R., and S. J. Richards. 2011. Five new microhylid frog species from enga province, papua new guinea, and remarks on albericus alpestris (anura, microhylidae). VERTEBRATE ZOOLOGY 61:343–372.</w:t>
       </w:r>
     </w:p>
-    <w:bookmarkEnd w:id="94"/>
-    <w:bookmarkStart w:id="95" w:name="ref-Gunther:2001"/>
+    <w:bookmarkEnd w:id="89"/>
+    <w:bookmarkStart w:id="90" w:name="ref-Gunther:2001"/>
     <w:p>
       <w:pPr>
         <w:pStyle w:val="Bibliography"/>
@@ -33797,8 +33464,8 @@
         <w:t xml:space="preserve">Günther, R., S. Richards, and D. T. Iskandar. 2001. Two new species of the genus oreophryne from irian jaya, indonesia (amphibia, anura, microhylidae). Spixiana 24:257–274.</w:t>
       </w:r>
     </w:p>
-    <w:bookmarkEnd w:id="95"/>
-    <w:bookmarkStart w:id="97" w:name="ref-Hill:2022"/>
+    <w:bookmarkEnd w:id="90"/>
+    <w:bookmarkStart w:id="92" w:name="ref-Hill:2022"/>
     <w:p>
       <w:pPr>
         <w:pStyle w:val="Bibliography"/>
@@ -33809,7 +33476,7 @@
       <w:r>
         <w:t xml:space="preserve"> </w:t>
       </w:r>
-      <w:hyperlink r:id="rId96">
+      <w:hyperlink r:id="rId91">
         <w:r>
           <w:rPr>
             <w:rStyle w:val="Hyperlink"/>
@@ -33821,8 +33488,8 @@
         <w:t xml:space="preserve">. Molecular Phylogenetics and Evolution 177. Academic Press Inc.</w:t>
       </w:r>
     </w:p>
-    <w:bookmarkEnd w:id="97"/>
-    <w:bookmarkStart w:id="98" w:name="ref-Hill:2023a"/>
+    <w:bookmarkEnd w:id="92"/>
+    <w:bookmarkStart w:id="93" w:name="ref-Hill:2023a"/>
     <w:p>
       <w:pPr>
         <w:pStyle w:val="Bibliography"/>
@@ -33831,8 +33498,8 @@
         <w:t xml:space="preserve">Hill, E. C., D. F. Gao, D. A. Polhemus, C. J. Fraser, B. Iova, A. Allison, and M. A. Butler. 2023a. Testing geology with biology: Plate tectonics and the diversification of microhylid frogs in the papuan region. Integrative Organismal Biology.</w:t>
       </w:r>
     </w:p>
-    <w:bookmarkEnd w:id="98"/>
-    <w:bookmarkStart w:id="100" w:name="ref-Hill:2023"/>
+    <w:bookmarkEnd w:id="93"/>
+    <w:bookmarkStart w:id="95" w:name="ref-Hill:2023"/>
     <w:p>
       <w:pPr>
         <w:pStyle w:val="Bibliography"/>
@@ -33843,7 +33510,7 @@
       <w:r>
         <w:t xml:space="preserve"> </w:t>
       </w:r>
-      <w:hyperlink r:id="rId99">
+      <w:hyperlink r:id="rId94">
         <w:r>
           <w:rPr>
             <w:rStyle w:val="Hyperlink"/>
@@ -33855,8 +33522,8 @@
         <w:t xml:space="preserve">. Data in Brief 47:108987.</w:t>
       </w:r>
     </w:p>
-    <w:bookmarkEnd w:id="100"/>
-    <w:bookmarkStart w:id="102" w:name="ref-VanKampen:1923"/>
+    <w:bookmarkEnd w:id="95"/>
+    <w:bookmarkStart w:id="97" w:name="ref-VanKampen:1923"/>
     <w:p>
       <w:pPr>
         <w:pStyle w:val="Bibliography"/>
@@ -33867,7 +33534,7 @@
       <w:r>
         <w:t xml:space="preserve"> </w:t>
       </w:r>
-      <w:hyperlink r:id="rId101">
+      <w:hyperlink r:id="rId96">
         <w:r>
           <w:rPr>
             <w:rStyle w:val="Hyperlink"/>
@@ -33879,8 +33546,8 @@
         <w:t xml:space="preserve">. E. J. Brill, ltd, Leiden.</w:t>
       </w:r>
     </w:p>
-    <w:bookmarkEnd w:id="102"/>
-    <w:bookmarkStart w:id="104" w:name="ref-Koehler:2008"/>
+    <w:bookmarkEnd w:id="97"/>
+    <w:bookmarkStart w:id="99" w:name="ref-Koehler:2008"/>
     <w:p>
       <w:pPr>
         <w:pStyle w:val="Bibliography"/>
@@ -33891,7 +33558,7 @@
       <w:r>
         <w:t xml:space="preserve"> </w:t>
       </w:r>
-      <w:hyperlink r:id="rId103">
+      <w:hyperlink r:id="rId98">
         <w:r>
           <w:rPr>
             <w:rStyle w:val="Hyperlink"/>
@@ -33903,8 +33570,8 @@
         <w:t xml:space="preserve">. Molecular Phylogenetics and Evolution 47:353–365. ACADEMIC PRESS INC ELSEVIER SCIENCE, 525 B ST, STE 1900, SAN DIEGO, CA 92101-4495 USA.</w:t>
       </w:r>
     </w:p>
-    <w:bookmarkEnd w:id="104"/>
-    <w:bookmarkStart w:id="106" w:name="ref-Kraus:2016"/>
+    <w:bookmarkEnd w:id="99"/>
+    <w:bookmarkStart w:id="101" w:name="ref-Kraus:2016"/>
     <w:p>
       <w:pPr>
         <w:pStyle w:val="Bibliography"/>
@@ -33915,7 +33582,7 @@
       <w:r>
         <w:t xml:space="preserve"> </w:t>
       </w:r>
-      <w:hyperlink r:id="rId105">
+      <w:hyperlink r:id="rId100">
         <w:r>
           <w:rPr>
             <w:rStyle w:val="Hyperlink"/>
@@ -33927,8 +33594,8 @@
         <w:t xml:space="preserve">. Zootaxa 4195:1–68. Magnolia Press.</w:t>
       </w:r>
     </w:p>
-    <w:bookmarkEnd w:id="106"/>
-    <w:bookmarkStart w:id="108" w:name="ref-Kraus:2013"/>
+    <w:bookmarkEnd w:id="101"/>
+    <w:bookmarkStart w:id="103" w:name="ref-Kraus:2013"/>
     <w:p>
       <w:pPr>
         <w:pStyle w:val="Bibliography"/>
@@ -33939,7 +33606,7 @@
       <w:r>
         <w:t xml:space="preserve"> </w:t>
       </w:r>
-      <w:hyperlink r:id="rId107">
+      <w:hyperlink r:id="rId102">
         <w:r>
           <w:rPr>
             <w:rStyle w:val="Hyperlink"/>
@@ -33951,8 +33618,8 @@
         <w:t xml:space="preserve">. ZOOKEYS 93–121.</w:t>
       </w:r>
     </w:p>
-    <w:bookmarkEnd w:id="108"/>
-    <w:bookmarkStart w:id="110" w:name="ref-Kraus:2009"/>
+    <w:bookmarkEnd w:id="103"/>
+    <w:bookmarkStart w:id="105" w:name="ref-Kraus:2009"/>
     <w:p>
       <w:pPr>
         <w:pStyle w:val="Bibliography"/>
@@ -33963,7 +33630,7 @@
       <w:r>
         <w:t xml:space="preserve"> </w:t>
       </w:r>
-      <w:hyperlink r:id="rId109">
+      <w:hyperlink r:id="rId104">
         <w:r>
           <w:rPr>
             <w:rStyle w:val="Hyperlink"/>
@@ -33975,8 +33642,8 @@
         <w:t xml:space="preserve">. ZooKeys 26:53–76.</w:t>
       </w:r>
     </w:p>
-    <w:bookmarkEnd w:id="110"/>
-    <w:bookmarkStart w:id="111" w:name="ref-Kraus:2004"/>
+    <w:bookmarkEnd w:id="105"/>
+    <w:bookmarkStart w:id="106" w:name="ref-Kraus:2004"/>
     <w:p>
       <w:pPr>
         <w:pStyle w:val="Bibliography"/>
@@ -33985,8 +33652,8 @@
         <w:t xml:space="preserve">Kraus, F., and A. Allison. 2004. Notes on poorly known new guinea frogs. I. Microhylids from the d’entrecasteaux islands. HERPETOFAUNA-SYDNEY- 34:26–39. AUSTRALASIAN AFFILIATION OF HERPETOLOGICAL.</w:t>
       </w:r>
     </w:p>
-    <w:bookmarkEnd w:id="111"/>
-    <w:bookmarkStart w:id="113" w:name="ref-Lanfear:2012"/>
+    <w:bookmarkEnd w:id="106"/>
+    <w:bookmarkStart w:id="108" w:name="ref-Lanfear:2012"/>
     <w:p>
       <w:pPr>
         <w:pStyle w:val="Bibliography"/>
@@ -33997,7 +33664,7 @@
       <w:r>
         <w:t xml:space="preserve"> </w:t>
       </w:r>
-      <w:hyperlink r:id="rId112">
+      <w:hyperlink r:id="rId107">
         <w:r>
           <w:rPr>
             <w:rStyle w:val="Hyperlink"/>
@@ -34009,8 +33676,8 @@
         <w:t xml:space="preserve">. Molecular Biology and Evolution 29:1695–1701.</w:t>
       </w:r>
     </w:p>
-    <w:bookmarkEnd w:id="113"/>
-    <w:bookmarkStart w:id="115" w:name="ref-Maddison:2023"/>
+    <w:bookmarkEnd w:id="108"/>
+    <w:bookmarkStart w:id="110" w:name="ref-Maddison:2023"/>
     <w:p>
       <w:pPr>
         <w:pStyle w:val="Bibliography"/>
@@ -34021,7 +33688,7 @@
       <w:r>
         <w:t xml:space="preserve"> </w:t>
       </w:r>
-      <w:hyperlink r:id="rId114">
+      <w:hyperlink r:id="rId109">
         <w:r>
           <w:rPr>
             <w:rStyle w:val="Hyperlink"/>
@@ -34033,8 +33700,8 @@
         <w:t xml:space="preserve">.</w:t>
       </w:r>
     </w:p>
-    <w:bookmarkEnd w:id="115"/>
-    <w:bookmarkStart w:id="116" w:name="ref-Mehely:1897"/>
+    <w:bookmarkEnd w:id="110"/>
+    <w:bookmarkStart w:id="111" w:name="ref-Mehely:1897"/>
     <w:p>
       <w:pPr>
         <w:pStyle w:val="Bibliography"/>
@@ -34055,8 +33722,8 @@
         <w:t xml:space="preserve">zetek 20:398–419.</w:t>
       </w:r>
     </w:p>
-    <w:bookmarkEnd w:id="116"/>
-    <w:bookmarkStart w:id="117" w:name="ref-Menzies:2006"/>
+    <w:bookmarkEnd w:id="111"/>
+    <w:bookmarkStart w:id="112" w:name="ref-Menzies:2006"/>
     <w:p>
       <w:pPr>
         <w:pStyle w:val="Bibliography"/>
@@ -34065,8 +33732,8 @@
         <w:t xml:space="preserve">Menzies, J. 2006. The frogs of new guinea and the solomon islands. Pensoft Publishers.</w:t>
       </w:r>
     </w:p>
-    <w:bookmarkEnd w:id="117"/>
-    <w:bookmarkStart w:id="119" w:name="ref-Minh:2020"/>
+    <w:bookmarkEnd w:id="112"/>
+    <w:bookmarkStart w:id="114" w:name="ref-Minh:2020"/>
     <w:p>
       <w:pPr>
         <w:pStyle w:val="Bibliography"/>
@@ -34077,7 +33744,7 @@
       <w:r>
         <w:t xml:space="preserve"> </w:t>
       </w:r>
-      <w:hyperlink r:id="rId118">
+      <w:hyperlink r:id="rId113">
         <w:r>
           <w:rPr>
             <w:rStyle w:val="Hyperlink"/>
@@ -34089,8 +33756,8 @@
         <w:t xml:space="preserve">. Molecular Biology and Evolution 37:1530–1534.</w:t>
       </w:r>
     </w:p>
-    <w:bookmarkEnd w:id="119"/>
-    <w:bookmarkStart w:id="120" w:name="ref-Muller:1894"/>
+    <w:bookmarkEnd w:id="114"/>
+    <w:bookmarkStart w:id="115" w:name="ref-Muller:1894"/>
     <w:p>
       <w:pPr>
         <w:pStyle w:val="Bibliography"/>
@@ -34099,8 +33766,8 @@
         <w:t xml:space="preserve">Müller, F. 1894. Reptilien und amphibien aus celebes. Verhandlungen der Naturforschenden Gesellschaft in Basel 10:825–843.</w:t>
       </w:r>
     </w:p>
-    <w:bookmarkEnd w:id="120"/>
-    <w:bookmarkStart w:id="121" w:name="ref-Parker:1934"/>
+    <w:bookmarkEnd w:id="115"/>
+    <w:bookmarkStart w:id="116" w:name="ref-Parker:1934"/>
     <w:p>
       <w:pPr>
         <w:pStyle w:val="Bibliography"/>
@@ -34109,8 +33776,8 @@
         <w:t xml:space="preserve">Parker, H. W. 1934. A monograph of the frogs of the family microhylidae. London: Trustees of the British Museum.</w:t>
       </w:r>
     </w:p>
-    <w:bookmarkEnd w:id="121"/>
-    <w:bookmarkStart w:id="122" w:name="ref-Peters:1878"/>
+    <w:bookmarkEnd w:id="116"/>
+    <w:bookmarkStart w:id="117" w:name="ref-Peters:1878"/>
     <w:p>
       <w:pPr>
         <w:pStyle w:val="Bibliography"/>
@@ -34119,8 +33786,8 @@
         <w:t xml:space="preserve">Peters, W. C. H., and G. Doria. 1878. Catalogo dei rettili e dei batraci raccolti da o. Beccari, l.m. D’albertis a.a. Bruijn nella sotto-regione austro-malese. Annali del Museo civico di storia naturale di Genova 13:323–450.</w:t>
       </w:r>
     </w:p>
-    <w:bookmarkEnd w:id="122"/>
-    <w:bookmarkStart w:id="124" w:name="ref-Putri:2023"/>
+    <w:bookmarkEnd w:id="117"/>
+    <w:bookmarkStart w:id="119" w:name="ref-Putri:2023"/>
     <w:p>
       <w:pPr>
         <w:pStyle w:val="Bibliography"/>
@@ -34131,7 +33798,7 @@
       <w:r>
         <w:t xml:space="preserve"> </w:t>
       </w:r>
-      <w:hyperlink r:id="rId123">
+      <w:hyperlink r:id="rId118">
         <w:r>
           <w:rPr>
             <w:rStyle w:val="Hyperlink"/>
@@ -34143,8 +33810,8 @@
         <w:t xml:space="preserve">. Zootaxa 5353:455–467.</w:t>
       </w:r>
     </w:p>
-    <w:bookmarkEnd w:id="124"/>
-    <w:bookmarkStart w:id="126" w:name="ref-R:2024"/>
+    <w:bookmarkEnd w:id="119"/>
+    <w:bookmarkStart w:id="121" w:name="ref-R:2024"/>
     <w:p>
       <w:pPr>
         <w:pStyle w:val="Bibliography"/>
@@ -34155,7 +33822,7 @@
       <w:r>
         <w:t xml:space="preserve"> </w:t>
       </w:r>
-      <w:hyperlink r:id="rId125">
+      <w:hyperlink r:id="rId120">
         <w:r>
           <w:rPr>
             <w:rStyle w:val="Hyperlink"/>
@@ -34167,8 +33834,8 @@
         <w:t xml:space="preserve">. R Foundation for Statistical Computing, Vienna, Austria.</w:t>
       </w:r>
     </w:p>
-    <w:bookmarkEnd w:id="126"/>
-    <w:bookmarkStart w:id="128" w:name="ref-Revell:2012"/>
+    <w:bookmarkEnd w:id="121"/>
+    <w:bookmarkStart w:id="123" w:name="ref-Revell:2012"/>
     <w:p>
       <w:pPr>
         <w:pStyle w:val="Bibliography"/>
@@ -34179,7 +33846,7 @@
       <w:r>
         <w:t xml:space="preserve"> </w:t>
       </w:r>
-      <w:hyperlink r:id="rId127">
+      <w:hyperlink r:id="rId122">
         <w:r>
           <w:rPr>
             <w:rStyle w:val="Hyperlink"/>
@@ -34191,8 +33858,8 @@
         <w:t xml:space="preserve">. Methods in Ecology and Evolution 3:217–223.</w:t>
       </w:r>
     </w:p>
-    <w:bookmarkEnd w:id="128"/>
-    <w:bookmarkStart w:id="130" w:name="ref-Rivera:2017"/>
+    <w:bookmarkEnd w:id="123"/>
+    <w:bookmarkStart w:id="125" w:name="ref-Rivera:2017"/>
     <w:p>
       <w:pPr>
         <w:pStyle w:val="Bibliography"/>
@@ -34203,7 +33870,7 @@
       <w:r>
         <w:t xml:space="preserve"> </w:t>
       </w:r>
-      <w:hyperlink r:id="rId129">
+      <w:hyperlink r:id="rId124">
         <w:r>
           <w:rPr>
             <w:rStyle w:val="Hyperlink"/>
@@ -34215,8 +33882,8 @@
         <w:t xml:space="preserve">. Molecular Phylogenetics and Evolution 112:1–11. Academic Press Inc.</w:t>
       </w:r>
     </w:p>
-    <w:bookmarkEnd w:id="130"/>
-    <w:bookmarkStart w:id="132" w:name="ref-Setiadi:2010"/>
+    <w:bookmarkEnd w:id="125"/>
+    <w:bookmarkStart w:id="127" w:name="ref-Setiadi:2010"/>
     <w:p>
       <w:pPr>
         <w:pStyle w:val="Bibliography"/>
@@ -34227,7 +33894,7 @@
       <w:r>
         <w:t xml:space="preserve"> </w:t>
       </w:r>
-      <w:hyperlink r:id="rId131">
+      <w:hyperlink r:id="rId126">
         <w:r>
           <w:rPr>
             <w:rStyle w:val="Hyperlink"/>
@@ -34239,8 +33906,8 @@
         <w:t xml:space="preserve">. Conservation Biology 24:553–562.</w:t>
       </w:r>
     </w:p>
-    <w:bookmarkEnd w:id="132"/>
-    <w:bookmarkStart w:id="134" w:name="ref-Soliz:2025"/>
+    <w:bookmarkEnd w:id="127"/>
+    <w:bookmarkStart w:id="129" w:name="ref-Soliz:2025"/>
     <w:p>
       <w:pPr>
         <w:pStyle w:val="Bibliography"/>
@@ -34251,7 +33918,7 @@
       <w:r>
         <w:t xml:space="preserve"> </w:t>
       </w:r>
-      <w:hyperlink r:id="rId133">
+      <w:hyperlink r:id="rId128">
         <w:r>
           <w:rPr>
             <w:rStyle w:val="Hyperlink"/>
@@ -34263,19 +33930,29 @@
         <w:t xml:space="preserve">. Acta Zoologica 106:38–54.</w:t>
       </w:r>
     </w:p>
-    <w:bookmarkEnd w:id="134"/>
-    <w:bookmarkStart w:id="136" w:name="ref-Tu:2018"/>
+    <w:bookmarkEnd w:id="129"/>
+    <w:bookmarkStart w:id="130" w:name="ref-Stejneger:1908"/>
     <w:p>
       <w:pPr>
         <w:pStyle w:val="Bibliography"/>
       </w:pPr>
       <w:r>
+        <w:t xml:space="preserve">Stejneger, L. 1908. Two new species of toads from the philippines. Proceedings of the United States National Museum 33:573–576.</w:t>
+      </w:r>
+    </w:p>
+    <w:bookmarkEnd w:id="130"/>
+    <w:bookmarkStart w:id="132" w:name="ref-Tu:2018"/>
+    <w:p>
+      <w:pPr>
+        <w:pStyle w:val="Bibliography"/>
+      </w:pPr>
+      <w:r>
         <w:t xml:space="preserve">Tu, N., M. Yang, D. Liang, and P. Zhang. 2018.</w:t>
       </w:r>
       <w:r>
         <w:t xml:space="preserve"> </w:t>
       </w:r>
-      <w:hyperlink r:id="rId135">
+      <w:hyperlink r:id="rId131">
         <w:r>
           <w:rPr>
             <w:rStyle w:val="Hyperlink"/>
@@ -34287,8 +33964,8 @@
         <w:t xml:space="preserve">. Mol Phylogenet Evol 126:85–91.</w:t>
       </w:r>
     </w:p>
-    <w:bookmarkEnd w:id="136"/>
-    <w:bookmarkStart w:id="138" w:name="ref-Werner:1898"/>
+    <w:bookmarkEnd w:id="132"/>
+    <w:bookmarkStart w:id="134" w:name="ref-Werner:1898"/>
     <w:p>
       <w:pPr>
         <w:pStyle w:val="Bibliography"/>
@@ -34299,7 +33976,7 @@
       <w:r>
         <w:t xml:space="preserve"> </w:t>
       </w:r>
-      <w:hyperlink r:id="rId137">
+      <w:hyperlink r:id="rId133">
         <w:r>
           <w:rPr>
             <w:rStyle w:val="Hyperlink"/>
@@ -34341,8 +34018,8 @@
         <w:t xml:space="preserve">. Zoologischer Anzeiger 21:552–556. Jena VEB Gustav Fischer Verlag.</w:t>
       </w:r>
     </w:p>
-    <w:bookmarkEnd w:id="138"/>
-    <w:bookmarkStart w:id="140" w:name="ref-Wickham:2016"/>
+    <w:bookmarkEnd w:id="134"/>
+    <w:bookmarkStart w:id="136" w:name="ref-Wickham:2016"/>
     <w:p>
       <w:pPr>
         <w:pStyle w:val="Bibliography"/>
@@ -34353,7 +34030,7 @@
       <w:r>
         <w:t xml:space="preserve"> </w:t>
       </w:r>
-      <w:hyperlink r:id="rId139">
+      <w:hyperlink r:id="rId135">
         <w:r>
           <w:rPr>
             <w:rStyle w:val="Hyperlink"/>
@@ -34365,8 +34042,8 @@
         <w:t xml:space="preserve">. Springer-Verlag New York.</w:t>
       </w:r>
     </w:p>
-    <w:bookmarkEnd w:id="140"/>
-    <w:bookmarkStart w:id="142" w:name="ref-Ye:2012"/>
+    <w:bookmarkEnd w:id="136"/>
+    <w:bookmarkStart w:id="138" w:name="ref-Ye:2012"/>
     <w:p>
       <w:pPr>
         <w:pStyle w:val="Bibliography"/>
@@ -34377,7 +34054,7 @@
       <w:r>
         <w:t xml:space="preserve"> </w:t>
       </w:r>
-      <w:hyperlink r:id="rId141">
+      <w:hyperlink r:id="rId137">
         <w:r>
           <w:rPr>
             <w:rStyle w:val="Hyperlink"/>
@@ -34389,8 +34066,8 @@
         <w:t xml:space="preserve">. BMC Bioinformatics 13:134.</w:t>
       </w:r>
     </w:p>
-    <w:bookmarkEnd w:id="142"/>
-    <w:bookmarkStart w:id="144" w:name="ref-Yu:2020"/>
+    <w:bookmarkEnd w:id="138"/>
+    <w:bookmarkStart w:id="140" w:name="ref-Yu:2020"/>
     <w:p>
       <w:pPr>
         <w:pStyle w:val="Bibliography"/>
@@ -34401,7 +34078,7 @@
       <w:r>
         <w:t xml:space="preserve"> </w:t>
       </w:r>
-      <w:hyperlink r:id="rId143">
+      <w:hyperlink r:id="rId139">
         <w:r>
           <w:rPr>
             <w:rStyle w:val="Hyperlink"/>
@@ -34413,8 +34090,8 @@
         <w:t xml:space="preserve">. Current Protocols in Bioinformatics 69:e96.</w:t>
       </w:r>
     </w:p>
-    <w:bookmarkEnd w:id="144"/>
-    <w:bookmarkStart w:id="146" w:name="ref-Yu:2017"/>
+    <w:bookmarkEnd w:id="140"/>
+    <w:bookmarkStart w:id="142" w:name="ref-Yu:2017"/>
     <w:p>
       <w:pPr>
         <w:pStyle w:val="Bibliography"/>
@@ -34425,7 +34102,7 @@
       <w:r>
         <w:t xml:space="preserve"> </w:t>
       </w:r>
-      <w:hyperlink r:id="rId145">
+      <w:hyperlink r:id="rId141">
         <w:r>
           <w:rPr>
             <w:rStyle w:val="Hyperlink"/>
@@ -34437,8 +34114,8 @@
         <w:t xml:space="preserve"> Methods in Ecology and Evolution 8:28–36.</w:t>
       </w:r>
     </w:p>
-    <w:bookmarkEnd w:id="146"/>
-    <w:bookmarkStart w:id="148" w:name="ref-ICZN:1999"/>
+    <w:bookmarkEnd w:id="142"/>
+    <w:bookmarkStart w:id="144" w:name="ref-ICZN:1999"/>
     <w:p>
       <w:pPr>
         <w:pStyle w:val="Bibliography"/>
@@ -34449,7 +34126,7 @@
       <w:r>
         <w:t xml:space="preserve"> </w:t>
       </w:r>
-      <w:hyperlink r:id="rId147">
+      <w:hyperlink r:id="rId143">
         <w:r>
           <w:rPr>
             <w:rStyle w:val="Hyperlink"/>
@@ -34461,8 +34138,8 @@
         <w:t xml:space="preserve">. London, International Trust for Zoological Nomenclature, c/o Natural History Museum, 1999.</w:t>
       </w:r>
     </w:p>
-    <w:bookmarkEnd w:id="148"/>
-    <w:bookmarkStart w:id="149" w:name="ref-Zweifel:2003"/>
+    <w:bookmarkEnd w:id="144"/>
+    <w:bookmarkStart w:id="145" w:name="ref-Zweifel:2003"/>
     <w:p>
       <w:pPr>
         <w:pStyle w:val="Bibliography"/>
@@ -34471,8 +34148,8 @@
         <w:t xml:space="preserve">Zweifel, R. G. 2003. A new species of microhylid frog, genus oreophryne, from papua new guinea. American Museum Novitates 1–8.</w:t>
       </w:r>
     </w:p>
-    <w:bookmarkEnd w:id="149"/>
-    <w:bookmarkStart w:id="150" w:name="ref-Zweifel:1956"/>
+    <w:bookmarkEnd w:id="145"/>
+    <w:bookmarkStart w:id="146" w:name="ref-Zweifel:1956"/>
     <w:p>
       <w:pPr>
         <w:pStyle w:val="Bibliography"/>
@@ -34481,8 +34158,8 @@
         <w:t xml:space="preserve">Zweifel, R. G. 1956. Microhylid frogs from new guinea, with descriptions of new species. American Museum Novitates 1–49.</w:t>
       </w:r>
     </w:p>
-    <w:bookmarkEnd w:id="150"/>
-    <w:bookmarkStart w:id="152" w:name="ref-Zweifel:2005"/>
+    <w:bookmarkEnd w:id="146"/>
+    <w:bookmarkStart w:id="148" w:name="ref-Zweifel:2005"/>
     <w:p>
       <w:pPr>
         <w:pStyle w:val="Bibliography"/>
@@ -34493,7 +34170,7 @@
       <w:r>
         <w:t xml:space="preserve"> </w:t>
       </w:r>
-      <w:hyperlink r:id="rId151">
+      <w:hyperlink r:id="rId147">
         <w:r>
           <w:rPr>
             <w:rStyle w:val="Hyperlink"/>
@@ -34505,8 +34182,8 @@
         <w:t xml:space="preserve">. American Museum Novitates 3495:1–25.</w:t>
       </w:r>
     </w:p>
-    <w:bookmarkEnd w:id="152"/>
-    <w:bookmarkStart w:id="154" w:name="ref-Zweifel:2003a"/>
+    <w:bookmarkEnd w:id="148"/>
+    <w:bookmarkStart w:id="150" w:name="ref-Zweifel:2003a"/>
     <w:p>
       <w:pPr>
         <w:pStyle w:val="Bibliography"/>
@@ -34517,7 +34194,7 @@
       <w:r>
         <w:t xml:space="preserve"> </w:t>
       </w:r>
-      <w:hyperlink r:id="rId153">
+      <w:hyperlink r:id="rId149">
         <w:r>
           <w:rPr>
             <w:rStyle w:val="Hyperlink"/>
@@ -34529,9 +34206,9 @@
         <w:t xml:space="preserve">. AMERICAN MUSEUM NOVITATES 1–31.</w:t>
       </w:r>
     </w:p>
-    <w:bookmarkEnd w:id="154"/>
-    <w:bookmarkEnd w:id="155"/>
-    <w:bookmarkEnd w:id="156"/>
+    <w:bookmarkEnd w:id="150"/>
+    <w:bookmarkEnd w:id="151"/>
+    <w:bookmarkEnd w:id="152"/>
     <w:sectPr/>
   </w:body>
 </w:document>

</xml_diff>

<commit_message>
updated diagnosis and phylogenetic definition blocks for both genera
</commit_message>
<xml_diff>
--- a/Products/oreo-taxonomy.docx
+++ b/Products/oreo-taxonomy.docx
@@ -27182,65 +27182,7 @@
         <w:t xml:space="preserve">Auparoparo</w:t>
       </w:r>
       <w:r>
-        <w:t xml:space="preserve">. Diagnoses should be made by molecular phylogenetic analysis, including at least representatives of</w:t>
-      </w:r>
-      <w:r>
-        <w:t xml:space="preserve"> </w:t>
-      </w:r>
-      <w:r>
-        <w:rPr>
-          <w:i/>
-          <w:iCs/>
-        </w:rPr>
-        <w:t xml:space="preserve">Oreophryne</w:t>
-      </w:r>
-      <w:r>
-        <w:t xml:space="preserve">,</w:t>
-      </w:r>
-      <w:r>
-        <w:t xml:space="preserve"> </w:t>
-      </w:r>
-      <w:r>
-        <w:rPr>
-          <w:i/>
-          <w:iCs/>
-        </w:rPr>
-        <w:t xml:space="preserve">Auparoparo</w:t>
-      </w:r>
-      <w:r>
-        <w:t xml:space="preserve">,</w:t>
-      </w:r>
-      <w:r>
-        <w:t xml:space="preserve"> </w:t>
-      </w:r>
-      <w:r>
-        <w:rPr>
-          <w:i/>
-          <w:iCs/>
-        </w:rPr>
-        <w:t xml:space="preserve">Cophixalus</w:t>
-      </w:r>
-      <w:r>
-        <w:t xml:space="preserve"> </w:t>
-      </w:r>
-      <w:r>
-        <w:t xml:space="preserve">and</w:t>
-      </w:r>
-      <w:r>
-        <w:t xml:space="preserve"> </w:t>
-      </w:r>
-      <w:r>
-        <w:rPr>
-          <w:i/>
-          <w:iCs/>
-        </w:rPr>
-        <w:t xml:space="preserve">Paedophryne</w:t>
-      </w:r>
-      <w:r>
-        <w:t xml:space="preserve"> </w:t>
-      </w:r>
-      <w:r>
-        <w:t xml:space="preserve">or other closest sister genera as outgroups.</w:t>
+        <w:t xml:space="preserve">. Diagnoses should be made by molecular phylogenetic analysis, based on the phylogenetic definition below.</w:t>
       </w:r>
     </w:p>
     <w:p>
@@ -27486,7 +27428,10 @@
         <w:t xml:space="preserve"> </w:t>
       </w:r>
       <w:r>
-        <w:t xml:space="preserve">(Peters and Doria, 1878), the type species of</w:t>
+        <w:t xml:space="preserve">(Peters and Doria 1878)</w:t>
+      </w:r>
+      <w:r>
+        <w:t xml:space="preserve">, the type species of</w:t>
       </w:r>
       <w:r>
         <w:t xml:space="preserve"> </w:t>
@@ -27515,7 +27460,37 @@
         <w:t xml:space="preserve"> </w:t>
       </w:r>
       <w:r>
-        <w:t xml:space="preserve">more recently than they do with</w:t>
+        <w:t xml:space="preserve">more recently than they do with reference species of all the other nominal generic clades listed in</w:t>
+      </w:r>
+      <w:r>
+        <w:t xml:space="preserve"> </w:t>
+      </w:r>
+      <w:hyperlink w:anchor="tbl-genera-types">
+        <w:r>
+          <w:rPr>
+            <w:rStyle w:val="Hyperlink"/>
+          </w:rPr>
+          <w:t xml:space="preserve">Table 4</w:t>
+        </w:r>
+      </w:hyperlink>
+      <w:r>
+        <w:t xml:space="preserve">; with reference species of the closest sister clades to</w:t>
+      </w:r>
+      <w:r>
+        <w:t xml:space="preserve"> </w:t>
+      </w:r>
+      <w:r>
+        <w:rPr>
+          <w:i/>
+          <w:iCs/>
+        </w:rPr>
+        <w:t xml:space="preserve">Oreophryne</w:t>
+      </w:r>
+      <w:r>
+        <w:t xml:space="preserve"> </w:t>
+      </w:r>
+      <w:r>
+        <w:t xml:space="preserve">currently being</w:t>
       </w:r>
       <w:r>
         <w:t xml:space="preserve"> </w:t>
@@ -27531,7 +27506,10 @@
         <w:t xml:space="preserve"> </w:t>
       </w:r>
       <w:r>
-        <w:t xml:space="preserve">Kraus 2016, nor</w:t>
+        <w:t xml:space="preserve">Kraus (2016)</w:t>
+      </w:r>
+      <w:r>
+        <w:t xml:space="preserve">,</w:t>
       </w:r>
       <w:r>
         <w:t xml:space="preserve"> </w:t>
@@ -27547,7 +27525,10 @@
         <w:t xml:space="preserve"> </w:t>
       </w:r>
       <w:r>
-        <w:t xml:space="preserve">Boettger 1892, nor</w:t>
+        <w:t xml:space="preserve">Boettger (1892)</w:t>
+      </w:r>
+      <w:r>
+        <w:t xml:space="preserve">, and</w:t>
       </w:r>
       <w:r>
         <w:t xml:space="preserve"> </w:t>
@@ -27563,7 +27544,20 @@
         <w:t xml:space="preserve"> </w:t>
       </w:r>
       <w:r>
-        <w:t xml:space="preserve">Kraus 2010.</w:t>
+        <w:t xml:space="preserve">(</w:t>
+      </w:r>
+      <w:r>
+        <w:rPr>
+          <w:b/>
+          <w:bCs/>
+        </w:rPr>
+        <w:t xml:space="preserve">Kraus:2010?</w:t>
+      </w:r>
+      <w:r>
+        <w:t xml:space="preserve">)</w:t>
+      </w:r>
+      <w:r>
+        <w:t xml:space="preserve">.</w:t>
       </w:r>
     </w:p>
     <w:tbl>
@@ -30529,7 +30523,19 @@
         <w:t xml:space="preserve">Oreophryne</w:t>
       </w:r>
       <w:r>
-        <w:t xml:space="preserve">. Diagnoses should be made by molecular phylogenetic analysis, including at least representatives of</w:t>
+        <w:t xml:space="preserve">. Diagnoses should be made by molecular phylogenetic analysis, based on the phylogenetic definition below.</w:t>
+      </w:r>
+    </w:p>
+    <w:p>
+      <w:pPr>
+        <w:pStyle w:val="BodyText"/>
+      </w:pPr>
+      <w:r>
+        <w:rPr>
+          <w:b/>
+          <w:bCs/>
+        </w:rPr>
+        <w:t xml:space="preserve">Description:</w:t>
       </w:r>
       <w:r>
         <w:t xml:space="preserve"> </w:t>
@@ -30542,7 +30548,10 @@
         <w:t xml:space="preserve">Auparoparo</w:t>
       </w:r>
       <w:r>
-        <w:t xml:space="preserve">,</w:t>
+        <w:t xml:space="preserve"> </w:t>
+      </w:r>
+      <w:r>
+        <w:t xml:space="preserve">differs from most other genera in subfamily Asterophryinae, but not from</w:t>
       </w:r>
       <w:r>
         <w:t xml:space="preserve"> </w:t>
@@ -30555,23 +30564,41 @@
         <w:t xml:space="preserve">Oreophryne</w:t>
       </w:r>
       <w:r>
-        <w:t xml:space="preserve">,</w:t>
-      </w:r>
-      <w:r>
-        <w:t xml:space="preserve"> </w:t>
+        <w:t xml:space="preserve">, by the combination of (1) presence of highly reduced clavicles (vs absence or elongate) which have a distinctly curved shape; (2) presence of well developed digital discs, with finger discs notably wider than toe discs (typically 20% or more); (3) arboreal lifestyle (perch height &gt;2m above ground); (4) small to moderately large body size in known species, from 16mm (</w:t>
       </w:r>
       <w:r>
         <w:rPr>
           <w:i/>
           <w:iCs/>
         </w:rPr>
-        <w:t xml:space="preserve">Cophixalus</w:t>
-      </w:r>
-      <w:r>
-        <w:t xml:space="preserve"> </w:t>
-      </w:r>
-      <w:r>
-        <w:t xml:space="preserve">and</w:t>
+        <w:t xml:space="preserve">A. brunnea</w:t>
+      </w:r>
+      <w:r>
+        <w:t xml:space="preserve">, Kraus 2017) to 25 mm (A. picticrus, Kraus 2016); (5) small to invisible tympanum; (6) large eyes with pupil horizontal; (7) occasional presence of toe webbing; (8) and thin, elongated limbs; and (9) and in many species males that call with a</w:t>
+      </w:r>
+      <w:r>
+        <w:t xml:space="preserve"> </w:t>
+      </w:r>
+      <w:r>
+        <w:t xml:space="preserve">“whinny”</w:t>
+      </w:r>
+      <w:r>
+        <w:t xml:space="preserve"> </w:t>
+      </w:r>
+      <w:r>
+        <w:t xml:space="preserve">call type or in some species</w:t>
+      </w:r>
+      <w:r>
+        <w:t xml:space="preserve"> </w:t>
+      </w:r>
+      <w:r>
+        <w:t xml:space="preserve">“rattle”</w:t>
+      </w:r>
+      <w:r>
+        <w:t xml:space="preserve"> </w:t>
+      </w:r>
+      <w:r>
+        <w:t xml:space="preserve">type. Some species of</w:t>
       </w:r>
       <w:r>
         <w:t xml:space="preserve"> </w:t>
@@ -30581,13 +30608,65 @@
           <w:i/>
           <w:iCs/>
         </w:rPr>
-        <w:t xml:space="preserve">Paedophryne</w:t>
-      </w:r>
-      <w:r>
-        <w:t xml:space="preserve"> </w:t>
-      </w:r>
-      <w:r>
-        <w:t xml:space="preserve">or other closest sister genera as outgroups.</w:t>
+        <w:t xml:space="preserve">Auparoparo</w:t>
+      </w:r>
+      <w:r>
+        <w:t xml:space="preserve"> </w:t>
+      </w:r>
+      <w:r>
+        <w:t xml:space="preserve">may be distinguished from</w:t>
+      </w:r>
+      <w:r>
+        <w:t xml:space="preserve"> </w:t>
+      </w:r>
+      <w:r>
+        <w:rPr>
+          <w:i/>
+          <w:iCs/>
+        </w:rPr>
+        <w:t xml:space="preserve">Oreophryne</w:t>
+      </w:r>
+      <w:r>
+        <w:t xml:space="preserve"> </w:t>
+      </w:r>
+      <w:r>
+        <w:t xml:space="preserve">by larger finger pads than toe pads and males calling with</w:t>
+      </w:r>
+      <w:r>
+        <w:t xml:space="preserve"> </w:t>
+      </w:r>
+      <w:r>
+        <w:t xml:space="preserve">“whinny”</w:t>
+      </w:r>
+      <w:r>
+        <w:t xml:space="preserve"> </w:t>
+      </w:r>
+      <w:r>
+        <w:t xml:space="preserve">but not</w:t>
+      </w:r>
+      <w:r>
+        <w:t xml:space="preserve"> </w:t>
+      </w:r>
+      <w:r>
+        <w:t xml:space="preserve">“honk”</w:t>
+      </w:r>
+      <w:r>
+        <w:t xml:space="preserve"> </w:t>
+      </w:r>
+      <w:r>
+        <w:t xml:space="preserve">or</w:t>
+      </w:r>
+      <w:r>
+        <w:t xml:space="preserve"> </w:t>
+      </w:r>
+      <w:r>
+        <w:t xml:space="preserve">“peep”</w:t>
+      </w:r>
+      <w:r>
+        <w:t xml:space="preserve"> </w:t>
+      </w:r>
+      <w:r>
+        <w:t xml:space="preserve">call types.</w:t>
       </w:r>
     </w:p>
     <w:p>
@@ -30599,7 +30678,7 @@
           <w:b/>
           <w:bCs/>
         </w:rPr>
-        <w:t xml:space="preserve">Description:</w:t>
+        <w:t xml:space="preserve">Phylogenetic definition:</w:t>
       </w:r>
       <w:r>
         <w:t xml:space="preserve"> </w:t>
@@ -30615,7 +30694,7 @@
         <w:t xml:space="preserve"> </w:t>
       </w:r>
       <w:r>
-        <w:t xml:space="preserve">differs from most other genera in subfamily Asterophryinae, but not from</w:t>
+        <w:t xml:space="preserve">(NCN) applies to the largest crown clade originating in (CCN) is defined as the maximum crown-clade originating with the most recent common ancestor of</w:t>
       </w:r>
       <w:r>
         <w:t xml:space="preserve"> </w:t>
@@ -30625,44 +30704,16 @@
           <w:i/>
           <w:iCs/>
         </w:rPr>
-        <w:t xml:space="preserve">Oreophryne</w:t>
-      </w:r>
-      <w:r>
-        <w:t xml:space="preserve">, by the combination of (1) presence of highly reduced clavicles (vs absence or elongate) which have a distinctly curved shape; (2) presence of well developed digital discs, with finger discs notably wider than toe discs (typically 20% or more); (3) arboreal lifestyle (perch height &gt;2m above ground); (4) small to moderately large body size in known species, from 16mm (</w:t>
-      </w:r>
-      <w:r>
-        <w:rPr>
-          <w:i/>
-          <w:iCs/>
-        </w:rPr>
-        <w:t xml:space="preserve">A. brunnea</w:t>
-      </w:r>
-      <w:r>
-        <w:t xml:space="preserve">, Kraus 2017) to 25 mm (A. picticrus, Kraus 2016); (5) small to invisible tympanum; (6) large eyes with pupil horizontal; (7) occasional presence of toe webbing; (8) and thin, elongated limbs; and (9) and in many species males that call with a</w:t>
-      </w:r>
-      <w:r>
-        <w:t xml:space="preserve"> </w:t>
-      </w:r>
-      <w:r>
-        <w:t xml:space="preserve">“whinny”</w:t>
-      </w:r>
-      <w:r>
-        <w:t xml:space="preserve"> </w:t>
-      </w:r>
-      <w:r>
-        <w:t xml:space="preserve">call type or in some species</w:t>
-      </w:r>
-      <w:r>
-        <w:t xml:space="preserve"> </w:t>
-      </w:r>
-      <w:r>
-        <w:t xml:space="preserve">“rattle”</w:t>
-      </w:r>
-      <w:r>
-        <w:t xml:space="preserve"> </w:t>
-      </w:r>
-      <w:r>
-        <w:t xml:space="preserve">type. Some species of</w:t>
+        <w:t xml:space="preserve">Auparoparo penelopeia</w:t>
+      </w:r>
+      <w:r>
+        <w:t xml:space="preserve"> </w:t>
+      </w:r>
+      <w:r>
+        <w:t xml:space="preserve">(Kraus 2016)</w:t>
+      </w:r>
+      <w:r>
+        <w:t xml:space="preserve">, the type species of</w:t>
       </w:r>
       <w:r>
         <w:t xml:space="preserve"> </w:t>
@@ -30675,90 +30726,7 @@
         <w:t xml:space="preserve">Auparoparo</w:t>
       </w:r>
       <w:r>
-        <w:t xml:space="preserve"> </w:t>
-      </w:r>
-      <w:r>
-        <w:t xml:space="preserve">may be distinguished from</w:t>
-      </w:r>
-      <w:r>
-        <w:t xml:space="preserve"> </w:t>
-      </w:r>
-      <w:r>
-        <w:rPr>
-          <w:i/>
-          <w:iCs/>
-        </w:rPr>
-        <w:t xml:space="preserve">Oreophryne</w:t>
-      </w:r>
-      <w:r>
-        <w:t xml:space="preserve"> </w:t>
-      </w:r>
-      <w:r>
-        <w:t xml:space="preserve">by larger finger pads than toe pads and males calling with</w:t>
-      </w:r>
-      <w:r>
-        <w:t xml:space="preserve"> </w:t>
-      </w:r>
-      <w:r>
-        <w:t xml:space="preserve">“whinny”</w:t>
-      </w:r>
-      <w:r>
-        <w:t xml:space="preserve"> </w:t>
-      </w:r>
-      <w:r>
-        <w:t xml:space="preserve">but not</w:t>
-      </w:r>
-      <w:r>
-        <w:t xml:space="preserve"> </w:t>
-      </w:r>
-      <w:r>
-        <w:t xml:space="preserve">“honk”</w:t>
-      </w:r>
-      <w:r>
-        <w:t xml:space="preserve"> </w:t>
-      </w:r>
-      <w:r>
-        <w:t xml:space="preserve">or</w:t>
-      </w:r>
-      <w:r>
-        <w:t xml:space="preserve"> </w:t>
-      </w:r>
-      <w:r>
-        <w:t xml:space="preserve">“peep”</w:t>
-      </w:r>
-      <w:r>
-        <w:t xml:space="preserve"> </w:t>
-      </w:r>
-      <w:r>
-        <w:t xml:space="preserve">call types.</w:t>
-      </w:r>
-    </w:p>
-    <w:p>
-      <w:pPr>
-        <w:pStyle w:val="BodyText"/>
-      </w:pPr>
-      <w:r>
-        <w:rPr>
-          <w:b/>
-          <w:bCs/>
-        </w:rPr>
-        <w:t xml:space="preserve">Phylogenetic definition:</w:t>
-      </w:r>
-      <w:r>
-        <w:t xml:space="preserve"> </w:t>
-      </w:r>
-      <w:r>
-        <w:rPr>
-          <w:i/>
-          <w:iCs/>
-        </w:rPr>
-        <w:t xml:space="preserve">Auparoparo</w:t>
-      </w:r>
-      <w:r>
-        <w:t xml:space="preserve"> </w:t>
-      </w:r>
-      <w:r>
-        <w:t xml:space="preserve">(NCN) applies to the largest crown clade originating in (CCN) is defined as the maximum crown-clade originating with the most recent common ancestor of Auparoparo penelopeia Kraus 2016, the type species of Auparoparo, and all extant species that share a common ancestor with</w:t>
+        <w:t xml:space="preserve">, and all extant species that share a common ancestor with</w:t>
       </w:r>
       <w:r>
         <w:t xml:space="preserve"> </w:t>
@@ -30798,13 +30766,35 @@
           <w:i/>
           <w:iCs/>
         </w:rPr>
+        <w:t xml:space="preserve">Oreophryne senckenbergiana</w:t>
+      </w:r>
+      <w:r>
+        <w:t xml:space="preserve"> </w:t>
+      </w:r>
+      <w:r>
+        <w:t xml:space="preserve">(Peters and Doria 1878)</w:t>
+      </w:r>
+      <w:r>
+        <w:t xml:space="preserve">,</w:t>
+      </w:r>
+      <w:r>
+        <w:t xml:space="preserve"> </w:t>
+      </w:r>
+      <w:r>
+        <w:rPr>
+          <w:i/>
+          <w:iCs/>
+        </w:rPr>
         <w:t xml:space="preserve">Cophixalus verrucosus</w:t>
       </w:r>
       <w:r>
         <w:t xml:space="preserve"> </w:t>
       </w:r>
       <w:r>
-        <w:t xml:space="preserve">Boettger 1892,</w:t>
+        <w:t xml:space="preserve">Boettger (1892)</w:t>
+      </w:r>
+      <w:r>
+        <w:t xml:space="preserve">, and</w:t>
       </w:r>
       <w:r>
         <w:t xml:space="preserve"> </w:t>
@@ -30820,35 +30810,18 @@
         <w:t xml:space="preserve"> </w:t>
       </w:r>
       <w:r>
-        <w:t xml:space="preserve">Kraus 2010,</w:t>
-      </w:r>
-      <w:r>
-        <w:t xml:space="preserve"> </w:t>
+        <w:t xml:space="preserve">(</w:t>
       </w:r>
       <w:r>
         <w:rPr>
-          <w:i/>
-          <w:iCs/>
+          <w:b/>
+          <w:bCs/>
         </w:rPr>
-        <w:t xml:space="preserve">Oreophryne senckenbergiana</w:t>
-      </w:r>
-      <w:r>
-        <w:t xml:space="preserve"> </w:t>
-      </w:r>
-      <w:r>
-        <w:t xml:space="preserve">Peters and Doria, 1878, and any of the remaining genera in</w:t>
-      </w:r>
-      <w:r>
-        <w:t xml:space="preserve"> </w:t>
-      </w:r>
-      <w:hyperlink w:anchor="tbl-genera-types">
-        <w:r>
-          <w:rPr>
-            <w:rStyle w:val="Hyperlink"/>
-          </w:rPr>
-          <w:t xml:space="preserve">Table 4</w:t>
-        </w:r>
-      </w:hyperlink>
+        <w:t xml:space="preserve">Kraus:2010?</w:t>
+      </w:r>
+      <w:r>
+        <w:t xml:space="preserve">)</w:t>
+      </w:r>
       <w:r>
         <w:t xml:space="preserve">.</w:t>
       </w:r>
@@ -33002,7 +32975,7 @@
       </w:r>
     </w:p>
     <w:bookmarkEnd w:id="58"/>
-    <w:bookmarkStart w:id="152" w:name="citations"/>
+    <w:bookmarkStart w:id="153" w:name="citations"/>
     <w:p>
       <w:pPr>
         <w:pStyle w:val="Heading1"/>
@@ -33011,7 +32984,7 @@
         <w:t xml:space="preserve">Citations</w:t>
       </w:r>
     </w:p>
-    <w:bookmarkStart w:id="151" w:name="refs"/>
+    <w:bookmarkStart w:id="152" w:name="refs"/>
     <w:bookmarkStart w:id="59" w:name="ref-Ahl:1933"/>
     <w:p>
       <w:pPr>
@@ -33070,34 +33043,50 @@
       </w:r>
     </w:p>
     <w:bookmarkEnd w:id="63"/>
-    <w:bookmarkStart w:id="64" w:name="ref-Boettger:1895"/>
+    <w:bookmarkStart w:id="64" w:name="ref-Boettger:1892"/>
     <w:p>
       <w:pPr>
         <w:pStyle w:val="Bibliography"/>
       </w:pPr>
       <w:r>
-        <w:t xml:space="preserve">Boettger, O. 1895. Liste der reptilien und batrachier der insel halmaheira nach den sammlungen prof. Dr. W. K</w:t>
+        <w:t xml:space="preserve">Boettger, O. 1892. Katalog der batrachier-sammlung im museum der senckenbergischen naturforschenden gesellshaft in frankfurt am main. Frankfurt a. M.: Gebr</w:t>
       </w:r>
       <w:r>
         <w:t xml:space="preserve">ü</w:t>
       </w:r>
       <w:r>
-        <w:t xml:space="preserve">kenthal’s. Zoologischer Anzeiger 18:129–138.</w:t>
+        <w:t xml:space="preserve">der Knauer.</w:t>
       </w:r>
     </w:p>
     <w:bookmarkEnd w:id="64"/>
-    <w:bookmarkStart w:id="66" w:name="ref-Boulenger:1896"/>
+    <w:bookmarkStart w:id="65" w:name="ref-Boettger:1895"/>
     <w:p>
       <w:pPr>
         <w:pStyle w:val="Bibliography"/>
       </w:pPr>
       <w:r>
+        <w:t xml:space="preserve">Boettger, O. 1895. Liste der reptilien und batrachier der insel halmaheira nach den sammlungen prof. Dr. W. K</w:t>
+      </w:r>
+      <w:r>
+        <w:t xml:space="preserve">ü</w:t>
+      </w:r>
+      <w:r>
+        <w:t xml:space="preserve">kenthal’s. Zoologischer Anzeiger 18:129–138.</w:t>
+      </w:r>
+    </w:p>
+    <w:bookmarkEnd w:id="65"/>
+    <w:bookmarkStart w:id="67" w:name="ref-Boulenger:1896"/>
+    <w:p>
+      <w:pPr>
+        <w:pStyle w:val="Bibliography"/>
+      </w:pPr>
+      <w:r>
         <w:t xml:space="preserve">Boulenger, G. A. 1896.</w:t>
       </w:r>
       <w:r>
         <w:t xml:space="preserve"> </w:t>
       </w:r>
-      <w:hyperlink r:id="rId65">
+      <w:hyperlink r:id="rId66">
         <w:r>
           <w:rPr>
             <w:rStyle w:val="Hyperlink"/>
@@ -33109,8 +33098,8 @@
         <w:t xml:space="preserve">. The Annals and magazine of natural history; zoology, botany, and geology, Series 6 18:62–64.</w:t>
       </w:r>
     </w:p>
-    <w:bookmarkEnd w:id="66"/>
-    <w:bookmarkStart w:id="68" w:name="ref-Brown:2015"/>
+    <w:bookmarkEnd w:id="67"/>
+    <w:bookmarkStart w:id="69" w:name="ref-Brown:2015"/>
     <w:p>
       <w:pPr>
         <w:pStyle w:val="Bibliography"/>
@@ -33121,7 +33110,7 @@
       <w:r>
         <w:t xml:space="preserve"> </w:t>
       </w:r>
-      <w:hyperlink r:id="rId67">
+      <w:hyperlink r:id="rId68">
         <w:r>
           <w:rPr>
             <w:rStyle w:val="Hyperlink"/>
@@ -33133,8 +33122,8 @@
         <w:t xml:space="preserve">. Zoological Journal of the Linnean Society 174:130–168.</w:t>
       </w:r>
     </w:p>
-    <w:bookmarkEnd w:id="68"/>
-    <w:bookmarkStart w:id="70" w:name="ref-deQueiroz:2020"/>
+    <w:bookmarkEnd w:id="69"/>
+    <w:bookmarkStart w:id="71" w:name="ref-deQueiroz:2020"/>
     <w:p>
       <w:pPr>
         <w:pStyle w:val="Bibliography"/>
@@ -33145,7 +33134,7 @@
       <w:r>
         <w:t xml:space="preserve"> </w:t>
       </w:r>
-      <w:hyperlink r:id="rId69">
+      <w:hyperlink r:id="rId70">
         <w:r>
           <w:rPr>
             <w:rStyle w:val="Hyperlink"/>
@@ -33157,8 +33146,8 @@
         <w:t xml:space="preserve">. 1st ed. CRC Press.</w:t>
       </w:r>
     </w:p>
-    <w:bookmarkEnd w:id="70"/>
-    <w:bookmarkStart w:id="72" w:name="ref-deQueiroz:1992"/>
+    <w:bookmarkEnd w:id="71"/>
+    <w:bookmarkStart w:id="73" w:name="ref-deQueiroz:1992"/>
     <w:p>
       <w:pPr>
         <w:pStyle w:val="Bibliography"/>
@@ -33169,7 +33158,7 @@
       <w:r>
         <w:t xml:space="preserve"> </w:t>
       </w:r>
-      <w:hyperlink r:id="rId71">
+      <w:hyperlink r:id="rId72">
         <w:r>
           <w:rPr>
             <w:rStyle w:val="Hyperlink"/>
@@ -33193,8 +33182,8 @@
         <w:t xml:space="preserve">23:449–480.</w:t>
       </w:r>
     </w:p>
-    <w:bookmarkEnd w:id="72"/>
-    <w:bookmarkStart w:id="74" w:name="ref-deQueiroz:1990"/>
+    <w:bookmarkEnd w:id="73"/>
+    <w:bookmarkStart w:id="75" w:name="ref-deQueiroz:1990"/>
     <w:p>
       <w:pPr>
         <w:pStyle w:val="Bibliography"/>
@@ -33205,7 +33194,7 @@
       <w:r>
         <w:t xml:space="preserve"> </w:t>
       </w:r>
-      <w:hyperlink r:id="rId73">
+      <w:hyperlink r:id="rId74">
         <w:r>
           <w:rPr>
             <w:rStyle w:val="Hyperlink"/>
@@ -33217,8 +33206,8 @@
         <w:t xml:space="preserve">. Systematic Zoology 39:307–322.</w:t>
       </w:r>
     </w:p>
-    <w:bookmarkEnd w:id="74"/>
-    <w:bookmarkStart w:id="76" w:name="ref-deQueiroz:1994"/>
+    <w:bookmarkEnd w:id="75"/>
+    <w:bookmarkStart w:id="77" w:name="ref-deQueiroz:1994"/>
     <w:p>
       <w:pPr>
         <w:pStyle w:val="Bibliography"/>
@@ -33229,7 +33218,7 @@
       <w:r>
         <w:t xml:space="preserve"> </w:t>
       </w:r>
-      <w:hyperlink r:id="rId75">
+      <w:hyperlink r:id="rId76">
         <w:r>
           <w:rPr>
             <w:rStyle w:val="Hyperlink"/>
@@ -33253,8 +33242,8 @@
         <w:t xml:space="preserve">9:27–31.</w:t>
       </w:r>
     </w:p>
-    <w:bookmarkEnd w:id="76"/>
-    <w:bookmarkStart w:id="78" w:name="ref-deSa:2012"/>
+    <w:bookmarkEnd w:id="77"/>
+    <w:bookmarkStart w:id="79" w:name="ref-deSa:2012"/>
     <w:p>
       <w:pPr>
         <w:pStyle w:val="Bibliography"/>
@@ -33265,7 +33254,7 @@
       <w:r>
         <w:t xml:space="preserve"> </w:t>
       </w:r>
-      <w:hyperlink r:id="rId77">
+      <w:hyperlink r:id="rId78">
         <w:r>
           <w:rPr>
             <w:rStyle w:val="Hyperlink"/>
@@ -33292,8 +33281,8 @@
         <w:t xml:space="preserve">.</w:t>
       </w:r>
     </w:p>
-    <w:bookmarkEnd w:id="78"/>
-    <w:bookmarkStart w:id="80" w:name="ref-Edgar:2004"/>
+    <w:bookmarkEnd w:id="79"/>
+    <w:bookmarkStart w:id="81" w:name="ref-Edgar:2004"/>
     <w:p>
       <w:pPr>
         <w:pStyle w:val="Bibliography"/>
@@ -33304,7 +33293,7 @@
       <w:r>
         <w:t xml:space="preserve"> </w:t>
       </w:r>
-      <w:hyperlink r:id="rId79">
+      <w:hyperlink r:id="rId80">
         <w:r>
           <w:rPr>
             <w:rStyle w:val="Hyperlink"/>
@@ -33316,8 +33305,8 @@
         <w:t xml:space="preserve">. BMC Bioinformatics 5:113.</w:t>
       </w:r>
     </w:p>
-    <w:bookmarkEnd w:id="80"/>
-    <w:bookmarkStart w:id="82" w:name="ref-Engelkes:2020"/>
+    <w:bookmarkEnd w:id="81"/>
+    <w:bookmarkStart w:id="83" w:name="ref-Engelkes:2020"/>
     <w:p>
       <w:pPr>
         <w:pStyle w:val="Bibliography"/>
@@ -33328,7 +33317,7 @@
       <w:r>
         <w:t xml:space="preserve"> </w:t>
       </w:r>
-      <w:hyperlink r:id="rId81">
+      <w:hyperlink r:id="rId82">
         <w:r>
           <w:rPr>
             <w:rStyle w:val="Hyperlink"/>
@@ -33340,8 +33329,8 @@
         <w:t xml:space="preserve">. ECOLOGY AND EVOLUTION 10:11467–11487.</w:t>
       </w:r>
     </w:p>
-    <w:bookmarkEnd w:id="82"/>
-    <w:bookmarkStart w:id="84" w:name="ref-Frost:2024"/>
+    <w:bookmarkEnd w:id="83"/>
+    <w:bookmarkStart w:id="85" w:name="ref-Frost:2024"/>
     <w:p>
       <w:pPr>
         <w:pStyle w:val="Bibliography"/>
@@ -33352,7 +33341,7 @@
       <w:r>
         <w:t xml:space="preserve"> </w:t>
       </w:r>
-      <w:hyperlink r:id="rId83">
+      <w:hyperlink r:id="rId84">
         <w:r>
           <w:rPr>
             <w:rStyle w:val="Hyperlink"/>
@@ -33364,8 +33353,8 @@
         <w:t xml:space="preserve">.</w:t>
       </w:r>
     </w:p>
-    <w:bookmarkEnd w:id="84"/>
-    <w:bookmarkStart w:id="86" w:name="ref-Gillman:2020"/>
+    <w:bookmarkEnd w:id="85"/>
+    <w:bookmarkStart w:id="87" w:name="ref-Gillman:2020"/>
     <w:p>
       <w:pPr>
         <w:pStyle w:val="Bibliography"/>
@@ -33376,7 +33365,7 @@
       <w:r>
         <w:t xml:space="preserve"> </w:t>
       </w:r>
-      <w:hyperlink r:id="rId85">
+      <w:hyperlink r:id="rId86">
         <w:r>
           <w:rPr>
             <w:rStyle w:val="Hyperlink"/>
@@ -33388,8 +33377,8 @@
         <w:t xml:space="preserve">. Communications Biology 3:609.</w:t>
       </w:r>
     </w:p>
-    <w:bookmarkEnd w:id="86"/>
-    <w:bookmarkStart w:id="88" w:name="ref-Gunther:2023"/>
+    <w:bookmarkEnd w:id="87"/>
+    <w:bookmarkStart w:id="89" w:name="ref-Gunther:2023"/>
     <w:p>
       <w:pPr>
         <w:pStyle w:val="Bibliography"/>
@@ -33400,7 +33389,7 @@
       <w:r>
         <w:t xml:space="preserve"> </w:t>
       </w:r>
-      <w:hyperlink r:id="rId87">
+      <w:hyperlink r:id="rId88">
         <w:r>
           <w:rPr>
             <w:rStyle w:val="Hyperlink"/>
@@ -33444,8 +33433,8 @@
         <w:t xml:space="preserve">r Naturforschung.</w:t>
       </w:r>
     </w:p>
-    <w:bookmarkEnd w:id="88"/>
-    <w:bookmarkStart w:id="89" w:name="ref-Gunther:2011"/>
+    <w:bookmarkEnd w:id="89"/>
+    <w:bookmarkStart w:id="90" w:name="ref-Gunther:2011"/>
     <w:p>
       <w:pPr>
         <w:pStyle w:val="Bibliography"/>
@@ -33454,8 +33443,8 @@
         <w:t xml:space="preserve">Günther, R., and S. J. Richards. 2011. Five new microhylid frog species from enga province, papua new guinea, and remarks on albericus alpestris (anura, microhylidae). VERTEBRATE ZOOLOGY 61:343–372.</w:t>
       </w:r>
     </w:p>
-    <w:bookmarkEnd w:id="89"/>
-    <w:bookmarkStart w:id="90" w:name="ref-Gunther:2001"/>
+    <w:bookmarkEnd w:id="90"/>
+    <w:bookmarkStart w:id="91" w:name="ref-Gunther:2001"/>
     <w:p>
       <w:pPr>
         <w:pStyle w:val="Bibliography"/>
@@ -33464,8 +33453,8 @@
         <w:t xml:space="preserve">Günther, R., S. Richards, and D. T. Iskandar. 2001. Two new species of the genus oreophryne from irian jaya, indonesia (amphibia, anura, microhylidae). Spixiana 24:257–274.</w:t>
       </w:r>
     </w:p>
-    <w:bookmarkEnd w:id="90"/>
-    <w:bookmarkStart w:id="92" w:name="ref-Hill:2022"/>
+    <w:bookmarkEnd w:id="91"/>
+    <w:bookmarkStart w:id="93" w:name="ref-Hill:2022"/>
     <w:p>
       <w:pPr>
         <w:pStyle w:val="Bibliography"/>
@@ -33476,7 +33465,7 @@
       <w:r>
         <w:t xml:space="preserve"> </w:t>
       </w:r>
-      <w:hyperlink r:id="rId91">
+      <w:hyperlink r:id="rId92">
         <w:r>
           <w:rPr>
             <w:rStyle w:val="Hyperlink"/>
@@ -33488,8 +33477,8 @@
         <w:t xml:space="preserve">. Molecular Phylogenetics and Evolution 177. Academic Press Inc.</w:t>
       </w:r>
     </w:p>
-    <w:bookmarkEnd w:id="92"/>
-    <w:bookmarkStart w:id="93" w:name="ref-Hill:2023a"/>
+    <w:bookmarkEnd w:id="93"/>
+    <w:bookmarkStart w:id="94" w:name="ref-Hill:2023a"/>
     <w:p>
       <w:pPr>
         <w:pStyle w:val="Bibliography"/>
@@ -33498,8 +33487,8 @@
         <w:t xml:space="preserve">Hill, E. C., D. F. Gao, D. A. Polhemus, C. J. Fraser, B. Iova, A. Allison, and M. A. Butler. 2023a. Testing geology with biology: Plate tectonics and the diversification of microhylid frogs in the papuan region. Integrative Organismal Biology.</w:t>
       </w:r>
     </w:p>
-    <w:bookmarkEnd w:id="93"/>
-    <w:bookmarkStart w:id="95" w:name="ref-Hill:2023"/>
+    <w:bookmarkEnd w:id="94"/>
+    <w:bookmarkStart w:id="96" w:name="ref-Hill:2023"/>
     <w:p>
       <w:pPr>
         <w:pStyle w:val="Bibliography"/>
@@ -33510,7 +33499,7 @@
       <w:r>
         <w:t xml:space="preserve"> </w:t>
       </w:r>
-      <w:hyperlink r:id="rId94">
+      <w:hyperlink r:id="rId95">
         <w:r>
           <w:rPr>
             <w:rStyle w:val="Hyperlink"/>
@@ -33522,8 +33511,8 @@
         <w:t xml:space="preserve">. Data in Brief 47:108987.</w:t>
       </w:r>
     </w:p>
-    <w:bookmarkEnd w:id="95"/>
-    <w:bookmarkStart w:id="97" w:name="ref-VanKampen:1923"/>
+    <w:bookmarkEnd w:id="96"/>
+    <w:bookmarkStart w:id="98" w:name="ref-VanKampen:1923"/>
     <w:p>
       <w:pPr>
         <w:pStyle w:val="Bibliography"/>
@@ -33534,7 +33523,7 @@
       <w:r>
         <w:t xml:space="preserve"> </w:t>
       </w:r>
-      <w:hyperlink r:id="rId96">
+      <w:hyperlink r:id="rId97">
         <w:r>
           <w:rPr>
             <w:rStyle w:val="Hyperlink"/>
@@ -33546,8 +33535,8 @@
         <w:t xml:space="preserve">. E. J. Brill, ltd, Leiden.</w:t>
       </w:r>
     </w:p>
-    <w:bookmarkEnd w:id="97"/>
-    <w:bookmarkStart w:id="99" w:name="ref-Koehler:2008"/>
+    <w:bookmarkEnd w:id="98"/>
+    <w:bookmarkStart w:id="100" w:name="ref-Koehler:2008"/>
     <w:p>
       <w:pPr>
         <w:pStyle w:val="Bibliography"/>
@@ -33558,7 +33547,7 @@
       <w:r>
         <w:t xml:space="preserve"> </w:t>
       </w:r>
-      <w:hyperlink r:id="rId98">
+      <w:hyperlink r:id="rId99">
         <w:r>
           <w:rPr>
             <w:rStyle w:val="Hyperlink"/>
@@ -33570,8 +33559,8 @@
         <w:t xml:space="preserve">. Molecular Phylogenetics and Evolution 47:353–365. ACADEMIC PRESS INC ELSEVIER SCIENCE, 525 B ST, STE 1900, SAN DIEGO, CA 92101-4495 USA.</w:t>
       </w:r>
     </w:p>
-    <w:bookmarkEnd w:id="99"/>
-    <w:bookmarkStart w:id="101" w:name="ref-Kraus:2016"/>
+    <w:bookmarkEnd w:id="100"/>
+    <w:bookmarkStart w:id="102" w:name="ref-Kraus:2016"/>
     <w:p>
       <w:pPr>
         <w:pStyle w:val="Bibliography"/>
@@ -33582,7 +33571,7 @@
       <w:r>
         <w:t xml:space="preserve"> </w:t>
       </w:r>
-      <w:hyperlink r:id="rId100">
+      <w:hyperlink r:id="rId101">
         <w:r>
           <w:rPr>
             <w:rStyle w:val="Hyperlink"/>
@@ -33594,8 +33583,8 @@
         <w:t xml:space="preserve">. Zootaxa 4195:1–68. Magnolia Press.</w:t>
       </w:r>
     </w:p>
-    <w:bookmarkEnd w:id="101"/>
-    <w:bookmarkStart w:id="103" w:name="ref-Kraus:2013"/>
+    <w:bookmarkEnd w:id="102"/>
+    <w:bookmarkStart w:id="104" w:name="ref-Kraus:2013"/>
     <w:p>
       <w:pPr>
         <w:pStyle w:val="Bibliography"/>
@@ -33606,7 +33595,7 @@
       <w:r>
         <w:t xml:space="preserve"> </w:t>
       </w:r>
-      <w:hyperlink r:id="rId102">
+      <w:hyperlink r:id="rId103">
         <w:r>
           <w:rPr>
             <w:rStyle w:val="Hyperlink"/>
@@ -33618,8 +33607,8 @@
         <w:t xml:space="preserve">. ZOOKEYS 93–121.</w:t>
       </w:r>
     </w:p>
-    <w:bookmarkEnd w:id="103"/>
-    <w:bookmarkStart w:id="105" w:name="ref-Kraus:2009"/>
+    <w:bookmarkEnd w:id="104"/>
+    <w:bookmarkStart w:id="106" w:name="ref-Kraus:2009"/>
     <w:p>
       <w:pPr>
         <w:pStyle w:val="Bibliography"/>
@@ -33630,7 +33619,7 @@
       <w:r>
         <w:t xml:space="preserve"> </w:t>
       </w:r>
-      <w:hyperlink r:id="rId104">
+      <w:hyperlink r:id="rId105">
         <w:r>
           <w:rPr>
             <w:rStyle w:val="Hyperlink"/>
@@ -33642,8 +33631,8 @@
         <w:t xml:space="preserve">. ZooKeys 26:53–76.</w:t>
       </w:r>
     </w:p>
-    <w:bookmarkEnd w:id="105"/>
-    <w:bookmarkStart w:id="106" w:name="ref-Kraus:2004"/>
+    <w:bookmarkEnd w:id="106"/>
+    <w:bookmarkStart w:id="107" w:name="ref-Kraus:2004"/>
     <w:p>
       <w:pPr>
         <w:pStyle w:val="Bibliography"/>
@@ -33652,8 +33641,8 @@
         <w:t xml:space="preserve">Kraus, F., and A. Allison. 2004. Notes on poorly known new guinea frogs. I. Microhylids from the d’entrecasteaux islands. HERPETOFAUNA-SYDNEY- 34:26–39. AUSTRALASIAN AFFILIATION OF HERPETOLOGICAL.</w:t>
       </w:r>
     </w:p>
-    <w:bookmarkEnd w:id="106"/>
-    <w:bookmarkStart w:id="108" w:name="ref-Lanfear:2012"/>
+    <w:bookmarkEnd w:id="107"/>
+    <w:bookmarkStart w:id="109" w:name="ref-Lanfear:2012"/>
     <w:p>
       <w:pPr>
         <w:pStyle w:val="Bibliography"/>
@@ -33664,7 +33653,7 @@
       <w:r>
         <w:t xml:space="preserve"> </w:t>
       </w:r>
-      <w:hyperlink r:id="rId107">
+      <w:hyperlink r:id="rId108">
         <w:r>
           <w:rPr>
             <w:rStyle w:val="Hyperlink"/>
@@ -33676,8 +33665,8 @@
         <w:t xml:space="preserve">. Molecular Biology and Evolution 29:1695–1701.</w:t>
       </w:r>
     </w:p>
-    <w:bookmarkEnd w:id="108"/>
-    <w:bookmarkStart w:id="110" w:name="ref-Maddison:2023"/>
+    <w:bookmarkEnd w:id="109"/>
+    <w:bookmarkStart w:id="111" w:name="ref-Maddison:2023"/>
     <w:p>
       <w:pPr>
         <w:pStyle w:val="Bibliography"/>
@@ -33688,7 +33677,7 @@
       <w:r>
         <w:t xml:space="preserve"> </w:t>
       </w:r>
-      <w:hyperlink r:id="rId109">
+      <w:hyperlink r:id="rId110">
         <w:r>
           <w:rPr>
             <w:rStyle w:val="Hyperlink"/>
@@ -33700,8 +33689,8 @@
         <w:t xml:space="preserve">.</w:t>
       </w:r>
     </w:p>
-    <w:bookmarkEnd w:id="110"/>
-    <w:bookmarkStart w:id="111" w:name="ref-Mehely:1897"/>
+    <w:bookmarkEnd w:id="111"/>
+    <w:bookmarkStart w:id="112" w:name="ref-Mehely:1897"/>
     <w:p>
       <w:pPr>
         <w:pStyle w:val="Bibliography"/>
@@ -33722,8 +33711,8 @@
         <w:t xml:space="preserve">zetek 20:398–419.</w:t>
       </w:r>
     </w:p>
-    <w:bookmarkEnd w:id="111"/>
-    <w:bookmarkStart w:id="112" w:name="ref-Menzies:2006"/>
+    <w:bookmarkEnd w:id="112"/>
+    <w:bookmarkStart w:id="113" w:name="ref-Menzies:2006"/>
     <w:p>
       <w:pPr>
         <w:pStyle w:val="Bibliography"/>
@@ -33732,8 +33721,8 @@
         <w:t xml:space="preserve">Menzies, J. 2006. The frogs of new guinea and the solomon islands. Pensoft Publishers.</w:t>
       </w:r>
     </w:p>
-    <w:bookmarkEnd w:id="112"/>
-    <w:bookmarkStart w:id="114" w:name="ref-Minh:2020"/>
+    <w:bookmarkEnd w:id="113"/>
+    <w:bookmarkStart w:id="115" w:name="ref-Minh:2020"/>
     <w:p>
       <w:pPr>
         <w:pStyle w:val="Bibliography"/>
@@ -33744,7 +33733,7 @@
       <w:r>
         <w:t xml:space="preserve"> </w:t>
       </w:r>
-      <w:hyperlink r:id="rId113">
+      <w:hyperlink r:id="rId114">
         <w:r>
           <w:rPr>
             <w:rStyle w:val="Hyperlink"/>
@@ -33756,8 +33745,8 @@
         <w:t xml:space="preserve">. Molecular Biology and Evolution 37:1530–1534.</w:t>
       </w:r>
     </w:p>
-    <w:bookmarkEnd w:id="114"/>
-    <w:bookmarkStart w:id="115" w:name="ref-Muller:1894"/>
+    <w:bookmarkEnd w:id="115"/>
+    <w:bookmarkStart w:id="116" w:name="ref-Muller:1894"/>
     <w:p>
       <w:pPr>
         <w:pStyle w:val="Bibliography"/>
@@ -33766,8 +33755,8 @@
         <w:t xml:space="preserve">Müller, F. 1894. Reptilien und amphibien aus celebes. Verhandlungen der Naturforschenden Gesellschaft in Basel 10:825–843.</w:t>
       </w:r>
     </w:p>
-    <w:bookmarkEnd w:id="115"/>
-    <w:bookmarkStart w:id="116" w:name="ref-Parker:1934"/>
+    <w:bookmarkEnd w:id="116"/>
+    <w:bookmarkStart w:id="117" w:name="ref-Parker:1934"/>
     <w:p>
       <w:pPr>
         <w:pStyle w:val="Bibliography"/>
@@ -33776,8 +33765,8 @@
         <w:t xml:space="preserve">Parker, H. W. 1934. A monograph of the frogs of the family microhylidae. London: Trustees of the British Museum.</w:t>
       </w:r>
     </w:p>
-    <w:bookmarkEnd w:id="116"/>
-    <w:bookmarkStart w:id="117" w:name="ref-Peters:1878"/>
+    <w:bookmarkEnd w:id="117"/>
+    <w:bookmarkStart w:id="118" w:name="ref-Peters:1878"/>
     <w:p>
       <w:pPr>
         <w:pStyle w:val="Bibliography"/>
@@ -33786,8 +33775,8 @@
         <w:t xml:space="preserve">Peters, W. C. H., and G. Doria. 1878. Catalogo dei rettili e dei batraci raccolti da o. Beccari, l.m. D’albertis a.a. Bruijn nella sotto-regione austro-malese. Annali del Museo civico di storia naturale di Genova 13:323–450.</w:t>
       </w:r>
     </w:p>
-    <w:bookmarkEnd w:id="117"/>
-    <w:bookmarkStart w:id="119" w:name="ref-Putri:2023"/>
+    <w:bookmarkEnd w:id="118"/>
+    <w:bookmarkStart w:id="120" w:name="ref-Putri:2023"/>
     <w:p>
       <w:pPr>
         <w:pStyle w:val="Bibliography"/>
@@ -33798,7 +33787,7 @@
       <w:r>
         <w:t xml:space="preserve"> </w:t>
       </w:r>
-      <w:hyperlink r:id="rId118">
+      <w:hyperlink r:id="rId119">
         <w:r>
           <w:rPr>
             <w:rStyle w:val="Hyperlink"/>
@@ -33810,8 +33799,8 @@
         <w:t xml:space="preserve">. Zootaxa 5353:455–467.</w:t>
       </w:r>
     </w:p>
-    <w:bookmarkEnd w:id="119"/>
-    <w:bookmarkStart w:id="121" w:name="ref-R:2024"/>
+    <w:bookmarkEnd w:id="120"/>
+    <w:bookmarkStart w:id="122" w:name="ref-R:2024"/>
     <w:p>
       <w:pPr>
         <w:pStyle w:val="Bibliography"/>
@@ -33822,7 +33811,7 @@
       <w:r>
         <w:t xml:space="preserve"> </w:t>
       </w:r>
-      <w:hyperlink r:id="rId120">
+      <w:hyperlink r:id="rId121">
         <w:r>
           <w:rPr>
             <w:rStyle w:val="Hyperlink"/>
@@ -33834,8 +33823,8 @@
         <w:t xml:space="preserve">. R Foundation for Statistical Computing, Vienna, Austria.</w:t>
       </w:r>
     </w:p>
-    <w:bookmarkEnd w:id="121"/>
-    <w:bookmarkStart w:id="123" w:name="ref-Revell:2012"/>
+    <w:bookmarkEnd w:id="122"/>
+    <w:bookmarkStart w:id="124" w:name="ref-Revell:2012"/>
     <w:p>
       <w:pPr>
         <w:pStyle w:val="Bibliography"/>
@@ -33846,7 +33835,7 @@
       <w:r>
         <w:t xml:space="preserve"> </w:t>
       </w:r>
-      <w:hyperlink r:id="rId122">
+      <w:hyperlink r:id="rId123">
         <w:r>
           <w:rPr>
             <w:rStyle w:val="Hyperlink"/>
@@ -33858,8 +33847,8 @@
         <w:t xml:space="preserve">. Methods in Ecology and Evolution 3:217–223.</w:t>
       </w:r>
     </w:p>
-    <w:bookmarkEnd w:id="123"/>
-    <w:bookmarkStart w:id="125" w:name="ref-Rivera:2017"/>
+    <w:bookmarkEnd w:id="124"/>
+    <w:bookmarkStart w:id="126" w:name="ref-Rivera:2017"/>
     <w:p>
       <w:pPr>
         <w:pStyle w:val="Bibliography"/>
@@ -33870,7 +33859,7 @@
       <w:r>
         <w:t xml:space="preserve"> </w:t>
       </w:r>
-      <w:hyperlink r:id="rId124">
+      <w:hyperlink r:id="rId125">
         <w:r>
           <w:rPr>
             <w:rStyle w:val="Hyperlink"/>
@@ -33882,8 +33871,8 @@
         <w:t xml:space="preserve">. Molecular Phylogenetics and Evolution 112:1–11. Academic Press Inc.</w:t>
       </w:r>
     </w:p>
-    <w:bookmarkEnd w:id="125"/>
-    <w:bookmarkStart w:id="127" w:name="ref-Setiadi:2010"/>
+    <w:bookmarkEnd w:id="126"/>
+    <w:bookmarkStart w:id="128" w:name="ref-Setiadi:2010"/>
     <w:p>
       <w:pPr>
         <w:pStyle w:val="Bibliography"/>
@@ -33894,7 +33883,7 @@
       <w:r>
         <w:t xml:space="preserve"> </w:t>
       </w:r>
-      <w:hyperlink r:id="rId126">
+      <w:hyperlink r:id="rId127">
         <w:r>
           <w:rPr>
             <w:rStyle w:val="Hyperlink"/>
@@ -33906,8 +33895,8 @@
         <w:t xml:space="preserve">. Conservation Biology 24:553–562.</w:t>
       </w:r>
     </w:p>
-    <w:bookmarkEnd w:id="127"/>
-    <w:bookmarkStart w:id="129" w:name="ref-Soliz:2025"/>
+    <w:bookmarkEnd w:id="128"/>
+    <w:bookmarkStart w:id="130" w:name="ref-Soliz:2025"/>
     <w:p>
       <w:pPr>
         <w:pStyle w:val="Bibliography"/>
@@ -33918,7 +33907,7 @@
       <w:r>
         <w:t xml:space="preserve"> </w:t>
       </w:r>
-      <w:hyperlink r:id="rId128">
+      <w:hyperlink r:id="rId129">
         <w:r>
           <w:rPr>
             <w:rStyle w:val="Hyperlink"/>
@@ -33930,8 +33919,8 @@
         <w:t xml:space="preserve">. Acta Zoologica 106:38–54.</w:t>
       </w:r>
     </w:p>
-    <w:bookmarkEnd w:id="129"/>
-    <w:bookmarkStart w:id="130" w:name="ref-Stejneger:1908"/>
+    <w:bookmarkEnd w:id="130"/>
+    <w:bookmarkStart w:id="131" w:name="ref-Stejneger:1908"/>
     <w:p>
       <w:pPr>
         <w:pStyle w:val="Bibliography"/>
@@ -33940,8 +33929,8 @@
         <w:t xml:space="preserve">Stejneger, L. 1908. Two new species of toads from the philippines. Proceedings of the United States National Museum 33:573–576.</w:t>
       </w:r>
     </w:p>
-    <w:bookmarkEnd w:id="130"/>
-    <w:bookmarkStart w:id="132" w:name="ref-Tu:2018"/>
+    <w:bookmarkEnd w:id="131"/>
+    <w:bookmarkStart w:id="133" w:name="ref-Tu:2018"/>
     <w:p>
       <w:pPr>
         <w:pStyle w:val="Bibliography"/>
@@ -33952,7 +33941,7 @@
       <w:r>
         <w:t xml:space="preserve"> </w:t>
       </w:r>
-      <w:hyperlink r:id="rId131">
+      <w:hyperlink r:id="rId132">
         <w:r>
           <w:rPr>
             <w:rStyle w:val="Hyperlink"/>
@@ -33964,8 +33953,8 @@
         <w:t xml:space="preserve">. Mol Phylogenet Evol 126:85–91.</w:t>
       </w:r>
     </w:p>
-    <w:bookmarkEnd w:id="132"/>
-    <w:bookmarkStart w:id="134" w:name="ref-Werner:1898"/>
+    <w:bookmarkEnd w:id="133"/>
+    <w:bookmarkStart w:id="135" w:name="ref-Werner:1898"/>
     <w:p>
       <w:pPr>
         <w:pStyle w:val="Bibliography"/>
@@ -33976,7 +33965,7 @@
       <w:r>
         <w:t xml:space="preserve"> </w:t>
       </w:r>
-      <w:hyperlink r:id="rId133">
+      <w:hyperlink r:id="rId134">
         <w:r>
           <w:rPr>
             <w:rStyle w:val="Hyperlink"/>
@@ -34018,8 +34007,8 @@
         <w:t xml:space="preserve">. Zoologischer Anzeiger 21:552–556. Jena VEB Gustav Fischer Verlag.</w:t>
       </w:r>
     </w:p>
-    <w:bookmarkEnd w:id="134"/>
-    <w:bookmarkStart w:id="136" w:name="ref-Wickham:2016"/>
+    <w:bookmarkEnd w:id="135"/>
+    <w:bookmarkStart w:id="137" w:name="ref-Wickham:2016"/>
     <w:p>
       <w:pPr>
         <w:pStyle w:val="Bibliography"/>
@@ -34030,7 +34019,7 @@
       <w:r>
         <w:t xml:space="preserve"> </w:t>
       </w:r>
-      <w:hyperlink r:id="rId135">
+      <w:hyperlink r:id="rId136">
         <w:r>
           <w:rPr>
             <w:rStyle w:val="Hyperlink"/>
@@ -34042,8 +34031,8 @@
         <w:t xml:space="preserve">. Springer-Verlag New York.</w:t>
       </w:r>
     </w:p>
-    <w:bookmarkEnd w:id="136"/>
-    <w:bookmarkStart w:id="138" w:name="ref-Ye:2012"/>
+    <w:bookmarkEnd w:id="137"/>
+    <w:bookmarkStart w:id="139" w:name="ref-Ye:2012"/>
     <w:p>
       <w:pPr>
         <w:pStyle w:val="Bibliography"/>
@@ -34054,7 +34043,7 @@
       <w:r>
         <w:t xml:space="preserve"> </w:t>
       </w:r>
-      <w:hyperlink r:id="rId137">
+      <w:hyperlink r:id="rId138">
         <w:r>
           <w:rPr>
             <w:rStyle w:val="Hyperlink"/>
@@ -34066,8 +34055,8 @@
         <w:t xml:space="preserve">. BMC Bioinformatics 13:134.</w:t>
       </w:r>
     </w:p>
-    <w:bookmarkEnd w:id="138"/>
-    <w:bookmarkStart w:id="140" w:name="ref-Yu:2020"/>
+    <w:bookmarkEnd w:id="139"/>
+    <w:bookmarkStart w:id="141" w:name="ref-Yu:2020"/>
     <w:p>
       <w:pPr>
         <w:pStyle w:val="Bibliography"/>
@@ -34078,7 +34067,7 @@
       <w:r>
         <w:t xml:space="preserve"> </w:t>
       </w:r>
-      <w:hyperlink r:id="rId139">
+      <w:hyperlink r:id="rId140">
         <w:r>
           <w:rPr>
             <w:rStyle w:val="Hyperlink"/>
@@ -34090,8 +34079,8 @@
         <w:t xml:space="preserve">. Current Protocols in Bioinformatics 69:e96.</w:t>
       </w:r>
     </w:p>
-    <w:bookmarkEnd w:id="140"/>
-    <w:bookmarkStart w:id="142" w:name="ref-Yu:2017"/>
+    <w:bookmarkEnd w:id="141"/>
+    <w:bookmarkStart w:id="143" w:name="ref-Yu:2017"/>
     <w:p>
       <w:pPr>
         <w:pStyle w:val="Bibliography"/>
@@ -34102,7 +34091,7 @@
       <w:r>
         <w:t xml:space="preserve"> </w:t>
       </w:r>
-      <w:hyperlink r:id="rId141">
+      <w:hyperlink r:id="rId142">
         <w:r>
           <w:rPr>
             <w:rStyle w:val="Hyperlink"/>
@@ -34114,8 +34103,8 @@
         <w:t xml:space="preserve"> Methods in Ecology and Evolution 8:28–36.</w:t>
       </w:r>
     </w:p>
-    <w:bookmarkEnd w:id="142"/>
-    <w:bookmarkStart w:id="144" w:name="ref-ICZN:1999"/>
+    <w:bookmarkEnd w:id="143"/>
+    <w:bookmarkStart w:id="145" w:name="ref-ICZN:1999"/>
     <w:p>
       <w:pPr>
         <w:pStyle w:val="Bibliography"/>
@@ -34126,7 +34115,7 @@
       <w:r>
         <w:t xml:space="preserve"> </w:t>
       </w:r>
-      <w:hyperlink r:id="rId143">
+      <w:hyperlink r:id="rId144">
         <w:r>
           <w:rPr>
             <w:rStyle w:val="Hyperlink"/>
@@ -34138,8 +34127,8 @@
         <w:t xml:space="preserve">. London, International Trust for Zoological Nomenclature, c/o Natural History Museum, 1999.</w:t>
       </w:r>
     </w:p>
-    <w:bookmarkEnd w:id="144"/>
-    <w:bookmarkStart w:id="145" w:name="ref-Zweifel:2003"/>
+    <w:bookmarkEnd w:id="145"/>
+    <w:bookmarkStart w:id="146" w:name="ref-Zweifel:2003"/>
     <w:p>
       <w:pPr>
         <w:pStyle w:val="Bibliography"/>
@@ -34148,8 +34137,8 @@
         <w:t xml:space="preserve">Zweifel, R. G. 2003. A new species of microhylid frog, genus oreophryne, from papua new guinea. American Museum Novitates 1–8.</w:t>
       </w:r>
     </w:p>
-    <w:bookmarkEnd w:id="145"/>
-    <w:bookmarkStart w:id="146" w:name="ref-Zweifel:1956"/>
+    <w:bookmarkEnd w:id="146"/>
+    <w:bookmarkStart w:id="147" w:name="ref-Zweifel:1956"/>
     <w:p>
       <w:pPr>
         <w:pStyle w:val="Bibliography"/>
@@ -34158,8 +34147,8 @@
         <w:t xml:space="preserve">Zweifel, R. G. 1956. Microhylid frogs from new guinea, with descriptions of new species. American Museum Novitates 1–49.</w:t>
       </w:r>
     </w:p>
-    <w:bookmarkEnd w:id="146"/>
-    <w:bookmarkStart w:id="148" w:name="ref-Zweifel:2005"/>
+    <w:bookmarkEnd w:id="147"/>
+    <w:bookmarkStart w:id="149" w:name="ref-Zweifel:2005"/>
     <w:p>
       <w:pPr>
         <w:pStyle w:val="Bibliography"/>
@@ -34170,7 +34159,7 @@
       <w:r>
         <w:t xml:space="preserve"> </w:t>
       </w:r>
-      <w:hyperlink r:id="rId147">
+      <w:hyperlink r:id="rId148">
         <w:r>
           <w:rPr>
             <w:rStyle w:val="Hyperlink"/>
@@ -34182,8 +34171,8 @@
         <w:t xml:space="preserve">. American Museum Novitates 3495:1–25.</w:t>
       </w:r>
     </w:p>
-    <w:bookmarkEnd w:id="148"/>
-    <w:bookmarkStart w:id="150" w:name="ref-Zweifel:2003a"/>
+    <w:bookmarkEnd w:id="149"/>
+    <w:bookmarkStart w:id="151" w:name="ref-Zweifel:2003a"/>
     <w:p>
       <w:pPr>
         <w:pStyle w:val="Bibliography"/>
@@ -34194,7 +34183,7 @@
       <w:r>
         <w:t xml:space="preserve"> </w:t>
       </w:r>
-      <w:hyperlink r:id="rId149">
+      <w:hyperlink r:id="rId150">
         <w:r>
           <w:rPr>
             <w:rStyle w:val="Hyperlink"/>
@@ -34206,9 +34195,9 @@
         <w:t xml:space="preserve">. AMERICAN MUSEUM NOVITATES 1–31.</w:t>
       </w:r>
     </w:p>
-    <w:bookmarkEnd w:id="150"/>
     <w:bookmarkEnd w:id="151"/>
     <w:bookmarkEnd w:id="152"/>
+    <w:bookmarkEnd w:id="153"/>
     <w:sectPr/>
   </w:body>
 </w:document>

</xml_diff>

<commit_message>
updated mansucript with Allisonʻs citation fixes for diagnosis
</commit_message>
<xml_diff>
--- a/Products/oreo-taxonomy.docx
+++ b/Products/oreo-taxonomy.docx
@@ -55,7 +55,7 @@
         <w:pStyle w:val="Date"/>
       </w:pPr>
       <w:r>
-        <w:t xml:space="preserve">2025-04-18</w:t>
+        <w:t xml:space="preserve">2025-04-24</w:t>
       </w:r>
     </w:p>
     <w:p>
@@ -432,7 +432,7 @@
         <w:t xml:space="preserve"> </w:t>
       </w:r>
       <w:r>
-        <w:t xml:space="preserve">(Zweifel et al. 2009; Günther and Richards 2011; Putri et al. 2023)</w:t>
+        <w:t xml:space="preserve">(Zweifel et al. 2009; Günther and Richards 2012; Putri et al. 2023)</w:t>
       </w:r>
       <w:r>
         <w:t xml:space="preserve">.</w:t>
@@ -26938,34 +26938,46 @@
         <w:pStyle w:val="BodyText"/>
       </w:pPr>
       <w:r>
-        <w:rPr>
-          <w:b/>
-          <w:bCs/>
-        </w:rPr>
-        <w:t xml:space="preserve">Family Microhylidae Günther, 1858 (1843)</w:t>
-      </w:r>
-      <w:r>
-        <w:br/>
-      </w:r>
-      <w:r>
-        <w:rPr>
-          <w:b/>
-          <w:bCs/>
-        </w:rPr>
-        <w:t xml:space="preserve">Subfamily Asterophryinae Günther, 1858</w:t>
-      </w:r>
-      <w:r>
-        <w:br/>
-      </w:r>
-      <w:r>
-        <w:rPr>
-          <w:b/>
-          <w:bCs/>
-        </w:rPr>
-        <w:t xml:space="preserve">Genus Oreophryne Boettger, 1895 amended</w:t>
-      </w:r>
-      <w:r>
-        <w:br/>
+        <w:t xml:space="preserve">__Family Microhylidae</w:t>
+      </w:r>
+      <w:r>
+        <w:t xml:space="preserve"> </w:t>
+      </w:r>
+      <w:r>
+        <w:t xml:space="preserve">(Günther 1858)</w:t>
+      </w:r>
+      <w:r>
+        <w:t xml:space="preserve"> </w:t>
+      </w:r>
+      <w:r>
+        <w:t xml:space="preserve">Subfamily Asterophryinae</w:t>
+      </w:r>
+      <w:r>
+        <w:t xml:space="preserve"> </w:t>
+      </w:r>
+      <w:r>
+        <w:t xml:space="preserve">(Günther 1858)</w:t>
+      </w:r>
+      <w:r>
+        <w:t xml:space="preserve"> </w:t>
+      </w:r>
+      <w:r>
+        <w:t xml:space="preserve">Genus Oreophryne</w:t>
+      </w:r>
+      <w:r>
+        <w:t xml:space="preserve"> </w:t>
+      </w:r>
+      <w:r>
+        <w:t xml:space="preserve">(Boettger 1895)</w:t>
+      </w:r>
+      <w:r>
+        <w:t xml:space="preserve"> </w:t>
+      </w:r>
+      <w:r>
+        <w:t xml:space="preserve">amended</w:t>
+      </w:r>
+      <w:r>
+        <w:t xml:space="preserve"> </w:t>
       </w:r>
       <w:r>
         <w:rPr>
@@ -26978,10 +26990,10 @@
         <w:t xml:space="preserve"> </w:t>
       </w:r>
       <w:r>
-        <w:t xml:space="preserve">Peters and Doria, 1878</w:t>
-      </w:r>
-      <w:r>
-        <w:br/>
+        <w:t xml:space="preserve">(Peters and Doria 1878)</w:t>
+      </w:r>
+      <w:r>
+        <w:t xml:space="preserve"> </w:t>
       </w:r>
       <w:r>
         <w:rPr>
@@ -26991,7 +27003,7 @@
         <w:t xml:space="preserve">Callula</w:t>
       </w:r>
       <w:r>
-        <w:br/>
+        <w:t xml:space="preserve"> </w:t>
       </w:r>
       <w:r>
         <w:rPr>
@@ -27004,7 +27016,13 @@
         <w:t xml:space="preserve"> </w:t>
       </w:r>
       <w:r>
-        <w:t xml:space="preserve">Boettger, 1895: 135. Type species:</w:t>
+        <w:t xml:space="preserve">(Boettger 1895)</w:t>
+      </w:r>
+      <w:r>
+        <w:t xml:space="preserve"> </w:t>
+      </w:r>
+      <w:r>
+        <w:t xml:space="preserve">Type species:</w:t>
       </w:r>
       <w:r>
         <w:t xml:space="preserve"> </w:t>
@@ -27017,13 +27035,28 @@
         <w:t xml:space="preserve">Oreophryne senckenbergiana</w:t>
       </w:r>
       <w:r>
-        <w:br/>
-      </w:r>
-      <w:r>
-        <w:t xml:space="preserve">Boettger, 1895 (= Microhyla achatina var. moluccensis Peters and Doria, 1878), by monotypy. Placed on Official List of Generic Names in Zoology by Opinion 1266, Anonymous, 1984.</w:t>
-      </w:r>
-      <w:r>
-        <w:br/>
+        <w:t xml:space="preserve"> </w:t>
+      </w:r>
+      <w:r>
+        <w:t xml:space="preserve">(Boettger 1895)</w:t>
+      </w:r>
+      <w:r>
+        <w:t xml:space="preserve"> </w:t>
+      </w:r>
+      <w:r>
+        <w:t xml:space="preserve">(= Microhyla achatina var. moluccensis</w:t>
+      </w:r>
+      <w:r>
+        <w:t xml:space="preserve"> </w:t>
+      </w:r>
+      <w:r>
+        <w:t xml:space="preserve">(Peters and Doria 1878)</w:t>
+      </w:r>
+      <w:r>
+        <w:t xml:space="preserve">, by monotypy. Placed on Official List of Generic Names in Zoology by Opinion 1266, Anonymous, 1984.</w:t>
+      </w:r>
+      <w:r>
+        <w:t xml:space="preserve"> </w:t>
       </w:r>
       <w:r>
         <w:rPr>
@@ -27033,7 +27066,7 @@
         <w:t xml:space="preserve">Sphenophryne</w:t>
       </w:r>
       <w:r>
-        <w:br/>
+        <w:t xml:space="preserve"> </w:t>
       </w:r>
       <w:r>
         <w:rPr>
@@ -27043,7 +27076,7 @@
         <w:t xml:space="preserve">Phrynixalus</w:t>
       </w:r>
       <w:r>
-        <w:br/>
+        <w:t xml:space="preserve"> </w:t>
       </w:r>
       <w:r>
         <w:rPr>
@@ -27056,13 +27089,7 @@
         <w:t xml:space="preserve"> </w:t>
       </w:r>
       <w:r>
-        <w:t xml:space="preserve">Wandolleck, 1911</w:t>
-      </w:r>
-      <w:r>
-        <w:t xml:space="preserve"> </w:t>
-      </w:r>
-      <w:r>
-        <w:t xml:space="preserve">“1910”</w:t>
+        <w:t xml:space="preserve">(Wandolleck 1911)</w:t>
       </w:r>
       <w:r>
         <w:t xml:space="preserve">, Type species:</w:t>
@@ -27081,7 +27108,13 @@
         <w:t xml:space="preserve"> </w:t>
       </w:r>
       <w:r>
-        <w:t xml:space="preserve">Wandolleck, 1911 (=</w:t>
+        <w:t xml:space="preserve">(Wandolleck 1911)</w:t>
+      </w:r>
+      <w:r>
+        <w:t xml:space="preserve"> </w:t>
+      </w:r>
+      <w:r>
+        <w:t xml:space="preserve">(=</w:t>
       </w:r>
       <w:r>
         <w:t xml:space="preserve"> </w:t>
@@ -27097,10 +27130,31 @@
         <w:t xml:space="preserve"> </w:t>
       </w:r>
       <w:r>
-        <w:t xml:space="preserve">Méhely, 1897), by subsequent designation of Parker, 1934. Synonymy by Nieden, 1926.</w:t>
-      </w:r>
-      <w:r>
-        <w:br/>
+        <w:t xml:space="preserve">(Méhely 1897)</w:t>
+      </w:r>
+      <w:r>
+        <w:t xml:space="preserve">, by subsequent designation of</w:t>
+      </w:r>
+      <w:r>
+        <w:t xml:space="preserve"> </w:t>
+      </w:r>
+      <w:r>
+        <w:t xml:space="preserve">(Parker 1934)</w:t>
+      </w:r>
+      <w:r>
+        <w:t xml:space="preserve">. Synonymy by</w:t>
+      </w:r>
+      <w:r>
+        <w:t xml:space="preserve"> </w:t>
+      </w:r>
+      <w:r>
+        <w:t xml:space="preserve">(Nieden 1926)</w:t>
+      </w:r>
+      <w:r>
+        <w:t xml:space="preserve">.</w:t>
+      </w:r>
+      <w:r>
+        <w:t xml:space="preserve"> </w:t>
       </w:r>
       <w:r>
         <w:rPr>
@@ -27110,7 +27164,7 @@
         <w:t xml:space="preserve">Cophixalus</w:t>
       </w:r>
       <w:r>
-        <w:br/>
+        <w:t xml:space="preserve"> </w:t>
       </w:r>
       <w:r>
         <w:rPr>
@@ -27135,7 +27189,7 @@
         <w:t xml:space="preserve"> </w:t>
       </w:r>
       <w:r>
-        <w:t xml:space="preserve">(Peters and Doria, 1878)</w:t>
+        <w:t xml:space="preserve">(Peters and Doria 1878)</w:t>
       </w:r>
     </w:p>
     <w:p>
@@ -27250,7 +27304,7 @@
         <w:t xml:space="preserve">O. graminis</w:t>
       </w:r>
       <w:r>
-        <w:t xml:space="preserve">, Günther and Richards 2011)</w:t>
+        <w:t xml:space="preserve">, Günther and Richards 2012)</w:t>
       </w:r>
       <w:r>
         <w:t xml:space="preserve"> </w:t>
@@ -27506,7 +27560,7 @@
         <w:t xml:space="preserve"> </w:t>
       </w:r>
       <w:r>
-        <w:t xml:space="preserve">Kraus (2016)</w:t>
+        <w:t xml:space="preserve">(Kraus 2016)</w:t>
       </w:r>
       <w:r>
         <w:t xml:space="preserve">,</w:t>
@@ -27525,7 +27579,7 @@
         <w:t xml:space="preserve"> </w:t>
       </w:r>
       <w:r>
-        <w:t xml:space="preserve">Boettger (1892)</w:t>
+        <w:t xml:space="preserve">(Boettger 1892)</w:t>
       </w:r>
       <w:r>
         <w:t xml:space="preserve">, and</w:t>
@@ -27544,17 +27598,7 @@
         <w:t xml:space="preserve"> </w:t>
       </w:r>
       <w:r>
-        <w:t xml:space="preserve">(</w:t>
-      </w:r>
-      <w:r>
-        <w:rPr>
-          <w:b/>
-          <w:bCs/>
-        </w:rPr>
-        <w:t xml:space="preserve">Kraus:2010?</w:t>
-      </w:r>
-      <w:r>
-        <w:t xml:space="preserve">)</w:t>
+        <w:t xml:space="preserve">(Kraus 2010)</w:t>
       </w:r>
       <w:r>
         <w:t xml:space="preserve">.</w:t>
@@ -29941,7 +29985,10 @@
         <w:t xml:space="preserve"> </w:t>
       </w:r>
       <w:r>
-        <w:t xml:space="preserve">(Kraus &amp; Allison, 2009),</w:t>
+        <w:t xml:space="preserve">(Kraus and Allison 2009)</w:t>
+      </w:r>
+      <w:r>
+        <w:t xml:space="preserve">,</w:t>
       </w:r>
       <w:r>
         <w:t xml:space="preserve"> </w:t>
@@ -29957,13 +30004,10 @@
         <w:t xml:space="preserve"> </w:t>
       </w:r>
       <w:r>
-        <w:t xml:space="preserve">(</w:t>
-      </w:r>
-      <w:r>
         <w:t xml:space="preserve">(Stejneger 1908)</w:t>
       </w:r>
       <w:r>
-        <w:t xml:space="preserve">),</w:t>
+        <w:t xml:space="preserve">,</w:t>
       </w:r>
       <w:r>
         <w:t xml:space="preserve"> </w:t>
@@ -29979,7 +30023,10 @@
         <w:t xml:space="preserve"> </w:t>
       </w:r>
       <w:r>
-        <w:t xml:space="preserve">(Kraus, 2016),</w:t>
+        <w:t xml:space="preserve">(Kraus 2016)</w:t>
+      </w:r>
+      <w:r>
+        <w:t xml:space="preserve">,</w:t>
       </w:r>
       <w:r>
         <w:t xml:space="preserve"> </w:t>
@@ -29995,7 +30042,10 @@
         <w:t xml:space="preserve"> </w:t>
       </w:r>
       <w:r>
-        <w:t xml:space="preserve">(Méhely, 1897),</w:t>
+        <w:t xml:space="preserve">(Méhely 1897)</w:t>
+      </w:r>
+      <w:r>
+        <w:t xml:space="preserve">,</w:t>
       </w:r>
       <w:r>
         <w:t xml:space="preserve"> </w:t>
@@ -30011,7 +30061,10 @@
         <w:t xml:space="preserve"> </w:t>
       </w:r>
       <w:r>
-        <w:t xml:space="preserve">(Werner, 1898),</w:t>
+        <w:t xml:space="preserve">(Werner 1898)</w:t>
+      </w:r>
+      <w:r>
+        <w:t xml:space="preserve">,</w:t>
       </w:r>
       <w:r>
         <w:t xml:space="preserve"> </w:t>
@@ -30027,7 +30080,10 @@
         <w:t xml:space="preserve"> </w:t>
       </w:r>
       <w:r>
-        <w:t xml:space="preserve">([Kraus, 2013]),</w:t>
+        <w:t xml:space="preserve">(Kraus 2013)</w:t>
+      </w:r>
+      <w:r>
+        <w:t xml:space="preserve">,</w:t>
       </w:r>
       <w:r>
         <w:t xml:space="preserve"> </w:t>
@@ -30043,7 +30099,10 @@
         <w:t xml:space="preserve"> </w:t>
       </w:r>
       <w:r>
-        <w:t xml:space="preserve">((Horst, 1883),</w:t>
+        <w:t xml:space="preserve">(Horst 1883)</w:t>
+      </w:r>
+      <w:r>
+        <w:t xml:space="preserve">,</w:t>
       </w:r>
       <w:r>
         <w:t xml:space="preserve"> </w:t>
@@ -30059,7 +30118,10 @@
         <w:t xml:space="preserve"> </w:t>
       </w:r>
       <w:r>
-        <w:t xml:space="preserve">(Boettger, 1892),</w:t>
+        <w:t xml:space="preserve">(Boettger 1892)</w:t>
+      </w:r>
+      <w:r>
+        <w:t xml:space="preserve">,</w:t>
       </w:r>
       <w:r>
         <w:t xml:space="preserve"> </w:t>
@@ -30075,7 +30137,13 @@
         <w:t xml:space="preserve"> </w:t>
       </w:r>
       <w:r>
-        <w:t xml:space="preserve">(Günther &amp; Richards, 2012),</w:t>
+        <w:t xml:space="preserve">[</w:t>
+      </w:r>
+      <w:r>
+        <w:t xml:space="preserve">Günther and Richards (2012)</w:t>
+      </w:r>
+      <w:r>
+        <w:t xml:space="preserve">),</w:t>
       </w:r>
       <w:r>
         <w:t xml:space="preserve"> </w:t>
@@ -30110,7 +30178,10 @@
         <w:t xml:space="preserve"> </w:t>
       </w:r>
       <w:r>
-        <w:t xml:space="preserve">(Kraus, 2016),</w:t>
+        <w:t xml:space="preserve">(Kraus 2016)</w:t>
+      </w:r>
+      <w:r>
+        <w:t xml:space="preserve">,</w:t>
       </w:r>
       <w:r>
         <w:t xml:space="preserve"> </w:t>
@@ -30126,7 +30197,10 @@
         <w:t xml:space="preserve"> </w:t>
       </w:r>
       <w:r>
-        <w:t xml:space="preserve">(Boulenger, 1898),</w:t>
+        <w:t xml:space="preserve">(Boulenger 1898)</w:t>
+      </w:r>
+      <w:r>
+        <w:t xml:space="preserve">,</w:t>
       </w:r>
       <w:r>
         <w:t xml:space="preserve"> </w:t>
@@ -30142,7 +30216,10 @@
         <w:t xml:space="preserve"> </w:t>
       </w:r>
       <w:r>
-        <w:t xml:space="preserve">(Brown and Alcala, 1967),</w:t>
+        <w:t xml:space="preserve">(Brown and Alcala 1967)</w:t>
+      </w:r>
+      <w:r>
+        <w:t xml:space="preserve">,</w:t>
       </w:r>
       <w:r>
         <w:t xml:space="preserve"> </w:t>
@@ -30158,7 +30235,10 @@
         <w:t xml:space="preserve"> </w:t>
       </w:r>
       <w:r>
-        <w:t xml:space="preserve">(Zweifel, 2003),</w:t>
+        <w:t xml:space="preserve">(Zweifel 2003)</w:t>
+      </w:r>
+      <w:r>
+        <w:t xml:space="preserve">,</w:t>
       </w:r>
       <w:r>
         <w:t xml:space="preserve"> </w:t>
@@ -30174,7 +30254,10 @@
         <w:t xml:space="preserve"> </w:t>
       </w:r>
       <w:r>
-        <w:t xml:space="preserve">(Loveridge, 1955),</w:t>
+        <w:t xml:space="preserve">(Loveridge 1955)</w:t>
+      </w:r>
+      <w:r>
+        <w:t xml:space="preserve">,</w:t>
       </w:r>
       <w:r>
         <w:t xml:space="preserve"> </w:t>
@@ -30190,7 +30273,10 @@
         <w:t xml:space="preserve"> </w:t>
       </w:r>
       <w:r>
-        <w:t xml:space="preserve">(Kraus, 2013),</w:t>
+        <w:t xml:space="preserve">(Kraus 2013)</w:t>
+      </w:r>
+      <w:r>
+        <w:t xml:space="preserve">,</w:t>
       </w:r>
       <w:r>
         <w:t xml:space="preserve"> </w:t>
@@ -30206,7 +30292,10 @@
         <w:t xml:space="preserve"> </w:t>
       </w:r>
       <w:r>
-        <w:t xml:space="preserve">(Kraus, 2016), and</w:t>
+        <w:t xml:space="preserve">(Kraus 2016)</w:t>
+      </w:r>
+      <w:r>
+        <w:t xml:space="preserve">, and</w:t>
       </w:r>
       <w:r>
         <w:t xml:space="preserve"> </w:t>
@@ -30222,7 +30311,10 @@
         <w:t xml:space="preserve"> </w:t>
       </w:r>
       <w:r>
-        <w:t xml:space="preserve">(Peters &amp; Doria, 1878). A number of species were not available for our study but should molecular evidence demonstrate their relationship within Oreophryne, those species should also retain their generic identity.</w:t>
+        <w:t xml:space="preserve">(Peters and Doria 1878)</w:t>
+      </w:r>
+      <w:r>
+        <w:t xml:space="preserve">. A number of species were not available for our study but should molecular evidence demonstrate their relationship within Oreophryne, those species should also retain their generic identity.</w:t>
       </w:r>
     </w:p>
     <w:p>
@@ -30376,20 +30468,56 @@
           <w:b/>
           <w:bCs/>
         </w:rPr>
-        <w:t xml:space="preserve">Family Microhylidae Günther, 1858</w:t>
-      </w:r>
-      <w:r>
-        <w:br/>
+        <w:t xml:space="preserve">Family Microhylidae</w:t>
       </w:r>
       <w:r>
         <w:rPr>
           <w:b/>
           <w:bCs/>
         </w:rPr>
-        <w:t xml:space="preserve">Subfamily Asterophryinae Günther, 1858</w:t>
-      </w:r>
-      <w:r>
-        <w:br/>
+        <w:t xml:space="preserve"> </w:t>
+      </w:r>
+      <w:r>
+        <w:rPr>
+          <w:b/>
+          <w:bCs/>
+        </w:rPr>
+        <w:t xml:space="preserve">(Günther 1858)</w:t>
+      </w:r>
+      <w:r>
+        <w:rPr>
+          <w:b/>
+          <w:bCs/>
+        </w:rPr>
+        <w:t xml:space="preserve"> </w:t>
+      </w:r>
+      <w:r>
+        <w:rPr>
+          <w:b/>
+          <w:bCs/>
+        </w:rPr>
+        <w:t xml:space="preserve">Subfamily Asterophryinae</w:t>
+      </w:r>
+      <w:r>
+        <w:rPr>
+          <w:b/>
+          <w:bCs/>
+        </w:rPr>
+        <w:t xml:space="preserve"> </w:t>
+      </w:r>
+      <w:r>
+        <w:rPr>
+          <w:b/>
+          <w:bCs/>
+        </w:rPr>
+        <w:t xml:space="preserve">(Günther 1858)</w:t>
+      </w:r>
+      <w:r>
+        <w:rPr>
+          <w:b/>
+          <w:bCs/>
+        </w:rPr>
+        <w:t xml:space="preserve"> </w:t>
       </w:r>
       <w:r>
         <w:rPr>
@@ -30399,7 +30527,7 @@
         <w:t xml:space="preserve">Genus Auparoparo gen. Nov.</w:t>
       </w:r>
       <w:r>
-        <w:br/>
+        <w:t xml:space="preserve"> </w:t>
       </w:r>
       <w:r>
         <w:rPr>
@@ -30412,10 +30540,10 @@
         <w:t xml:space="preserve"> </w:t>
       </w:r>
       <w:r>
-        <w:t xml:space="preserve">Boettger, 1895</w:t>
-      </w:r>
-      <w:r>
-        <w:br/>
+        <w:t xml:space="preserve">(Boettger 1895)</w:t>
+      </w:r>
+      <w:r>
+        <w:t xml:space="preserve"> </w:t>
       </w:r>
       <w:r>
         <w:rPr>
@@ -30428,10 +30556,10 @@
         <w:t xml:space="preserve"> </w:t>
       </w:r>
       <w:r>
-        <w:t xml:space="preserve">Fry, 1917</w:t>
-      </w:r>
-      <w:r>
-        <w:br/>
+        <w:t xml:space="preserve">(Fry 1917)</w:t>
+      </w:r>
+      <w:r>
+        <w:t xml:space="preserve"> </w:t>
       </w:r>
       <w:r>
         <w:rPr>
@@ -30444,10 +30572,16 @@
         <w:t xml:space="preserve"> </w:t>
       </w:r>
       <w:r>
-        <w:t xml:space="preserve">(anthonyi) Boulenger, 1897</w:t>
-      </w:r>
-      <w:r>
-        <w:br/>
+        <w:t xml:space="preserve">(anthonyi)</w:t>
+      </w:r>
+      <w:r>
+        <w:t xml:space="preserve"> </w:t>
+      </w:r>
+      <w:r>
+        <w:t xml:space="preserve">(Boulenger 1897)</w:t>
+      </w:r>
+      <w:r>
+        <w:t xml:space="preserve"> </w:t>
       </w:r>
       <w:r>
         <w:t xml:space="preserve">Type species</w:t>
@@ -30466,7 +30600,13 @@
         <w:t xml:space="preserve"> </w:t>
       </w:r>
       <w:r>
-        <w:t xml:space="preserve">(Kraus 2016) [=</w:t>
+        <w:t xml:space="preserve">(Kraus 2016)</w:t>
+      </w:r>
+      <w:r>
+        <w:t xml:space="preserve"> </w:t>
+      </w:r>
+      <w:r>
+        <w:t xml:space="preserve">[=</w:t>
       </w:r>
       <w:r>
         <w:rPr>
@@ -30564,7 +30704,13 @@
         <w:t xml:space="preserve">Oreophryne</w:t>
       </w:r>
       <w:r>
-        <w:t xml:space="preserve">, by the combination of (1) presence of highly reduced clavicles (vs absence or elongate) which have a distinctly curved shape; (2) presence of well developed digital discs, with finger discs notably wider than toe discs (typically 20% or more); (3) arboreal lifestyle (perch height &gt;2m above ground); (4) small to moderately large body size in known species, from 16mm (</w:t>
+        <w:t xml:space="preserve">, by the combination of (1) presence of highly reduced clavicles (vs absence or elongate) which have a distinctly curved shape; (2) presence of well developed digital discs, with finger discs notably wider than toe discs (typically 20% or more); (3) arboreal lifestyle (perch height &gt;2m above ground); (4) small to moderately large body size in known species, from 16mm</w:t>
+      </w:r>
+      <w:r>
+        <w:t xml:space="preserve"> </w:t>
+      </w:r>
+      <w:r>
+        <w:t xml:space="preserve">(</w:t>
       </w:r>
       <w:r>
         <w:rPr>
@@ -30574,7 +30720,32 @@
         <w:t xml:space="preserve">A. brunnea</w:t>
       </w:r>
       <w:r>
-        <w:t xml:space="preserve">, Kraus 2017) to 25 mm (A. picticrus, Kraus 2016); (5) small to invisible tympanum; (6) large eyes with pupil horizontal; (7) occasional presence of toe webbing; (8) and thin, elongated limbs; and (9) and in many species males that call with a</w:t>
+        <w:t xml:space="preserve">, Kraus 2017)</w:t>
+      </w:r>
+      <w:r>
+        <w:t xml:space="preserve"> </w:t>
+      </w:r>
+      <w:r>
+        <w:t xml:space="preserve">to 25 mm</w:t>
+      </w:r>
+      <w:r>
+        <w:t xml:space="preserve"> </w:t>
+      </w:r>
+      <w:r>
+        <w:t xml:space="preserve">(</w:t>
+      </w:r>
+      <w:r>
+        <w:rPr>
+          <w:i/>
+          <w:iCs/>
+        </w:rPr>
+        <w:t xml:space="preserve">A. picticrus</w:t>
+      </w:r>
+      <w:r>
+        <w:t xml:space="preserve">, Kraus 2016)</w:t>
+      </w:r>
+      <w:r>
+        <w:t xml:space="preserve">; (5) small to invisible tympanum; (6) large eyes with pupil horizontal; (7) occasional presence of toe webbing; (8) and thin, elongated limbs; and (9) and in many species males that call with a</w:t>
       </w:r>
       <w:r>
         <w:t xml:space="preserve"> </w:t>
@@ -30791,7 +30962,7 @@
         <w:t xml:space="preserve"> </w:t>
       </w:r>
       <w:r>
-        <w:t xml:space="preserve">Boettger (1892)</w:t>
+        <w:t xml:space="preserve">(Boettger 1892)</w:t>
       </w:r>
       <w:r>
         <w:t xml:space="preserve">, and</w:t>
@@ -30810,17 +30981,7 @@
         <w:t xml:space="preserve"> </w:t>
       </w:r>
       <w:r>
-        <w:t xml:space="preserve">(</w:t>
-      </w:r>
-      <w:r>
-        <w:rPr>
-          <w:b/>
-          <w:bCs/>
-        </w:rPr>
-        <w:t xml:space="preserve">Kraus:2010?</w:t>
-      </w:r>
-      <w:r>
-        <w:t xml:space="preserve">)</w:t>
+        <w:t xml:space="preserve">(Kraus 2010)</w:t>
       </w:r>
       <w:r>
         <w:t xml:space="preserve">.</w:t>
@@ -30873,7 +31034,10 @@
         <w:t xml:space="preserve"> </w:t>
       </w:r>
       <w:r>
-        <w:t xml:space="preserve">(Kraus, 2017),</w:t>
+        <w:t xml:space="preserve">(Kraus 2017)</w:t>
+      </w:r>
+      <w:r>
+        <w:t xml:space="preserve">,</w:t>
       </w:r>
       <w:r>
         <w:t xml:space="preserve"> </w:t>
@@ -30889,7 +31053,10 @@
         <w:t xml:space="preserve"> </w:t>
       </w:r>
       <w:r>
-        <w:t xml:space="preserve">(Kraus, 2016),</w:t>
+        <w:t xml:space="preserve">(Kraus 2016)</w:t>
+      </w:r>
+      <w:r>
+        <w:t xml:space="preserve">,</w:t>
       </w:r>
       <w:r>
         <w:t xml:space="preserve"> </w:t>
@@ -30905,7 +31072,10 @@
         <w:t xml:space="preserve"> </w:t>
       </w:r>
       <w:r>
-        <w:t xml:space="preserve">Kraus and Allison, 2009,</w:t>
+        <w:t xml:space="preserve">(Kraus and Allison 2009)</w:t>
+      </w:r>
+      <w:r>
+        <w:t xml:space="preserve">,</w:t>
       </w:r>
       <w:r>
         <w:t xml:space="preserve"> </w:t>
@@ -30921,7 +31091,10 @@
         <w:t xml:space="preserve"> </w:t>
       </w:r>
       <w:r>
-        <w:t xml:space="preserve">Zweifel, 1956,</w:t>
+        <w:t xml:space="preserve">(Zweifel 1956)</w:t>
+      </w:r>
+      <w:r>
+        <w:t xml:space="preserve">,</w:t>
       </w:r>
       <w:r>
         <w:t xml:space="preserve"> </w:t>
@@ -30937,7 +31110,10 @@
         <w:t xml:space="preserve"> </w:t>
       </w:r>
       <w:r>
-        <w:t xml:space="preserve">Kraus, 2016,</w:t>
+        <w:t xml:space="preserve">(Kraus 2016)</w:t>
+      </w:r>
+      <w:r>
+        <w:t xml:space="preserve">,</w:t>
       </w:r>
       <w:r>
         <w:t xml:space="preserve"> </w:t>
@@ -30953,7 +31129,10 @@
         <w:t xml:space="preserve"> </w:t>
       </w:r>
       <w:r>
-        <w:t xml:space="preserve">Kraus, 2016,</w:t>
+        <w:t xml:space="preserve">(Kraus 2016)</w:t>
+      </w:r>
+      <w:r>
+        <w:t xml:space="preserve">,</w:t>
       </w:r>
       <w:r>
         <w:t xml:space="preserve"> </w:t>
@@ -30969,7 +31148,10 @@
         <w:t xml:space="preserve"> </w:t>
       </w:r>
       <w:r>
-        <w:t xml:space="preserve">Kraus, 2016,</w:t>
+        <w:t xml:space="preserve">(Kraus 2016)</w:t>
+      </w:r>
+      <w:r>
+        <w:t xml:space="preserve">,</w:t>
       </w:r>
       <w:r>
         <w:t xml:space="preserve"> </w:t>
@@ -30985,7 +31167,10 @@
         <w:t xml:space="preserve"> </w:t>
       </w:r>
       <w:r>
-        <w:t xml:space="preserve">Kraus, 2017,</w:t>
+        <w:t xml:space="preserve">(Kraus 2017)</w:t>
+      </w:r>
+      <w:r>
+        <w:t xml:space="preserve">,</w:t>
       </w:r>
       <w:r>
         <w:t xml:space="preserve"> </w:t>
@@ -31001,7 +31186,10 @@
         <w:t xml:space="preserve"> </w:t>
       </w:r>
       <w:r>
-        <w:t xml:space="preserve">Kraus, 2016,</w:t>
+        <w:t xml:space="preserve">(Kraus 2016)</w:t>
+      </w:r>
+      <w:r>
+        <w:t xml:space="preserve">,</w:t>
       </w:r>
       <w:r>
         <w:t xml:space="preserve"> </w:t>
@@ -31030,7 +31218,10 @@
         <w:t xml:space="preserve"> </w:t>
       </w:r>
       <w:r>
-        <w:t xml:space="preserve">(Kraus 2016),</w:t>
+        <w:t xml:space="preserve">(Kraus 2016)</w:t>
+      </w:r>
+      <w:r>
+        <w:t xml:space="preserve">,</w:t>
       </w:r>
       <w:r>
         <w:t xml:space="preserve"> </w:t>
@@ -31046,7 +31237,10 @@
         <w:t xml:space="preserve"> </w:t>
       </w:r>
       <w:r>
-        <w:t xml:space="preserve">(Boulenger, 1896).</w:t>
+        <w:t xml:space="preserve">(Boulenger 1896)</w:t>
+      </w:r>
+      <w:r>
+        <w:t xml:space="preserve">.</w:t>
       </w:r>
     </w:p>
     <w:p>
@@ -32975,7 +33169,7 @@
       </w:r>
     </w:p>
     <w:bookmarkEnd w:id="58"/>
-    <w:bookmarkStart w:id="153" w:name="citations"/>
+    <w:bookmarkStart w:id="168" w:name="citations"/>
     <w:p>
       <w:pPr>
         <w:pStyle w:val="Heading1"/>
@@ -32984,7 +33178,7 @@
         <w:t xml:space="preserve">Citations</w:t>
       </w:r>
     </w:p>
-    <w:bookmarkStart w:id="152" w:name="refs"/>
+    <w:bookmarkStart w:id="167" w:name="refs"/>
     <w:bookmarkStart w:id="59" w:name="ref-Ahl:1933"/>
     <w:p>
       <w:pPr>
@@ -33075,18 +33269,38 @@
       </w:r>
     </w:p>
     <w:bookmarkEnd w:id="65"/>
-    <w:bookmarkStart w:id="67" w:name="ref-Boulenger:1896"/>
+    <w:bookmarkStart w:id="66" w:name="ref-Boulenger:1898"/>
     <w:p>
       <w:pPr>
         <w:pStyle w:val="Bibliography"/>
       </w:pPr>
       <w:r>
+        <w:t xml:space="preserve">Boulenger, G. A. 1898. An account of the reptiles and batrachians collected by dr. L. Loria in british new guinea. Annali del Museo civico di storia naturale di Genova, Serie 2 18:695–710.</w:t>
+      </w:r>
+    </w:p>
+    <w:bookmarkEnd w:id="66"/>
+    <w:bookmarkStart w:id="67" w:name="ref-Boulenger:1897"/>
+    <w:p>
+      <w:pPr>
+        <w:pStyle w:val="Bibliography"/>
+      </w:pPr>
+      <w:r>
+        <w:t xml:space="preserve">Boulenger, G. A. 1897. Descriptions of new lizards and frogs from mount victoria, owen stanley range, new guinea, collected by mr. A. S. anthony. Annals and Magazine of Natural History, Series 6 19:6–13.</w:t>
+      </w:r>
+    </w:p>
+    <w:bookmarkEnd w:id="67"/>
+    <w:bookmarkStart w:id="69" w:name="ref-Boulenger:1896"/>
+    <w:p>
+      <w:pPr>
+        <w:pStyle w:val="Bibliography"/>
+      </w:pPr>
+      <w:r>
         <w:t xml:space="preserve">Boulenger, G. A. 1896.</w:t>
       </w:r>
       <w:r>
         <w:t xml:space="preserve"> </w:t>
       </w:r>
-      <w:hyperlink r:id="rId66">
+      <w:hyperlink r:id="rId68">
         <w:r>
           <w:rPr>
             <w:rStyle w:val="Hyperlink"/>
@@ -33098,8 +33312,8 @@
         <w:t xml:space="preserve">. The Annals and magazine of natural history; zoology, botany, and geology, Series 6 18:62–64.</w:t>
       </w:r>
     </w:p>
-    <w:bookmarkEnd w:id="67"/>
-    <w:bookmarkStart w:id="69" w:name="ref-Brown:2015"/>
+    <w:bookmarkEnd w:id="69"/>
+    <w:bookmarkStart w:id="71" w:name="ref-Brown:2015"/>
     <w:p>
       <w:pPr>
         <w:pStyle w:val="Bibliography"/>
@@ -33110,7 +33324,7 @@
       <w:r>
         <w:t xml:space="preserve"> </w:t>
       </w:r>
-      <w:hyperlink r:id="rId68">
+      <w:hyperlink r:id="rId70">
         <w:r>
           <w:rPr>
             <w:rStyle w:val="Hyperlink"/>
@@ -33122,19 +33336,43 @@
         <w:t xml:space="preserve">. Zoological Journal of the Linnean Society 174:130–168.</w:t>
       </w:r>
     </w:p>
-    <w:bookmarkEnd w:id="69"/>
-    <w:bookmarkStart w:id="71" w:name="ref-deQueiroz:2020"/>
+    <w:bookmarkEnd w:id="71"/>
+    <w:bookmarkStart w:id="73" w:name="ref-Brown:1967"/>
     <w:p>
       <w:pPr>
         <w:pStyle w:val="Bibliography"/>
       </w:pPr>
       <w:r>
+        <w:t xml:space="preserve">Brown, Walter C. (Walter Creighton), and Alcala Angel C. 1967.</w:t>
+      </w:r>
+      <w:r>
+        <w:t xml:space="preserve"> </w:t>
+      </w:r>
+      <w:hyperlink r:id="rId72">
+        <w:r>
+          <w:rPr>
+            <w:rStyle w:val="Hyperlink"/>
+          </w:rPr>
+          <w:t xml:space="preserve">A new frog of the genus oreophryne and a list of amphibians from camiguin island, philippines</w:t>
+        </w:r>
+      </w:hyperlink>
+      <w:r>
+        <w:t xml:space="preserve">. Proceedings of the Biological Society of Washington 80:65–68. Washington, Biological Society of Washington,.</w:t>
+      </w:r>
+    </w:p>
+    <w:bookmarkEnd w:id="73"/>
+    <w:bookmarkStart w:id="75" w:name="ref-deQueiroz:2020"/>
+    <w:p>
+      <w:pPr>
+        <w:pStyle w:val="Bibliography"/>
+      </w:pPr>
+      <w:r>
         <w:t xml:space="preserve">de Queiroz, K., and P. Cantino. 2020.</w:t>
       </w:r>
       <w:r>
         <w:t xml:space="preserve"> </w:t>
       </w:r>
-      <w:hyperlink r:id="rId70">
+      <w:hyperlink r:id="rId74">
         <w:r>
           <w:rPr>
             <w:rStyle w:val="Hyperlink"/>
@@ -33146,8 +33384,8 @@
         <w:t xml:space="preserve">. 1st ed. CRC Press.</w:t>
       </w:r>
     </w:p>
-    <w:bookmarkEnd w:id="71"/>
-    <w:bookmarkStart w:id="73" w:name="ref-deQueiroz:1992"/>
+    <w:bookmarkEnd w:id="75"/>
+    <w:bookmarkStart w:id="77" w:name="ref-deQueiroz:1992"/>
     <w:p>
       <w:pPr>
         <w:pStyle w:val="Bibliography"/>
@@ -33158,7 +33396,7 @@
       <w:r>
         <w:t xml:space="preserve"> </w:t>
       </w:r>
-      <w:hyperlink r:id="rId72">
+      <w:hyperlink r:id="rId76">
         <w:r>
           <w:rPr>
             <w:rStyle w:val="Hyperlink"/>
@@ -33182,8 +33420,8 @@
         <w:t xml:space="preserve">23:449–480.</w:t>
       </w:r>
     </w:p>
-    <w:bookmarkEnd w:id="73"/>
-    <w:bookmarkStart w:id="75" w:name="ref-deQueiroz:1990"/>
+    <w:bookmarkEnd w:id="77"/>
+    <w:bookmarkStart w:id="79" w:name="ref-deQueiroz:1990"/>
     <w:p>
       <w:pPr>
         <w:pStyle w:val="Bibliography"/>
@@ -33194,7 +33432,7 @@
       <w:r>
         <w:t xml:space="preserve"> </w:t>
       </w:r>
-      <w:hyperlink r:id="rId74">
+      <w:hyperlink r:id="rId78">
         <w:r>
           <w:rPr>
             <w:rStyle w:val="Hyperlink"/>
@@ -33206,8 +33444,8 @@
         <w:t xml:space="preserve">. Systematic Zoology 39:307–322.</w:t>
       </w:r>
     </w:p>
-    <w:bookmarkEnd w:id="75"/>
-    <w:bookmarkStart w:id="77" w:name="ref-deQueiroz:1994"/>
+    <w:bookmarkEnd w:id="79"/>
+    <w:bookmarkStart w:id="81" w:name="ref-deQueiroz:1994"/>
     <w:p>
       <w:pPr>
         <w:pStyle w:val="Bibliography"/>
@@ -33218,7 +33456,7 @@
       <w:r>
         <w:t xml:space="preserve"> </w:t>
       </w:r>
-      <w:hyperlink r:id="rId76">
+      <w:hyperlink r:id="rId80">
         <w:r>
           <w:rPr>
             <w:rStyle w:val="Hyperlink"/>
@@ -33242,8 +33480,8 @@
         <w:t xml:space="preserve">9:27–31.</w:t>
       </w:r>
     </w:p>
-    <w:bookmarkEnd w:id="77"/>
-    <w:bookmarkStart w:id="79" w:name="ref-deSa:2012"/>
+    <w:bookmarkEnd w:id="81"/>
+    <w:bookmarkStart w:id="83" w:name="ref-deSa:2012"/>
     <w:p>
       <w:pPr>
         <w:pStyle w:val="Bibliography"/>
@@ -33254,7 +33492,7 @@
       <w:r>
         <w:t xml:space="preserve"> </w:t>
       </w:r>
-      <w:hyperlink r:id="rId78">
+      <w:hyperlink r:id="rId82">
         <w:r>
           <w:rPr>
             <w:rStyle w:val="Hyperlink"/>
@@ -33281,8 +33519,8 @@
         <w:t xml:space="preserve">.</w:t>
       </w:r>
     </w:p>
-    <w:bookmarkEnd w:id="79"/>
-    <w:bookmarkStart w:id="81" w:name="ref-Edgar:2004"/>
+    <w:bookmarkEnd w:id="83"/>
+    <w:bookmarkStart w:id="85" w:name="ref-Edgar:2004"/>
     <w:p>
       <w:pPr>
         <w:pStyle w:val="Bibliography"/>
@@ -33293,7 +33531,7 @@
       <w:r>
         <w:t xml:space="preserve"> </w:t>
       </w:r>
-      <w:hyperlink r:id="rId80">
+      <w:hyperlink r:id="rId84">
         <w:r>
           <w:rPr>
             <w:rStyle w:val="Hyperlink"/>
@@ -33305,8 +33543,8 @@
         <w:t xml:space="preserve">. BMC Bioinformatics 5:113.</w:t>
       </w:r>
     </w:p>
-    <w:bookmarkEnd w:id="81"/>
-    <w:bookmarkStart w:id="83" w:name="ref-Engelkes:2020"/>
+    <w:bookmarkEnd w:id="85"/>
+    <w:bookmarkStart w:id="87" w:name="ref-Engelkes:2020"/>
     <w:p>
       <w:pPr>
         <w:pStyle w:val="Bibliography"/>
@@ -33317,7 +33555,7 @@
       <w:r>
         <w:t xml:space="preserve"> </w:t>
       </w:r>
-      <w:hyperlink r:id="rId82">
+      <w:hyperlink r:id="rId86">
         <w:r>
           <w:rPr>
             <w:rStyle w:val="Hyperlink"/>
@@ -33329,8 +33567,8 @@
         <w:t xml:space="preserve">. ECOLOGY AND EVOLUTION 10:11467–11487.</w:t>
       </w:r>
     </w:p>
-    <w:bookmarkEnd w:id="83"/>
-    <w:bookmarkStart w:id="85" w:name="ref-Frost:2024"/>
+    <w:bookmarkEnd w:id="87"/>
+    <w:bookmarkStart w:id="89" w:name="ref-Frost:2024"/>
     <w:p>
       <w:pPr>
         <w:pStyle w:val="Bibliography"/>
@@ -33341,7 +33579,7 @@
       <w:r>
         <w:t xml:space="preserve"> </w:t>
       </w:r>
-      <w:hyperlink r:id="rId84">
+      <w:hyperlink r:id="rId88">
         <w:r>
           <w:rPr>
             <w:rStyle w:val="Hyperlink"/>
@@ -33353,19 +33591,29 @@
         <w:t xml:space="preserve">.</w:t>
       </w:r>
     </w:p>
-    <w:bookmarkEnd w:id="85"/>
-    <w:bookmarkStart w:id="87" w:name="ref-Gillman:2020"/>
+    <w:bookmarkEnd w:id="89"/>
+    <w:bookmarkStart w:id="90" w:name="ref-Fry:1917"/>
     <w:p>
       <w:pPr>
         <w:pStyle w:val="Bibliography"/>
       </w:pPr>
       <w:r>
+        <w:t xml:space="preserve">Fry, D. B. 1917. Description of aphantophryne, a new batrachian genus from new guinea; with comparative notes on the pectoral musculature. Proceedings of the Linnean Society of New South Wales 41:770–785.</w:t>
+      </w:r>
+    </w:p>
+    <w:bookmarkEnd w:id="90"/>
+    <w:bookmarkStart w:id="92" w:name="ref-Gillman:2020"/>
+    <w:p>
+      <w:pPr>
+        <w:pStyle w:val="Bibliography"/>
+      </w:pPr>
+      <w:r>
         <w:t xml:space="preserve">Gillman, L. N., and S. D. Wright. 2020.</w:t>
       </w:r>
       <w:r>
         <w:t xml:space="preserve"> </w:t>
       </w:r>
-      <w:hyperlink r:id="rId86">
+      <w:hyperlink r:id="rId91">
         <w:r>
           <w:rPr>
             <w:rStyle w:val="Hyperlink"/>
@@ -33377,19 +33625,42 @@
         <w:t xml:space="preserve">. Communications Biology 3:609.</w:t>
       </w:r>
     </w:p>
-    <w:bookmarkEnd w:id="87"/>
-    <w:bookmarkStart w:id="89" w:name="ref-Gunther:2023"/>
+    <w:bookmarkEnd w:id="92"/>
+    <w:bookmarkStart w:id="93" w:name="ref-Gunther:1858"/>
     <w:p>
       <w:pPr>
         <w:pStyle w:val="Bibliography"/>
       </w:pPr>
       <w:r>
+        <w:t xml:space="preserve">Günther, A. C. L. G. 1858. On the systematic arrangement of the tailless batrachians and the structure of</w:t>
+      </w:r>
+      <w:r>
+        <w:t xml:space="preserve"> </w:t>
+      </w:r>
+      <w:r>
+        <w:rPr>
+          <w:i/>
+          <w:iCs/>
+        </w:rPr>
+        <w:t xml:space="preserve">rhinophrynus dorsalis</w:t>
+      </w:r>
+      <w:r>
+        <w:t xml:space="preserve">. Proceedings of the Zoological Society of London 339–352.</w:t>
+      </w:r>
+    </w:p>
+    <w:bookmarkEnd w:id="93"/>
+    <w:bookmarkStart w:id="95" w:name="ref-Gunther:2023"/>
+    <w:p>
+      <w:pPr>
+        <w:pStyle w:val="Bibliography"/>
+      </w:pPr>
+      <w:r>
         <w:t xml:space="preserve">Günther, R., D. T. Iskandar, and S. J. Richards. 2023.</w:t>
       </w:r>
       <w:r>
         <w:t xml:space="preserve"> </w:t>
       </w:r>
-      <w:hyperlink r:id="rId88">
+      <w:hyperlink r:id="rId94">
         <w:r>
           <w:rPr>
             <w:rStyle w:val="Hyperlink"/>
@@ -33433,18 +33704,18 @@
         <w:t xml:space="preserve">r Naturforschung.</w:t>
       </w:r>
     </w:p>
-    <w:bookmarkEnd w:id="89"/>
-    <w:bookmarkStart w:id="90" w:name="ref-Gunther:2011"/>
+    <w:bookmarkEnd w:id="95"/>
+    <w:bookmarkStart w:id="96" w:name="ref-Gunther:2012"/>
     <w:p>
       <w:pPr>
         <w:pStyle w:val="Bibliography"/>
       </w:pPr>
       <w:r>
-        <w:t xml:space="preserve">Günther, R., and S. J. Richards. 2011. Five new microhylid frog species from enga province, papua new guinea, and remarks on albericus alpestris (anura, microhylidae). VERTEBRATE ZOOLOGY 61:343–372.</w:t>
+        <w:t xml:space="preserve">Günther, R., and S. J. Richards. 2012. Five new microhylid frog species from enga province, papua new guinea, and remarks on albericus alpestris (anura, microhylidae). VERTEBRATE ZOOLOGY 61:343–372.</w:t>
       </w:r>
     </w:p>
-    <w:bookmarkEnd w:id="90"/>
-    <w:bookmarkStart w:id="91" w:name="ref-Gunther:2001"/>
+    <w:bookmarkEnd w:id="96"/>
+    <w:bookmarkStart w:id="97" w:name="ref-Gunther:2001"/>
     <w:p>
       <w:pPr>
         <w:pStyle w:val="Bibliography"/>
@@ -33453,8 +33724,8 @@
         <w:t xml:space="preserve">Günther, R., S. Richards, and D. T. Iskandar. 2001. Two new species of the genus oreophryne from irian jaya, indonesia (amphibia, anura, microhylidae). Spixiana 24:257–274.</w:t>
       </w:r>
     </w:p>
-    <w:bookmarkEnd w:id="91"/>
-    <w:bookmarkStart w:id="93" w:name="ref-Hill:2022"/>
+    <w:bookmarkEnd w:id="97"/>
+    <w:bookmarkStart w:id="99" w:name="ref-Hill:2022"/>
     <w:p>
       <w:pPr>
         <w:pStyle w:val="Bibliography"/>
@@ -33465,7 +33736,7 @@
       <w:r>
         <w:t xml:space="preserve"> </w:t>
       </w:r>
-      <w:hyperlink r:id="rId92">
+      <w:hyperlink r:id="rId98">
         <w:r>
           <w:rPr>
             <w:rStyle w:val="Hyperlink"/>
@@ -33477,8 +33748,8 @@
         <w:t xml:space="preserve">. Molecular Phylogenetics and Evolution 177. Academic Press Inc.</w:t>
       </w:r>
     </w:p>
-    <w:bookmarkEnd w:id="93"/>
-    <w:bookmarkStart w:id="94" w:name="ref-Hill:2023a"/>
+    <w:bookmarkEnd w:id="99"/>
+    <w:bookmarkStart w:id="100" w:name="ref-Hill:2023a"/>
     <w:p>
       <w:pPr>
         <w:pStyle w:val="Bibliography"/>
@@ -33487,8 +33758,8 @@
         <w:t xml:space="preserve">Hill, E. C., D. F. Gao, D. A. Polhemus, C. J. Fraser, B. Iova, A. Allison, and M. A. Butler. 2023a. Testing geology with biology: Plate tectonics and the diversification of microhylid frogs in the papuan region. Integrative Organismal Biology.</w:t>
       </w:r>
     </w:p>
-    <w:bookmarkEnd w:id="94"/>
-    <w:bookmarkStart w:id="96" w:name="ref-Hill:2023"/>
+    <w:bookmarkEnd w:id="100"/>
+    <w:bookmarkStart w:id="102" w:name="ref-Hill:2023"/>
     <w:p>
       <w:pPr>
         <w:pStyle w:val="Bibliography"/>
@@ -33499,7 +33770,7 @@
       <w:r>
         <w:t xml:space="preserve"> </w:t>
       </w:r>
-      <w:hyperlink r:id="rId95">
+      <w:hyperlink r:id="rId101">
         <w:r>
           <w:rPr>
             <w:rStyle w:val="Hyperlink"/>
@@ -33511,19 +33782,29 @@
         <w:t xml:space="preserve">. Data in Brief 47:108987.</w:t>
       </w:r>
     </w:p>
-    <w:bookmarkEnd w:id="96"/>
-    <w:bookmarkStart w:id="98" w:name="ref-VanKampen:1923"/>
+    <w:bookmarkEnd w:id="102"/>
+    <w:bookmarkStart w:id="103" w:name="ref-Horst:1883"/>
     <w:p>
       <w:pPr>
         <w:pStyle w:val="Bibliography"/>
       </w:pPr>
       <w:r>
+        <w:t xml:space="preserve">Horst, R. 1883. On new and little-known frogs from the malayan archipelago. Notes from the Leyden Museum 5:235–244.</w:t>
+      </w:r>
+    </w:p>
+    <w:bookmarkEnd w:id="103"/>
+    <w:bookmarkStart w:id="105" w:name="ref-VanKampen:1923"/>
+    <w:p>
+      <w:pPr>
+        <w:pStyle w:val="Bibliography"/>
+      </w:pPr>
+      <w:r>
         <w:t xml:space="preserve">Kampen, P. N. van. 1923.</w:t>
       </w:r>
       <w:r>
         <w:t xml:space="preserve"> </w:t>
       </w:r>
-      <w:hyperlink r:id="rId97">
+      <w:hyperlink r:id="rId104">
         <w:r>
           <w:rPr>
             <w:rStyle w:val="Hyperlink"/>
@@ -33535,8 +33816,8 @@
         <w:t xml:space="preserve">. E. J. Brill, ltd, Leiden.</w:t>
       </w:r>
     </w:p>
-    <w:bookmarkEnd w:id="98"/>
-    <w:bookmarkStart w:id="100" w:name="ref-Koehler:2008"/>
+    <w:bookmarkEnd w:id="105"/>
+    <w:bookmarkStart w:id="107" w:name="ref-Koehler:2008"/>
     <w:p>
       <w:pPr>
         <w:pStyle w:val="Bibliography"/>
@@ -33547,7 +33828,7 @@
       <w:r>
         <w:t xml:space="preserve"> </w:t>
       </w:r>
-      <w:hyperlink r:id="rId99">
+      <w:hyperlink r:id="rId106">
         <w:r>
           <w:rPr>
             <w:rStyle w:val="Hyperlink"/>
@@ -33559,19 +33840,67 @@
         <w:t xml:space="preserve">. Molecular Phylogenetics and Evolution 47:353–365. ACADEMIC PRESS INC ELSEVIER SCIENCE, 525 B ST, STE 1900, SAN DIEGO, CA 92101-4495 USA.</w:t>
       </w:r>
     </w:p>
-    <w:bookmarkEnd w:id="100"/>
-    <w:bookmarkStart w:id="102" w:name="ref-Kraus:2016"/>
+    <w:bookmarkEnd w:id="107"/>
+    <w:bookmarkStart w:id="109" w:name="ref-Kraus:2017"/>
     <w:p>
       <w:pPr>
         <w:pStyle w:val="Bibliography"/>
       </w:pPr>
       <w:r>
+        <w:t xml:space="preserve">Kraus, F. 2017.</w:t>
+      </w:r>
+      <w:r>
+        <w:t xml:space="preserve"> </w:t>
+      </w:r>
+      <w:hyperlink r:id="rId108">
+        <w:r>
+          <w:rPr>
+            <w:rStyle w:val="Hyperlink"/>
+          </w:rPr>
+          <w:t xml:space="preserve">A new insular species of oreophryne (anura, microhylidae) from papua new guinea</w:t>
+        </w:r>
+      </w:hyperlink>
+      <w:r>
+        <w:t xml:space="preserve">. Journal of Herpetology 51:552–558. Society for the Study of Amphibians; Reptiles.</w:t>
+      </w:r>
+    </w:p>
+    <w:bookmarkEnd w:id="109"/>
+    <w:bookmarkStart w:id="111" w:name="ref-Kraus:2010"/>
+    <w:p>
+      <w:pPr>
+        <w:pStyle w:val="Bibliography"/>
+      </w:pPr>
+      <w:r>
+        <w:t xml:space="preserve">Kraus, F. 2010.</w:t>
+      </w:r>
+      <w:r>
+        <w:t xml:space="preserve"> </w:t>
+      </w:r>
+      <w:hyperlink r:id="rId110">
+        <w:r>
+          <w:rPr>
+            <w:rStyle w:val="Hyperlink"/>
+          </w:rPr>
+          <w:t xml:space="preserve">New genus of diminutive microhylid frogs from papua new guinea</w:t>
+        </w:r>
+      </w:hyperlink>
+      <w:r>
+        <w:t xml:space="preserve">. ZOOKEYS 39–59.</w:t>
+      </w:r>
+    </w:p>
+    <w:bookmarkEnd w:id="111"/>
+    <w:bookmarkStart w:id="113" w:name="ref-Kraus:2016"/>
+    <w:p>
+      <w:pPr>
+        <w:pStyle w:val="Bibliography"/>
+      </w:pPr>
+      <w:r>
         <w:t xml:space="preserve">Kraus, F. 2016.</w:t>
       </w:r>
       <w:r>
         <w:t xml:space="preserve"> </w:t>
       </w:r>
-      <w:hyperlink r:id="rId101">
+      <w:hyperlink r:id="rId112">
         <w:r>
           <w:rPr>
             <w:rStyle w:val="Hyperlink"/>
@@ -33583,8 +33912,8 @@
         <w:t xml:space="preserve">. Zootaxa 4195:1–68. Magnolia Press.</w:t>
       </w:r>
     </w:p>
-    <w:bookmarkEnd w:id="102"/>
-    <w:bookmarkStart w:id="104" w:name="ref-Kraus:2013"/>
+    <w:bookmarkEnd w:id="113"/>
+    <w:bookmarkStart w:id="115" w:name="ref-Kraus:2013"/>
     <w:p>
       <w:pPr>
         <w:pStyle w:val="Bibliography"/>
@@ -33595,7 +33924,7 @@
       <w:r>
         <w:t xml:space="preserve"> </w:t>
       </w:r>
-      <w:hyperlink r:id="rId103">
+      <w:hyperlink r:id="rId114">
         <w:r>
           <w:rPr>
             <w:rStyle w:val="Hyperlink"/>
@@ -33607,8 +33936,8 @@
         <w:t xml:space="preserve">. ZOOKEYS 93–121.</w:t>
       </w:r>
     </w:p>
-    <w:bookmarkEnd w:id="104"/>
-    <w:bookmarkStart w:id="106" w:name="ref-Kraus:2009"/>
+    <w:bookmarkEnd w:id="115"/>
+    <w:bookmarkStart w:id="117" w:name="ref-Kraus:2009"/>
     <w:p>
       <w:pPr>
         <w:pStyle w:val="Bibliography"/>
@@ -33619,7 +33948,7 @@
       <w:r>
         <w:t xml:space="preserve"> </w:t>
       </w:r>
-      <w:hyperlink r:id="rId105">
+      <w:hyperlink r:id="rId116">
         <w:r>
           <w:rPr>
             <w:rStyle w:val="Hyperlink"/>
@@ -33631,8 +33960,8 @@
         <w:t xml:space="preserve">. ZooKeys 26:53–76.</w:t>
       </w:r>
     </w:p>
-    <w:bookmarkEnd w:id="106"/>
-    <w:bookmarkStart w:id="107" w:name="ref-Kraus:2004"/>
+    <w:bookmarkEnd w:id="117"/>
+    <w:bookmarkStart w:id="118" w:name="ref-Kraus:2004"/>
     <w:p>
       <w:pPr>
         <w:pStyle w:val="Bibliography"/>
@@ -33641,8 +33970,8 @@
         <w:t xml:space="preserve">Kraus, F., and A. Allison. 2004. Notes on poorly known new guinea frogs. I. Microhylids from the d’entrecasteaux islands. HERPETOFAUNA-SYDNEY- 34:26–39. AUSTRALASIAN AFFILIATION OF HERPETOLOGICAL.</w:t>
       </w:r>
     </w:p>
-    <w:bookmarkEnd w:id="107"/>
-    <w:bookmarkStart w:id="109" w:name="ref-Lanfear:2012"/>
+    <w:bookmarkEnd w:id="118"/>
+    <w:bookmarkStart w:id="120" w:name="ref-Lanfear:2012"/>
     <w:p>
       <w:pPr>
         <w:pStyle w:val="Bibliography"/>
@@ -33653,7 +33982,7 @@
       <w:r>
         <w:t xml:space="preserve"> </w:t>
       </w:r>
-      <w:hyperlink r:id="rId108">
+      <w:hyperlink r:id="rId119">
         <w:r>
           <w:rPr>
             <w:rStyle w:val="Hyperlink"/>
@@ -33665,19 +33994,29 @@
         <w:t xml:space="preserve">. Molecular Biology and Evolution 29:1695–1701.</w:t>
       </w:r>
     </w:p>
-    <w:bookmarkEnd w:id="109"/>
-    <w:bookmarkStart w:id="111" w:name="ref-Maddison:2023"/>
+    <w:bookmarkEnd w:id="120"/>
+    <w:bookmarkStart w:id="121" w:name="ref-Loveridge:1955"/>
     <w:p>
       <w:pPr>
         <w:pStyle w:val="Bibliography"/>
       </w:pPr>
       <w:r>
+        <w:t xml:space="preserve">Loveridge, A. 1955. New frogs of the genera asterophrys and oreophryne from new guinea. Breviora. Museum of Comparative Zoology, Cambridge, Massachusetts 50:1–5.</w:t>
+      </w:r>
+    </w:p>
+    <w:bookmarkEnd w:id="121"/>
+    <w:bookmarkStart w:id="123" w:name="ref-Maddison:2023"/>
+    <w:p>
+      <w:pPr>
+        <w:pStyle w:val="Bibliography"/>
+      </w:pPr>
+      <w:r>
         <w:t xml:space="preserve">Maddison, W. P., and D. R. Maddison. 2023.</w:t>
       </w:r>
       <w:r>
         <w:t xml:space="preserve"> </w:t>
       </w:r>
-      <w:hyperlink r:id="rId110">
+      <w:hyperlink r:id="rId122">
         <w:r>
           <w:rPr>
             <w:rStyle w:val="Hyperlink"/>
@@ -33689,8 +34028,8 @@
         <w:t xml:space="preserve">.</w:t>
       </w:r>
     </w:p>
-    <w:bookmarkEnd w:id="111"/>
-    <w:bookmarkStart w:id="112" w:name="ref-Mehely:1897"/>
+    <w:bookmarkEnd w:id="123"/>
+    <w:bookmarkStart w:id="124" w:name="ref-Mehely:1897"/>
     <w:p>
       <w:pPr>
         <w:pStyle w:val="Bibliography"/>
@@ -33711,8 +34050,8 @@
         <w:t xml:space="preserve">zetek 20:398–419.</w:t>
       </w:r>
     </w:p>
-    <w:bookmarkEnd w:id="112"/>
-    <w:bookmarkStart w:id="113" w:name="ref-Menzies:2006"/>
+    <w:bookmarkEnd w:id="124"/>
+    <w:bookmarkStart w:id="125" w:name="ref-Menzies:2006"/>
     <w:p>
       <w:pPr>
         <w:pStyle w:val="Bibliography"/>
@@ -33721,8 +34060,8 @@
         <w:t xml:space="preserve">Menzies, J. 2006. The frogs of new guinea and the solomon islands. Pensoft Publishers.</w:t>
       </w:r>
     </w:p>
-    <w:bookmarkEnd w:id="113"/>
-    <w:bookmarkStart w:id="115" w:name="ref-Minh:2020"/>
+    <w:bookmarkEnd w:id="125"/>
+    <w:bookmarkStart w:id="127" w:name="ref-Minh:2020"/>
     <w:p>
       <w:pPr>
         <w:pStyle w:val="Bibliography"/>
@@ -33733,7 +34072,7 @@
       <w:r>
         <w:t xml:space="preserve"> </w:t>
       </w:r>
-      <w:hyperlink r:id="rId114">
+      <w:hyperlink r:id="rId126">
         <w:r>
           <w:rPr>
             <w:rStyle w:val="Hyperlink"/>
@@ -33745,8 +34084,8 @@
         <w:t xml:space="preserve">. Molecular Biology and Evolution 37:1530–1534.</w:t>
       </w:r>
     </w:p>
-    <w:bookmarkEnd w:id="115"/>
-    <w:bookmarkStart w:id="116" w:name="ref-Muller:1894"/>
+    <w:bookmarkEnd w:id="127"/>
+    <w:bookmarkStart w:id="128" w:name="ref-Muller:1894"/>
     <w:p>
       <w:pPr>
         <w:pStyle w:val="Bibliography"/>
@@ -33755,39 +34094,49 @@
         <w:t xml:space="preserve">Müller, F. 1894. Reptilien und amphibien aus celebes. Verhandlungen der Naturforschenden Gesellschaft in Basel 10:825–843.</w:t>
       </w:r>
     </w:p>
-    <w:bookmarkEnd w:id="116"/>
-    <w:bookmarkStart w:id="117" w:name="ref-Parker:1934"/>
+    <w:bookmarkEnd w:id="128"/>
+    <w:bookmarkStart w:id="129" w:name="ref-Nieden:1926"/>
     <w:p>
       <w:pPr>
         <w:pStyle w:val="Bibliography"/>
       </w:pPr>
       <w:r>
-        <w:t xml:space="preserve">Parker, H. W. 1934. A monograph of the frogs of the family microhylidae. London: Trustees of the British Museum.</w:t>
+        <w:t xml:space="preserve">Nieden, F. 1926. Anura II. engystomatidae. Das Tierreich 49:1–110.</w:t>
       </w:r>
     </w:p>
-    <w:bookmarkEnd w:id="117"/>
-    <w:bookmarkStart w:id="118" w:name="ref-Peters:1878"/>
+    <w:bookmarkEnd w:id="129"/>
+    <w:bookmarkStart w:id="130" w:name="ref-Parker:1934"/>
     <w:p>
       <w:pPr>
         <w:pStyle w:val="Bibliography"/>
       </w:pPr>
       <w:r>
-        <w:t xml:space="preserve">Peters, W. C. H., and G. Doria. 1878. Catalogo dei rettili e dei batraci raccolti da o. Beccari, l.m. D’albertis a.a. Bruijn nella sotto-regione austro-malese. Annali del Museo civico di storia naturale di Genova 13:323–450.</w:t>
+        <w:t xml:space="preserve">Parker, H. W. 1934. A monograph of the frogs of the family microhylidae. London: Trustees of the British Museum.</w:t>
       </w:r>
     </w:p>
-    <w:bookmarkEnd w:id="118"/>
-    <w:bookmarkStart w:id="120" w:name="ref-Putri:2023"/>
+    <w:bookmarkEnd w:id="130"/>
+    <w:bookmarkStart w:id="131" w:name="ref-Peters:1878"/>
     <w:p>
       <w:pPr>
         <w:pStyle w:val="Bibliography"/>
       </w:pPr>
       <w:r>
+        <w:t xml:space="preserve">Peters, W. C. H., and G. Doria. 1878. Catalogo dei rettili e dei batraci raccolti da o. Beccari, l.m. D’albertis a.a. Bruijn nella sotto-regione austro-malese. Annali del Museo civico di storia naturale di Genova 13:323–450.</w:t>
+      </w:r>
+    </w:p>
+    <w:bookmarkEnd w:id="131"/>
+    <w:bookmarkStart w:id="133" w:name="ref-Putri:2023"/>
+    <w:p>
+      <w:pPr>
+        <w:pStyle w:val="Bibliography"/>
+      </w:pPr>
+      <w:r>
         <w:t xml:space="preserve">Putri, A., W. TRILAKSONO, H. KURNIATI, A. Hitch, A. Jr, K. Widayati, A. Farajallah, and A. Hamidy. 2023.</w:t>
       </w:r>
       <w:r>
         <w:t xml:space="preserve"> </w:t>
       </w:r>
-      <w:hyperlink r:id="rId119">
+      <w:hyperlink r:id="rId132">
         <w:r>
           <w:rPr>
             <w:rStyle w:val="Hyperlink"/>
@@ -33799,8 +34148,8 @@
         <w:t xml:space="preserve">. Zootaxa 5353:455–467.</w:t>
       </w:r>
     </w:p>
-    <w:bookmarkEnd w:id="120"/>
-    <w:bookmarkStart w:id="122" w:name="ref-R:2024"/>
+    <w:bookmarkEnd w:id="133"/>
+    <w:bookmarkStart w:id="135" w:name="ref-R:2024"/>
     <w:p>
       <w:pPr>
         <w:pStyle w:val="Bibliography"/>
@@ -33811,7 +34160,7 @@
       <w:r>
         <w:t xml:space="preserve"> </w:t>
       </w:r>
-      <w:hyperlink r:id="rId121">
+      <w:hyperlink r:id="rId134">
         <w:r>
           <w:rPr>
             <w:rStyle w:val="Hyperlink"/>
@@ -33823,8 +34172,8 @@
         <w:t xml:space="preserve">. R Foundation for Statistical Computing, Vienna, Austria.</w:t>
       </w:r>
     </w:p>
-    <w:bookmarkEnd w:id="122"/>
-    <w:bookmarkStart w:id="124" w:name="ref-Revell:2012"/>
+    <w:bookmarkEnd w:id="135"/>
+    <w:bookmarkStart w:id="137" w:name="ref-Revell:2012"/>
     <w:p>
       <w:pPr>
         <w:pStyle w:val="Bibliography"/>
@@ -33835,7 +34184,7 @@
       <w:r>
         <w:t xml:space="preserve"> </w:t>
       </w:r>
-      <w:hyperlink r:id="rId123">
+      <w:hyperlink r:id="rId136">
         <w:r>
           <w:rPr>
             <w:rStyle w:val="Hyperlink"/>
@@ -33847,8 +34196,8 @@
         <w:t xml:space="preserve">. Methods in Ecology and Evolution 3:217–223.</w:t>
       </w:r>
     </w:p>
-    <w:bookmarkEnd w:id="124"/>
-    <w:bookmarkStart w:id="126" w:name="ref-Rivera:2017"/>
+    <w:bookmarkEnd w:id="137"/>
+    <w:bookmarkStart w:id="139" w:name="ref-Rivera:2017"/>
     <w:p>
       <w:pPr>
         <w:pStyle w:val="Bibliography"/>
@@ -33859,7 +34208,7 @@
       <w:r>
         <w:t xml:space="preserve"> </w:t>
       </w:r>
-      <w:hyperlink r:id="rId125">
+      <w:hyperlink r:id="rId138">
         <w:r>
           <w:rPr>
             <w:rStyle w:val="Hyperlink"/>
@@ -33871,8 +34220,8 @@
         <w:t xml:space="preserve">. Molecular Phylogenetics and Evolution 112:1–11. Academic Press Inc.</w:t>
       </w:r>
     </w:p>
-    <w:bookmarkEnd w:id="126"/>
-    <w:bookmarkStart w:id="128" w:name="ref-Setiadi:2010"/>
+    <w:bookmarkEnd w:id="139"/>
+    <w:bookmarkStart w:id="141" w:name="ref-Setiadi:2010"/>
     <w:p>
       <w:pPr>
         <w:pStyle w:val="Bibliography"/>
@@ -33883,7 +34232,7 @@
       <w:r>
         <w:t xml:space="preserve"> </w:t>
       </w:r>
-      <w:hyperlink r:id="rId127">
+      <w:hyperlink r:id="rId140">
         <w:r>
           <w:rPr>
             <w:rStyle w:val="Hyperlink"/>
@@ -33895,8 +34244,8 @@
         <w:t xml:space="preserve">. Conservation Biology 24:553–562.</w:t>
       </w:r>
     </w:p>
-    <w:bookmarkEnd w:id="128"/>
-    <w:bookmarkStart w:id="130" w:name="ref-Soliz:2025"/>
+    <w:bookmarkEnd w:id="141"/>
+    <w:bookmarkStart w:id="143" w:name="ref-Soliz:2025"/>
     <w:p>
       <w:pPr>
         <w:pStyle w:val="Bibliography"/>
@@ -33907,7 +34256,7 @@
       <w:r>
         <w:t xml:space="preserve"> </w:t>
       </w:r>
-      <w:hyperlink r:id="rId129">
+      <w:hyperlink r:id="rId142">
         <w:r>
           <w:rPr>
             <w:rStyle w:val="Hyperlink"/>
@@ -33919,8 +34268,8 @@
         <w:t xml:space="preserve">. Acta Zoologica 106:38–54.</w:t>
       </w:r>
     </w:p>
-    <w:bookmarkEnd w:id="130"/>
-    <w:bookmarkStart w:id="131" w:name="ref-Stejneger:1908"/>
+    <w:bookmarkEnd w:id="143"/>
+    <w:bookmarkStart w:id="144" w:name="ref-Stejneger:1908"/>
     <w:p>
       <w:pPr>
         <w:pStyle w:val="Bibliography"/>
@@ -33929,8 +34278,8 @@
         <w:t xml:space="preserve">Stejneger, L. 1908. Two new species of toads from the philippines. Proceedings of the United States National Museum 33:573–576.</w:t>
       </w:r>
     </w:p>
-    <w:bookmarkEnd w:id="131"/>
-    <w:bookmarkStart w:id="133" w:name="ref-Tu:2018"/>
+    <w:bookmarkEnd w:id="144"/>
+    <w:bookmarkStart w:id="146" w:name="ref-Tu:2018"/>
     <w:p>
       <w:pPr>
         <w:pStyle w:val="Bibliography"/>
@@ -33941,7 +34290,7 @@
       <w:r>
         <w:t xml:space="preserve"> </w:t>
       </w:r>
-      <w:hyperlink r:id="rId132">
+      <w:hyperlink r:id="rId145">
         <w:r>
           <w:rPr>
             <w:rStyle w:val="Hyperlink"/>
@@ -33953,19 +34302,49 @@
         <w:t xml:space="preserve">. Mol Phylogenet Evol 126:85–91.</w:t>
       </w:r>
     </w:p>
-    <w:bookmarkEnd w:id="133"/>
-    <w:bookmarkStart w:id="135" w:name="ref-Werner:1898"/>
+    <w:bookmarkEnd w:id="146"/>
+    <w:bookmarkStart w:id="148" w:name="ref-Wandolleck:1911"/>
     <w:p>
       <w:pPr>
         <w:pStyle w:val="Bibliography"/>
       </w:pPr>
       <w:r>
+        <w:t xml:space="preserve">Wandolleck, Benno. 1911.</w:t>
+      </w:r>
+      <w:r>
+        <w:t xml:space="preserve"> </w:t>
+      </w:r>
+      <w:hyperlink r:id="rId147">
+        <w:r>
+          <w:rPr>
+            <w:rStyle w:val="Hyperlink"/>
+          </w:rPr>
+          <w:t xml:space="preserve">Die amphibien und reptilien der papuanischen ausbeute dr. schlaginhaufens</w:t>
+        </w:r>
+      </w:hyperlink>
+      <w:r>
+        <w:t xml:space="preserve">. Abhandlungen und Berichte des K</w:t>
+      </w:r>
+      <w:r>
+        <w:t xml:space="preserve">ö</w:t>
+      </w:r>
+      <w:r>
+        <w:t xml:space="preserve">nigl. Zoologischen und Anthropologisch-Etnographischen Museums zu Dresden 13:1–15. Berlin, R. Friedlaender, 1887-1917.</w:t>
+      </w:r>
+    </w:p>
+    <w:bookmarkEnd w:id="148"/>
+    <w:bookmarkStart w:id="150" w:name="ref-Werner:1898"/>
+    <w:p>
+      <w:pPr>
+        <w:pStyle w:val="Bibliography"/>
+      </w:pPr>
+      <w:r>
         <w:t xml:space="preserve">Werner, Franz. 1898.</w:t>
       </w:r>
       <w:r>
         <w:t xml:space="preserve"> </w:t>
       </w:r>
-      <w:hyperlink r:id="rId134">
+      <w:hyperlink r:id="rId149">
         <w:r>
           <w:rPr>
             <w:rStyle w:val="Hyperlink"/>
@@ -34007,8 +34386,8 @@
         <w:t xml:space="preserve">. Zoologischer Anzeiger 21:552–556. Jena VEB Gustav Fischer Verlag.</w:t>
       </w:r>
     </w:p>
-    <w:bookmarkEnd w:id="135"/>
-    <w:bookmarkStart w:id="137" w:name="ref-Wickham:2016"/>
+    <w:bookmarkEnd w:id="150"/>
+    <w:bookmarkStart w:id="152" w:name="ref-Wickham:2016"/>
     <w:p>
       <w:pPr>
         <w:pStyle w:val="Bibliography"/>
@@ -34019,7 +34398,7 @@
       <w:r>
         <w:t xml:space="preserve"> </w:t>
       </w:r>
-      <w:hyperlink r:id="rId136">
+      <w:hyperlink r:id="rId151">
         <w:r>
           <w:rPr>
             <w:rStyle w:val="Hyperlink"/>
@@ -34031,8 +34410,8 @@
         <w:t xml:space="preserve">. Springer-Verlag New York.</w:t>
       </w:r>
     </w:p>
-    <w:bookmarkEnd w:id="137"/>
-    <w:bookmarkStart w:id="139" w:name="ref-Ye:2012"/>
+    <w:bookmarkEnd w:id="152"/>
+    <w:bookmarkStart w:id="154" w:name="ref-Ye:2012"/>
     <w:p>
       <w:pPr>
         <w:pStyle w:val="Bibliography"/>
@@ -34043,7 +34422,7 @@
       <w:r>
         <w:t xml:space="preserve"> </w:t>
       </w:r>
-      <w:hyperlink r:id="rId138">
+      <w:hyperlink r:id="rId153">
         <w:r>
           <w:rPr>
             <w:rStyle w:val="Hyperlink"/>
@@ -34055,8 +34434,8 @@
         <w:t xml:space="preserve">. BMC Bioinformatics 13:134.</w:t>
       </w:r>
     </w:p>
-    <w:bookmarkEnd w:id="139"/>
-    <w:bookmarkStart w:id="141" w:name="ref-Yu:2020"/>
+    <w:bookmarkEnd w:id="154"/>
+    <w:bookmarkStart w:id="156" w:name="ref-Yu:2020"/>
     <w:p>
       <w:pPr>
         <w:pStyle w:val="Bibliography"/>
@@ -34067,7 +34446,7 @@
       <w:r>
         <w:t xml:space="preserve"> </w:t>
       </w:r>
-      <w:hyperlink r:id="rId140">
+      <w:hyperlink r:id="rId155">
         <w:r>
           <w:rPr>
             <w:rStyle w:val="Hyperlink"/>
@@ -34079,8 +34458,8 @@
         <w:t xml:space="preserve">. Current Protocols in Bioinformatics 69:e96.</w:t>
       </w:r>
     </w:p>
-    <w:bookmarkEnd w:id="141"/>
-    <w:bookmarkStart w:id="143" w:name="ref-Yu:2017"/>
+    <w:bookmarkEnd w:id="156"/>
+    <w:bookmarkStart w:id="158" w:name="ref-Yu:2017"/>
     <w:p>
       <w:pPr>
         <w:pStyle w:val="Bibliography"/>
@@ -34091,7 +34470,7 @@
       <w:r>
         <w:t xml:space="preserve"> </w:t>
       </w:r>
-      <w:hyperlink r:id="rId142">
+      <w:hyperlink r:id="rId157">
         <w:r>
           <w:rPr>
             <w:rStyle w:val="Hyperlink"/>
@@ -34103,8 +34482,8 @@
         <w:t xml:space="preserve"> Methods in Ecology and Evolution 8:28–36.</w:t>
       </w:r>
     </w:p>
-    <w:bookmarkEnd w:id="143"/>
-    <w:bookmarkStart w:id="145" w:name="ref-ICZN:1999"/>
+    <w:bookmarkEnd w:id="158"/>
+    <w:bookmarkStart w:id="160" w:name="ref-ICZN:1999"/>
     <w:p>
       <w:pPr>
         <w:pStyle w:val="Bibliography"/>
@@ -34115,7 +34494,7 @@
       <w:r>
         <w:t xml:space="preserve"> </w:t>
       </w:r>
-      <w:hyperlink r:id="rId144">
+      <w:hyperlink r:id="rId159">
         <w:r>
           <w:rPr>
             <w:rStyle w:val="Hyperlink"/>
@@ -34127,8 +34506,8 @@
         <w:t xml:space="preserve">. London, International Trust for Zoological Nomenclature, c/o Natural History Museum, 1999.</w:t>
       </w:r>
     </w:p>
-    <w:bookmarkEnd w:id="145"/>
-    <w:bookmarkStart w:id="146" w:name="ref-Zweifel:2003"/>
+    <w:bookmarkEnd w:id="160"/>
+    <w:bookmarkStart w:id="161" w:name="ref-Zweifel:2003"/>
     <w:p>
       <w:pPr>
         <w:pStyle w:val="Bibliography"/>
@@ -34137,8 +34516,8 @@
         <w:t xml:space="preserve">Zweifel, R. G. 2003. A new species of microhylid frog, genus oreophryne, from papua new guinea. American Museum Novitates 1–8.</w:t>
       </w:r>
     </w:p>
-    <w:bookmarkEnd w:id="146"/>
-    <w:bookmarkStart w:id="147" w:name="ref-Zweifel:1956"/>
+    <w:bookmarkEnd w:id="161"/>
+    <w:bookmarkStart w:id="162" w:name="ref-Zweifel:1956"/>
     <w:p>
       <w:pPr>
         <w:pStyle w:val="Bibliography"/>
@@ -34147,8 +34526,8 @@
         <w:t xml:space="preserve">Zweifel, R. G. 1956. Microhylid frogs from new guinea, with descriptions of new species. American Museum Novitates 1–49.</w:t>
       </w:r>
     </w:p>
-    <w:bookmarkEnd w:id="147"/>
-    <w:bookmarkStart w:id="149" w:name="ref-Zweifel:2005"/>
+    <w:bookmarkEnd w:id="162"/>
+    <w:bookmarkStart w:id="164" w:name="ref-Zweifel:2005"/>
     <w:p>
       <w:pPr>
         <w:pStyle w:val="Bibliography"/>
@@ -34159,7 +34538,7 @@
       <w:r>
         <w:t xml:space="preserve"> </w:t>
       </w:r>
-      <w:hyperlink r:id="rId148">
+      <w:hyperlink r:id="rId163">
         <w:r>
           <w:rPr>
             <w:rStyle w:val="Hyperlink"/>
@@ -34171,8 +34550,8 @@
         <w:t xml:space="preserve">. American Museum Novitates 3495:1–25.</w:t>
       </w:r>
     </w:p>
-    <w:bookmarkEnd w:id="149"/>
-    <w:bookmarkStart w:id="151" w:name="ref-Zweifel:2003a"/>
+    <w:bookmarkEnd w:id="164"/>
+    <w:bookmarkStart w:id="166" w:name="ref-Zweifel:2003a"/>
     <w:p>
       <w:pPr>
         <w:pStyle w:val="Bibliography"/>
@@ -34183,7 +34562,7 @@
       <w:r>
         <w:t xml:space="preserve"> </w:t>
       </w:r>
-      <w:hyperlink r:id="rId150">
+      <w:hyperlink r:id="rId165">
         <w:r>
           <w:rPr>
             <w:rStyle w:val="Hyperlink"/>
@@ -34195,9 +34574,9 @@
         <w:t xml:space="preserve">. AMERICAN MUSEUM NOVITATES 1–31.</w:t>
       </w:r>
     </w:p>
-    <w:bookmarkEnd w:id="151"/>
-    <w:bookmarkEnd w:id="152"/>
-    <w:bookmarkEnd w:id="153"/>
+    <w:bookmarkEnd w:id="166"/>
+    <w:bookmarkEnd w:id="167"/>
+    <w:bookmarkEnd w:id="168"/>
     <w:sectPr/>
   </w:body>
 </w:document>

</xml_diff>